<commit_message>
Publish bridge visuals in teaching pack
Co-authored-by: shaseaver25 <shannon@tailoredu.org>
</commit_message>
<xml_diff>
--- a/teaching-pack/00-INSTRUCTOR/FILE-INDEX.docx
+++ b/teaching-pack/00-INSTRUCTOR/FILE-INDEX.docx
@@ -29,7 +29,7 @@
           <w:color w:val="6B7280"/>
           <w:sz w:val="19"/>
         </w:rPr>
-        <w:t>Twenty-eight files. Folders are in teaching order.</w:t>
+        <w:t>Folders are in teaching order.</w:t>
       </w:r>
     </w:p>
     <w:p>
@@ -189,6 +189,46 @@
                 <w:sz w:val="17"/>
               </w:rPr>
               <w:t>This page</w:t>
+            </w:r>
+          </w:p>
+        </w:tc>
+      </w:tr>
+      <w:tr>
+        <w:tc>
+          <w:tcPr>
+            <w:tcW w:type="dxa" w:w="4608"/>
+          </w:tcPr>
+          <w:p>
+            <w:pPr>
+              <w:spacing w:before="20" w:after="20" w:line="252" w:lineRule="auto"/>
+            </w:pPr>
+            <w:r>
+              <w:rPr>
+                <w:rFonts w:ascii="Barlow" w:hAnsi="Barlow" w:cs="Barlow"/>
+                <w:b w:val="0"/>
+                <w:i w:val="0"/>
+                <w:sz w:val="17"/>
+              </w:rPr>
+              <w:t>BRIDGE-VISUALS.txt</w:t>
+            </w:r>
+          </w:p>
+        </w:tc>
+        <w:tc>
+          <w:tcPr>
+            <w:tcW w:type="dxa" w:w="5328"/>
+          </w:tcPr>
+          <w:p>
+            <w:pPr>
+              <w:spacing w:before="20" w:after="20" w:line="252" w:lineRule="auto"/>
+            </w:pPr>
+            <w:r>
+              <w:rPr>
+                <w:rFonts w:ascii="Barlow" w:hAnsi="Barlow" w:cs="Barlow"/>
+                <w:b w:val="0"/>
+                <w:i w:val="0"/>
+                <w:sz w:val="17"/>
+              </w:rPr>
+              <w:t>Slide asset note; location map status</w:t>
             </w:r>
           </w:p>
         </w:tc>
@@ -1698,6 +1738,208 @@
         </w:tc>
       </w:tr>
     </w:tbl>
+    <w:p>
+      <w:pPr>
+        <w:spacing w:before="260" w:after="80" w:line="240" w:lineRule="auto"/>
+      </w:pPr>
+      <w:r>
+        <w:rPr>
+          <w:rFonts w:ascii="Barlow Condensed" w:hAnsi="Barlow Condensed" w:cs="Barlow Condensed"/>
+          <w:b/>
+          <w:i w:val="0"/>
+          <w:color w:val="1F3A5F"/>
+          <w:sz w:val="25"/>
+          <w:caps w:val="1"/>
+          <w:spacing w:val="12"/>
+        </w:rPr>
+        <w:t>06-BRIDGE</w:t>
+      </w:r>
+    </w:p>
+    <w:tbl>
+      <w:tblPr>
+        <w:tblStyle w:val="TableGrid"/>
+        <w:tblW w:type="auto" w:w="0"/>
+        <w:jc w:val="left"/>
+        <w:tblLook w:firstColumn="1" w:firstRow="1" w:lastColumn="0" w:lastRow="0" w:noHBand="0" w:noVBand="1" w:val="04A0"/>
+        <w:tblLayout w:type="fixed"/>
+        <w:tblCellMar>
+          <w:top w:w="60" w:type="dxa"/>
+          <w:left w:w="110" w:type="dxa"/>
+          <w:bottom w:w="60" w:type="dxa"/>
+          <w:right w:w="110" w:type="dxa"/>
+        </w:tblCellMar>
+      </w:tblPr>
+      <w:tblGrid>
+        <w:gridCol w:w="4968"/>
+        <w:gridCol w:w="4968"/>
+      </w:tblGrid>
+      <w:tr>
+        <w:tc>
+          <w:tcPr>
+            <w:tcW w:type="dxa" w:w="4608"/>
+            <w:shd w:val="clear" w:color="auto" w:fill="1F3A5F"/>
+          </w:tcPr>
+          <w:p>
+            <w:pPr>
+              <w:spacing w:before="20" w:after="20" w:line="252" w:lineRule="auto"/>
+            </w:pPr>
+            <w:r>
+              <w:rPr>
+                <w:rFonts w:ascii="Barlow Condensed" w:hAnsi="Barlow Condensed" w:cs="Barlow Condensed"/>
+                <w:b/>
+                <w:i w:val="0"/>
+                <w:color w:val="FFFFFF"/>
+                <w:sz w:val="17"/>
+              </w:rPr>
+              <w:t>File</w:t>
+            </w:r>
+          </w:p>
+        </w:tc>
+        <w:tc>
+          <w:tcPr>
+            <w:tcW w:type="dxa" w:w="5328"/>
+            <w:shd w:val="clear" w:color="auto" w:fill="1F3A5F"/>
+          </w:tcPr>
+          <w:p>
+            <w:pPr>
+              <w:spacing w:before="20" w:after="20" w:line="252" w:lineRule="auto"/>
+            </w:pPr>
+            <w:r>
+              <w:rPr>
+                <w:rFonts w:ascii="Barlow Condensed" w:hAnsi="Barlow Condensed" w:cs="Barlow Condensed"/>
+                <w:b/>
+                <w:i w:val="0"/>
+                <w:color w:val="FFFFFF"/>
+                <w:sz w:val="17"/>
+              </w:rPr>
+              <w:t>What it is</w:t>
+            </w:r>
+          </w:p>
+        </w:tc>
+      </w:tr>
+      <w:tr>
+        <w:tc>
+          <w:tcPr>
+            <w:tcW w:type="dxa" w:w="4608"/>
+          </w:tcPr>
+          <w:p>
+            <w:pPr>
+              <w:spacing w:before="20" w:after="20" w:line="252" w:lineRule="auto"/>
+            </w:pPr>
+            <w:r>
+              <w:rPr>
+                <w:rFonts w:ascii="Barlow" w:hAnsi="Barlow" w:cs="Barlow"/>
+                <w:b w:val="0"/>
+                <w:i w:val="0"/>
+                <w:sz w:val="17"/>
+              </w:rPr>
+              <w:t>otter-bend-lift-bridge.jpg</w:t>
+            </w:r>
+          </w:p>
+        </w:tc>
+        <w:tc>
+          <w:tcPr>
+            <w:tcW w:type="dxa" w:w="5328"/>
+          </w:tcPr>
+          <w:p>
+            <w:pPr>
+              <w:spacing w:before="20" w:after="20" w:line="252" w:lineRule="auto"/>
+            </w:pPr>
+            <w:r>
+              <w:rPr>
+                <w:rFonts w:ascii="Barlow" w:hAnsi="Barlow" w:cs="Barlow"/>
+                <w:b w:val="0"/>
+                <w:i w:val="0"/>
+                <w:sz w:val="17"/>
+              </w:rPr>
+              <w:t>Flat illustration, ready for PowerPoint</w:t>
+            </w:r>
+          </w:p>
+        </w:tc>
+      </w:tr>
+      <w:tr>
+        <w:tc>
+          <w:tcPr>
+            <w:tcW w:type="dxa" w:w="4608"/>
+            <w:shd w:val="clear" w:color="auto" w:fill="F4F6F8"/>
+          </w:tcPr>
+          <w:p>
+            <w:pPr>
+              <w:spacing w:before="20" w:after="20" w:line="252" w:lineRule="auto"/>
+            </w:pPr>
+            <w:r>
+              <w:rPr>
+                <w:rFonts w:ascii="Barlow" w:hAnsi="Barlow" w:cs="Barlow"/>
+                <w:b w:val="0"/>
+                <w:i w:val="0"/>
+                <w:sz w:val="17"/>
+              </w:rPr>
+              <w:t>otter-bend-general-elevation.png</w:t>
+            </w:r>
+          </w:p>
+        </w:tc>
+        <w:tc>
+          <w:tcPr>
+            <w:tcW w:type="dxa" w:w="5328"/>
+            <w:shd w:val="clear" w:color="auto" w:fill="F4F6F8"/>
+          </w:tcPr>
+          <w:p>
+            <w:pPr>
+              <w:spacing w:before="20" w:after="20" w:line="252" w:lineRule="auto"/>
+            </w:pPr>
+            <w:r>
+              <w:rPr>
+                <w:rFonts w:ascii="Barlow" w:hAnsi="Barlow" w:cs="Barlow"/>
+                <w:b w:val="0"/>
+                <w:i w:val="0"/>
+                <w:sz w:val="17"/>
+              </w:rPr>
+              <w:t>Dimensioned general elevation; keep the disclaimer visible</w:t>
+            </w:r>
+          </w:p>
+        </w:tc>
+      </w:tr>
+      <w:tr>
+        <w:tc>
+          <w:tcPr>
+            <w:tcW w:type="dxa" w:w="4608"/>
+          </w:tcPr>
+          <w:p>
+            <w:pPr>
+              <w:spacing w:before="20" w:after="20" w:line="252" w:lineRule="auto"/>
+            </w:pPr>
+            <w:r>
+              <w:rPr>
+                <w:rFonts w:ascii="Barlow" w:hAnsi="Barlow" w:cs="Barlow"/>
+                <w:b w:val="0"/>
+                <w:i w:val="0"/>
+                <w:sz w:val="17"/>
+              </w:rPr>
+              <w:t>README.txt</w:t>
+            </w:r>
+          </w:p>
+        </w:tc>
+        <w:tc>
+          <w:tcPr>
+            <w:tcW w:type="dxa" w:w="5328"/>
+          </w:tcPr>
+          <w:p>
+            <w:pPr>
+              <w:spacing w:before="20" w:after="20" w:line="252" w:lineRule="auto"/>
+            </w:pPr>
+            <w:r>
+              <w:rPr>
+                <w:rFonts w:ascii="Barlow" w:hAnsi="Barlow" w:cs="Barlow"/>
+                <w:b w:val="0"/>
+                <w:i w:val="0"/>
+                <w:sz w:val="17"/>
+              </w:rPr>
+              <w:t>PowerPoint placement and disclaimer instructions</w:t>
+            </w:r>
+          </w:p>
+        </w:tc>
+      </w:tr>
+    </w:tbl>
     <w:sectPr>
       <w:headerReference w:type="default" r:id="rId9"/>
       <w:footerReference w:type="default" r:id="rId10"/>

</xml_diff>

<commit_message>
Add location and gauge array slide assets
Co-authored-by: shaseaver25 <shannon@tailoredu.org>
</commit_message>
<xml_diff>
--- a/teaching-pack/00-INSTRUCTOR/FILE-INDEX.docx
+++ b/teaching-pack/00-INSTRUCTOR/FILE-INDEX.docx
@@ -228,7 +228,7 @@
                 <w:i w:val="0"/>
                 <w:sz w:val="17"/>
               </w:rPr>
-              <w:t>Slide asset note; location map status</w:t>
+              <w:t>Four PowerPoint-ready bridge assets and usage notes</w:t>
             </w:r>
           </w:p>
         </w:tc>
@@ -1915,6 +1915,88 @@
                 <w:i w:val="0"/>
                 <w:sz w:val="17"/>
               </w:rPr>
+              <w:t>otter-bend-location-map.png</w:t>
+            </w:r>
+          </w:p>
+        </w:tc>
+        <w:tc>
+          <w:tcPr>
+            <w:tcW w:type="dxa" w:w="5328"/>
+          </w:tcPr>
+          <w:p>
+            <w:pPr>
+              <w:spacing w:before="20" w:after="20" w:line="252" w:lineRule="auto"/>
+            </w:pPr>
+            <w:r>
+              <w:rPr>
+                <w:rFonts w:ascii="Barlow" w:hAnsi="Barlow" w:cs="Barlow"/>
+                <w:b w:val="0"/>
+                <w:i w:val="0"/>
+                <w:sz w:val="17"/>
+              </w:rPr>
+              <w:t>Fictional Kinnick County / County Road 9 location map</w:t>
+            </w:r>
+          </w:p>
+        </w:tc>
+      </w:tr>
+      <w:tr>
+        <w:tc>
+          <w:tcPr>
+            <w:tcW w:type="dxa" w:w="4608"/>
+            <w:shd w:val="clear" w:color="auto" w:fill="F4F6F8"/>
+          </w:tcPr>
+          <w:p>
+            <w:pPr>
+              <w:spacing w:before="20" w:after="20" w:line="252" w:lineRule="auto"/>
+            </w:pPr>
+            <w:r>
+              <w:rPr>
+                <w:rFonts w:ascii="Barlow" w:hAnsi="Barlow" w:cs="Barlow"/>
+                <w:b w:val="0"/>
+                <w:i w:val="0"/>
+                <w:sz w:val="17"/>
+              </w:rPr>
+              <w:t>otter-bend-strain-gauge-array.png</w:t>
+            </w:r>
+          </w:p>
+        </w:tc>
+        <w:tc>
+          <w:tcPr>
+            <w:tcW w:type="dxa" w:w="5328"/>
+            <w:shd w:val="clear" w:color="auto" w:fill="F4F6F8"/>
+          </w:tcPr>
+          <w:p>
+            <w:pPr>
+              <w:spacing w:before="20" w:after="20" w:line="252" w:lineRule="auto"/>
+            </w:pPr>
+            <w:r>
+              <w:rPr>
+                <w:rFonts w:ascii="Barlow" w:hAnsi="Barlow" w:cs="Barlow"/>
+                <w:b w:val="0"/>
+                <w:i w:val="0"/>
+                <w:sz w:val="17"/>
+              </w:rPr>
+              <w:t>M02 gauge array G1–G8; G5/G6 at midspan, G6 redundant</w:t>
+            </w:r>
+          </w:p>
+        </w:tc>
+      </w:tr>
+      <w:tr>
+        <w:tc>
+          <w:tcPr>
+            <w:tcW w:type="dxa" w:w="4608"/>
+          </w:tcPr>
+          <w:p>
+            <w:pPr>
+              <w:spacing w:before="20" w:after="20" w:line="252" w:lineRule="auto"/>
+            </w:pPr>
+            <w:r>
+              <w:rPr>
+                <w:rFonts w:ascii="Barlow" w:hAnsi="Barlow" w:cs="Barlow"/>
+                <w:b w:val="0"/>
+                <w:i w:val="0"/>
+                <w:sz w:val="17"/>
+              </w:rPr>
               <w:t>README.txt</w:t>
             </w:r>
           </w:p>

</xml_diff>

<commit_message>
Finalize primary bridge PowerPoint assets
Co-authored-by: shaseaver25 <shannon@tailoredu.org>
</commit_message>
<xml_diff>
--- a/teaching-pack/00-INSTRUCTOR/FILE-INDEX.docx
+++ b/teaching-pack/00-INSTRUCTOR/FILE-INDEX.docx
@@ -228,7 +228,7 @@
                 <w:i w:val="0"/>
                 <w:sz w:val="17"/>
               </w:rPr>
-              <w:t>Four PowerPoint-ready bridge assets and usage notes</w:t>
+              <w:t>Four primary bridge assets, optional locator, usage notes</w:t>
             </w:r>
           </w:p>
         </w:tc>
@@ -1833,7 +1833,7 @@
                 <w:i w:val="0"/>
                 <w:sz w:val="17"/>
               </w:rPr>
-              <w:t>otter-bend-lift-bridge.jpg</w:t>
+              <w:t>otter-bend-lift-bridge-flat-claude.png</w:t>
             </w:r>
           </w:p>
         </w:tc>
@@ -1852,7 +1852,7 @@
                 <w:i w:val="0"/>
                 <w:sz w:val="17"/>
               </w:rPr>
-              <w:t>Flat illustration, ready for PowerPoint</w:t>
+              <w:t>Primary flat illustration, ready for PowerPoint</w:t>
             </w:r>
           </w:p>
         </w:tc>
@@ -1915,7 +1915,7 @@
                 <w:i w:val="0"/>
                 <w:sz w:val="17"/>
               </w:rPr>
-              <w:t>otter-bend-location-map.png</w:t>
+              <w:t>otter-bend-strain-gauge-array.png</w:t>
             </w:r>
           </w:p>
         </w:tc>
@@ -1934,7 +1934,7 @@
                 <w:i w:val="0"/>
                 <w:sz w:val="17"/>
               </w:rPr>
-              <w:t>Fictional Kinnick County / County Road 9 location map</w:t>
+              <w:t>M02 gauge array G1–G8; G5/G6 at midspan, G6 redundant</w:t>
             </w:r>
           </w:p>
         </w:tc>
@@ -1956,7 +1956,7 @@
                 <w:i w:val="0"/>
                 <w:sz w:val="17"/>
               </w:rPr>
-              <w:t>otter-bend-strain-gauge-array.png</w:t>
+              <w:t>otter-bend-site-location.png</w:t>
             </w:r>
           </w:p>
         </w:tc>
@@ -1976,7 +1976,7 @@
                 <w:i w:val="0"/>
                 <w:sz w:val="17"/>
               </w:rPr>
-              <w:t>M02 gauge array G1–G8; G5/G6 at midspan, G6 redundant</w:t>
+              <w:t>Primary site map: Otter Bend, Kinnickville, County Road 9</w:t>
             </w:r>
           </w:p>
         </w:tc>
@@ -1997,6 +1997,47 @@
                 <w:i w:val="0"/>
                 <w:sz w:val="17"/>
               </w:rPr>
+              <w:t>otter-bend-location-map.png</w:t>
+            </w:r>
+          </w:p>
+        </w:tc>
+        <w:tc>
+          <w:tcPr>
+            <w:tcW w:type="dxa" w:w="5328"/>
+          </w:tcPr>
+          <w:p>
+            <w:pPr>
+              <w:spacing w:before="20" w:after="20" w:line="252" w:lineRule="auto"/>
+            </w:pPr>
+            <w:r>
+              <w:rPr>
+                <w:rFonts w:ascii="Barlow" w:hAnsi="Barlow" w:cs="Barlow"/>
+                <w:b w:val="0"/>
+                <w:i w:val="0"/>
+                <w:sz w:val="17"/>
+              </w:rPr>
+              <w:t>Optional backup: simpler fictional-site locator</w:t>
+            </w:r>
+          </w:p>
+        </w:tc>
+      </w:tr>
+      <w:tr>
+        <w:tc>
+          <w:tcPr>
+            <w:tcW w:type="dxa" w:w="4608"/>
+            <w:shd w:val="clear" w:color="auto" w:fill="F4F6F8"/>
+          </w:tcPr>
+          <w:p>
+            <w:pPr>
+              <w:spacing w:before="20" w:after="20" w:line="252" w:lineRule="auto"/>
+            </w:pPr>
+            <w:r>
+              <w:rPr>
+                <w:rFonts w:ascii="Barlow" w:hAnsi="Barlow" w:cs="Barlow"/>
+                <w:b w:val="0"/>
+                <w:i w:val="0"/>
+                <w:sz w:val="17"/>
+              </w:rPr>
               <w:t>README.txt</w:t>
             </w:r>
           </w:p>
@@ -2004,6 +2045,7 @@
         <w:tc>
           <w:tcPr>
             <w:tcW w:type="dxa" w:w="5328"/>
+            <w:shd w:val="clear" w:color="auto" w:fill="F4F6F8"/>
           </w:tcPr>
           <w:p>
             <w:pPr>

</xml_diff>

<commit_message>
Publish spoiler-safe M02 deck artifacts
Co-authored-by: shaseaver25 <shannon@tailoredu.org>
</commit_message>
<xml_diff>
--- a/teaching-pack/00-INSTRUCTOR/FILE-INDEX.docx
+++ b/teaching-pack/00-INSTRUCTOR/FILE-INDEX.docx
@@ -899,7 +899,7 @@
                 <w:i w:val="0"/>
                 <w:sz w:val="17"/>
               </w:rPr>
-              <w:t>M02-slides-measurement.pptx</w:t>
+              <w:t>M02-student.pptx</w:t>
             </w:r>
           </w:p>
         </w:tc>
@@ -918,7 +918,7 @@
                 <w:i w:val="0"/>
                 <w:sz w:val="17"/>
               </w:rPr>
-              <w:t>20 slides</w:t>
+              <w:t>11 slides — project first; contains no gauge answer tables</w:t>
             </w:r>
           </w:p>
         </w:tc>
@@ -940,6 +940,47 @@
                 <w:i w:val="0"/>
                 <w:sz w:val="17"/>
               </w:rPr>
+              <w:t>M02-instructor-reveal.pptx</w:t>
+            </w:r>
+          </w:p>
+        </w:tc>
+        <w:tc>
+          <w:tcPr>
+            <w:tcW w:type="dxa" w:w="5328"/>
+            <w:shd w:val="clear" w:color="auto" w:fill="F4F6F8"/>
+          </w:tcPr>
+          <w:p>
+            <w:pPr>
+              <w:spacing w:before="20" w:after="20" w:line="252" w:lineRule="auto"/>
+            </w:pPr>
+            <w:r>
+              <w:rPr>
+                <w:rFonts w:ascii="Barlow" w:hAnsi="Barlow" w:cs="Barlow"/>
+                <w:b w:val="0"/>
+                <w:i w:val="0"/>
+                <w:sz w:val="17"/>
+              </w:rPr>
+              <w:t>9 slides — keep closed until after students struggle</w:t>
+            </w:r>
+          </w:p>
+        </w:tc>
+      </w:tr>
+      <w:tr>
+        <w:tc>
+          <w:tcPr>
+            <w:tcW w:type="dxa" w:w="4608"/>
+          </w:tcPr>
+          <w:p>
+            <w:pPr>
+              <w:spacing w:before="20" w:after="20" w:line="252" w:lineRule="auto"/>
+            </w:pPr>
+            <w:r>
+              <w:rPr>
+                <w:rFonts w:ascii="Barlow" w:hAnsi="Barlow" w:cs="Barlow"/>
+                <w:b w:val="0"/>
+                <w:i w:val="0"/>
+                <w:sz w:val="17"/>
+              </w:rPr>
               <w:t>H2-01-measurement-lab.docx</w:t>
             </w:r>
           </w:p>
@@ -947,7 +988,6 @@
         <w:tc>
           <w:tcPr>
             <w:tcW w:type="dxa" w:w="5328"/>
-            <w:shd w:val="clear" w:color="auto" w:fill="F4F6F8"/>
           </w:tcPr>
           <w:p>
             <w:pPr>
@@ -969,6 +1009,7 @@
         <w:tc>
           <w:tcPr>
             <w:tcW w:type="dxa" w:w="4608"/>
+            <w:shd w:val="clear" w:color="auto" w:fill="F4F6F8"/>
           </w:tcPr>
           <w:p>
             <w:pPr>
@@ -988,6 +1029,7 @@
         <w:tc>
           <w:tcPr>
             <w:tcW w:type="dxa" w:w="5328"/>
+            <w:shd w:val="clear" w:color="auto" w:fill="F4F6F8"/>
           </w:tcPr>
           <w:p>
             <w:pPr>
@@ -1009,7 +1051,6 @@
         <w:tc>
           <w:tcPr>
             <w:tcW w:type="dxa" w:w="4608"/>
-            <w:shd w:val="clear" w:color="auto" w:fill="F4F6F8"/>
           </w:tcPr>
           <w:p>
             <w:pPr>
@@ -1029,7 +1070,6 @@
         <w:tc>
           <w:tcPr>
             <w:tcW w:type="dxa" w:w="5328"/>
-            <w:shd w:val="clear" w:color="auto" w:fill="F4F6F8"/>
           </w:tcPr>
           <w:p>
             <w:pPr>
@@ -1051,6 +1091,7 @@
         <w:tc>
           <w:tcPr>
             <w:tcW w:type="dxa" w:w="4608"/>
+            <w:shd w:val="clear" w:color="auto" w:fill="F4F6F8"/>
           </w:tcPr>
           <w:p>
             <w:pPr>
@@ -1070,6 +1111,7 @@
         <w:tc>
           <w:tcPr>
             <w:tcW w:type="dxa" w:w="5328"/>
+            <w:shd w:val="clear" w:color="auto" w:fill="F4F6F8"/>
           </w:tcPr>
           <w:p>
             <w:pPr>
@@ -1091,7 +1133,6 @@
         <w:tc>
           <w:tcPr>
             <w:tcW w:type="dxa" w:w="4608"/>
-            <w:shd w:val="clear" w:color="auto" w:fill="F4F6F8"/>
           </w:tcPr>
           <w:p>
             <w:pPr>
@@ -1111,7 +1152,6 @@
         <w:tc>
           <w:tcPr>
             <w:tcW w:type="dxa" w:w="5328"/>
-            <w:shd w:val="clear" w:color="auto" w:fill="F4F6F8"/>
           </w:tcPr>
           <w:p>
             <w:pPr>
@@ -1133,6 +1173,7 @@
         <w:tc>
           <w:tcPr>
             <w:tcW w:type="dxa" w:w="4608"/>
+            <w:shd w:val="clear" w:color="auto" w:fill="F4F6F8"/>
           </w:tcPr>
           <w:p>
             <w:pPr>
@@ -1152,6 +1193,7 @@
         <w:tc>
           <w:tcPr>
             <w:tcW w:type="dxa" w:w="5328"/>
+            <w:shd w:val="clear" w:color="auto" w:fill="F4F6F8"/>
           </w:tcPr>
           <w:p>
             <w:pPr>
@@ -1173,7 +1215,6 @@
         <w:tc>
           <w:tcPr>
             <w:tcW w:type="dxa" w:w="4608"/>
-            <w:shd w:val="clear" w:color="auto" w:fill="F4F6F8"/>
           </w:tcPr>
           <w:p>
             <w:pPr>
@@ -1193,7 +1234,6 @@
         <w:tc>
           <w:tcPr>
             <w:tcW w:type="dxa" w:w="5328"/>
-            <w:shd w:val="clear" w:color="auto" w:fill="F4F6F8"/>
           </w:tcPr>
           <w:p>
             <w:pPr>
@@ -1215,6 +1255,7 @@
         <w:tc>
           <w:tcPr>
             <w:tcW w:type="dxa" w:w="4608"/>
+            <w:shd w:val="clear" w:color="auto" w:fill="F4F6F8"/>
           </w:tcPr>
           <w:p>
             <w:pPr>
@@ -1234,6 +1275,7 @@
         <w:tc>
           <w:tcPr>
             <w:tcW w:type="dxa" w:w="5328"/>
+            <w:shd w:val="clear" w:color="auto" w:fill="F4F6F8"/>
           </w:tcPr>
           <w:p>
             <w:pPr>

</xml_diff>

<commit_message>
Add instructor run-of-day newsletters
Co-authored-by: shaseaver25 <shannon@tailoredu.org>
</commit_message>
<xml_diff>
--- a/teaching-pack/00-INSTRUCTOR/FILE-INDEX.docx
+++ b/teaching-pack/00-INSTRUCTOR/FILE-INDEX.docx
@@ -229,6 +229,170 @@
                 <w:sz w:val="17"/>
               </w:rPr>
               <w:t>Four primary bridge assets, optional locator, usage notes</w:t>
+            </w:r>
+          </w:p>
+        </w:tc>
+      </w:tr>
+      <w:tr>
+        <w:tc>
+          <w:tcPr>
+            <w:tcW w:type="dxa" w:w="4608"/>
+            <w:shd w:val="clear" w:color="auto" w:fill="F4F6F8"/>
+          </w:tcPr>
+          <w:p>
+            <w:pPr>
+              <w:spacing w:before="20" w:after="20" w:line="252" w:lineRule="auto"/>
+            </w:pPr>
+            <w:r>
+              <w:rPr>
+                <w:rFonts w:ascii="Barlow" w:hAnsi="Barlow" w:cs="Barlow"/>
+                <w:b w:val="0"/>
+                <w:i w:val="0"/>
+                <w:sz w:val="17"/>
+              </w:rPr>
+              <w:t>run-of-day/index.html</w:t>
+            </w:r>
+          </w:p>
+        </w:tc>
+        <w:tc>
+          <w:tcPr>
+            <w:tcW w:type="dxa" w:w="5328"/>
+            <w:shd w:val="clear" w:color="auto" w:fill="F4F6F8"/>
+          </w:tcPr>
+          <w:p>
+            <w:pPr>
+              <w:spacing w:before="20" w:after="20" w:line="252" w:lineRule="auto"/>
+            </w:pPr>
+            <w:r>
+              <w:rPr>
+                <w:rFonts w:ascii="Barlow" w:hAnsi="Barlow" w:cs="Barlow"/>
+                <w:b w:val="0"/>
+                <w:i w:val="0"/>
+                <w:sz w:val="17"/>
+              </w:rPr>
+              <w:t>Newsletter-style podium desk linking M01–M03</w:t>
+            </w:r>
+          </w:p>
+        </w:tc>
+      </w:tr>
+      <w:tr>
+        <w:tc>
+          <w:tcPr>
+            <w:tcW w:type="dxa" w:w="4608"/>
+          </w:tcPr>
+          <w:p>
+            <w:pPr>
+              <w:spacing w:before="20" w:after="20" w:line="252" w:lineRule="auto"/>
+            </w:pPr>
+            <w:r>
+              <w:rPr>
+                <w:rFonts w:ascii="Barlow" w:hAnsi="Barlow" w:cs="Barlow"/>
+                <w:b w:val="0"/>
+                <w:i w:val="0"/>
+                <w:sz w:val="17"/>
+              </w:rPr>
+              <w:t>run-of-day/M01-run-of-day.html</w:t>
+            </w:r>
+          </w:p>
+        </w:tc>
+        <w:tc>
+          <w:tcPr>
+            <w:tcW w:type="dxa" w:w="5328"/>
+          </w:tcPr>
+          <w:p>
+            <w:pPr>
+              <w:spacing w:before="20" w:after="20" w:line="252" w:lineRule="auto"/>
+            </w:pPr>
+            <w:r>
+              <w:rPr>
+                <w:rFonts w:ascii="Barlow" w:hAnsi="Barlow" w:cs="Barlow"/>
+                <w:b w:val="0"/>
+                <w:i w:val="0"/>
+                <w:sz w:val="17"/>
+              </w:rPr>
+              <w:t>Exact slides, script and handouts for M01</w:t>
+            </w:r>
+          </w:p>
+        </w:tc>
+      </w:tr>
+      <w:tr>
+        <w:tc>
+          <w:tcPr>
+            <w:tcW w:type="dxa" w:w="4608"/>
+            <w:shd w:val="clear" w:color="auto" w:fill="F4F6F8"/>
+          </w:tcPr>
+          <w:p>
+            <w:pPr>
+              <w:spacing w:before="20" w:after="20" w:line="252" w:lineRule="auto"/>
+            </w:pPr>
+            <w:r>
+              <w:rPr>
+                <w:rFonts w:ascii="Barlow" w:hAnsi="Barlow" w:cs="Barlow"/>
+                <w:b w:val="0"/>
+                <w:i w:val="0"/>
+                <w:sz w:val="17"/>
+              </w:rPr>
+              <w:t>run-of-day/M02-run-of-day.html</w:t>
+            </w:r>
+          </w:p>
+        </w:tc>
+        <w:tc>
+          <w:tcPr>
+            <w:tcW w:type="dxa" w:w="5328"/>
+            <w:shd w:val="clear" w:color="auto" w:fill="F4F6F8"/>
+          </w:tcPr>
+          <w:p>
+            <w:pPr>
+              <w:spacing w:before="20" w:after="20" w:line="252" w:lineRule="auto"/>
+            </w:pPr>
+            <w:r>
+              <w:rPr>
+                <w:rFonts w:ascii="Barlow" w:hAnsi="Barlow" w:cs="Barlow"/>
+                <w:b w:val="0"/>
+                <w:i w:val="0"/>
+                <w:sz w:val="17"/>
+              </w:rPr>
+              <w:t>Spoiler-safe deck switch, G6 reveal and Case B</w:t>
+            </w:r>
+          </w:p>
+        </w:tc>
+      </w:tr>
+      <w:tr>
+        <w:tc>
+          <w:tcPr>
+            <w:tcW w:type="dxa" w:w="4608"/>
+          </w:tcPr>
+          <w:p>
+            <w:pPr>
+              <w:spacing w:before="20" w:after="20" w:line="252" w:lineRule="auto"/>
+            </w:pPr>
+            <w:r>
+              <w:rPr>
+                <w:rFonts w:ascii="Barlow" w:hAnsi="Barlow" w:cs="Barlow"/>
+                <w:b w:val="0"/>
+                <w:i w:val="0"/>
+                <w:sz w:val="17"/>
+              </w:rPr>
+              <w:t>run-of-day/M03-run-of-day.html</w:t>
+            </w:r>
+          </w:p>
+        </w:tc>
+        <w:tc>
+          <w:tcPr>
+            <w:tcW w:type="dxa" w:w="5328"/>
+          </w:tcPr>
+          <w:p>
+            <w:pPr>
+              <w:spacing w:before="20" w:after="20" w:line="252" w:lineRule="auto"/>
+            </w:pPr>
+            <w:r>
+              <w:rPr>
+                <w:rFonts w:ascii="Barlow" w:hAnsi="Barlow" w:cs="Barlow"/>
+                <w:b w:val="0"/>
+                <w:i w:val="0"/>
+                <w:sz w:val="17"/>
+              </w:rPr>
+              <w:t>Exact slides, source-check script and reveals</w:t>
             </w:r>
           </w:p>
         </w:tc>

</xml_diff>

<commit_message>
Preserve instructor HTML during pack builds
Co-authored-by: shaseaver25 <shannon@tailoredu.org>
</commit_message>
<xml_diff>
--- a/teaching-pack/00-INSTRUCTOR/FILE-INDEX.docx
+++ b/teaching-pack/00-INSTRUCTOR/FILE-INDEX.docx
@@ -250,6 +250,47 @@
                 <w:i w:val="0"/>
                 <w:sz w:val="17"/>
               </w:rPr>
+              <w:t>why-this-way.html</w:t>
+            </w:r>
+          </w:p>
+        </w:tc>
+        <w:tc>
+          <w:tcPr>
+            <w:tcW w:type="dxa" w:w="5328"/>
+            <w:shd w:val="clear" w:color="auto" w:fill="F4F6F8"/>
+          </w:tcPr>
+          <w:p>
+            <w:pPr>
+              <w:spacing w:before="20" w:after="20" w:line="252" w:lineRule="auto"/>
+            </w:pPr>
+            <w:r>
+              <w:rPr>
+                <w:rFonts w:ascii="Barlow" w:hAnsi="Barlow" w:cs="Barlow"/>
+                <w:b w:val="0"/>
+                <w:i w:val="0"/>
+                <w:sz w:val="17"/>
+              </w:rPr>
+              <w:t>Faculty briefing: rationale, benefits, outcomes, assessment and Q&amp;A</w:t>
+            </w:r>
+          </w:p>
+        </w:tc>
+      </w:tr>
+      <w:tr>
+        <w:tc>
+          <w:tcPr>
+            <w:tcW w:type="dxa" w:w="4608"/>
+          </w:tcPr>
+          <w:p>
+            <w:pPr>
+              <w:spacing w:before="20" w:after="20" w:line="252" w:lineRule="auto"/>
+            </w:pPr>
+            <w:r>
+              <w:rPr>
+                <w:rFonts w:ascii="Barlow" w:hAnsi="Barlow" w:cs="Barlow"/>
+                <w:b w:val="0"/>
+                <w:i w:val="0"/>
+                <w:sz w:val="17"/>
+              </w:rPr>
               <w:t>run-of-day/index.html</w:t>
             </w:r>
           </w:p>
@@ -257,7 +298,6 @@
         <w:tc>
           <w:tcPr>
             <w:tcW w:type="dxa" w:w="5328"/>
-            <w:shd w:val="clear" w:color="auto" w:fill="F4F6F8"/>
           </w:tcPr>
           <w:p>
             <w:pPr>
@@ -279,6 +319,7 @@
         <w:tc>
           <w:tcPr>
             <w:tcW w:type="dxa" w:w="4608"/>
+            <w:shd w:val="clear" w:color="auto" w:fill="F4F6F8"/>
           </w:tcPr>
           <w:p>
             <w:pPr>
@@ -298,6 +339,7 @@
         <w:tc>
           <w:tcPr>
             <w:tcW w:type="dxa" w:w="5328"/>
+            <w:shd w:val="clear" w:color="auto" w:fill="F4F6F8"/>
           </w:tcPr>
           <w:p>
             <w:pPr>
@@ -319,7 +361,6 @@
         <w:tc>
           <w:tcPr>
             <w:tcW w:type="dxa" w:w="4608"/>
-            <w:shd w:val="clear" w:color="auto" w:fill="F4F6F8"/>
           </w:tcPr>
           <w:p>
             <w:pPr>
@@ -339,7 +380,6 @@
         <w:tc>
           <w:tcPr>
             <w:tcW w:type="dxa" w:w="5328"/>
-            <w:shd w:val="clear" w:color="auto" w:fill="F4F6F8"/>
           </w:tcPr>
           <w:p>
             <w:pPr>
@@ -361,6 +401,7 @@
         <w:tc>
           <w:tcPr>
             <w:tcW w:type="dxa" w:w="4608"/>
+            <w:shd w:val="clear" w:color="auto" w:fill="F4F6F8"/>
           </w:tcPr>
           <w:p>
             <w:pPr>
@@ -380,6 +421,7 @@
         <w:tc>
           <w:tcPr>
             <w:tcW w:type="dxa" w:w="5328"/>
+            <w:shd w:val="clear" w:color="auto" w:fill="F4F6F8"/>
           </w:tcPr>
           <w:p>
             <w:pPr>

</xml_diff>

<commit_message>
Generate and verify M04 classroom artifacts
Co-authored-by: shaseaver25 <shannon@tailoredu.org>
</commit_message>
<xml_diff>
--- a/teaching-pack/00-INSTRUCTOR/FILE-INDEX.docx
+++ b/teaching-pack/00-INSTRUCTOR/FILE-INDEX.docx
@@ -127,7 +127,7 @@
                 <w:i w:val="0"/>
                 <w:sz w:val="17"/>
               </w:rPr>
-              <w:t>INSTRUCTOR-GUIDE-M01-M03.docx</w:t>
+              <w:t>INSTRUCTOR-GUIDE-M01-M04.docx</w:t>
             </w:r>
           </w:p>
         </w:tc>
@@ -310,7 +310,7 @@
                 <w:i w:val="0"/>
                 <w:sz w:val="17"/>
               </w:rPr>
-              <w:t>Newsletter-style podium desk linking M01–M03</w:t>
+              <w:t>Newsletter-style podium desk linking M01–M04</w:t>
             </w:r>
           </w:p>
         </w:tc>
@@ -435,6 +435,46 @@
                 <w:sz w:val="17"/>
               </w:rPr>
               <w:t>Exact slides, source-check script and reveals</w:t>
+            </w:r>
+          </w:p>
+        </w:tc>
+      </w:tr>
+      <w:tr>
+        <w:tc>
+          <w:tcPr>
+            <w:tcW w:type="dxa" w:w="4608"/>
+          </w:tcPr>
+          <w:p>
+            <w:pPr>
+              <w:spacing w:before="20" w:after="20" w:line="252" w:lineRule="auto"/>
+            </w:pPr>
+            <w:r>
+              <w:rPr>
+                <w:rFonts w:ascii="Barlow" w:hAnsi="Barlow" w:cs="Barlow"/>
+                <w:b w:val="0"/>
+                <w:i w:val="0"/>
+                <w:sz w:val="17"/>
+              </w:rPr>
+              <w:t>run-of-day/M04-run-of-day.html</w:t>
+            </w:r>
+          </w:p>
+        </w:tc>
+        <w:tc>
+          <w:tcPr>
+            <w:tcW w:type="dxa" w:w="5328"/>
+          </w:tcPr>
+          <w:p>
+            <w:pPr>
+              <w:spacing w:before="20" w:after="20" w:line="252" w:lineRule="auto"/>
+            </w:pPr>
+            <w:r>
+              <w:rPr>
+                <w:rFonts w:ascii="Barlow" w:hAnsi="Barlow" w:cs="Barlow"/>
+                <w:b w:val="0"/>
+                <w:i w:val="0"/>
+                <w:sz w:val="17"/>
+              </w:rPr>
+              <w:t>Spoiler-safe statistics hunt, deck switch and key</w:t>
             </w:r>
           </w:p>
         </w:tc>
@@ -1880,6 +1920,414 @@
           <w:caps w:val="1"/>
           <w:spacing w:val="12"/>
         </w:rPr>
+        <w:t>08-M04-one-number</w:t>
+      </w:r>
+    </w:p>
+    <w:tbl>
+      <w:tblPr>
+        <w:tblStyle w:val="TableGrid"/>
+        <w:tblW w:type="auto" w:w="0"/>
+        <w:jc w:val="left"/>
+        <w:tblLook w:firstColumn="1" w:firstRow="1" w:lastColumn="0" w:lastRow="0" w:noHBand="0" w:noVBand="1" w:val="04A0"/>
+        <w:tblLayout w:type="fixed"/>
+        <w:tblCellMar>
+          <w:top w:w="60" w:type="dxa"/>
+          <w:left w:w="110" w:type="dxa"/>
+          <w:bottom w:w="60" w:type="dxa"/>
+          <w:right w:w="110" w:type="dxa"/>
+        </w:tblCellMar>
+      </w:tblPr>
+      <w:tblGrid>
+        <w:gridCol w:w="4968"/>
+        <w:gridCol w:w="4968"/>
+      </w:tblGrid>
+      <w:tr>
+        <w:tc>
+          <w:tcPr>
+            <w:tcW w:type="dxa" w:w="4608"/>
+            <w:shd w:val="clear" w:color="auto" w:fill="1F3A5F"/>
+          </w:tcPr>
+          <w:p>
+            <w:pPr>
+              <w:spacing w:before="20" w:after="20" w:line="252" w:lineRule="auto"/>
+            </w:pPr>
+            <w:r>
+              <w:rPr>
+                <w:rFonts w:ascii="Barlow Condensed" w:hAnsi="Barlow Condensed" w:cs="Barlow Condensed"/>
+                <w:b/>
+                <w:i w:val="0"/>
+                <w:color w:val="FFFFFF"/>
+                <w:sz w:val="17"/>
+              </w:rPr>
+              <w:t>File</w:t>
+            </w:r>
+          </w:p>
+        </w:tc>
+        <w:tc>
+          <w:tcPr>
+            <w:tcW w:type="dxa" w:w="5328"/>
+            <w:shd w:val="clear" w:color="auto" w:fill="1F3A5F"/>
+          </w:tcPr>
+          <w:p>
+            <w:pPr>
+              <w:spacing w:before="20" w:after="20" w:line="252" w:lineRule="auto"/>
+            </w:pPr>
+            <w:r>
+              <w:rPr>
+                <w:rFonts w:ascii="Barlow Condensed" w:hAnsi="Barlow Condensed" w:cs="Barlow Condensed"/>
+                <w:b/>
+                <w:i w:val="0"/>
+                <w:color w:val="FFFFFF"/>
+                <w:sz w:val="17"/>
+              </w:rPr>
+              <w:t>What it is</w:t>
+            </w:r>
+          </w:p>
+        </w:tc>
+      </w:tr>
+      <w:tr>
+        <w:tc>
+          <w:tcPr>
+            <w:tcW w:type="dxa" w:w="4608"/>
+          </w:tcPr>
+          <w:p>
+            <w:pPr>
+              <w:spacing w:before="20" w:after="20" w:line="252" w:lineRule="auto"/>
+            </w:pPr>
+            <w:r>
+              <w:rPr>
+                <w:rFonts w:ascii="Barlow" w:hAnsi="Barlow" w:cs="Barlow"/>
+                <w:b w:val="0"/>
+                <w:i w:val="0"/>
+                <w:sz w:val="17"/>
+              </w:rPr>
+              <w:t>M04-student.pptx</w:t>
+            </w:r>
+          </w:p>
+        </w:tc>
+        <w:tc>
+          <w:tcPr>
+            <w:tcW w:type="dxa" w:w="5328"/>
+          </w:tcPr>
+          <w:p>
+            <w:pPr>
+              <w:spacing w:before="20" w:after="20" w:line="252" w:lineRule="auto"/>
+            </w:pPr>
+            <w:r>
+              <w:rPr>
+                <w:rFonts w:ascii="Barlow" w:hAnsi="Barlow" w:cs="Barlow"/>
+                <w:b w:val="0"/>
+                <w:i w:val="0"/>
+                <w:sz w:val="17"/>
+              </w:rPr>
+              <w:t>12 slides — project first; no spread or low-count answers</w:t>
+            </w:r>
+          </w:p>
+        </w:tc>
+      </w:tr>
+      <w:tr>
+        <w:tc>
+          <w:tcPr>
+            <w:tcW w:type="dxa" w:w="4608"/>
+            <w:shd w:val="clear" w:color="auto" w:fill="F4F6F8"/>
+          </w:tcPr>
+          <w:p>
+            <w:pPr>
+              <w:spacing w:before="20" w:after="20" w:line="252" w:lineRule="auto"/>
+            </w:pPr>
+            <w:r>
+              <w:rPr>
+                <w:rFonts w:ascii="Barlow" w:hAnsi="Barlow" w:cs="Barlow"/>
+                <w:b w:val="0"/>
+                <w:i w:val="0"/>
+                <w:sz w:val="17"/>
+              </w:rPr>
+              <w:t>M04-instructor-reveal.pptx</w:t>
+            </w:r>
+          </w:p>
+        </w:tc>
+        <w:tc>
+          <w:tcPr>
+            <w:tcW w:type="dxa" w:w="5328"/>
+            <w:shd w:val="clear" w:color="auto" w:fill="F4F6F8"/>
+          </w:tcPr>
+          <w:p>
+            <w:pPr>
+              <w:spacing w:before="20" w:after="20" w:line="252" w:lineRule="auto"/>
+            </w:pPr>
+            <w:r>
+              <w:rPr>
+                <w:rFonts w:ascii="Barlow" w:hAnsi="Barlow" w:cs="Barlow"/>
+                <w:b w:val="0"/>
+                <w:i w:val="0"/>
+                <w:sz w:val="17"/>
+              </w:rPr>
+              <w:t>8 slides — keep closed through the spreadsheet hunt</w:t>
+            </w:r>
+          </w:p>
+        </w:tc>
+      </w:tr>
+      <w:tr>
+        <w:tc>
+          <w:tcPr>
+            <w:tcW w:type="dxa" w:w="4608"/>
+          </w:tcPr>
+          <w:p>
+            <w:pPr>
+              <w:spacing w:before="20" w:after="20" w:line="252" w:lineRule="auto"/>
+            </w:pPr>
+            <w:r>
+              <w:rPr>
+                <w:rFonts w:ascii="Barlow" w:hAnsi="Barlow" w:cs="Barlow"/>
+                <w:b w:val="0"/>
+                <w:i w:val="0"/>
+                <w:sz w:val="17"/>
+              </w:rPr>
+              <w:t>H4-01-diane-one-number-ask.docx</w:t>
+            </w:r>
+          </w:p>
+        </w:tc>
+        <w:tc>
+          <w:tcPr>
+            <w:tcW w:type="dxa" w:w="5328"/>
+          </w:tcPr>
+          <w:p>
+            <w:pPr>
+              <w:spacing w:before="20" w:after="20" w:line="252" w:lineRule="auto"/>
+            </w:pPr>
+            <w:r>
+              <w:rPr>
+                <w:rFonts w:ascii="Barlow" w:hAnsi="Barlow" w:cs="Barlow"/>
+                <w:b w:val="0"/>
+                <w:i w:val="0"/>
+                <w:sz w:val="17"/>
+              </w:rPr>
+              <w:t>Diane's brief and six-hour menu</w:t>
+            </w:r>
+          </w:p>
+        </w:tc>
+      </w:tr>
+      <w:tr>
+        <w:tc>
+          <w:tcPr>
+            <w:tcW w:type="dxa" w:w="4608"/>
+            <w:shd w:val="clear" w:color="auto" w:fill="F4F6F8"/>
+          </w:tcPr>
+          <w:p>
+            <w:pPr>
+              <w:spacing w:before="20" w:after="20" w:line="252" w:lineRule="auto"/>
+            </w:pPr>
+            <w:r>
+              <w:rPr>
+                <w:rFonts w:ascii="Barlow" w:hAnsi="Barlow" w:cs="Barlow"/>
+                <w:b w:val="0"/>
+                <w:i w:val="0"/>
+                <w:sz w:val="17"/>
+              </w:rPr>
+              <w:t>H4-02-spreadsheet-hunt.docx</w:t>
+            </w:r>
+          </w:p>
+        </w:tc>
+        <w:tc>
+          <w:tcPr>
+            <w:tcW w:type="dxa" w:w="5328"/>
+            <w:shd w:val="clear" w:color="auto" w:fill="F4F6F8"/>
+          </w:tcPr>
+          <w:p>
+            <w:pPr>
+              <w:spacing w:before="20" w:after="20" w:line="252" w:lineRule="auto"/>
+            </w:pPr>
+            <w:r>
+              <w:rPr>
+                <w:rFonts w:ascii="Barlow" w:hAnsi="Barlow" w:cs="Barlow"/>
+                <w:b w:val="0"/>
+                <w:i w:val="0"/>
+                <w:sz w:val="17"/>
+              </w:rPr>
+              <w:t>Center, spread, CV, low count and sample scope</w:t>
+            </w:r>
+          </w:p>
+        </w:tc>
+      </w:tr>
+      <w:tr>
+        <w:tc>
+          <w:tcPr>
+            <w:tcW w:type="dxa" w:w="4608"/>
+          </w:tcPr>
+          <w:p>
+            <w:pPr>
+              <w:spacing w:before="20" w:after="20" w:line="252" w:lineRule="auto"/>
+            </w:pPr>
+            <w:r>
+              <w:rPr>
+                <w:rFonts w:ascii="Barlow" w:hAnsi="Barlow" w:cs="Barlow"/>
+                <w:b w:val="0"/>
+                <w:i w:val="0"/>
+                <w:sz w:val="17"/>
+              </w:rPr>
+              <w:t>H4-03-foreman-core-summary.docx</w:t>
+            </w:r>
+          </w:p>
+        </w:tc>
+        <w:tc>
+          <w:tcPr>
+            <w:tcW w:type="dxa" w:w="5328"/>
+          </w:tcPr>
+          <w:p>
+            <w:pPr>
+              <w:spacing w:before="20" w:after="20" w:line="252" w:lineRule="auto"/>
+            </w:pPr>
+            <w:r>
+              <w:rPr>
+                <w:rFonts w:ascii="Barlow" w:hAnsi="Barlow" w:cs="Barlow"/>
+                <w:b w:val="0"/>
+                <w:i w:val="0"/>
+                <w:sz w:val="17"/>
+              </w:rPr>
+              <w:t>Correct mean, unsupported adequacy conclusion</w:t>
+            </w:r>
+          </w:p>
+        </w:tc>
+      </w:tr>
+      <w:tr>
+        <w:tc>
+          <w:tcPr>
+            <w:tcW w:type="dxa" w:w="4608"/>
+            <w:shd w:val="clear" w:color="auto" w:fill="F4F6F8"/>
+          </w:tcPr>
+          <w:p>
+            <w:pPr>
+              <w:spacing w:before="20" w:after="20" w:line="252" w:lineRule="auto"/>
+            </w:pPr>
+            <w:r>
+              <w:rPr>
+                <w:rFonts w:ascii="Barlow" w:hAnsi="Barlow" w:cs="Barlow"/>
+                <w:b w:val="0"/>
+                <w:i w:val="0"/>
+                <w:sz w:val="17"/>
+              </w:rPr>
+              <w:t>H4-04-three-sentence-brief.docx</w:t>
+            </w:r>
+          </w:p>
+        </w:tc>
+        <w:tc>
+          <w:tcPr>
+            <w:tcW w:type="dxa" w:w="5328"/>
+            <w:shd w:val="clear" w:color="auto" w:fill="F4F6F8"/>
+          </w:tcPr>
+          <w:p>
+            <w:pPr>
+              <w:spacing w:before="20" w:after="20" w:line="252" w:lineRule="auto"/>
+            </w:pPr>
+            <w:r>
+              <w:rPr>
+                <w:rFonts w:ascii="Barlow" w:hAnsi="Barlow" w:cs="Barlow"/>
+                <w:b w:val="0"/>
+                <w:i w:val="0"/>
+                <w:sz w:val="17"/>
+              </w:rPr>
+              <w:t>Student hand-in and note v1</w:t>
+            </w:r>
+          </w:p>
+        </w:tc>
+      </w:tr>
+      <w:tr>
+        <w:tc>
+          <w:tcPr>
+            <w:tcW w:type="dxa" w:w="4608"/>
+          </w:tcPr>
+          <w:p>
+            <w:pPr>
+              <w:spacing w:before="20" w:after="20" w:line="252" w:lineRule="auto"/>
+            </w:pPr>
+            <w:r>
+              <w:rPr>
+                <w:rFonts w:ascii="Barlow" w:hAnsi="Barlow" w:cs="Barlow"/>
+                <w:b w:val="0"/>
+                <w:i w:val="0"/>
+                <w:sz w:val="17"/>
+              </w:rPr>
+              <w:t>cores_2027.csv</w:t>
+            </w:r>
+          </w:p>
+        </w:tc>
+        <w:tc>
+          <w:tcPr>
+            <w:tcW w:type="dxa" w:w="5328"/>
+          </w:tcPr>
+          <w:p>
+            <w:pPr>
+              <w:spacing w:before="20" w:after="20" w:line="252" w:lineRule="auto"/>
+            </w:pPr>
+            <w:r>
+              <w:rPr>
+                <w:rFonts w:ascii="Barlow" w:hAnsi="Barlow" w:cs="Barlow"/>
+                <w:b w:val="0"/>
+                <w:i w:val="0"/>
+                <w:sz w:val="17"/>
+              </w:rPr>
+              <w:t>24 shoulder core strengths; M04 and later M09 input</w:t>
+            </w:r>
+          </w:p>
+        </w:tc>
+      </w:tr>
+      <w:tr>
+        <w:tc>
+          <w:tcPr>
+            <w:tcW w:type="dxa" w:w="4608"/>
+            <w:shd w:val="clear" w:color="auto" w:fill="F4F6F8"/>
+          </w:tcPr>
+          <w:p>
+            <w:pPr>
+              <w:spacing w:before="20" w:after="20" w:line="252" w:lineRule="auto"/>
+            </w:pPr>
+            <w:r>
+              <w:rPr>
+                <w:rFonts w:ascii="Barlow" w:hAnsi="Barlow" w:cs="Barlow"/>
+                <w:b w:val="0"/>
+                <w:i w:val="0"/>
+                <w:sz w:val="17"/>
+              </w:rPr>
+              <w:t>KEY-M04-answer-key.docx</w:t>
+            </w:r>
+          </w:p>
+        </w:tc>
+        <w:tc>
+          <w:tcPr>
+            <w:tcW w:type="dxa" w:w="5328"/>
+            <w:shd w:val="clear" w:color="auto" w:fill="F4F6F8"/>
+          </w:tcPr>
+          <w:p>
+            <w:pPr>
+              <w:spacing w:before="20" w:after="20" w:line="252" w:lineRule="auto"/>
+            </w:pPr>
+            <w:r>
+              <w:rPr>
+                <w:rFonts w:ascii="Barlow" w:hAnsi="Barlow" w:cs="Barlow"/>
+                <w:b w:val="0"/>
+                <w:i w:val="0"/>
+                <w:sz w:val="17"/>
+              </w:rPr>
+              <w:t>Statistics, model brief, guardrails and timing</w:t>
+            </w:r>
+          </w:p>
+        </w:tc>
+      </w:tr>
+    </w:tbl>
+    <w:p>
+      <w:pPr>
+        <w:spacing w:before="260" w:after="80" w:line="240" w:lineRule="auto"/>
+      </w:pPr>
+      <w:r>
+        <w:rPr>
+          <w:rFonts w:ascii="Barlow Condensed" w:hAnsi="Barlow Condensed" w:cs="Barlow Condensed"/>
+          <w:b/>
+          <w:i w:val="0"/>
+          <w:color w:val="1F3A5F"/>
+          <w:sz w:val="25"/>
+          <w:caps w:val="1"/>
+          <w:spacing w:val="12"/>
+        </w:rPr>
         <w:t>05-CHARTS</w:t>
       </w:r>
     </w:p>
@@ -2342,7 +2790,7 @@
         <w:color w:val="6B7280"/>
         <w:sz w:val="16"/>
       </w:rPr>
-      <w:t>SEIS 201  ·  M01 – M03</w:t>
+      <w:t>SEIS 201  ·  M01 – M04</w:t>
     </w:r>
     <w:r>
       <w:tab/>
@@ -2415,7 +2863,7 @@
         <w:caps w:val="1"/>
         <w:spacing w:val="20"/>
       </w:rPr>
-      <w:t>M01 – M03  ·  FILE INDEX</w:t>
+      <w:t>M01 – M04  ·  FILE INDEX</w:t>
     </w:r>
   </w:p>
 </w:hdr>

</xml_diff>

<commit_message>
Generate and verify M05 deliverables
Co-authored-by: shaseaver25 <shannon@tailoredu.org>
</commit_message>
<xml_diff>
--- a/teaching-pack/00-INSTRUCTOR/FILE-INDEX.docx
+++ b/teaching-pack/00-INSTRUCTOR/FILE-INDEX.docx
@@ -27,9 +27,9 @@
           <w:b w:val="0"/>
           <w:i w:val="0"/>
           <w:color w:val="6B7280"/>
-          <w:sz w:val="19"/>
+          <w:sz w:val="18"/>
         </w:rPr>
-        <w:t>Folders are in teaching order.</w:t>
+        <w:t>Folders are in teaching order. M04 is built in PR #8 and is not duplicated by this main-based M05 change; merge that dependency to obtain the uninterrupted M01–M05 pack.</w:t>
       </w:r>
     </w:p>
     <w:p>
@@ -70,7 +70,7 @@
       <w:tr>
         <w:tc>
           <w:tcPr>
-            <w:tcW w:type="dxa" w:w="4608"/>
+            <w:tcW w:type="dxa" w:w="4536"/>
             <w:shd w:val="clear" w:color="auto" w:fill="1F3A5F"/>
           </w:tcPr>
           <w:p>
@@ -83,7 +83,7 @@
                 <w:b/>
                 <w:i w:val="0"/>
                 <w:color w:val="FFFFFF"/>
-                <w:sz w:val="17"/>
+                <w:sz w:val="16"/>
               </w:rPr>
               <w:t>File</w:t>
             </w:r>
@@ -91,7 +91,7 @@
         </w:tc>
         <w:tc>
           <w:tcPr>
-            <w:tcW w:type="dxa" w:w="5328"/>
+            <w:tcW w:type="dxa" w:w="5400"/>
             <w:shd w:val="clear" w:color="auto" w:fill="1F3A5F"/>
           </w:tcPr>
           <w:p>
@@ -104,7 +104,7 @@
                 <w:b/>
                 <w:i w:val="0"/>
                 <w:color w:val="FFFFFF"/>
-                <w:sz w:val="17"/>
+                <w:sz w:val="16"/>
               </w:rPr>
               <w:t>What it is</w:t>
             </w:r>
@@ -114,7 +114,7 @@
       <w:tr>
         <w:tc>
           <w:tcPr>
-            <w:tcW w:type="dxa" w:w="4608"/>
+            <w:tcW w:type="dxa" w:w="4536"/>
           </w:tcPr>
           <w:p>
             <w:pPr>
@@ -125,15 +125,15 @@
                 <w:rFonts w:ascii="Barlow" w:hAnsi="Barlow" w:cs="Barlow"/>
                 <w:b w:val="0"/>
                 <w:i w:val="0"/>
-                <w:sz w:val="17"/>
+                <w:sz w:val="16"/>
               </w:rPr>
-              <w:t>INSTRUCTOR-GUIDE-M01-M03.docx</w:t>
+              <w:t>run-of-day/index.html</w:t>
             </w:r>
           </w:p>
         </w:tc>
         <w:tc>
           <w:tcPr>
-            <w:tcW w:type="dxa" w:w="5328"/>
+            <w:tcW w:type="dxa" w:w="5400"/>
           </w:tcPr>
           <w:p>
             <w:pPr>
@@ -144,9 +144,9 @@
                 <w:rFonts w:ascii="Barlow" w:hAnsi="Barlow" w:cs="Barlow"/>
                 <w:b w:val="0"/>
                 <w:i w:val="0"/>
-                <w:sz w:val="17"/>
+                <w:sz w:val="16"/>
               </w:rPr>
-              <w:t>Run of show, prep, continuity, review checklist</w:t>
+              <w:t>Podium desk for the built meetings</w:t>
             </w:r>
           </w:p>
         </w:tc>
@@ -154,7 +154,7 @@
       <w:tr>
         <w:tc>
           <w:tcPr>
-            <w:tcW w:type="dxa" w:w="4608"/>
+            <w:tcW w:type="dxa" w:w="4536"/>
             <w:shd w:val="clear" w:color="auto" w:fill="F4F6F8"/>
           </w:tcPr>
           <w:p>
@@ -166,15 +166,15 @@
                 <w:rFonts w:ascii="Barlow" w:hAnsi="Barlow" w:cs="Barlow"/>
                 <w:b w:val="0"/>
                 <w:i w:val="0"/>
-                <w:sz w:val="17"/>
+                <w:sz w:val="16"/>
               </w:rPr>
-              <w:t>FILE-INDEX.docx</w:t>
+              <w:t>run-of-day/M05-run-of-day.html</w:t>
             </w:r>
           </w:p>
         </w:tc>
         <w:tc>
           <w:tcPr>
-            <w:tcW w:type="dxa" w:w="5328"/>
+            <w:tcW w:type="dxa" w:w="5400"/>
             <w:shd w:val="clear" w:color="auto" w:fill="F4F6F8"/>
           </w:tcPr>
           <w:p>
@@ -186,9 +186,9 @@
                 <w:rFonts w:ascii="Barlow" w:hAnsi="Barlow" w:cs="Barlow"/>
                 <w:b w:val="0"/>
                 <w:i w:val="0"/>
-                <w:sz w:val="17"/>
+                <w:sz w:val="16"/>
               </w:rPr>
-              <w:t>This page</w:t>
+              <w:t>M05 exact slides, script, hunt, and gated answer</w:t>
             </w:r>
           </w:p>
         </w:tc>
@@ -196,7 +196,7 @@
       <w:tr>
         <w:tc>
           <w:tcPr>
-            <w:tcW w:type="dxa" w:w="4608"/>
+            <w:tcW w:type="dxa" w:w="4536"/>
           </w:tcPr>
           <w:p>
             <w:pPr>
@@ -207,15 +207,15 @@
                 <w:rFonts w:ascii="Barlow" w:hAnsi="Barlow" w:cs="Barlow"/>
                 <w:b w:val="0"/>
                 <w:i w:val="0"/>
-                <w:sz w:val="17"/>
+                <w:sz w:val="16"/>
               </w:rPr>
-              <w:t>BRIDGE-VISUALS.txt</w:t>
+              <w:t>FILE-INDEX.docx</w:t>
             </w:r>
           </w:p>
         </w:tc>
         <w:tc>
           <w:tcPr>
-            <w:tcW w:type="dxa" w:w="5328"/>
+            <w:tcW w:type="dxa" w:w="5400"/>
           </w:tcPr>
           <w:p>
             <w:pPr>
@@ -226,215 +226,9 @@
                 <w:rFonts w:ascii="Barlow" w:hAnsi="Barlow" w:cs="Barlow"/>
                 <w:b w:val="0"/>
                 <w:i w:val="0"/>
-                <w:sz w:val="17"/>
+                <w:sz w:val="16"/>
               </w:rPr>
-              <w:t>Four primary bridge assets, optional locator, usage notes</w:t>
-            </w:r>
-          </w:p>
-        </w:tc>
-      </w:tr>
-      <w:tr>
-        <w:tc>
-          <w:tcPr>
-            <w:tcW w:type="dxa" w:w="4608"/>
-            <w:shd w:val="clear" w:color="auto" w:fill="F4F6F8"/>
-          </w:tcPr>
-          <w:p>
-            <w:pPr>
-              <w:spacing w:before="20" w:after="20" w:line="252" w:lineRule="auto"/>
-            </w:pPr>
-            <w:r>
-              <w:rPr>
-                <w:rFonts w:ascii="Barlow" w:hAnsi="Barlow" w:cs="Barlow"/>
-                <w:b w:val="0"/>
-                <w:i w:val="0"/>
-                <w:sz w:val="17"/>
-              </w:rPr>
-              <w:t>why-this-way.html</w:t>
-            </w:r>
-          </w:p>
-        </w:tc>
-        <w:tc>
-          <w:tcPr>
-            <w:tcW w:type="dxa" w:w="5328"/>
-            <w:shd w:val="clear" w:color="auto" w:fill="F4F6F8"/>
-          </w:tcPr>
-          <w:p>
-            <w:pPr>
-              <w:spacing w:before="20" w:after="20" w:line="252" w:lineRule="auto"/>
-            </w:pPr>
-            <w:r>
-              <w:rPr>
-                <w:rFonts w:ascii="Barlow" w:hAnsi="Barlow" w:cs="Barlow"/>
-                <w:b w:val="0"/>
-                <w:i w:val="0"/>
-                <w:sz w:val="17"/>
-              </w:rPr>
-              <w:t>Faculty briefing: rationale, benefits, outcomes, assessment and Q&amp;A</w:t>
-            </w:r>
-          </w:p>
-        </w:tc>
-      </w:tr>
-      <w:tr>
-        <w:tc>
-          <w:tcPr>
-            <w:tcW w:type="dxa" w:w="4608"/>
-          </w:tcPr>
-          <w:p>
-            <w:pPr>
-              <w:spacing w:before="20" w:after="20" w:line="252" w:lineRule="auto"/>
-            </w:pPr>
-            <w:r>
-              <w:rPr>
-                <w:rFonts w:ascii="Barlow" w:hAnsi="Barlow" w:cs="Barlow"/>
-                <w:b w:val="0"/>
-                <w:i w:val="0"/>
-                <w:sz w:val="17"/>
-              </w:rPr>
-              <w:t>run-of-day/index.html</w:t>
-            </w:r>
-          </w:p>
-        </w:tc>
-        <w:tc>
-          <w:tcPr>
-            <w:tcW w:type="dxa" w:w="5328"/>
-          </w:tcPr>
-          <w:p>
-            <w:pPr>
-              <w:spacing w:before="20" w:after="20" w:line="252" w:lineRule="auto"/>
-            </w:pPr>
-            <w:r>
-              <w:rPr>
-                <w:rFonts w:ascii="Barlow" w:hAnsi="Barlow" w:cs="Barlow"/>
-                <w:b w:val="0"/>
-                <w:i w:val="0"/>
-                <w:sz w:val="17"/>
-              </w:rPr>
-              <w:t>Newsletter-style podium desk linking M01–M03</w:t>
-            </w:r>
-          </w:p>
-        </w:tc>
-      </w:tr>
-      <w:tr>
-        <w:tc>
-          <w:tcPr>
-            <w:tcW w:type="dxa" w:w="4608"/>
-            <w:shd w:val="clear" w:color="auto" w:fill="F4F6F8"/>
-          </w:tcPr>
-          <w:p>
-            <w:pPr>
-              <w:spacing w:before="20" w:after="20" w:line="252" w:lineRule="auto"/>
-            </w:pPr>
-            <w:r>
-              <w:rPr>
-                <w:rFonts w:ascii="Barlow" w:hAnsi="Barlow" w:cs="Barlow"/>
-                <w:b w:val="0"/>
-                <w:i w:val="0"/>
-                <w:sz w:val="17"/>
-              </w:rPr>
-              <w:t>run-of-day/M01-run-of-day.html</w:t>
-            </w:r>
-          </w:p>
-        </w:tc>
-        <w:tc>
-          <w:tcPr>
-            <w:tcW w:type="dxa" w:w="5328"/>
-            <w:shd w:val="clear" w:color="auto" w:fill="F4F6F8"/>
-          </w:tcPr>
-          <w:p>
-            <w:pPr>
-              <w:spacing w:before="20" w:after="20" w:line="252" w:lineRule="auto"/>
-            </w:pPr>
-            <w:r>
-              <w:rPr>
-                <w:rFonts w:ascii="Barlow" w:hAnsi="Barlow" w:cs="Barlow"/>
-                <w:b w:val="0"/>
-                <w:i w:val="0"/>
-                <w:sz w:val="17"/>
-              </w:rPr>
-              <w:t>Exact slides, script and handouts for M01</w:t>
-            </w:r>
-          </w:p>
-        </w:tc>
-      </w:tr>
-      <w:tr>
-        <w:tc>
-          <w:tcPr>
-            <w:tcW w:type="dxa" w:w="4608"/>
-          </w:tcPr>
-          <w:p>
-            <w:pPr>
-              <w:spacing w:before="20" w:after="20" w:line="252" w:lineRule="auto"/>
-            </w:pPr>
-            <w:r>
-              <w:rPr>
-                <w:rFonts w:ascii="Barlow" w:hAnsi="Barlow" w:cs="Barlow"/>
-                <w:b w:val="0"/>
-                <w:i w:val="0"/>
-                <w:sz w:val="17"/>
-              </w:rPr>
-              <w:t>run-of-day/M02-run-of-day.html</w:t>
-            </w:r>
-          </w:p>
-        </w:tc>
-        <w:tc>
-          <w:tcPr>
-            <w:tcW w:type="dxa" w:w="5328"/>
-          </w:tcPr>
-          <w:p>
-            <w:pPr>
-              <w:spacing w:before="20" w:after="20" w:line="252" w:lineRule="auto"/>
-            </w:pPr>
-            <w:r>
-              <w:rPr>
-                <w:rFonts w:ascii="Barlow" w:hAnsi="Barlow" w:cs="Barlow"/>
-                <w:b w:val="0"/>
-                <w:i w:val="0"/>
-                <w:sz w:val="17"/>
-              </w:rPr>
-              <w:t>Spoiler-safe deck switch, G6 reveal and Case B</w:t>
-            </w:r>
-          </w:p>
-        </w:tc>
-      </w:tr>
-      <w:tr>
-        <w:tc>
-          <w:tcPr>
-            <w:tcW w:type="dxa" w:w="4608"/>
-            <w:shd w:val="clear" w:color="auto" w:fill="F4F6F8"/>
-          </w:tcPr>
-          <w:p>
-            <w:pPr>
-              <w:spacing w:before="20" w:after="20" w:line="252" w:lineRule="auto"/>
-            </w:pPr>
-            <w:r>
-              <w:rPr>
-                <w:rFonts w:ascii="Barlow" w:hAnsi="Barlow" w:cs="Barlow"/>
-                <w:b w:val="0"/>
-                <w:i w:val="0"/>
-                <w:sz w:val="17"/>
-              </w:rPr>
-              <w:t>run-of-day/M03-run-of-day.html</w:t>
-            </w:r>
-          </w:p>
-        </w:tc>
-        <w:tc>
-          <w:tcPr>
-            <w:tcW w:type="dxa" w:w="5328"/>
-            <w:shd w:val="clear" w:color="auto" w:fill="F4F6F8"/>
-          </w:tcPr>
-          <w:p>
-            <w:pPr>
-              <w:spacing w:before="20" w:after="20" w:line="252" w:lineRule="auto"/>
-            </w:pPr>
-            <w:r>
-              <w:rPr>
-                <w:rFonts w:ascii="Barlow" w:hAnsi="Barlow" w:cs="Barlow"/>
-                <w:b w:val="0"/>
-                <w:i w:val="0"/>
-                <w:sz w:val="17"/>
-              </w:rPr>
-              <w:t>Exact slides, source-check script and reveals</w:t>
+              <w:t>This generated file index</w:t>
             </w:r>
           </w:p>
         </w:tc>
@@ -454,7 +248,7 @@
           <w:caps w:val="1"/>
           <w:spacing w:val="12"/>
         </w:rPr>
-        <w:t>01-BRAND-KIT</w:t>
+        <w:t>02–04</w:t>
       </w:r>
     </w:p>
     <w:tbl>
@@ -478,7 +272,7 @@
       <w:tr>
         <w:tc>
           <w:tcPr>
-            <w:tcW w:type="dxa" w:w="4608"/>
+            <w:tcW w:type="dxa" w:w="4536"/>
             <w:shd w:val="clear" w:color="auto" w:fill="1F3A5F"/>
           </w:tcPr>
           <w:p>
@@ -491,7 +285,7 @@
                 <w:b/>
                 <w:i w:val="0"/>
                 <w:color w:val="FFFFFF"/>
-                <w:sz w:val="17"/>
+                <w:sz w:val="16"/>
               </w:rPr>
               <w:t>File</w:t>
             </w:r>
@@ -499,7 +293,7 @@
         </w:tc>
         <w:tc>
           <w:tcPr>
-            <w:tcW w:type="dxa" w:w="5328"/>
+            <w:tcW w:type="dxa" w:w="5400"/>
             <w:shd w:val="clear" w:color="auto" w:fill="1F3A5F"/>
           </w:tcPr>
           <w:p>
@@ -512,7 +306,7 @@
                 <w:b/>
                 <w:i w:val="0"/>
                 <w:color w:val="FFFFFF"/>
-                <w:sz w:val="17"/>
+                <w:sz w:val="16"/>
               </w:rPr>
               <w:t>What it is</w:t>
             </w:r>
@@ -522,7 +316,7 @@
       <w:tr>
         <w:tc>
           <w:tcPr>
-            <w:tcW w:type="dxa" w:w="4608"/>
+            <w:tcW w:type="dxa" w:w="4536"/>
           </w:tcPr>
           <w:p>
             <w:pPr>
@@ -533,15 +327,15 @@
                 <w:rFonts w:ascii="Barlow" w:hAnsi="Barlow" w:cs="Barlow"/>
                 <w:b w:val="0"/>
                 <w:i w:val="0"/>
-                <w:sz w:val="17"/>
+                <w:sz w:val="16"/>
               </w:rPr>
-              <w:t>ACMEJOB-brand-kit.zip</w:t>
+              <w:t>M01–M03 materials</w:t>
             </w:r>
           </w:p>
         </w:tc>
         <w:tc>
           <w:tcPr>
-            <w:tcW w:type="dxa" w:w="5328"/>
+            <w:tcW w:type="dxa" w:w="5400"/>
           </w:tcPr>
           <w:p>
             <w:pPr>
@@ -552,51 +346,9 @@
                 <w:rFonts w:ascii="Barlow" w:hAnsi="Barlow" w:cs="Barlow"/>
                 <w:b w:val="0"/>
                 <w:i w:val="0"/>
-                <w:sz w:val="17"/>
+                <w:sz w:val="16"/>
               </w:rPr>
-              <w:t>Hand this to students. Fonts, logos, templates, brand guide</w:t>
-            </w:r>
-          </w:p>
-        </w:tc>
-      </w:tr>
-      <w:tr>
-        <w:tc>
-          <w:tcPr>
-            <w:tcW w:type="dxa" w:w="4608"/>
-            <w:shd w:val="clear" w:color="auto" w:fill="F4F6F8"/>
-          </w:tcPr>
-          <w:p>
-            <w:pPr>
-              <w:spacing w:before="20" w:after="20" w:line="252" w:lineRule="auto"/>
-            </w:pPr>
-            <w:r>
-              <w:rPr>
-                <w:rFonts w:ascii="Barlow" w:hAnsi="Barlow" w:cs="Barlow"/>
-                <w:b w:val="0"/>
-                <w:i w:val="0"/>
-                <w:sz w:val="17"/>
-              </w:rPr>
-              <w:t>(unzipped copy)</w:t>
-            </w:r>
-          </w:p>
-        </w:tc>
-        <w:tc>
-          <w:tcPr>
-            <w:tcW w:type="dxa" w:w="5328"/>
-            <w:shd w:val="clear" w:color="auto" w:fill="F4F6F8"/>
-          </w:tcPr>
-          <w:p>
-            <w:pPr>
-              <w:spacing w:before="20" w:after="20" w:line="252" w:lineRule="auto"/>
-            </w:pPr>
-            <w:r>
-              <w:rPr>
-                <w:rFonts w:ascii="Barlow" w:hAnsi="Barlow" w:cs="Barlow"/>
-                <w:b w:val="0"/>
-                <w:i w:val="0"/>
-                <w:sz w:val="17"/>
-              </w:rPr>
-              <w:t>Same contents, for you to look through</w:t>
+              <w:t>Existing complete teaching packs on main</w:t>
             </w:r>
           </w:p>
         </w:tc>
@@ -616,7 +368,7 @@
           <w:caps w:val="1"/>
           <w:spacing w:val="12"/>
         </w:rPr>
-        <w:t>02-M01-first-day</w:t>
+        <w:t>08-M04-one-number (PR #8 dependency)</w:t>
       </w:r>
     </w:p>
     <w:tbl>
@@ -640,7 +392,7 @@
       <w:tr>
         <w:tc>
           <w:tcPr>
-            <w:tcW w:type="dxa" w:w="4608"/>
+            <w:tcW w:type="dxa" w:w="4536"/>
             <w:shd w:val="clear" w:color="auto" w:fill="1F3A5F"/>
           </w:tcPr>
           <w:p>
@@ -653,7 +405,7 @@
                 <w:b/>
                 <w:i w:val="0"/>
                 <w:color w:val="FFFFFF"/>
-                <w:sz w:val="17"/>
+                <w:sz w:val="16"/>
               </w:rPr>
               <w:t>File</w:t>
             </w:r>
@@ -661,7 +413,7 @@
         </w:tc>
         <w:tc>
           <w:tcPr>
-            <w:tcW w:type="dxa" w:w="5328"/>
+            <w:tcW w:type="dxa" w:w="5400"/>
             <w:shd w:val="clear" w:color="auto" w:fill="1F3A5F"/>
           </w:tcPr>
           <w:p>
@@ -674,7 +426,7 @@
                 <w:b/>
                 <w:i w:val="0"/>
                 <w:color w:val="FFFFFF"/>
-                <w:sz w:val="17"/>
+                <w:sz w:val="16"/>
               </w:rPr>
               <w:t>What it is</w:t>
             </w:r>
@@ -684,7 +436,7 @@
       <w:tr>
         <w:tc>
           <w:tcPr>
-            <w:tcW w:type="dxa" w:w="4608"/>
+            <w:tcW w:type="dxa" w:w="4536"/>
           </w:tcPr>
           <w:p>
             <w:pPr>
@@ -695,15 +447,15 @@
                 <w:rFonts w:ascii="Barlow" w:hAnsi="Barlow" w:cs="Barlow"/>
                 <w:b w:val="0"/>
                 <w:i w:val="0"/>
-                <w:sz w:val="17"/>
+                <w:sz w:val="16"/>
               </w:rPr>
-              <w:t>M01-slides-first-day.pptx</w:t>
+              <w:t>M04 student/reveal decks, handouts, cores_2027.csv, key</w:t>
             </w:r>
           </w:p>
         </w:tc>
         <w:tc>
           <w:tcPr>
-            <w:tcW w:type="dxa" w:w="5328"/>
+            <w:tcW w:type="dxa" w:w="5400"/>
           </w:tcPr>
           <w:p>
             <w:pPr>
@@ -714,297 +466,9 @@
                 <w:rFonts w:ascii="Barlow" w:hAnsi="Barlow" w:cs="Barlow"/>
                 <w:b w:val="0"/>
                 <w:i w:val="0"/>
-                <w:sz w:val="17"/>
+                <w:sz w:val="16"/>
               </w:rPr>
-              <w:t>24 slides</w:t>
-            </w:r>
-          </w:p>
-        </w:tc>
-      </w:tr>
-      <w:tr>
-        <w:tc>
-          <w:tcPr>
-            <w:tcW w:type="dxa" w:w="4608"/>
-            <w:shd w:val="clear" w:color="auto" w:fill="F4F6F8"/>
-          </w:tcPr>
-          <w:p>
-            <w:pPr>
-              <w:spacing w:before="20" w:after="20" w:line="252" w:lineRule="auto"/>
-            </w:pPr>
-            <w:r>
-              <w:rPr>
-                <w:rFonts w:ascii="Barlow" w:hAnsi="Barlow" w:cs="Barlow"/>
-                <w:b w:val="0"/>
-                <w:i w:val="0"/>
-                <w:sz w:val="17"/>
-              </w:rPr>
-              <w:t>H1-01-orientation-memo-halvorsen.docx</w:t>
-            </w:r>
-          </w:p>
-        </w:tc>
-        <w:tc>
-          <w:tcPr>
-            <w:tcW w:type="dxa" w:w="5328"/>
-            <w:shd w:val="clear" w:color="auto" w:fill="F4F6F8"/>
-          </w:tcPr>
-          <w:p>
-            <w:pPr>
-              <w:spacing w:before="20" w:after="20" w:line="252" w:lineRule="auto"/>
-            </w:pPr>
-            <w:r>
-              <w:rPr>
-                <w:rFonts w:ascii="Barlow" w:hAnsi="Barlow" w:cs="Barlow"/>
-                <w:b w:val="0"/>
-                <w:i w:val="0"/>
-                <w:sz w:val="17"/>
-              </w:rPr>
-              <w:t>Diane's memo — project or read aloud</w:t>
-            </w:r>
-          </w:p>
-        </w:tc>
-      </w:tr>
-      <w:tr>
-        <w:tc>
-          <w:tcPr>
-            <w:tcW w:type="dxa" w:w="4608"/>
-          </w:tcPr>
-          <w:p>
-            <w:pPr>
-              <w:spacing w:before="20" w:after="20" w:line="252" w:lineRule="auto"/>
-            </w:pPr>
-            <w:r>
-              <w:rPr>
-                <w:rFonts w:ascii="Barlow" w:hAnsi="Barlow" w:cs="Barlow"/>
-                <w:b w:val="0"/>
-                <w:i w:val="0"/>
-                <w:sz w:val="17"/>
-              </w:rPr>
-              <w:t>H1-02-load-rating-sheet.docx</w:t>
-            </w:r>
-          </w:p>
-        </w:tc>
-        <w:tc>
-          <w:tcPr>
-            <w:tcW w:type="dxa" w:w="5328"/>
-          </w:tcPr>
-          <w:p>
-            <w:pPr>
-              <w:spacing w:before="20" w:after="20" w:line="252" w:lineRule="auto"/>
-            </w:pPr>
-            <w:r>
-              <w:rPr>
-                <w:rFonts w:ascii="Barlow" w:hAnsi="Barlow" w:cs="Barlow"/>
-                <w:b w:val="0"/>
-                <w:i w:val="0"/>
-                <w:sz w:val="17"/>
-              </w:rPr>
-              <w:t>The rule. Worked G-3, blank G-4</w:t>
-            </w:r>
-          </w:p>
-        </w:tc>
-      </w:tr>
-      <w:tr>
-        <w:tc>
-          <w:tcPr>
-            <w:tcW w:type="dxa" w:w="4608"/>
-            <w:shd w:val="clear" w:color="auto" w:fill="F4F6F8"/>
-          </w:tcPr>
-          <w:p>
-            <w:pPr>
-              <w:spacing w:before="20" w:after="20" w:line="252" w:lineRule="auto"/>
-            </w:pPr>
-            <w:r>
-              <w:rPr>
-                <w:rFonts w:ascii="Barlow" w:hAnsi="Barlow" w:cs="Barlow"/>
-                <w:b w:val="0"/>
-                <w:i w:val="0"/>
-                <w:sz w:val="17"/>
-              </w:rPr>
-              <w:t>H1-03-foreman-deck-assessment.docx</w:t>
-            </w:r>
-          </w:p>
-        </w:tc>
-        <w:tc>
-          <w:tcPr>
-            <w:tcW w:type="dxa" w:w="5328"/>
-            <w:shd w:val="clear" w:color="auto" w:fill="F4F6F8"/>
-          </w:tcPr>
-          <w:p>
-            <w:pPr>
-              <w:spacing w:before="20" w:after="20" w:line="252" w:lineRule="auto"/>
-            </w:pPr>
-            <w:r>
-              <w:rPr>
-                <w:rFonts w:ascii="Barlow" w:hAnsi="Barlow" w:cs="Barlow"/>
-                <w:b w:val="0"/>
-                <w:i w:val="0"/>
-                <w:sz w:val="17"/>
-              </w:rPr>
-              <w:t>FOREMAN's six panel ratings</w:t>
-            </w:r>
-          </w:p>
-        </w:tc>
-      </w:tr>
-      <w:tr>
-        <w:tc>
-          <w:tcPr>
-            <w:tcW w:type="dxa" w:w="4608"/>
-          </w:tcPr>
-          <w:p>
-            <w:pPr>
-              <w:spacing w:before="20" w:after="20" w:line="252" w:lineRule="auto"/>
-            </w:pPr>
-            <w:r>
-              <w:rPr>
-                <w:rFonts w:ascii="Barlow" w:hAnsi="Barlow" w:cs="Barlow"/>
-                <w:b w:val="0"/>
-                <w:i w:val="0"/>
-                <w:sz w:val="17"/>
-              </w:rPr>
-              <w:t>H1-04-deck-panel-history-2019.docx</w:t>
-            </w:r>
-          </w:p>
-        </w:tc>
-        <w:tc>
-          <w:tcPr>
-            <w:tcW w:type="dxa" w:w="5328"/>
-          </w:tcPr>
-          <w:p>
-            <w:pPr>
-              <w:spacing w:before="20" w:after="20" w:line="252" w:lineRule="auto"/>
-            </w:pPr>
-            <w:r>
-              <w:rPr>
-                <w:rFonts w:ascii="Barlow" w:hAnsi="Barlow" w:cs="Barlow"/>
-                <w:b w:val="0"/>
-                <w:i w:val="0"/>
-                <w:sz w:val="17"/>
-              </w:rPr>
-              <w:t>Diane's 2019 field ratings, same panels</w:t>
-            </w:r>
-          </w:p>
-        </w:tc>
-      </w:tr>
-      <w:tr>
-        <w:tc>
-          <w:tcPr>
-            <w:tcW w:type="dxa" w:w="4608"/>
-            <w:shd w:val="clear" w:color="auto" w:fill="F4F6F8"/>
-          </w:tcPr>
-          <w:p>
-            <w:pPr>
-              <w:spacing w:before="20" w:after="20" w:line="252" w:lineRule="auto"/>
-            </w:pPr>
-            <w:r>
-              <w:rPr>
-                <w:rFonts w:ascii="Barlow" w:hAnsi="Barlow" w:cs="Barlow"/>
-                <w:b w:val="0"/>
-                <w:i w:val="0"/>
-                <w:sz w:val="17"/>
-              </w:rPr>
-              <w:t>H1-05-task-sort-activity.docx</w:t>
-            </w:r>
-          </w:p>
-        </w:tc>
-        <w:tc>
-          <w:tcPr>
-            <w:tcW w:type="dxa" w:w="5328"/>
-            <w:shd w:val="clear" w:color="auto" w:fill="F4F6F8"/>
-          </w:tcPr>
-          <w:p>
-            <w:pPr>
-              <w:spacing w:before="20" w:after="20" w:line="252" w:lineRule="auto"/>
-            </w:pPr>
-            <w:r>
-              <w:rPr>
-                <w:rFonts w:ascii="Barlow" w:hAnsi="Barlow" w:cs="Barlow"/>
-                <w:b w:val="0"/>
-                <w:i w:val="0"/>
-                <w:sz w:val="17"/>
-              </w:rPr>
-              <w:t>Nine tasks to sort</w:t>
-            </w:r>
-          </w:p>
-        </w:tc>
-      </w:tr>
-      <w:tr>
-        <w:tc>
-          <w:tcPr>
-            <w:tcW w:type="dxa" w:w="4608"/>
-          </w:tcPr>
-          <w:p>
-            <w:pPr>
-              <w:spacing w:before="20" w:after="20" w:line="252" w:lineRule="auto"/>
-            </w:pPr>
-            <w:r>
-              <w:rPr>
-                <w:rFonts w:ascii="Barlow" w:hAnsi="Barlow" w:cs="Barlow"/>
-                <w:b w:val="0"/>
-                <w:i w:val="0"/>
-                <w:sz w:val="17"/>
-              </w:rPr>
-              <w:t>H1-06-note-v1-template-rubric.docx</w:t>
-            </w:r>
-          </w:p>
-        </w:tc>
-        <w:tc>
-          <w:tcPr>
-            <w:tcW w:type="dxa" w:w="5328"/>
-          </w:tcPr>
-          <w:p>
-            <w:pPr>
-              <w:spacing w:before="20" w:after="20" w:line="252" w:lineRule="auto"/>
-            </w:pPr>
-            <w:r>
-              <w:rPr>
-                <w:rFonts w:ascii="Barlow" w:hAnsi="Barlow" w:cs="Barlow"/>
-                <w:b w:val="0"/>
-                <w:i w:val="0"/>
-                <w:sz w:val="17"/>
-              </w:rPr>
-              <w:t>The note, and how it is graded</w:t>
-            </w:r>
-          </w:p>
-        </w:tc>
-      </w:tr>
-      <w:tr>
-        <w:tc>
-          <w:tcPr>
-            <w:tcW w:type="dxa" w:w="4608"/>
-            <w:shd w:val="clear" w:color="auto" w:fill="F4F6F8"/>
-          </w:tcPr>
-          <w:p>
-            <w:pPr>
-              <w:spacing w:before="20" w:after="20" w:line="252" w:lineRule="auto"/>
-            </w:pPr>
-            <w:r>
-              <w:rPr>
-                <w:rFonts w:ascii="Barlow" w:hAnsi="Barlow" w:cs="Barlow"/>
-                <w:b w:val="0"/>
-                <w:i w:val="0"/>
-                <w:sz w:val="17"/>
-              </w:rPr>
-              <w:t>KEY-M01-answer-key.docx</w:t>
-            </w:r>
-          </w:p>
-        </w:tc>
-        <w:tc>
-          <w:tcPr>
-            <w:tcW w:type="dxa" w:w="5328"/>
-            <w:shd w:val="clear" w:color="auto" w:fill="F4F6F8"/>
-          </w:tcPr>
-          <w:p>
-            <w:pPr>
-              <w:spacing w:before="20" w:after="20" w:line="252" w:lineRule="auto"/>
-            </w:pPr>
-            <w:r>
-              <w:rPr>
-                <w:rFonts w:ascii="Barlow" w:hAnsi="Barlow" w:cs="Barlow"/>
-                <w:b w:val="0"/>
-                <w:i w:val="0"/>
-                <w:sz w:val="17"/>
-              </w:rPr>
-              <w:t>Answers and teaching notes</w:t>
+              <w:t>Merge PR #8; M05 intentionally does not copy unmerged files</w:t>
             </w:r>
           </w:p>
         </w:tc>
@@ -1024,7 +488,7 @@
           <w:caps w:val="1"/>
           <w:spacing w:val="12"/>
         </w:rPr>
-        <w:t>03-M02-measurement</w:t>
+        <w:t>09-M05-overnight-alarm</w:t>
       </w:r>
     </w:p>
     <w:tbl>
@@ -1048,7 +512,7 @@
       <w:tr>
         <w:tc>
           <w:tcPr>
-            <w:tcW w:type="dxa" w:w="4608"/>
+            <w:tcW w:type="dxa" w:w="4536"/>
             <w:shd w:val="clear" w:color="auto" w:fill="1F3A5F"/>
           </w:tcPr>
           <w:p>
@@ -1061,7 +525,7 @@
                 <w:b/>
                 <w:i w:val="0"/>
                 <w:color w:val="FFFFFF"/>
-                <w:sz w:val="17"/>
+                <w:sz w:val="16"/>
               </w:rPr>
               <w:t>File</w:t>
             </w:r>
@@ -1069,7 +533,7 @@
         </w:tc>
         <w:tc>
           <w:tcPr>
-            <w:tcW w:type="dxa" w:w="5328"/>
+            <w:tcW w:type="dxa" w:w="5400"/>
             <w:shd w:val="clear" w:color="auto" w:fill="1F3A5F"/>
           </w:tcPr>
           <w:p>
@@ -1082,7 +546,7 @@
                 <w:b/>
                 <w:i w:val="0"/>
                 <w:color w:val="FFFFFF"/>
-                <w:sz w:val="17"/>
+                <w:sz w:val="16"/>
               </w:rPr>
               <w:t>What it is</w:t>
             </w:r>
@@ -1092,7 +556,7 @@
       <w:tr>
         <w:tc>
           <w:tcPr>
-            <w:tcW w:type="dxa" w:w="4608"/>
+            <w:tcW w:type="dxa" w:w="4536"/>
           </w:tcPr>
           <w:p>
             <w:pPr>
@@ -1103,15 +567,15 @@
                 <w:rFonts w:ascii="Barlow" w:hAnsi="Barlow" w:cs="Barlow"/>
                 <w:b w:val="0"/>
                 <w:i w:val="0"/>
-                <w:sz w:val="17"/>
+                <w:sz w:val="16"/>
               </w:rPr>
-              <w:t>M02-student.pptx</w:t>
+              <w:t>M05-student.pptx</w:t>
             </w:r>
           </w:p>
         </w:tc>
         <w:tc>
           <w:tcPr>
-            <w:tcW w:type="dxa" w:w="5328"/>
+            <w:tcW w:type="dxa" w:w="5400"/>
           </w:tcPr>
           <w:p>
             <w:pPr>
@@ -1122,9 +586,9 @@
                 <w:rFonts w:ascii="Barlow" w:hAnsi="Barlow" w:cs="Barlow"/>
                 <w:b w:val="0"/>
                 <w:i w:val="0"/>
-                <w:sz w:val="17"/>
+                <w:sz w:val="16"/>
               </w:rPr>
-              <w:t>11 slides — project first; contains no gauge answer tables</w:t>
+              <w:t>13 slides; no gated M05 conclusion or M06 cause</w:t>
             </w:r>
           </w:p>
         </w:tc>
@@ -1132,7 +596,7 @@
       <w:tr>
         <w:tc>
           <w:tcPr>
-            <w:tcW w:type="dxa" w:w="4608"/>
+            <w:tcW w:type="dxa" w:w="4536"/>
             <w:shd w:val="clear" w:color="auto" w:fill="F4F6F8"/>
           </w:tcPr>
           <w:p>
@@ -1144,15 +608,15 @@
                 <w:rFonts w:ascii="Barlow" w:hAnsi="Barlow" w:cs="Barlow"/>
                 <w:b w:val="0"/>
                 <w:i w:val="0"/>
-                <w:sz w:val="17"/>
+                <w:sz w:val="16"/>
               </w:rPr>
-              <w:t>M02-instructor-reveal.pptx</w:t>
+              <w:t>M05-instructor-reveal.pptx</w:t>
             </w:r>
           </w:p>
         </w:tc>
         <w:tc>
           <w:tcPr>
-            <w:tcW w:type="dxa" w:w="5328"/>
+            <w:tcW w:type="dxa" w:w="5400"/>
             <w:shd w:val="clear" w:color="auto" w:fill="F4F6F8"/>
           </w:tcPr>
           <w:p>
@@ -1164,9 +628,9 @@
                 <w:rFonts w:ascii="Barlow" w:hAnsi="Barlow" w:cs="Barlow"/>
                 <w:b w:val="0"/>
                 <w:i w:val="0"/>
-                <w:sz w:val="17"/>
+                <w:sz w:val="16"/>
               </w:rPr>
-              <w:t>9 slides — keep closed until after students struggle</w:t>
+              <w:t>7 slides; open after the hunt</w:t>
             </w:r>
           </w:p>
         </w:tc>
@@ -1174,7 +638,7 @@
       <w:tr>
         <w:tc>
           <w:tcPr>
-            <w:tcW w:type="dxa" w:w="4608"/>
+            <w:tcW w:type="dxa" w:w="4536"/>
           </w:tcPr>
           <w:p>
             <w:pPr>
@@ -1185,15 +649,15 @@
                 <w:rFonts w:ascii="Barlow" w:hAnsi="Barlow" w:cs="Barlow"/>
                 <w:b w:val="0"/>
                 <w:i w:val="0"/>
-                <w:sz w:val="17"/>
+                <w:sz w:val="16"/>
               </w:rPr>
-              <w:t>H2-01-measurement-lab.docx</w:t>
+              <w:t>H5-01-diane-overnight-dispatch.docx</w:t>
             </w:r>
           </w:p>
         </w:tc>
         <w:tc>
           <w:tcPr>
-            <w:tcW w:type="dxa" w:w="5328"/>
+            <w:tcW w:type="dxa" w:w="5400"/>
           </w:tcPr>
           <w:p>
             <w:pPr>
@@ -1204,9 +668,9 @@
                 <w:rFonts w:ascii="Barlow" w:hAnsi="Barlow" w:cs="Barlow"/>
                 <w:b w:val="0"/>
                 <w:i w:val="0"/>
-                <w:sz w:val="17"/>
+                <w:sz w:val="16"/>
               </w:rPr>
-              <w:t>The lab, with ruler and no-instrument fallbacks</w:t>
+              <w:t>Diane's sharper mode and eight-hour menu</w:t>
             </w:r>
           </w:p>
         </w:tc>
@@ -1214,7 +678,7 @@
       <w:tr>
         <w:tc>
           <w:tcPr>
-            <w:tcW w:type="dxa" w:w="4608"/>
+            <w:tcW w:type="dxa" w:w="4536"/>
             <w:shd w:val="clear" w:color="auto" w:fill="F4F6F8"/>
           </w:tcPr>
           <w:p>
@@ -1226,15 +690,15 @@
                 <w:rFonts w:ascii="Barlow" w:hAnsi="Barlow" w:cs="Barlow"/>
                 <w:b w:val="0"/>
                 <w:i w:val="0"/>
-                <w:sz w:val="17"/>
+                <w:sz w:val="16"/>
               </w:rPr>
-              <w:t>H2-02-sensor-installation-record.docx</w:t>
+              <w:t>H5-02-FOREMAN-alarm-report.docx</w:t>
             </w:r>
           </w:p>
         </w:tc>
         <w:tc>
           <w:tcPr>
-            <w:tcW w:type="dxa" w:w="5328"/>
+            <w:tcW w:type="dxa" w:w="5400"/>
             <w:shd w:val="clear" w:color="auto" w:fill="F4F6F8"/>
           </w:tcPr>
           <w:p>
@@ -1246,9 +710,9 @@
                 <w:rFonts w:ascii="Barlow" w:hAnsi="Barlow" w:cs="Barlow"/>
                 <w:b w:val="0"/>
                 <w:i w:val="0"/>
-                <w:sz w:val="17"/>
+                <w:sz w:val="16"/>
               </w:rPr>
-              <w:t>The install record, with Wes's margin note</w:t>
+              <w:t>3:07 a.m. emergency closure draft</w:t>
             </w:r>
           </w:p>
         </w:tc>
@@ -1256,7 +720,7 @@
       <w:tr>
         <w:tc>
           <w:tcPr>
-            <w:tcW w:type="dxa" w:w="4608"/>
+            <w:tcW w:type="dxa" w:w="4536"/>
           </w:tcPr>
           <w:p>
             <w:pPr>
@@ -1267,15 +731,15 @@
                 <w:rFonts w:ascii="Barlow" w:hAnsi="Barlow" w:cs="Barlow"/>
                 <w:b w:val="0"/>
                 <w:i w:val="0"/>
-                <w:sz w:val="17"/>
+                <w:sz w:val="16"/>
               </w:rPr>
-              <w:t>H2-03-foreman-baseline-check.docx</w:t>
+              <w:t>H5-03-agent-loop-audit.docx</w:t>
             </w:r>
           </w:p>
         </w:tc>
         <w:tc>
           <w:tcPr>
-            <w:tcW w:type="dxa" w:w="5328"/>
+            <w:tcW w:type="dxa" w:w="5400"/>
           </w:tcPr>
           <w:p>
             <w:pPr>
@@ -1286,9 +750,9 @@
                 <w:rFonts w:ascii="Barlow" w:hAnsi="Barlow" w:cs="Barlow"/>
                 <w:b w:val="0"/>
                 <w:i w:val="0"/>
-                <w:sz w:val="17"/>
+                <w:sz w:val="16"/>
               </w:rPr>
-              <w:t>FOREMAN's PASS</w:t>
+              <w:t>Plan/tool/observation/decision and pipeline hunt</w:t>
             </w:r>
           </w:p>
         </w:tc>
@@ -1296,7 +760,7 @@
       <w:tr>
         <w:tc>
           <w:tcPr>
-            <w:tcW w:type="dxa" w:w="4608"/>
+            <w:tcW w:type="dxa" w:w="4536"/>
             <w:shd w:val="clear" w:color="auto" w:fill="F4F6F8"/>
           </w:tcPr>
           <w:p>
@@ -1308,15 +772,15 @@
                 <w:rFonts w:ascii="Barlow" w:hAnsi="Barlow" w:cs="Barlow"/>
                 <w:b w:val="0"/>
                 <w:i w:val="0"/>
-                <w:sz w:val="17"/>
+                <w:sz w:val="16"/>
               </w:rPr>
-              <w:t>H2-04-HW1-gauge-baseline.docx</w:t>
+              <w:t>H5-04-note-v1-and-HW3.docx</w:t>
             </w:r>
           </w:p>
         </w:tc>
         <w:tc>
           <w:tcPr>
-            <w:tcW w:type="dxa" w:w="5328"/>
+            <w:tcW w:type="dxa" w:w="5400"/>
             <w:shd w:val="clear" w:color="auto" w:fill="F4F6F8"/>
           </w:tcPr>
           <w:p>
@@ -1328,9 +792,9 @@
                 <w:rFonts w:ascii="Barlow" w:hAnsi="Barlow" w:cs="Barlow"/>
                 <w:b w:val="0"/>
                 <w:i w:val="0"/>
-                <w:sz w:val="17"/>
+                <w:sz w:val="16"/>
               </w:rPr>
-              <w:t>HW1 and the ten-hour budget</w:t>
+              <w:t>Student hand-in and duplicate-timestamp audit</w:t>
             </w:r>
           </w:p>
         </w:tc>
@@ -1338,7 +802,7 @@
       <w:tr>
         <w:tc>
           <w:tcPr>
-            <w:tcW w:type="dxa" w:w="4608"/>
+            <w:tcW w:type="dxa" w:w="4536"/>
           </w:tcPr>
           <w:p>
             <w:pPr>
@@ -1349,15 +813,15 @@
                 <w:rFonts w:ascii="Barlow" w:hAnsi="Barlow" w:cs="Barlow"/>
                 <w:b w:val="0"/>
                 <w:i w:val="0"/>
-                <w:sz w:val="17"/>
+                <w:sz w:val="16"/>
               </w:rPr>
-              <w:t>H2-05-hours-and-decision-log.docx</w:t>
+              <w:t>feed.csv</w:t>
             </w:r>
           </w:p>
         </w:tc>
         <w:tc>
           <w:tcPr>
-            <w:tcW w:type="dxa" w:w="5328"/>
+            <w:tcW w:type="dxa" w:w="5400"/>
           </w:tcPr>
           <w:p>
             <w:pPr>
@@ -1368,9 +832,9 @@
                 <w:rFonts w:ascii="Barlow" w:hAnsi="Barlow" w:cs="Barlow"/>
                 <w:b w:val="0"/>
                 <w:i w:val="0"/>
-                <w:sz w:val="17"/>
+                <w:sz w:val="16"/>
               </w:rPr>
-              <w:t>One page, kept all semester</w:t>
+              <w:t>First two weeks, 8 gauges, 10-minute readings, planted duplicate block</w:t>
             </w:r>
           </w:p>
         </w:tc>
@@ -1378,7 +842,7 @@
       <w:tr>
         <w:tc>
           <w:tcPr>
-            <w:tcW w:type="dxa" w:w="4608"/>
+            <w:tcW w:type="dxa" w:w="4536"/>
             <w:shd w:val="clear" w:color="auto" w:fill="F4F6F8"/>
           </w:tcPr>
           <w:p>
@@ -1390,15 +854,15 @@
                 <w:rFonts w:ascii="Barlow" w:hAnsi="Barlow" w:cs="Barlow"/>
                 <w:b w:val="0"/>
                 <w:i w:val="0"/>
-                <w:sz w:val="17"/>
+                <w:sz w:val="16"/>
               </w:rPr>
-              <w:t>gauges_install.csv</w:t>
+              <w:t>threshold_config.csv</w:t>
             </w:r>
           </w:p>
         </w:tc>
         <w:tc>
           <w:tcPr>
-            <w:tcW w:type="dxa" w:w="5328"/>
+            <w:tcW w:type="dxa" w:w="5400"/>
             <w:shd w:val="clear" w:color="auto" w:fill="F4F6F8"/>
           </w:tcPr>
           <w:p>
@@ -1410,9 +874,9 @@
                 <w:rFonts w:ascii="Barlow" w:hAnsi="Barlow" w:cs="Barlow"/>
                 <w:b w:val="0"/>
                 <w:i w:val="0"/>
-                <w:sz w:val="17"/>
+                <w:sz w:val="16"/>
               </w:rPr>
-              <w:t>8 gauges × 12 readings. The keystone data file</w:t>
+              <w:t>Warning and closure-draft rules</w:t>
             </w:r>
           </w:p>
         </w:tc>
@@ -1420,7 +884,7 @@
       <w:tr>
         <w:tc>
           <w:tcPr>
-            <w:tcW w:type="dxa" w:w="4608"/>
+            <w:tcW w:type="dxa" w:w="4536"/>
           </w:tcPr>
           <w:p>
             <w:pPr>
@@ -1431,15 +895,15 @@
                 <w:rFonts w:ascii="Barlow" w:hAnsi="Barlow" w:cs="Barlow"/>
                 <w:b w:val="0"/>
                 <w:i w:val="0"/>
-                <w:sz w:val="17"/>
+                <w:sz w:val="16"/>
               </w:rPr>
-              <w:t>pin_measurements_backup.csv</w:t>
+              <w:t>FOREMAN-overnight-run.log</w:t>
             </w:r>
           </w:p>
         </w:tc>
         <w:tc>
           <w:tcPr>
-            <w:tcW w:type="dxa" w:w="5328"/>
+            <w:tcW w:type="dxa" w:w="5400"/>
           </w:tcPr>
           <w:p>
             <w:pPr>
@@ -1450,9 +914,9 @@
                 <w:rFonts w:ascii="Barlow" w:hAnsi="Barlow" w:cs="Barlow"/>
                 <w:b w:val="0"/>
                 <w:i w:val="0"/>
-                <w:sz w:val="17"/>
+                <w:sz w:val="16"/>
               </w:rPr>
-              <w:t>24 pin readings, two people — lab fallback</w:t>
+              <w:t>Step-by-step autonomous run</w:t>
             </w:r>
           </w:p>
         </w:tc>
@@ -1460,7 +924,7 @@
       <w:tr>
         <w:tc>
           <w:tcPr>
-            <w:tcW w:type="dxa" w:w="4608"/>
+            <w:tcW w:type="dxa" w:w="4536"/>
             <w:shd w:val="clear" w:color="auto" w:fill="F4F6F8"/>
           </w:tcPr>
           <w:p>
@@ -1472,15 +936,15 @@
                 <w:rFonts w:ascii="Barlow" w:hAnsi="Barlow" w:cs="Barlow"/>
                 <w:b w:val="0"/>
                 <w:i w:val="0"/>
-                <w:sz w:val="17"/>
+                <w:sz w:val="16"/>
               </w:rPr>
-              <w:t>KEY-M02-answer-key.docx</w:t>
+              <w:t>KEY-M05-answer-key.docx</w:t>
             </w:r>
           </w:p>
         </w:tc>
         <w:tc>
           <w:tcPr>
-            <w:tcW w:type="dxa" w:w="5328"/>
+            <w:tcW w:type="dxa" w:w="5400"/>
             <w:shd w:val="clear" w:color="auto" w:fill="F4F6F8"/>
           </w:tcPr>
           <w:p>
@@ -1492,821 +956,9 @@
                 <w:rFonts w:ascii="Barlow" w:hAnsi="Barlow" w:cs="Barlow"/>
                 <w:b w:val="0"/>
                 <w:i w:val="0"/>
-                <w:sz w:val="17"/>
+                <w:sz w:val="16"/>
               </w:rPr>
-              <w:t>Gauge statistics, the planted errors, timing</w:t>
-            </w:r>
-          </w:p>
-        </w:tc>
-      </w:tr>
-    </w:tbl>
-    <w:p>
-      <w:pPr>
-        <w:spacing w:before="260" w:after="80" w:line="240" w:lineRule="auto"/>
-      </w:pPr>
-      <w:r>
-        <w:rPr>
-          <w:rFonts w:ascii="Barlow Condensed" w:hAnsi="Barlow Condensed" w:cs="Barlow Condensed"/>
-          <w:b/>
-          <w:i w:val="0"/>
-          <w:color w:val="1F3A5F"/>
-          <w:sz w:val="25"/>
-          <w:caps w:val="1"/>
-          <w:spacing w:val="12"/>
-        </w:rPr>
-        <w:t>04-M03-hallucination</w:t>
-      </w:r>
-    </w:p>
-    <w:tbl>
-      <w:tblPr>
-        <w:tblStyle w:val="TableGrid"/>
-        <w:tblW w:type="auto" w:w="0"/>
-        <w:jc w:val="left"/>
-        <w:tblLook w:firstColumn="1" w:firstRow="1" w:lastColumn="0" w:lastRow="0" w:noHBand="0" w:noVBand="1" w:val="04A0"/>
-        <w:tblLayout w:type="fixed"/>
-        <w:tblCellMar>
-          <w:top w:w="60" w:type="dxa"/>
-          <w:left w:w="110" w:type="dxa"/>
-          <w:bottom w:w="60" w:type="dxa"/>
-          <w:right w:w="110" w:type="dxa"/>
-        </w:tblCellMar>
-      </w:tblPr>
-      <w:tblGrid>
-        <w:gridCol w:w="4968"/>
-        <w:gridCol w:w="4968"/>
-      </w:tblGrid>
-      <w:tr>
-        <w:tc>
-          <w:tcPr>
-            <w:tcW w:type="dxa" w:w="4608"/>
-            <w:shd w:val="clear" w:color="auto" w:fill="1F3A5F"/>
-          </w:tcPr>
-          <w:p>
-            <w:pPr>
-              <w:spacing w:before="20" w:after="20" w:line="252" w:lineRule="auto"/>
-            </w:pPr>
-            <w:r>
-              <w:rPr>
-                <w:rFonts w:ascii="Barlow Condensed" w:hAnsi="Barlow Condensed" w:cs="Barlow Condensed"/>
-                <w:b/>
-                <w:i w:val="0"/>
-                <w:color w:val="FFFFFF"/>
-                <w:sz w:val="17"/>
-              </w:rPr>
-              <w:t>File</w:t>
-            </w:r>
-          </w:p>
-        </w:tc>
-        <w:tc>
-          <w:tcPr>
-            <w:tcW w:type="dxa" w:w="5328"/>
-            <w:shd w:val="clear" w:color="auto" w:fill="1F3A5F"/>
-          </w:tcPr>
-          <w:p>
-            <w:pPr>
-              <w:spacing w:before="20" w:after="20" w:line="252" w:lineRule="auto"/>
-            </w:pPr>
-            <w:r>
-              <w:rPr>
-                <w:rFonts w:ascii="Barlow Condensed" w:hAnsi="Barlow Condensed" w:cs="Barlow Condensed"/>
-                <w:b/>
-                <w:i w:val="0"/>
-                <w:color w:val="FFFFFF"/>
-                <w:sz w:val="17"/>
-              </w:rPr>
-              <w:t>What it is</w:t>
-            </w:r>
-          </w:p>
-        </w:tc>
-      </w:tr>
-      <w:tr>
-        <w:tc>
-          <w:tcPr>
-            <w:tcW w:type="dxa" w:w="4608"/>
-          </w:tcPr>
-          <w:p>
-            <w:pPr>
-              <w:spacing w:before="20" w:after="20" w:line="252" w:lineRule="auto"/>
-            </w:pPr>
-            <w:r>
-              <w:rPr>
-                <w:rFonts w:ascii="Barlow" w:hAnsi="Barlow" w:cs="Barlow"/>
-                <w:b w:val="0"/>
-                <w:i w:val="0"/>
-                <w:sz w:val="17"/>
-              </w:rPr>
-              <w:t>M03-slides-hallucination.pptx</w:t>
-            </w:r>
-          </w:p>
-        </w:tc>
-        <w:tc>
-          <w:tcPr>
-            <w:tcW w:type="dxa" w:w="5328"/>
-          </w:tcPr>
-          <w:p>
-            <w:pPr>
-              <w:spacing w:before="20" w:after="20" w:line="252" w:lineRule="auto"/>
-            </w:pPr>
-            <w:r>
-              <w:rPr>
-                <w:rFonts w:ascii="Barlow" w:hAnsi="Barlow" w:cs="Barlow"/>
-                <w:b w:val="0"/>
-                <w:i w:val="0"/>
-                <w:sz w:val="17"/>
-              </w:rPr>
-              <w:t>21 slides</w:t>
-            </w:r>
-          </w:p>
-        </w:tc>
-      </w:tr>
-      <w:tr>
-        <w:tc>
-          <w:tcPr>
-            <w:tcW w:type="dxa" w:w="4608"/>
-            <w:shd w:val="clear" w:color="auto" w:fill="F4F6F8"/>
-          </w:tcPr>
-          <w:p>
-            <w:pPr>
-              <w:spacing w:before="20" w:after="20" w:line="252" w:lineRule="auto"/>
-            </w:pPr>
-            <w:r>
-              <w:rPr>
-                <w:rFonts w:ascii="Barlow" w:hAnsi="Barlow" w:cs="Barlow"/>
-                <w:b w:val="0"/>
-                <w:i w:val="0"/>
-                <w:sz w:val="17"/>
-              </w:rPr>
-              <w:t>H3-01-KC-MB-12-county-spec.docx</w:t>
-            </w:r>
-          </w:p>
-        </w:tc>
-        <w:tc>
-          <w:tcPr>
-            <w:tcW w:type="dxa" w:w="5328"/>
-            <w:shd w:val="clear" w:color="auto" w:fill="F4F6F8"/>
-          </w:tcPr>
-          <w:p>
-            <w:pPr>
-              <w:spacing w:before="20" w:after="20" w:line="252" w:lineRule="auto"/>
-            </w:pPr>
-            <w:r>
-              <w:rPr>
-                <w:rFonts w:ascii="Barlow" w:hAnsi="Barlow" w:cs="Barlow"/>
-                <w:b w:val="0"/>
-                <w:i w:val="0"/>
-                <w:sz w:val="17"/>
-              </w:rPr>
-              <w:t>The invented county spec. Print this one</w:t>
-            </w:r>
-          </w:p>
-        </w:tc>
-      </w:tr>
-      <w:tr>
-        <w:tc>
-          <w:tcPr>
-            <w:tcW w:type="dxa" w:w="4608"/>
-          </w:tcPr>
-          <w:p>
-            <w:pPr>
-              <w:spacing w:before="20" w:after="20" w:line="252" w:lineRule="auto"/>
-            </w:pPr>
-            <w:r>
-              <w:rPr>
-                <w:rFonts w:ascii="Barlow" w:hAnsi="Barlow" w:cs="Barlow"/>
-                <w:b w:val="0"/>
-                <w:i w:val="0"/>
-                <w:sz w:val="17"/>
-              </w:rPr>
-              <w:t>H3-02-foreman-spec-summary.docx</w:t>
-            </w:r>
-          </w:p>
-        </w:tc>
-        <w:tc>
-          <w:tcPr>
-            <w:tcW w:type="dxa" w:w="5328"/>
-          </w:tcPr>
-          <w:p>
-            <w:pPr>
-              <w:spacing w:before="20" w:after="20" w:line="252" w:lineRule="auto"/>
-            </w:pPr>
-            <w:r>
-              <w:rPr>
-                <w:rFonts w:ascii="Barlow" w:hAnsi="Barlow" w:cs="Barlow"/>
-                <w:b w:val="0"/>
-                <w:i w:val="0"/>
-                <w:sz w:val="17"/>
-              </w:rPr>
-              <w:t>Ten claims, two of them wrong</w:t>
-            </w:r>
-          </w:p>
-        </w:tc>
-      </w:tr>
-      <w:tr>
-        <w:tc>
-          <w:tcPr>
-            <w:tcW w:type="dxa" w:w="4608"/>
-            <w:shd w:val="clear" w:color="auto" w:fill="F4F6F8"/>
-          </w:tcPr>
-          <w:p>
-            <w:pPr>
-              <w:spacing w:before="20" w:after="20" w:line="252" w:lineRule="auto"/>
-            </w:pPr>
-            <w:r>
-              <w:rPr>
-                <w:rFonts w:ascii="Barlow" w:hAnsi="Barlow" w:cs="Barlow"/>
-                <w:b w:val="0"/>
-                <w:i w:val="0"/>
-                <w:sz w:val="17"/>
-              </w:rPr>
-              <w:t>H3-03-next-word-dice-activity.docx</w:t>
-            </w:r>
-          </w:p>
-        </w:tc>
-        <w:tc>
-          <w:tcPr>
-            <w:tcW w:type="dxa" w:w="5328"/>
-            <w:shd w:val="clear" w:color="auto" w:fill="F4F6F8"/>
-          </w:tcPr>
-          <w:p>
-            <w:pPr>
-              <w:spacing w:before="20" w:after="20" w:line="252" w:lineRule="auto"/>
-            </w:pPr>
-            <w:r>
-              <w:rPr>
-                <w:rFonts w:ascii="Barlow" w:hAnsi="Barlow" w:cs="Barlow"/>
-                <w:b w:val="0"/>
-                <w:i w:val="0"/>
-                <w:sz w:val="17"/>
-              </w:rPr>
-              <w:t>The dice table</w:t>
-            </w:r>
-          </w:p>
-        </w:tc>
-      </w:tr>
-      <w:tr>
-        <w:tc>
-          <w:tcPr>
-            <w:tcW w:type="dxa" w:w="4608"/>
-          </w:tcPr>
-          <w:p>
-            <w:pPr>
-              <w:spacing w:before="20" w:after="20" w:line="252" w:lineRule="auto"/>
-            </w:pPr>
-            <w:r>
-              <w:rPr>
-                <w:rFonts w:ascii="Barlow" w:hAnsi="Barlow" w:cs="Barlow"/>
-                <w:b w:val="0"/>
-                <w:i w:val="0"/>
-                <w:sz w:val="17"/>
-              </w:rPr>
-              <w:t>H3-04-source-check-worksheet.docx</w:t>
-            </w:r>
-          </w:p>
-        </w:tc>
-        <w:tc>
-          <w:tcPr>
-            <w:tcW w:type="dxa" w:w="5328"/>
-          </w:tcPr>
-          <w:p>
-            <w:pPr>
-              <w:spacing w:before="20" w:after="20" w:line="252" w:lineRule="auto"/>
-            </w:pPr>
-            <w:r>
-              <w:rPr>
-                <w:rFonts w:ascii="Barlow" w:hAnsi="Barlow" w:cs="Barlow"/>
-                <w:b w:val="0"/>
-                <w:i w:val="0"/>
-                <w:sz w:val="17"/>
-              </w:rPr>
-              <w:t>Check the ten claims</w:t>
-            </w:r>
-          </w:p>
-        </w:tc>
-      </w:tr>
-      <w:tr>
-        <w:tc>
-          <w:tcPr>
-            <w:tcW w:type="dxa" w:w="4608"/>
-            <w:shd w:val="clear" w:color="auto" w:fill="F4F6F8"/>
-          </w:tcPr>
-          <w:p>
-            <w:pPr>
-              <w:spacing w:before="20" w:after="20" w:line="252" w:lineRule="auto"/>
-            </w:pPr>
-            <w:r>
-              <w:rPr>
-                <w:rFonts w:ascii="Barlow" w:hAnsi="Barlow" w:cs="Barlow"/>
-                <w:b w:val="0"/>
-                <w:i w:val="0"/>
-                <w:sz w:val="17"/>
-              </w:rPr>
-              <w:t>H3-05-HW2-spec-summary-check.docx</w:t>
-            </w:r>
-          </w:p>
-        </w:tc>
-        <w:tc>
-          <w:tcPr>
-            <w:tcW w:type="dxa" w:w="5328"/>
-            <w:shd w:val="clear" w:color="auto" w:fill="F4F6F8"/>
-          </w:tcPr>
-          <w:p>
-            <w:pPr>
-              <w:spacing w:before="20" w:after="20" w:line="252" w:lineRule="auto"/>
-            </w:pPr>
-            <w:r>
-              <w:rPr>
-                <w:rFonts w:ascii="Barlow" w:hAnsi="Barlow" w:cs="Barlow"/>
-                <w:b w:val="0"/>
-                <w:i w:val="0"/>
-                <w:sz w:val="17"/>
-              </w:rPr>
-              <w:t>HW2</w:t>
-            </w:r>
-          </w:p>
-        </w:tc>
-      </w:tr>
-      <w:tr>
-        <w:tc>
-          <w:tcPr>
-            <w:tcW w:type="dxa" w:w="4608"/>
-          </w:tcPr>
-          <w:p>
-            <w:pPr>
-              <w:spacing w:before="20" w:after="20" w:line="252" w:lineRule="auto"/>
-            </w:pPr>
-            <w:r>
-              <w:rPr>
-                <w:rFonts w:ascii="Barlow" w:hAnsi="Barlow" w:cs="Barlow"/>
-                <w:b w:val="0"/>
-                <w:i w:val="0"/>
-                <w:sz w:val="17"/>
-              </w:rPr>
-              <w:t>KEY-M03-answer-key.docx</w:t>
-            </w:r>
-          </w:p>
-        </w:tc>
-        <w:tc>
-          <w:tcPr>
-            <w:tcW w:type="dxa" w:w="5328"/>
-          </w:tcPr>
-          <w:p>
-            <w:pPr>
-              <w:spacing w:before="20" w:after="20" w:line="252" w:lineRule="auto"/>
-            </w:pPr>
-            <w:r>
-              <w:rPr>
-                <w:rFonts w:ascii="Barlow" w:hAnsi="Barlow" w:cs="Barlow"/>
-                <w:b w:val="0"/>
-                <w:i w:val="0"/>
-                <w:sz w:val="17"/>
-              </w:rPr>
-              <w:t>Claim-by-claim verdicts, teaching notes</w:t>
-            </w:r>
-          </w:p>
-        </w:tc>
-      </w:tr>
-    </w:tbl>
-    <w:p>
-      <w:pPr>
-        <w:spacing w:before="260" w:after="80" w:line="240" w:lineRule="auto"/>
-      </w:pPr>
-      <w:r>
-        <w:rPr>
-          <w:rFonts w:ascii="Barlow Condensed" w:hAnsi="Barlow Condensed" w:cs="Barlow Condensed"/>
-          <w:b/>
-          <w:i w:val="0"/>
-          <w:color w:val="1F3A5F"/>
-          <w:sz w:val="25"/>
-          <w:caps w:val="1"/>
-          <w:spacing w:val="12"/>
-        </w:rPr>
-        <w:t>05-CHARTS</w:t>
-      </w:r>
-    </w:p>
-    <w:tbl>
-      <w:tblPr>
-        <w:tblStyle w:val="TableGrid"/>
-        <w:tblW w:type="auto" w:w="0"/>
-        <w:jc w:val="left"/>
-        <w:tblLook w:firstColumn="1" w:firstRow="1" w:lastColumn="0" w:lastRow="0" w:noHBand="0" w:noVBand="1" w:val="04A0"/>
-        <w:tblLayout w:type="fixed"/>
-        <w:tblCellMar>
-          <w:top w:w="60" w:type="dxa"/>
-          <w:left w:w="110" w:type="dxa"/>
-          <w:bottom w:w="60" w:type="dxa"/>
-          <w:right w:w="110" w:type="dxa"/>
-        </w:tblCellMar>
-      </w:tblPr>
-      <w:tblGrid>
-        <w:gridCol w:w="4968"/>
-        <w:gridCol w:w="4968"/>
-      </w:tblGrid>
-      <w:tr>
-        <w:tc>
-          <w:tcPr>
-            <w:tcW w:type="dxa" w:w="4608"/>
-            <w:shd w:val="clear" w:color="auto" w:fill="1F3A5F"/>
-          </w:tcPr>
-          <w:p>
-            <w:pPr>
-              <w:spacing w:before="20" w:after="20" w:line="252" w:lineRule="auto"/>
-            </w:pPr>
-            <w:r>
-              <w:rPr>
-                <w:rFonts w:ascii="Barlow Condensed" w:hAnsi="Barlow Condensed" w:cs="Barlow Condensed"/>
-                <w:b/>
-                <w:i w:val="0"/>
-                <w:color w:val="FFFFFF"/>
-                <w:sz w:val="17"/>
-              </w:rPr>
-              <w:t>File</w:t>
-            </w:r>
-          </w:p>
-        </w:tc>
-        <w:tc>
-          <w:tcPr>
-            <w:tcW w:type="dxa" w:w="5328"/>
-            <w:shd w:val="clear" w:color="auto" w:fill="1F3A5F"/>
-          </w:tcPr>
-          <w:p>
-            <w:pPr>
-              <w:spacing w:before="20" w:after="20" w:line="252" w:lineRule="auto"/>
-            </w:pPr>
-            <w:r>
-              <w:rPr>
-                <w:rFonts w:ascii="Barlow Condensed" w:hAnsi="Barlow Condensed" w:cs="Barlow Condensed"/>
-                <w:b/>
-                <w:i w:val="0"/>
-                <w:color w:val="FFFFFF"/>
-                <w:sz w:val="17"/>
-              </w:rPr>
-              <w:t>What it is</w:t>
-            </w:r>
-          </w:p>
-        </w:tc>
-      </w:tr>
-      <w:tr>
-        <w:tc>
-          <w:tcPr>
-            <w:tcW w:type="dxa" w:w="4608"/>
-          </w:tcPr>
-          <w:p>
-            <w:pPr>
-              <w:spacing w:before="20" w:after="20" w:line="252" w:lineRule="auto"/>
-            </w:pPr>
-            <w:r>
-              <w:rPr>
-                <w:rFonts w:ascii="Barlow" w:hAnsi="Barlow" w:cs="Barlow"/>
-                <w:b w:val="0"/>
-                <w:i w:val="0"/>
-                <w:sz w:val="17"/>
-              </w:rPr>
-              <w:t>*.png</w:t>
-            </w:r>
-          </w:p>
-        </w:tc>
-        <w:tc>
-          <w:tcPr>
-            <w:tcW w:type="dxa" w:w="5328"/>
-          </w:tcPr>
-          <w:p>
-            <w:pPr>
-              <w:spacing w:before="20" w:after="20" w:line="252" w:lineRule="auto"/>
-            </w:pPr>
-            <w:r>
-              <w:rPr>
-                <w:rFonts w:ascii="Barlow" w:hAnsi="Barlow" w:cs="Barlow"/>
-                <w:b w:val="0"/>
-                <w:i w:val="0"/>
-                <w:sz w:val="17"/>
-              </w:rPr>
-              <w:t>Every chart used in the decks, if you want them elsewhere</w:t>
-            </w:r>
-          </w:p>
-        </w:tc>
-      </w:tr>
-    </w:tbl>
-    <w:p>
-      <w:pPr>
-        <w:spacing w:before="260" w:after="80" w:line="240" w:lineRule="auto"/>
-      </w:pPr>
-      <w:r>
-        <w:rPr>
-          <w:rFonts w:ascii="Barlow Condensed" w:hAnsi="Barlow Condensed" w:cs="Barlow Condensed"/>
-          <w:b/>
-          <w:i w:val="0"/>
-          <w:color w:val="1F3A5F"/>
-          <w:sz w:val="25"/>
-          <w:caps w:val="1"/>
-          <w:spacing w:val="12"/>
-        </w:rPr>
-        <w:t>06-BRIDGE</w:t>
-      </w:r>
-    </w:p>
-    <w:tbl>
-      <w:tblPr>
-        <w:tblStyle w:val="TableGrid"/>
-        <w:tblW w:type="auto" w:w="0"/>
-        <w:jc w:val="left"/>
-        <w:tblLook w:firstColumn="1" w:firstRow="1" w:lastColumn="0" w:lastRow="0" w:noHBand="0" w:noVBand="1" w:val="04A0"/>
-        <w:tblLayout w:type="fixed"/>
-        <w:tblCellMar>
-          <w:top w:w="60" w:type="dxa"/>
-          <w:left w:w="110" w:type="dxa"/>
-          <w:bottom w:w="60" w:type="dxa"/>
-          <w:right w:w="110" w:type="dxa"/>
-        </w:tblCellMar>
-      </w:tblPr>
-      <w:tblGrid>
-        <w:gridCol w:w="4968"/>
-        <w:gridCol w:w="4968"/>
-      </w:tblGrid>
-      <w:tr>
-        <w:tc>
-          <w:tcPr>
-            <w:tcW w:type="dxa" w:w="4608"/>
-            <w:shd w:val="clear" w:color="auto" w:fill="1F3A5F"/>
-          </w:tcPr>
-          <w:p>
-            <w:pPr>
-              <w:spacing w:before="20" w:after="20" w:line="252" w:lineRule="auto"/>
-            </w:pPr>
-            <w:r>
-              <w:rPr>
-                <w:rFonts w:ascii="Barlow Condensed" w:hAnsi="Barlow Condensed" w:cs="Barlow Condensed"/>
-                <w:b/>
-                <w:i w:val="0"/>
-                <w:color w:val="FFFFFF"/>
-                <w:sz w:val="17"/>
-              </w:rPr>
-              <w:t>File</w:t>
-            </w:r>
-          </w:p>
-        </w:tc>
-        <w:tc>
-          <w:tcPr>
-            <w:tcW w:type="dxa" w:w="5328"/>
-            <w:shd w:val="clear" w:color="auto" w:fill="1F3A5F"/>
-          </w:tcPr>
-          <w:p>
-            <w:pPr>
-              <w:spacing w:before="20" w:after="20" w:line="252" w:lineRule="auto"/>
-            </w:pPr>
-            <w:r>
-              <w:rPr>
-                <w:rFonts w:ascii="Barlow Condensed" w:hAnsi="Barlow Condensed" w:cs="Barlow Condensed"/>
-                <w:b/>
-                <w:i w:val="0"/>
-                <w:color w:val="FFFFFF"/>
-                <w:sz w:val="17"/>
-              </w:rPr>
-              <w:t>What it is</w:t>
-            </w:r>
-          </w:p>
-        </w:tc>
-      </w:tr>
-      <w:tr>
-        <w:tc>
-          <w:tcPr>
-            <w:tcW w:type="dxa" w:w="4608"/>
-          </w:tcPr>
-          <w:p>
-            <w:pPr>
-              <w:spacing w:before="20" w:after="20" w:line="252" w:lineRule="auto"/>
-            </w:pPr>
-            <w:r>
-              <w:rPr>
-                <w:rFonts w:ascii="Barlow" w:hAnsi="Barlow" w:cs="Barlow"/>
-                <w:b w:val="0"/>
-                <w:i w:val="0"/>
-                <w:sz w:val="17"/>
-              </w:rPr>
-              <w:t>otter-bend-lift-bridge-flat-claude.png</w:t>
-            </w:r>
-          </w:p>
-        </w:tc>
-        <w:tc>
-          <w:tcPr>
-            <w:tcW w:type="dxa" w:w="5328"/>
-          </w:tcPr>
-          <w:p>
-            <w:pPr>
-              <w:spacing w:before="20" w:after="20" w:line="252" w:lineRule="auto"/>
-            </w:pPr>
-            <w:r>
-              <w:rPr>
-                <w:rFonts w:ascii="Barlow" w:hAnsi="Barlow" w:cs="Barlow"/>
-                <w:b w:val="0"/>
-                <w:i w:val="0"/>
-                <w:sz w:val="17"/>
-              </w:rPr>
-              <w:t>Primary flat illustration, ready for PowerPoint</w:t>
-            </w:r>
-          </w:p>
-        </w:tc>
-      </w:tr>
-      <w:tr>
-        <w:tc>
-          <w:tcPr>
-            <w:tcW w:type="dxa" w:w="4608"/>
-            <w:shd w:val="clear" w:color="auto" w:fill="F4F6F8"/>
-          </w:tcPr>
-          <w:p>
-            <w:pPr>
-              <w:spacing w:before="20" w:after="20" w:line="252" w:lineRule="auto"/>
-            </w:pPr>
-            <w:r>
-              <w:rPr>
-                <w:rFonts w:ascii="Barlow" w:hAnsi="Barlow" w:cs="Barlow"/>
-                <w:b w:val="0"/>
-                <w:i w:val="0"/>
-                <w:sz w:val="17"/>
-              </w:rPr>
-              <w:t>otter-bend-general-elevation.png</w:t>
-            </w:r>
-          </w:p>
-        </w:tc>
-        <w:tc>
-          <w:tcPr>
-            <w:tcW w:type="dxa" w:w="5328"/>
-            <w:shd w:val="clear" w:color="auto" w:fill="F4F6F8"/>
-          </w:tcPr>
-          <w:p>
-            <w:pPr>
-              <w:spacing w:before="20" w:after="20" w:line="252" w:lineRule="auto"/>
-            </w:pPr>
-            <w:r>
-              <w:rPr>
-                <w:rFonts w:ascii="Barlow" w:hAnsi="Barlow" w:cs="Barlow"/>
-                <w:b w:val="0"/>
-                <w:i w:val="0"/>
-                <w:sz w:val="17"/>
-              </w:rPr>
-              <w:t>Dimensioned general elevation; keep the disclaimer visible</w:t>
-            </w:r>
-          </w:p>
-        </w:tc>
-      </w:tr>
-      <w:tr>
-        <w:tc>
-          <w:tcPr>
-            <w:tcW w:type="dxa" w:w="4608"/>
-          </w:tcPr>
-          <w:p>
-            <w:pPr>
-              <w:spacing w:before="20" w:after="20" w:line="252" w:lineRule="auto"/>
-            </w:pPr>
-            <w:r>
-              <w:rPr>
-                <w:rFonts w:ascii="Barlow" w:hAnsi="Barlow" w:cs="Barlow"/>
-                <w:b w:val="0"/>
-                <w:i w:val="0"/>
-                <w:sz w:val="17"/>
-              </w:rPr>
-              <w:t>otter-bend-strain-gauge-array.png</w:t>
-            </w:r>
-          </w:p>
-        </w:tc>
-        <w:tc>
-          <w:tcPr>
-            <w:tcW w:type="dxa" w:w="5328"/>
-          </w:tcPr>
-          <w:p>
-            <w:pPr>
-              <w:spacing w:before="20" w:after="20" w:line="252" w:lineRule="auto"/>
-            </w:pPr>
-            <w:r>
-              <w:rPr>
-                <w:rFonts w:ascii="Barlow" w:hAnsi="Barlow" w:cs="Barlow"/>
-                <w:b w:val="0"/>
-                <w:i w:val="0"/>
-                <w:sz w:val="17"/>
-              </w:rPr>
-              <w:t>M02 gauge array G1–G8; G5/G6 at midspan, G6 redundant</w:t>
-            </w:r>
-          </w:p>
-        </w:tc>
-      </w:tr>
-      <w:tr>
-        <w:tc>
-          <w:tcPr>
-            <w:tcW w:type="dxa" w:w="4608"/>
-            <w:shd w:val="clear" w:color="auto" w:fill="F4F6F8"/>
-          </w:tcPr>
-          <w:p>
-            <w:pPr>
-              <w:spacing w:before="20" w:after="20" w:line="252" w:lineRule="auto"/>
-            </w:pPr>
-            <w:r>
-              <w:rPr>
-                <w:rFonts w:ascii="Barlow" w:hAnsi="Barlow" w:cs="Barlow"/>
-                <w:b w:val="0"/>
-                <w:i w:val="0"/>
-                <w:sz w:val="17"/>
-              </w:rPr>
-              <w:t>otter-bend-site-location.png</w:t>
-            </w:r>
-          </w:p>
-        </w:tc>
-        <w:tc>
-          <w:tcPr>
-            <w:tcW w:type="dxa" w:w="5328"/>
-            <w:shd w:val="clear" w:color="auto" w:fill="F4F6F8"/>
-          </w:tcPr>
-          <w:p>
-            <w:pPr>
-              <w:spacing w:before="20" w:after="20" w:line="252" w:lineRule="auto"/>
-            </w:pPr>
-            <w:r>
-              <w:rPr>
-                <w:rFonts w:ascii="Barlow" w:hAnsi="Barlow" w:cs="Barlow"/>
-                <w:b w:val="0"/>
-                <w:i w:val="0"/>
-                <w:sz w:val="17"/>
-              </w:rPr>
-              <w:t>Primary site map: Otter Bend, Kinnickville, County Road 9</w:t>
-            </w:r>
-          </w:p>
-        </w:tc>
-      </w:tr>
-      <w:tr>
-        <w:tc>
-          <w:tcPr>
-            <w:tcW w:type="dxa" w:w="4608"/>
-          </w:tcPr>
-          <w:p>
-            <w:pPr>
-              <w:spacing w:before="20" w:after="20" w:line="252" w:lineRule="auto"/>
-            </w:pPr>
-            <w:r>
-              <w:rPr>
-                <w:rFonts w:ascii="Barlow" w:hAnsi="Barlow" w:cs="Barlow"/>
-                <w:b w:val="0"/>
-                <w:i w:val="0"/>
-                <w:sz w:val="17"/>
-              </w:rPr>
-              <w:t>otter-bend-location-map.png</w:t>
-            </w:r>
-          </w:p>
-        </w:tc>
-        <w:tc>
-          <w:tcPr>
-            <w:tcW w:type="dxa" w:w="5328"/>
-          </w:tcPr>
-          <w:p>
-            <w:pPr>
-              <w:spacing w:before="20" w:after="20" w:line="252" w:lineRule="auto"/>
-            </w:pPr>
-            <w:r>
-              <w:rPr>
-                <w:rFonts w:ascii="Barlow" w:hAnsi="Barlow" w:cs="Barlow"/>
-                <w:b w:val="0"/>
-                <w:i w:val="0"/>
-                <w:sz w:val="17"/>
-              </w:rPr>
-              <w:t>Optional backup: simpler fictional-site locator</w:t>
-            </w:r>
-          </w:p>
-        </w:tc>
-      </w:tr>
-      <w:tr>
-        <w:tc>
-          <w:tcPr>
-            <w:tcW w:type="dxa" w:w="4608"/>
-            <w:shd w:val="clear" w:color="auto" w:fill="F4F6F8"/>
-          </w:tcPr>
-          <w:p>
-            <w:pPr>
-              <w:spacing w:before="20" w:after="20" w:line="252" w:lineRule="auto"/>
-            </w:pPr>
-            <w:r>
-              <w:rPr>
-                <w:rFonts w:ascii="Barlow" w:hAnsi="Barlow" w:cs="Barlow"/>
-                <w:b w:val="0"/>
-                <w:i w:val="0"/>
-                <w:sz w:val="17"/>
-              </w:rPr>
-              <w:t>README.txt</w:t>
-            </w:r>
-          </w:p>
-        </w:tc>
-        <w:tc>
-          <w:tcPr>
-            <w:tcW w:type="dxa" w:w="5328"/>
-            <w:shd w:val="clear" w:color="auto" w:fill="F4F6F8"/>
-          </w:tcPr>
-          <w:p>
-            <w:pPr>
-              <w:spacing w:before="20" w:after="20" w:line="252" w:lineRule="auto"/>
-            </w:pPr>
-            <w:r>
-              <w:rPr>
-                <w:rFonts w:ascii="Barlow" w:hAnsi="Barlow" w:cs="Barlow"/>
-                <w:b w:val="0"/>
-                <w:i w:val="0"/>
-                <w:sz w:val="17"/>
-              </w:rPr>
-              <w:t>PowerPoint placement and disclaimer instructions</w:t>
+              <w:t>Instructor-only trace, model note, duplicate key, M06 boundary</w:t>
             </w:r>
           </w:p>
         </w:tc>
@@ -2342,7 +994,7 @@
         <w:color w:val="6B7280"/>
         <w:sz w:val="16"/>
       </w:rPr>
-      <w:t>SEIS 201  ·  M01 – M03</w:t>
+      <w:t>SEIS 201  ·  M01 – M05</w:t>
     </w:r>
     <w:r>
       <w:tab/>
@@ -2415,7 +1067,7 @@
         <w:caps w:val="1"/>
         <w:spacing w:val="20"/>
       </w:rPr>
-      <w:t>M01 – M03  ·  FILE INDEX</w:t>
+      <w:t>M01 – M05  ·  FILE INDEX</w:t>
     </w:r>
   </w:p>
 </w:hdr>

</xml_diff>

<commit_message>
Build Meeting M06 alarm audit teaching pack
Co-authored-by: shaseaver25 <shannon@tailoredu.org>
</commit_message>
<xml_diff>
--- a/teaching-pack/00-INSTRUCTOR/FILE-INDEX.docx
+++ b/teaching-pack/00-INSTRUCTOR/FILE-INDEX.docx
@@ -27,9 +27,9 @@
           <w:b w:val="0"/>
           <w:i w:val="0"/>
           <w:color w:val="6B7280"/>
-          <w:sz w:val="19"/>
+          <w:sz w:val="18"/>
         </w:rPr>
-        <w:t>Folders are in teaching order.</w:t>
+        <w:t>M06 is based on main and depends on M05 PR #9 for feed.csv, the overnight run, threshold rules, and the unresolved alarm. M04 PR #8 supplies the preceding descriptive statistics meeting but is not a direct file dependency.</w:t>
       </w:r>
     </w:p>
     <w:p>
@@ -70,7 +70,7 @@
       <w:tr>
         <w:tc>
           <w:tcPr>
-            <w:tcW w:type="dxa" w:w="4608"/>
+            <w:tcW w:type="dxa" w:w="4536"/>
             <w:shd w:val="clear" w:color="auto" w:fill="1F3A5F"/>
           </w:tcPr>
           <w:p>
@@ -83,7 +83,7 @@
                 <w:b/>
                 <w:i w:val="0"/>
                 <w:color w:val="FFFFFF"/>
-                <w:sz w:val="17"/>
+                <w:sz w:val="16"/>
               </w:rPr>
               <w:t>File</w:t>
             </w:r>
@@ -91,7 +91,7 @@
         </w:tc>
         <w:tc>
           <w:tcPr>
-            <w:tcW w:type="dxa" w:w="5328"/>
+            <w:tcW w:type="dxa" w:w="5400"/>
             <w:shd w:val="clear" w:color="auto" w:fill="1F3A5F"/>
           </w:tcPr>
           <w:p>
@@ -104,7 +104,7 @@
                 <w:b/>
                 <w:i w:val="0"/>
                 <w:color w:val="FFFFFF"/>
-                <w:sz w:val="17"/>
+                <w:sz w:val="16"/>
               </w:rPr>
               <w:t>What it is</w:t>
             </w:r>
@@ -114,7 +114,7 @@
       <w:tr>
         <w:tc>
           <w:tcPr>
-            <w:tcW w:type="dxa" w:w="4608"/>
+            <w:tcW w:type="dxa" w:w="4536"/>
           </w:tcPr>
           <w:p>
             <w:pPr>
@@ -125,15 +125,15 @@
                 <w:rFonts w:ascii="Barlow" w:hAnsi="Barlow" w:cs="Barlow"/>
                 <w:b w:val="0"/>
                 <w:i w:val="0"/>
-                <w:sz w:val="17"/>
+                <w:sz w:val="16"/>
               </w:rPr>
-              <w:t>INSTRUCTOR-GUIDE-M01-M03.docx</w:t>
+              <w:t>run-of-day/index.html</w:t>
             </w:r>
           </w:p>
         </w:tc>
         <w:tc>
           <w:tcPr>
-            <w:tcW w:type="dxa" w:w="5328"/>
+            <w:tcW w:type="dxa" w:w="5400"/>
           </w:tcPr>
           <w:p>
             <w:pPr>
@@ -144,9 +144,9 @@
                 <w:rFonts w:ascii="Barlow" w:hAnsi="Barlow" w:cs="Barlow"/>
                 <w:b w:val="0"/>
                 <w:i w:val="0"/>
-                <w:sz w:val="17"/>
+                <w:sz w:val="16"/>
               </w:rPr>
-              <w:t>Run of show, prep, continuity, review checklist</w:t>
+              <w:t>Podium desk for Unit 1</w:t>
             </w:r>
           </w:p>
         </w:tc>
@@ -154,7 +154,7 @@
       <w:tr>
         <w:tc>
           <w:tcPr>
-            <w:tcW w:type="dxa" w:w="4608"/>
+            <w:tcW w:type="dxa" w:w="4536"/>
             <w:shd w:val="clear" w:color="auto" w:fill="F4F6F8"/>
           </w:tcPr>
           <w:p>
@@ -166,15 +166,15 @@
                 <w:rFonts w:ascii="Barlow" w:hAnsi="Barlow" w:cs="Barlow"/>
                 <w:b w:val="0"/>
                 <w:i w:val="0"/>
-                <w:sz w:val="17"/>
+                <w:sz w:val="16"/>
               </w:rPr>
-              <w:t>FILE-INDEX.docx</w:t>
+              <w:t>run-of-day/M06-run-of-day.html</w:t>
             </w:r>
           </w:p>
         </w:tc>
         <w:tc>
           <w:tcPr>
-            <w:tcW w:type="dxa" w:w="5328"/>
+            <w:tcW w:type="dxa" w:w="5400"/>
             <w:shd w:val="clear" w:color="auto" w:fill="F4F6F8"/>
           </w:tcPr>
           <w:p>
@@ -186,9 +186,9 @@
                 <w:rFonts w:ascii="Barlow" w:hAnsi="Barlow" w:cs="Barlow"/>
                 <w:b w:val="0"/>
                 <w:i w:val="0"/>
-                <w:sz w:val="17"/>
+                <w:sz w:val="16"/>
               </w:rPr>
-              <w:t>This page</w:t>
+              <w:t>M06 script, reveal boundary, debrief, and Wes handoff</w:t>
             </w:r>
           </w:p>
         </w:tc>
@@ -196,7 +196,7 @@
       <w:tr>
         <w:tc>
           <w:tcPr>
-            <w:tcW w:type="dxa" w:w="4608"/>
+            <w:tcW w:type="dxa" w:w="4536"/>
           </w:tcPr>
           <w:p>
             <w:pPr>
@@ -207,15 +207,15 @@
                 <w:rFonts w:ascii="Barlow" w:hAnsi="Barlow" w:cs="Barlow"/>
                 <w:b w:val="0"/>
                 <w:i w:val="0"/>
-                <w:sz w:val="17"/>
+                <w:sz w:val="16"/>
               </w:rPr>
-              <w:t>BRIDGE-VISUALS.txt</w:t>
+              <w:t>FILE-INDEX.docx</w:t>
             </w:r>
           </w:p>
         </w:tc>
         <w:tc>
           <w:tcPr>
-            <w:tcW w:type="dxa" w:w="5328"/>
+            <w:tcW w:type="dxa" w:w="5400"/>
           </w:tcPr>
           <w:p>
             <w:pPr>
@@ -226,215 +226,9 @@
                 <w:rFonts w:ascii="Barlow" w:hAnsi="Barlow" w:cs="Barlow"/>
                 <w:b w:val="0"/>
                 <w:i w:val="0"/>
-                <w:sz w:val="17"/>
+                <w:sz w:val="16"/>
               </w:rPr>
-              <w:t>Four primary bridge assets, optional locator, usage notes</w:t>
-            </w:r>
-          </w:p>
-        </w:tc>
-      </w:tr>
-      <w:tr>
-        <w:tc>
-          <w:tcPr>
-            <w:tcW w:type="dxa" w:w="4608"/>
-            <w:shd w:val="clear" w:color="auto" w:fill="F4F6F8"/>
-          </w:tcPr>
-          <w:p>
-            <w:pPr>
-              <w:spacing w:before="20" w:after="20" w:line="252" w:lineRule="auto"/>
-            </w:pPr>
-            <w:r>
-              <w:rPr>
-                <w:rFonts w:ascii="Barlow" w:hAnsi="Barlow" w:cs="Barlow"/>
-                <w:b w:val="0"/>
-                <w:i w:val="0"/>
-                <w:sz w:val="17"/>
-              </w:rPr>
-              <w:t>why-this-way.html</w:t>
-            </w:r>
-          </w:p>
-        </w:tc>
-        <w:tc>
-          <w:tcPr>
-            <w:tcW w:type="dxa" w:w="5328"/>
-            <w:shd w:val="clear" w:color="auto" w:fill="F4F6F8"/>
-          </w:tcPr>
-          <w:p>
-            <w:pPr>
-              <w:spacing w:before="20" w:after="20" w:line="252" w:lineRule="auto"/>
-            </w:pPr>
-            <w:r>
-              <w:rPr>
-                <w:rFonts w:ascii="Barlow" w:hAnsi="Barlow" w:cs="Barlow"/>
-                <w:b w:val="0"/>
-                <w:i w:val="0"/>
-                <w:sz w:val="17"/>
-              </w:rPr>
-              <w:t>Faculty briefing: rationale, benefits, outcomes, assessment and Q&amp;A</w:t>
-            </w:r>
-          </w:p>
-        </w:tc>
-      </w:tr>
-      <w:tr>
-        <w:tc>
-          <w:tcPr>
-            <w:tcW w:type="dxa" w:w="4608"/>
-          </w:tcPr>
-          <w:p>
-            <w:pPr>
-              <w:spacing w:before="20" w:after="20" w:line="252" w:lineRule="auto"/>
-            </w:pPr>
-            <w:r>
-              <w:rPr>
-                <w:rFonts w:ascii="Barlow" w:hAnsi="Barlow" w:cs="Barlow"/>
-                <w:b w:val="0"/>
-                <w:i w:val="0"/>
-                <w:sz w:val="17"/>
-              </w:rPr>
-              <w:t>run-of-day/index.html</w:t>
-            </w:r>
-          </w:p>
-        </w:tc>
-        <w:tc>
-          <w:tcPr>
-            <w:tcW w:type="dxa" w:w="5328"/>
-          </w:tcPr>
-          <w:p>
-            <w:pPr>
-              <w:spacing w:before="20" w:after="20" w:line="252" w:lineRule="auto"/>
-            </w:pPr>
-            <w:r>
-              <w:rPr>
-                <w:rFonts w:ascii="Barlow" w:hAnsi="Barlow" w:cs="Barlow"/>
-                <w:b w:val="0"/>
-                <w:i w:val="0"/>
-                <w:sz w:val="17"/>
-              </w:rPr>
-              <w:t>Newsletter-style podium desk linking M01–M03</w:t>
-            </w:r>
-          </w:p>
-        </w:tc>
-      </w:tr>
-      <w:tr>
-        <w:tc>
-          <w:tcPr>
-            <w:tcW w:type="dxa" w:w="4608"/>
-            <w:shd w:val="clear" w:color="auto" w:fill="F4F6F8"/>
-          </w:tcPr>
-          <w:p>
-            <w:pPr>
-              <w:spacing w:before="20" w:after="20" w:line="252" w:lineRule="auto"/>
-            </w:pPr>
-            <w:r>
-              <w:rPr>
-                <w:rFonts w:ascii="Barlow" w:hAnsi="Barlow" w:cs="Barlow"/>
-                <w:b w:val="0"/>
-                <w:i w:val="0"/>
-                <w:sz w:val="17"/>
-              </w:rPr>
-              <w:t>run-of-day/M01-run-of-day.html</w:t>
-            </w:r>
-          </w:p>
-        </w:tc>
-        <w:tc>
-          <w:tcPr>
-            <w:tcW w:type="dxa" w:w="5328"/>
-            <w:shd w:val="clear" w:color="auto" w:fill="F4F6F8"/>
-          </w:tcPr>
-          <w:p>
-            <w:pPr>
-              <w:spacing w:before="20" w:after="20" w:line="252" w:lineRule="auto"/>
-            </w:pPr>
-            <w:r>
-              <w:rPr>
-                <w:rFonts w:ascii="Barlow" w:hAnsi="Barlow" w:cs="Barlow"/>
-                <w:b w:val="0"/>
-                <w:i w:val="0"/>
-                <w:sz w:val="17"/>
-              </w:rPr>
-              <w:t>Exact slides, script and handouts for M01</w:t>
-            </w:r>
-          </w:p>
-        </w:tc>
-      </w:tr>
-      <w:tr>
-        <w:tc>
-          <w:tcPr>
-            <w:tcW w:type="dxa" w:w="4608"/>
-          </w:tcPr>
-          <w:p>
-            <w:pPr>
-              <w:spacing w:before="20" w:after="20" w:line="252" w:lineRule="auto"/>
-            </w:pPr>
-            <w:r>
-              <w:rPr>
-                <w:rFonts w:ascii="Barlow" w:hAnsi="Barlow" w:cs="Barlow"/>
-                <w:b w:val="0"/>
-                <w:i w:val="0"/>
-                <w:sz w:val="17"/>
-              </w:rPr>
-              <w:t>run-of-day/M02-run-of-day.html</w:t>
-            </w:r>
-          </w:p>
-        </w:tc>
-        <w:tc>
-          <w:tcPr>
-            <w:tcW w:type="dxa" w:w="5328"/>
-          </w:tcPr>
-          <w:p>
-            <w:pPr>
-              <w:spacing w:before="20" w:after="20" w:line="252" w:lineRule="auto"/>
-            </w:pPr>
-            <w:r>
-              <w:rPr>
-                <w:rFonts w:ascii="Barlow" w:hAnsi="Barlow" w:cs="Barlow"/>
-                <w:b w:val="0"/>
-                <w:i w:val="0"/>
-                <w:sz w:val="17"/>
-              </w:rPr>
-              <w:t>Spoiler-safe deck switch, G6 reveal and Case B</w:t>
-            </w:r>
-          </w:p>
-        </w:tc>
-      </w:tr>
-      <w:tr>
-        <w:tc>
-          <w:tcPr>
-            <w:tcW w:type="dxa" w:w="4608"/>
-            <w:shd w:val="clear" w:color="auto" w:fill="F4F6F8"/>
-          </w:tcPr>
-          <w:p>
-            <w:pPr>
-              <w:spacing w:before="20" w:after="20" w:line="252" w:lineRule="auto"/>
-            </w:pPr>
-            <w:r>
-              <w:rPr>
-                <w:rFonts w:ascii="Barlow" w:hAnsi="Barlow" w:cs="Barlow"/>
-                <w:b w:val="0"/>
-                <w:i w:val="0"/>
-                <w:sz w:val="17"/>
-              </w:rPr>
-              <w:t>run-of-day/M03-run-of-day.html</w:t>
-            </w:r>
-          </w:p>
-        </w:tc>
-        <w:tc>
-          <w:tcPr>
-            <w:tcW w:type="dxa" w:w="5328"/>
-            <w:shd w:val="clear" w:color="auto" w:fill="F4F6F8"/>
-          </w:tcPr>
-          <w:p>
-            <w:pPr>
-              <w:spacing w:before="20" w:after="20" w:line="252" w:lineRule="auto"/>
-            </w:pPr>
-            <w:r>
-              <w:rPr>
-                <w:rFonts w:ascii="Barlow" w:hAnsi="Barlow" w:cs="Barlow"/>
-                <w:b w:val="0"/>
-                <w:i w:val="0"/>
-                <w:sz w:val="17"/>
-              </w:rPr>
-              <w:t>Exact slides, source-check script and reveals</w:t>
+              <w:t>This generated index</w:t>
             </w:r>
           </w:p>
         </w:tc>
@@ -454,7 +248,7 @@
           <w:caps w:val="1"/>
           <w:spacing w:val="12"/>
         </w:rPr>
-        <w:t>01-BRAND-KIT</w:t>
+        <w:t>09-M05-overnight-alarm (PR #9 dependency)</w:t>
       </w:r>
     </w:p>
     <w:tbl>
@@ -478,7 +272,7 @@
       <w:tr>
         <w:tc>
           <w:tcPr>
-            <w:tcW w:type="dxa" w:w="4608"/>
+            <w:tcW w:type="dxa" w:w="4536"/>
             <w:shd w:val="clear" w:color="auto" w:fill="1F3A5F"/>
           </w:tcPr>
           <w:p>
@@ -491,7 +285,7 @@
                 <w:b/>
                 <w:i w:val="0"/>
                 <w:color w:val="FFFFFF"/>
-                <w:sz w:val="17"/>
+                <w:sz w:val="16"/>
               </w:rPr>
               <w:t>File</w:t>
             </w:r>
@@ -499,7 +293,7 @@
         </w:tc>
         <w:tc>
           <w:tcPr>
-            <w:tcW w:type="dxa" w:w="5328"/>
+            <w:tcW w:type="dxa" w:w="5400"/>
             <w:shd w:val="clear" w:color="auto" w:fill="1F3A5F"/>
           </w:tcPr>
           <w:p>
@@ -512,7 +306,7 @@
                 <w:b/>
                 <w:i w:val="0"/>
                 <w:color w:val="FFFFFF"/>
-                <w:sz w:val="17"/>
+                <w:sz w:val="16"/>
               </w:rPr>
               <w:t>What it is</w:t>
             </w:r>
@@ -522,7 +316,7 @@
       <w:tr>
         <w:tc>
           <w:tcPr>
-            <w:tcW w:type="dxa" w:w="4608"/>
+            <w:tcW w:type="dxa" w:w="4536"/>
           </w:tcPr>
           <w:p>
             <w:pPr>
@@ -533,15 +327,15 @@
                 <w:rFonts w:ascii="Barlow" w:hAnsi="Barlow" w:cs="Barlow"/>
                 <w:b w:val="0"/>
                 <w:i w:val="0"/>
-                <w:sz w:val="17"/>
+                <w:sz w:val="16"/>
               </w:rPr>
-              <w:t>ACMEJOB-brand-kit.zip</w:t>
+              <w:t>feed.csv + run log + threshold_config.csv</w:t>
             </w:r>
           </w:p>
         </w:tc>
         <w:tc>
           <w:tcPr>
-            <w:tcW w:type="dxa" w:w="5328"/>
+            <w:tcW w:type="dxa" w:w="5400"/>
           </w:tcPr>
           <w:p>
             <w:pPr>
@@ -552,51 +346,9 @@
                 <w:rFonts w:ascii="Barlow" w:hAnsi="Barlow" w:cs="Barlow"/>
                 <w:b w:val="0"/>
                 <w:i w:val="0"/>
-                <w:sz w:val="17"/>
+                <w:sz w:val="16"/>
               </w:rPr>
-              <w:t>Hand this to students. Fonts, logos, templates, brand guide</w:t>
-            </w:r>
-          </w:p>
-        </w:tc>
-      </w:tr>
-      <w:tr>
-        <w:tc>
-          <w:tcPr>
-            <w:tcW w:type="dxa" w:w="4608"/>
-            <w:shd w:val="clear" w:color="auto" w:fill="F4F6F8"/>
-          </w:tcPr>
-          <w:p>
-            <w:pPr>
-              <w:spacing w:before="20" w:after="20" w:line="252" w:lineRule="auto"/>
-            </w:pPr>
-            <w:r>
-              <w:rPr>
-                <w:rFonts w:ascii="Barlow" w:hAnsi="Barlow" w:cs="Barlow"/>
-                <w:b w:val="0"/>
-                <w:i w:val="0"/>
-                <w:sz w:val="17"/>
-              </w:rPr>
-              <w:t>(unzipped copy)</w:t>
-            </w:r>
-          </w:p>
-        </w:tc>
-        <w:tc>
-          <w:tcPr>
-            <w:tcW w:type="dxa" w:w="5328"/>
-            <w:shd w:val="clear" w:color="auto" w:fill="F4F6F8"/>
-          </w:tcPr>
-          <w:p>
-            <w:pPr>
-              <w:spacing w:before="20" w:after="20" w:line="252" w:lineRule="auto"/>
-            </w:pPr>
-            <w:r>
-              <w:rPr>
-                <w:rFonts w:ascii="Barlow" w:hAnsi="Barlow" w:cs="Barlow"/>
-                <w:b w:val="0"/>
-                <w:i w:val="0"/>
-                <w:sz w:val="17"/>
-              </w:rPr>
-              <w:t>Same contents, for you to look through</w:t>
+              <w:t>The chain and unresolved event audited in M06</w:t>
             </w:r>
           </w:p>
         </w:tc>
@@ -616,7 +368,7 @@
           <w:caps w:val="1"/>
           <w:spacing w:val="12"/>
         </w:rPr>
-        <w:t>02-M01-first-day</w:t>
+        <w:t>10-M06-alarm-audit</w:t>
       </w:r>
     </w:p>
     <w:tbl>
@@ -640,7 +392,7 @@
       <w:tr>
         <w:tc>
           <w:tcPr>
-            <w:tcW w:type="dxa" w:w="4608"/>
+            <w:tcW w:type="dxa" w:w="4536"/>
             <w:shd w:val="clear" w:color="auto" w:fill="1F3A5F"/>
           </w:tcPr>
           <w:p>
@@ -653,7 +405,7 @@
                 <w:b/>
                 <w:i w:val="0"/>
                 <w:color w:val="FFFFFF"/>
-                <w:sz w:val="17"/>
+                <w:sz w:val="16"/>
               </w:rPr>
               <w:t>File</w:t>
             </w:r>
@@ -661,7 +413,7 @@
         </w:tc>
         <w:tc>
           <w:tcPr>
-            <w:tcW w:type="dxa" w:w="5328"/>
+            <w:tcW w:type="dxa" w:w="5400"/>
             <w:shd w:val="clear" w:color="auto" w:fill="1F3A5F"/>
           </w:tcPr>
           <w:p>
@@ -674,7 +426,7 @@
                 <w:b/>
                 <w:i w:val="0"/>
                 <w:color w:val="FFFFFF"/>
-                <w:sz w:val="17"/>
+                <w:sz w:val="16"/>
               </w:rPr>
               <w:t>What it is</w:t>
             </w:r>
@@ -684,7 +436,7 @@
       <w:tr>
         <w:tc>
           <w:tcPr>
-            <w:tcW w:type="dxa" w:w="4608"/>
+            <w:tcW w:type="dxa" w:w="4536"/>
           </w:tcPr>
           <w:p>
             <w:pPr>
@@ -695,15 +447,15 @@
                 <w:rFonts w:ascii="Barlow" w:hAnsi="Barlow" w:cs="Barlow"/>
                 <w:b w:val="0"/>
                 <w:i w:val="0"/>
-                <w:sz w:val="17"/>
+                <w:sz w:val="16"/>
               </w:rPr>
-              <w:t>M01-slides-first-day.pptx</w:t>
+              <w:t>M06-student.pptx</w:t>
             </w:r>
           </w:p>
         </w:tc>
         <w:tc>
           <w:tcPr>
-            <w:tcW w:type="dxa" w:w="5328"/>
+            <w:tcW w:type="dxa" w:w="5400"/>
           </w:tcPr>
           <w:p>
             <w:pPr>
@@ -714,9 +466,9 @@
                 <w:rFonts w:ascii="Barlow" w:hAnsi="Barlow" w:cs="Barlow"/>
                 <w:b w:val="0"/>
                 <w:i w:val="0"/>
-                <w:sz w:val="17"/>
+                <w:sz w:val="16"/>
               </w:rPr>
-              <w:t>24 slides</w:t>
+              <w:t>Spoiler-safe 13-slide hunt deck</w:t>
             </w:r>
           </w:p>
         </w:tc>
@@ -724,7 +476,7 @@
       <w:tr>
         <w:tc>
           <w:tcPr>
-            <w:tcW w:type="dxa" w:w="4608"/>
+            <w:tcW w:type="dxa" w:w="4536"/>
             <w:shd w:val="clear" w:color="auto" w:fill="F4F6F8"/>
           </w:tcPr>
           <w:p>
@@ -736,15 +488,15 @@
                 <w:rFonts w:ascii="Barlow" w:hAnsi="Barlow" w:cs="Barlow"/>
                 <w:b w:val="0"/>
                 <w:i w:val="0"/>
-                <w:sz w:val="17"/>
+                <w:sz w:val="16"/>
               </w:rPr>
-              <w:t>H1-01-orientation-memo-halvorsen.docx</w:t>
+              <w:t>M06-instructor-reveal.pptx</w:t>
             </w:r>
           </w:p>
         </w:tc>
         <w:tc>
           <w:tcPr>
-            <w:tcW w:type="dxa" w:w="5328"/>
+            <w:tcW w:type="dxa" w:w="5400"/>
             <w:shd w:val="clear" w:color="auto" w:fill="F4F6F8"/>
           </w:tcPr>
           <w:p>
@@ -756,9 +508,9 @@
                 <w:rFonts w:ascii="Barlow" w:hAnsi="Barlow" w:cs="Barlow"/>
                 <w:b w:val="0"/>
                 <w:i w:val="0"/>
-                <w:sz w:val="17"/>
+                <w:sz w:val="16"/>
               </w:rPr>
-              <w:t>Diane's memo — project or read aloud</w:t>
+              <w:t>Gated 7-slide conclusion and Unit 1 close</w:t>
             </w:r>
           </w:p>
         </w:tc>
@@ -766,7 +518,7 @@
       <w:tr>
         <w:tc>
           <w:tcPr>
-            <w:tcW w:type="dxa" w:w="4608"/>
+            <w:tcW w:type="dxa" w:w="4536"/>
           </w:tcPr>
           <w:p>
             <w:pPr>
@@ -777,15 +529,15 @@
                 <w:rFonts w:ascii="Barlow" w:hAnsi="Barlow" w:cs="Barlow"/>
                 <w:b w:val="0"/>
                 <w:i w:val="0"/>
-                <w:sz w:val="17"/>
+                <w:sz w:val="16"/>
               </w:rPr>
-              <w:t>H1-02-load-rating-sheet.docx</w:t>
+              <w:t>H6-01-FOREMAN-alarm-disposition.docx</w:t>
             </w:r>
           </w:p>
         </w:tc>
         <w:tc>
           <w:tcPr>
-            <w:tcW w:type="dxa" w:w="5328"/>
+            <w:tcW w:type="dxa" w:w="5400"/>
           </w:tcPr>
           <w:p>
             <w:pPr>
@@ -796,9 +548,9 @@
                 <w:rFonts w:ascii="Barlow" w:hAnsi="Barlow" w:cs="Barlow"/>
                 <w:b w:val="0"/>
                 <w:i w:val="0"/>
-                <w:sz w:val="17"/>
+                <w:sz w:val="16"/>
               </w:rPr>
-              <w:t>The rule. Worked G-3, blank G-4</w:t>
+              <w:t>FOREMAN's normality / sensor-fault reversal</w:t>
             </w:r>
           </w:p>
         </w:tc>
@@ -806,7 +558,7 @@
       <w:tr>
         <w:tc>
           <w:tcPr>
-            <w:tcW w:type="dxa" w:w="4608"/>
+            <w:tcW w:type="dxa" w:w="4536"/>
             <w:shd w:val="clear" w:color="auto" w:fill="F4F6F8"/>
           </w:tcPr>
           <w:p>
@@ -818,15 +570,15 @@
                 <w:rFonts w:ascii="Barlow" w:hAnsi="Barlow" w:cs="Barlow"/>
                 <w:b w:val="0"/>
                 <w:i w:val="0"/>
-                <w:sz w:val="17"/>
+                <w:sz w:val="16"/>
               </w:rPr>
-              <w:t>H1-03-foreman-deck-assessment.docx</w:t>
+              <w:t>H6-02-distribution-and-chain-audit.docx</w:t>
             </w:r>
           </w:p>
         </w:tc>
         <w:tc>
           <w:tcPr>
-            <w:tcW w:type="dxa" w:w="5328"/>
+            <w:tcW w:type="dxa" w:w="5400"/>
             <w:shd w:val="clear" w:color="auto" w:fill="F4F6F8"/>
           </w:tcPr>
           <w:p>
@@ -838,9 +590,9 @@
                 <w:rFonts w:ascii="Barlow" w:hAnsi="Barlow" w:cs="Barlow"/>
                 <w:b w:val="0"/>
                 <w:i w:val="0"/>
-                <w:sz w:val="17"/>
+                <w:sz w:val="16"/>
               </w:rPr>
-              <w:t>FOREMAN's six panel ratings</w:t>
+              <w:t>Histogram, pipeline, and reasoning audit</w:t>
             </w:r>
           </w:p>
         </w:tc>
@@ -848,7 +600,7 @@
       <w:tr>
         <w:tc>
           <w:tcPr>
-            <w:tcW w:type="dxa" w:w="4608"/>
+            <w:tcW w:type="dxa" w:w="4536"/>
           </w:tcPr>
           <w:p>
             <w:pPr>
@@ -859,15 +611,15 @@
                 <w:rFonts w:ascii="Barlow" w:hAnsi="Barlow" w:cs="Barlow"/>
                 <w:b w:val="0"/>
                 <w:i w:val="0"/>
-                <w:sz w:val="17"/>
+                <w:sz w:val="16"/>
               </w:rPr>
-              <w:t>H1-04-deck-panel-history-2019.docx</w:t>
+              <w:t>H6-03-decision-log-and-unit-debrief.docx</w:t>
             </w:r>
           </w:p>
         </w:tc>
         <w:tc>
           <w:tcPr>
-            <w:tcW w:type="dxa" w:w="5328"/>
+            <w:tcW w:type="dxa" w:w="5400"/>
           </w:tcPr>
           <w:p>
             <w:pPr>
@@ -878,9 +630,9 @@
                 <w:rFonts w:ascii="Barlow" w:hAnsi="Barlow" w:cs="Barlow"/>
                 <w:b w:val="0"/>
                 <w:i w:val="0"/>
-                <w:sz w:val="17"/>
+                <w:sz w:val="16"/>
               </w:rPr>
-              <w:t>Diane's 2019 field ratings, same panels</w:t>
+              <w:t>Hand-in and mask-off prompts</w:t>
             </w:r>
           </w:p>
         </w:tc>
@@ -888,7 +640,7 @@
       <w:tr>
         <w:tc>
           <w:tcPr>
-            <w:tcW w:type="dxa" w:w="4608"/>
+            <w:tcW w:type="dxa" w:w="4536"/>
             <w:shd w:val="clear" w:color="auto" w:fill="F4F6F8"/>
           </w:tcPr>
           <w:p>
@@ -900,15 +652,15 @@
                 <w:rFonts w:ascii="Barlow" w:hAnsi="Barlow" w:cs="Barlow"/>
                 <w:b w:val="0"/>
                 <w:i w:val="0"/>
-                <w:sz w:val="17"/>
+                <w:sz w:val="16"/>
               </w:rPr>
-              <w:t>H1-05-task-sort-activity.docx</w:t>
+              <w:t>H6-04-Wes-gauge-file-handoff.docx</w:t>
             </w:r>
           </w:p>
         </w:tc>
         <w:tc>
           <w:tcPr>
-            <w:tcW w:type="dxa" w:w="5328"/>
+            <w:tcW w:type="dxa" w:w="5400"/>
             <w:shd w:val="clear" w:color="auto" w:fill="F4F6F8"/>
           </w:tcPr>
           <w:p>
@@ -920,9 +672,9 @@
                 <w:rFonts w:ascii="Barlow" w:hAnsi="Barlow" w:cs="Barlow"/>
                 <w:b w:val="0"/>
                 <w:i w:val="0"/>
-                <w:sz w:val="17"/>
+                <w:sz w:val="16"/>
               </w:rPr>
-              <w:t>Nine tasks to sort</w:t>
+              <w:t>Explicit student-to-Wes cover record</w:t>
             </w:r>
           </w:p>
         </w:tc>
@@ -930,7 +682,7 @@
       <w:tr>
         <w:tc>
           <w:tcPr>
-            <w:tcW w:type="dxa" w:w="4608"/>
+            <w:tcW w:type="dxa" w:w="4536"/>
           </w:tcPr>
           <w:p>
             <w:pPr>
@@ -941,15 +693,15 @@
                 <w:rFonts w:ascii="Barlow" w:hAnsi="Barlow" w:cs="Barlow"/>
                 <w:b w:val="0"/>
                 <w:i w:val="0"/>
-                <w:sz w:val="17"/>
+                <w:sz w:val="16"/>
               </w:rPr>
-              <w:t>H1-06-note-v1-template-rubric.docx</w:t>
+              <w:t>M06-gauge-audit-and-handoff.xlsx</w:t>
             </w:r>
           </w:p>
         </w:tc>
         <w:tc>
           <w:tcPr>
-            <w:tcW w:type="dxa" w:w="5328"/>
+            <w:tcW w:type="dxa" w:w="5400"/>
           </w:tcPr>
           <w:p>
             <w:pPr>
@@ -960,9 +712,9 @@
                 <w:rFonts w:ascii="Barlow" w:hAnsi="Barlow" w:cs="Barlow"/>
                 <w:b w:val="0"/>
                 <w:i w:val="0"/>
-                <w:sz w:val="17"/>
+                <w:sz w:val="16"/>
               </w:rPr>
-              <w:t>The note, and how it is graded</w:t>
+              <w:t>Student workbook handed to Wes; retain for M25</w:t>
             </w:r>
           </w:p>
         </w:tc>
@@ -970,7 +722,7 @@
       <w:tr>
         <w:tc>
           <w:tcPr>
-            <w:tcW w:type="dxa" w:w="4608"/>
+            <w:tcW w:type="dxa" w:w="4536"/>
             <w:shd w:val="clear" w:color="auto" w:fill="F4F6F8"/>
           </w:tcPr>
           <w:p>
@@ -982,15 +734,15 @@
                 <w:rFonts w:ascii="Barlow" w:hAnsi="Barlow" w:cs="Barlow"/>
                 <w:b w:val="0"/>
                 <w:i w:val="0"/>
-                <w:sz w:val="17"/>
+                <w:sz w:val="16"/>
               </w:rPr>
-              <w:t>KEY-M01-answer-key.docx</w:t>
+              <w:t>traffic_counts.csv</w:t>
             </w:r>
           </w:p>
         </w:tc>
         <w:tc>
           <w:tcPr>
-            <w:tcW w:type="dxa" w:w="5328"/>
+            <w:tcW w:type="dxa" w:w="5400"/>
             <w:shd w:val="clear" w:color="auto" w:fill="F4F6F8"/>
           </w:tcPr>
           <w:p>
@@ -1002,89 +754,9 @@
                 <w:rFonts w:ascii="Barlow" w:hAnsi="Barlow" w:cs="Barlow"/>
                 <w:b w:val="0"/>
                 <w:i w:val="0"/>
-                <w:sz w:val="17"/>
+                <w:sz w:val="16"/>
               </w:rPr>
-              <w:t>Answers and teaching notes</w:t>
-            </w:r>
-          </w:p>
-        </w:tc>
-      </w:tr>
-    </w:tbl>
-    <w:p>
-      <w:pPr>
-        <w:spacing w:before="260" w:after="80" w:line="240" w:lineRule="auto"/>
-      </w:pPr>
-      <w:r>
-        <w:rPr>
-          <w:rFonts w:ascii="Barlow Condensed" w:hAnsi="Barlow Condensed" w:cs="Barlow Condensed"/>
-          <w:b/>
-          <w:i w:val="0"/>
-          <w:color w:val="1F3A5F"/>
-          <w:sz w:val="25"/>
-          <w:caps w:val="1"/>
-          <w:spacing w:val="12"/>
-        </w:rPr>
-        <w:t>03-M02-measurement</w:t>
-      </w:r>
-    </w:p>
-    <w:tbl>
-      <w:tblPr>
-        <w:tblStyle w:val="TableGrid"/>
-        <w:tblW w:type="auto" w:w="0"/>
-        <w:jc w:val="left"/>
-        <w:tblLook w:firstColumn="1" w:firstRow="1" w:lastColumn="0" w:lastRow="0" w:noHBand="0" w:noVBand="1" w:val="04A0"/>
-        <w:tblLayout w:type="fixed"/>
-        <w:tblCellMar>
-          <w:top w:w="60" w:type="dxa"/>
-          <w:left w:w="110" w:type="dxa"/>
-          <w:bottom w:w="60" w:type="dxa"/>
-          <w:right w:w="110" w:type="dxa"/>
-        </w:tblCellMar>
-      </w:tblPr>
-      <w:tblGrid>
-        <w:gridCol w:w="4968"/>
-        <w:gridCol w:w="4968"/>
-      </w:tblGrid>
-      <w:tr>
-        <w:tc>
-          <w:tcPr>
-            <w:tcW w:type="dxa" w:w="4608"/>
-            <w:shd w:val="clear" w:color="auto" w:fill="1F3A5F"/>
-          </w:tcPr>
-          <w:p>
-            <w:pPr>
-              <w:spacing w:before="20" w:after="20" w:line="252" w:lineRule="auto"/>
-            </w:pPr>
-            <w:r>
-              <w:rPr>
-                <w:rFonts w:ascii="Barlow Condensed" w:hAnsi="Barlow Condensed" w:cs="Barlow Condensed"/>
-                <w:b/>
-                <w:i w:val="0"/>
-                <w:color w:val="FFFFFF"/>
-                <w:sz w:val="17"/>
-              </w:rPr>
-              <w:t>File</w:t>
-            </w:r>
-          </w:p>
-        </w:tc>
-        <w:tc>
-          <w:tcPr>
-            <w:tcW w:type="dxa" w:w="5328"/>
-            <w:shd w:val="clear" w:color="auto" w:fill="1F3A5F"/>
-          </w:tcPr>
-          <w:p>
-            <w:pPr>
-              <w:spacing w:before="20" w:after="20" w:line="252" w:lineRule="auto"/>
-            </w:pPr>
-            <w:r>
-              <w:rPr>
-                <w:rFonts w:ascii="Barlow Condensed" w:hAnsi="Barlow Condensed" w:cs="Barlow Condensed"/>
-                <w:b/>
-                <w:i w:val="0"/>
-                <w:color w:val="FFFFFF"/>
-                <w:sz w:val="17"/>
-              </w:rPr>
-              <w:t>What it is</w:t>
+              <w:t>Independent 03:00 event record</w:t>
             </w:r>
           </w:p>
         </w:tc>
@@ -1092,7 +764,7 @@
       <w:tr>
         <w:tc>
           <w:tcPr>
-            <w:tcW w:type="dxa" w:w="4608"/>
+            <w:tcW w:type="dxa" w:w="4536"/>
           </w:tcPr>
           <w:p>
             <w:pPr>
@@ -1103,15 +775,15 @@
                 <w:rFonts w:ascii="Barlow" w:hAnsi="Barlow" w:cs="Barlow"/>
                 <w:b w:val="0"/>
                 <w:i w:val="0"/>
-                <w:sz w:val="17"/>
+                <w:sz w:val="16"/>
               </w:rPr>
-              <w:t>M02-student.pptx</w:t>
+              <w:t>KEY-M06-answer-key.docx</w:t>
             </w:r>
           </w:p>
         </w:tc>
         <w:tc>
           <w:tcPr>
-            <w:tcW w:type="dxa" w:w="5328"/>
+            <w:tcW w:type="dxa" w:w="5400"/>
           </w:tcPr>
           <w:p>
             <w:pPr>
@@ -1122,1191 +794,9 @@
                 <w:rFonts w:ascii="Barlow" w:hAnsi="Barlow" w:cs="Barlow"/>
                 <w:b w:val="0"/>
                 <w:i w:val="0"/>
-                <w:sz w:val="17"/>
+                <w:sz w:val="16"/>
               </w:rPr>
-              <w:t>11 slides — project first; contains no gauge answer tables</w:t>
-            </w:r>
-          </w:p>
-        </w:tc>
-      </w:tr>
-      <w:tr>
-        <w:tc>
-          <w:tcPr>
-            <w:tcW w:type="dxa" w:w="4608"/>
-            <w:shd w:val="clear" w:color="auto" w:fill="F4F6F8"/>
-          </w:tcPr>
-          <w:p>
-            <w:pPr>
-              <w:spacing w:before="20" w:after="20" w:line="252" w:lineRule="auto"/>
-            </w:pPr>
-            <w:r>
-              <w:rPr>
-                <w:rFonts w:ascii="Barlow" w:hAnsi="Barlow" w:cs="Barlow"/>
-                <w:b w:val="0"/>
-                <w:i w:val="0"/>
-                <w:sz w:val="17"/>
-              </w:rPr>
-              <w:t>M02-instructor-reveal.pptx</w:t>
-            </w:r>
-          </w:p>
-        </w:tc>
-        <w:tc>
-          <w:tcPr>
-            <w:tcW w:type="dxa" w:w="5328"/>
-            <w:shd w:val="clear" w:color="auto" w:fill="F4F6F8"/>
-          </w:tcPr>
-          <w:p>
-            <w:pPr>
-              <w:spacing w:before="20" w:after="20" w:line="252" w:lineRule="auto"/>
-            </w:pPr>
-            <w:r>
-              <w:rPr>
-                <w:rFonts w:ascii="Barlow" w:hAnsi="Barlow" w:cs="Barlow"/>
-                <w:b w:val="0"/>
-                <w:i w:val="0"/>
-                <w:sz w:val="17"/>
-              </w:rPr>
-              <w:t>9 slides — keep closed until after students struggle</w:t>
-            </w:r>
-          </w:p>
-        </w:tc>
-      </w:tr>
-      <w:tr>
-        <w:tc>
-          <w:tcPr>
-            <w:tcW w:type="dxa" w:w="4608"/>
-          </w:tcPr>
-          <w:p>
-            <w:pPr>
-              <w:spacing w:before="20" w:after="20" w:line="252" w:lineRule="auto"/>
-            </w:pPr>
-            <w:r>
-              <w:rPr>
-                <w:rFonts w:ascii="Barlow" w:hAnsi="Barlow" w:cs="Barlow"/>
-                <w:b w:val="0"/>
-                <w:i w:val="0"/>
-                <w:sz w:val="17"/>
-              </w:rPr>
-              <w:t>H2-01-measurement-lab.docx</w:t>
-            </w:r>
-          </w:p>
-        </w:tc>
-        <w:tc>
-          <w:tcPr>
-            <w:tcW w:type="dxa" w:w="5328"/>
-          </w:tcPr>
-          <w:p>
-            <w:pPr>
-              <w:spacing w:before="20" w:after="20" w:line="252" w:lineRule="auto"/>
-            </w:pPr>
-            <w:r>
-              <w:rPr>
-                <w:rFonts w:ascii="Barlow" w:hAnsi="Barlow" w:cs="Barlow"/>
-                <w:b w:val="0"/>
-                <w:i w:val="0"/>
-                <w:sz w:val="17"/>
-              </w:rPr>
-              <w:t>The lab, with ruler and no-instrument fallbacks</w:t>
-            </w:r>
-          </w:p>
-        </w:tc>
-      </w:tr>
-      <w:tr>
-        <w:tc>
-          <w:tcPr>
-            <w:tcW w:type="dxa" w:w="4608"/>
-            <w:shd w:val="clear" w:color="auto" w:fill="F4F6F8"/>
-          </w:tcPr>
-          <w:p>
-            <w:pPr>
-              <w:spacing w:before="20" w:after="20" w:line="252" w:lineRule="auto"/>
-            </w:pPr>
-            <w:r>
-              <w:rPr>
-                <w:rFonts w:ascii="Barlow" w:hAnsi="Barlow" w:cs="Barlow"/>
-                <w:b w:val="0"/>
-                <w:i w:val="0"/>
-                <w:sz w:val="17"/>
-              </w:rPr>
-              <w:t>H2-02-sensor-installation-record.docx</w:t>
-            </w:r>
-          </w:p>
-        </w:tc>
-        <w:tc>
-          <w:tcPr>
-            <w:tcW w:type="dxa" w:w="5328"/>
-            <w:shd w:val="clear" w:color="auto" w:fill="F4F6F8"/>
-          </w:tcPr>
-          <w:p>
-            <w:pPr>
-              <w:spacing w:before="20" w:after="20" w:line="252" w:lineRule="auto"/>
-            </w:pPr>
-            <w:r>
-              <w:rPr>
-                <w:rFonts w:ascii="Barlow" w:hAnsi="Barlow" w:cs="Barlow"/>
-                <w:b w:val="0"/>
-                <w:i w:val="0"/>
-                <w:sz w:val="17"/>
-              </w:rPr>
-              <w:t>The install record, with Wes's margin note</w:t>
-            </w:r>
-          </w:p>
-        </w:tc>
-      </w:tr>
-      <w:tr>
-        <w:tc>
-          <w:tcPr>
-            <w:tcW w:type="dxa" w:w="4608"/>
-          </w:tcPr>
-          <w:p>
-            <w:pPr>
-              <w:spacing w:before="20" w:after="20" w:line="252" w:lineRule="auto"/>
-            </w:pPr>
-            <w:r>
-              <w:rPr>
-                <w:rFonts w:ascii="Barlow" w:hAnsi="Barlow" w:cs="Barlow"/>
-                <w:b w:val="0"/>
-                <w:i w:val="0"/>
-                <w:sz w:val="17"/>
-              </w:rPr>
-              <w:t>H2-03-foreman-baseline-check.docx</w:t>
-            </w:r>
-          </w:p>
-        </w:tc>
-        <w:tc>
-          <w:tcPr>
-            <w:tcW w:type="dxa" w:w="5328"/>
-          </w:tcPr>
-          <w:p>
-            <w:pPr>
-              <w:spacing w:before="20" w:after="20" w:line="252" w:lineRule="auto"/>
-            </w:pPr>
-            <w:r>
-              <w:rPr>
-                <w:rFonts w:ascii="Barlow" w:hAnsi="Barlow" w:cs="Barlow"/>
-                <w:b w:val="0"/>
-                <w:i w:val="0"/>
-                <w:sz w:val="17"/>
-              </w:rPr>
-              <w:t>FOREMAN's PASS</w:t>
-            </w:r>
-          </w:p>
-        </w:tc>
-      </w:tr>
-      <w:tr>
-        <w:tc>
-          <w:tcPr>
-            <w:tcW w:type="dxa" w:w="4608"/>
-            <w:shd w:val="clear" w:color="auto" w:fill="F4F6F8"/>
-          </w:tcPr>
-          <w:p>
-            <w:pPr>
-              <w:spacing w:before="20" w:after="20" w:line="252" w:lineRule="auto"/>
-            </w:pPr>
-            <w:r>
-              <w:rPr>
-                <w:rFonts w:ascii="Barlow" w:hAnsi="Barlow" w:cs="Barlow"/>
-                <w:b w:val="0"/>
-                <w:i w:val="0"/>
-                <w:sz w:val="17"/>
-              </w:rPr>
-              <w:t>H2-04-HW1-gauge-baseline.docx</w:t>
-            </w:r>
-          </w:p>
-        </w:tc>
-        <w:tc>
-          <w:tcPr>
-            <w:tcW w:type="dxa" w:w="5328"/>
-            <w:shd w:val="clear" w:color="auto" w:fill="F4F6F8"/>
-          </w:tcPr>
-          <w:p>
-            <w:pPr>
-              <w:spacing w:before="20" w:after="20" w:line="252" w:lineRule="auto"/>
-            </w:pPr>
-            <w:r>
-              <w:rPr>
-                <w:rFonts w:ascii="Barlow" w:hAnsi="Barlow" w:cs="Barlow"/>
-                <w:b w:val="0"/>
-                <w:i w:val="0"/>
-                <w:sz w:val="17"/>
-              </w:rPr>
-              <w:t>HW1 and the ten-hour budget</w:t>
-            </w:r>
-          </w:p>
-        </w:tc>
-      </w:tr>
-      <w:tr>
-        <w:tc>
-          <w:tcPr>
-            <w:tcW w:type="dxa" w:w="4608"/>
-          </w:tcPr>
-          <w:p>
-            <w:pPr>
-              <w:spacing w:before="20" w:after="20" w:line="252" w:lineRule="auto"/>
-            </w:pPr>
-            <w:r>
-              <w:rPr>
-                <w:rFonts w:ascii="Barlow" w:hAnsi="Barlow" w:cs="Barlow"/>
-                <w:b w:val="0"/>
-                <w:i w:val="0"/>
-                <w:sz w:val="17"/>
-              </w:rPr>
-              <w:t>H2-05-hours-and-decision-log.docx</w:t>
-            </w:r>
-          </w:p>
-        </w:tc>
-        <w:tc>
-          <w:tcPr>
-            <w:tcW w:type="dxa" w:w="5328"/>
-          </w:tcPr>
-          <w:p>
-            <w:pPr>
-              <w:spacing w:before="20" w:after="20" w:line="252" w:lineRule="auto"/>
-            </w:pPr>
-            <w:r>
-              <w:rPr>
-                <w:rFonts w:ascii="Barlow" w:hAnsi="Barlow" w:cs="Barlow"/>
-                <w:b w:val="0"/>
-                <w:i w:val="0"/>
-                <w:sz w:val="17"/>
-              </w:rPr>
-              <w:t>One page, kept all semester</w:t>
-            </w:r>
-          </w:p>
-        </w:tc>
-      </w:tr>
-      <w:tr>
-        <w:tc>
-          <w:tcPr>
-            <w:tcW w:type="dxa" w:w="4608"/>
-            <w:shd w:val="clear" w:color="auto" w:fill="F4F6F8"/>
-          </w:tcPr>
-          <w:p>
-            <w:pPr>
-              <w:spacing w:before="20" w:after="20" w:line="252" w:lineRule="auto"/>
-            </w:pPr>
-            <w:r>
-              <w:rPr>
-                <w:rFonts w:ascii="Barlow" w:hAnsi="Barlow" w:cs="Barlow"/>
-                <w:b w:val="0"/>
-                <w:i w:val="0"/>
-                <w:sz w:val="17"/>
-              </w:rPr>
-              <w:t>gauges_install.csv</w:t>
-            </w:r>
-          </w:p>
-        </w:tc>
-        <w:tc>
-          <w:tcPr>
-            <w:tcW w:type="dxa" w:w="5328"/>
-            <w:shd w:val="clear" w:color="auto" w:fill="F4F6F8"/>
-          </w:tcPr>
-          <w:p>
-            <w:pPr>
-              <w:spacing w:before="20" w:after="20" w:line="252" w:lineRule="auto"/>
-            </w:pPr>
-            <w:r>
-              <w:rPr>
-                <w:rFonts w:ascii="Barlow" w:hAnsi="Barlow" w:cs="Barlow"/>
-                <w:b w:val="0"/>
-                <w:i w:val="0"/>
-                <w:sz w:val="17"/>
-              </w:rPr>
-              <w:t>8 gauges × 12 readings. The keystone data file</w:t>
-            </w:r>
-          </w:p>
-        </w:tc>
-      </w:tr>
-      <w:tr>
-        <w:tc>
-          <w:tcPr>
-            <w:tcW w:type="dxa" w:w="4608"/>
-          </w:tcPr>
-          <w:p>
-            <w:pPr>
-              <w:spacing w:before="20" w:after="20" w:line="252" w:lineRule="auto"/>
-            </w:pPr>
-            <w:r>
-              <w:rPr>
-                <w:rFonts w:ascii="Barlow" w:hAnsi="Barlow" w:cs="Barlow"/>
-                <w:b w:val="0"/>
-                <w:i w:val="0"/>
-                <w:sz w:val="17"/>
-              </w:rPr>
-              <w:t>pin_measurements_backup.csv</w:t>
-            </w:r>
-          </w:p>
-        </w:tc>
-        <w:tc>
-          <w:tcPr>
-            <w:tcW w:type="dxa" w:w="5328"/>
-          </w:tcPr>
-          <w:p>
-            <w:pPr>
-              <w:spacing w:before="20" w:after="20" w:line="252" w:lineRule="auto"/>
-            </w:pPr>
-            <w:r>
-              <w:rPr>
-                <w:rFonts w:ascii="Barlow" w:hAnsi="Barlow" w:cs="Barlow"/>
-                <w:b w:val="0"/>
-                <w:i w:val="0"/>
-                <w:sz w:val="17"/>
-              </w:rPr>
-              <w:t>24 pin readings, two people — lab fallback</w:t>
-            </w:r>
-          </w:p>
-        </w:tc>
-      </w:tr>
-      <w:tr>
-        <w:tc>
-          <w:tcPr>
-            <w:tcW w:type="dxa" w:w="4608"/>
-            <w:shd w:val="clear" w:color="auto" w:fill="F4F6F8"/>
-          </w:tcPr>
-          <w:p>
-            <w:pPr>
-              <w:spacing w:before="20" w:after="20" w:line="252" w:lineRule="auto"/>
-            </w:pPr>
-            <w:r>
-              <w:rPr>
-                <w:rFonts w:ascii="Barlow" w:hAnsi="Barlow" w:cs="Barlow"/>
-                <w:b w:val="0"/>
-                <w:i w:val="0"/>
-                <w:sz w:val="17"/>
-              </w:rPr>
-              <w:t>KEY-M02-answer-key.docx</w:t>
-            </w:r>
-          </w:p>
-        </w:tc>
-        <w:tc>
-          <w:tcPr>
-            <w:tcW w:type="dxa" w:w="5328"/>
-            <w:shd w:val="clear" w:color="auto" w:fill="F4F6F8"/>
-          </w:tcPr>
-          <w:p>
-            <w:pPr>
-              <w:spacing w:before="20" w:after="20" w:line="252" w:lineRule="auto"/>
-            </w:pPr>
-            <w:r>
-              <w:rPr>
-                <w:rFonts w:ascii="Barlow" w:hAnsi="Barlow" w:cs="Barlow"/>
-                <w:b w:val="0"/>
-                <w:i w:val="0"/>
-                <w:sz w:val="17"/>
-              </w:rPr>
-              <w:t>Gauge statistics, the planted errors, timing</w:t>
-            </w:r>
-          </w:p>
-        </w:tc>
-      </w:tr>
-    </w:tbl>
-    <w:p>
-      <w:pPr>
-        <w:spacing w:before="260" w:after="80" w:line="240" w:lineRule="auto"/>
-      </w:pPr>
-      <w:r>
-        <w:rPr>
-          <w:rFonts w:ascii="Barlow Condensed" w:hAnsi="Barlow Condensed" w:cs="Barlow Condensed"/>
-          <w:b/>
-          <w:i w:val="0"/>
-          <w:color w:val="1F3A5F"/>
-          <w:sz w:val="25"/>
-          <w:caps w:val="1"/>
-          <w:spacing w:val="12"/>
-        </w:rPr>
-        <w:t>04-M03-hallucination</w:t>
-      </w:r>
-    </w:p>
-    <w:tbl>
-      <w:tblPr>
-        <w:tblStyle w:val="TableGrid"/>
-        <w:tblW w:type="auto" w:w="0"/>
-        <w:jc w:val="left"/>
-        <w:tblLook w:firstColumn="1" w:firstRow="1" w:lastColumn="0" w:lastRow="0" w:noHBand="0" w:noVBand="1" w:val="04A0"/>
-        <w:tblLayout w:type="fixed"/>
-        <w:tblCellMar>
-          <w:top w:w="60" w:type="dxa"/>
-          <w:left w:w="110" w:type="dxa"/>
-          <w:bottom w:w="60" w:type="dxa"/>
-          <w:right w:w="110" w:type="dxa"/>
-        </w:tblCellMar>
-      </w:tblPr>
-      <w:tblGrid>
-        <w:gridCol w:w="4968"/>
-        <w:gridCol w:w="4968"/>
-      </w:tblGrid>
-      <w:tr>
-        <w:tc>
-          <w:tcPr>
-            <w:tcW w:type="dxa" w:w="4608"/>
-            <w:shd w:val="clear" w:color="auto" w:fill="1F3A5F"/>
-          </w:tcPr>
-          <w:p>
-            <w:pPr>
-              <w:spacing w:before="20" w:after="20" w:line="252" w:lineRule="auto"/>
-            </w:pPr>
-            <w:r>
-              <w:rPr>
-                <w:rFonts w:ascii="Barlow Condensed" w:hAnsi="Barlow Condensed" w:cs="Barlow Condensed"/>
-                <w:b/>
-                <w:i w:val="0"/>
-                <w:color w:val="FFFFFF"/>
-                <w:sz w:val="17"/>
-              </w:rPr>
-              <w:t>File</w:t>
-            </w:r>
-          </w:p>
-        </w:tc>
-        <w:tc>
-          <w:tcPr>
-            <w:tcW w:type="dxa" w:w="5328"/>
-            <w:shd w:val="clear" w:color="auto" w:fill="1F3A5F"/>
-          </w:tcPr>
-          <w:p>
-            <w:pPr>
-              <w:spacing w:before="20" w:after="20" w:line="252" w:lineRule="auto"/>
-            </w:pPr>
-            <w:r>
-              <w:rPr>
-                <w:rFonts w:ascii="Barlow Condensed" w:hAnsi="Barlow Condensed" w:cs="Barlow Condensed"/>
-                <w:b/>
-                <w:i w:val="0"/>
-                <w:color w:val="FFFFFF"/>
-                <w:sz w:val="17"/>
-              </w:rPr>
-              <w:t>What it is</w:t>
-            </w:r>
-          </w:p>
-        </w:tc>
-      </w:tr>
-      <w:tr>
-        <w:tc>
-          <w:tcPr>
-            <w:tcW w:type="dxa" w:w="4608"/>
-          </w:tcPr>
-          <w:p>
-            <w:pPr>
-              <w:spacing w:before="20" w:after="20" w:line="252" w:lineRule="auto"/>
-            </w:pPr>
-            <w:r>
-              <w:rPr>
-                <w:rFonts w:ascii="Barlow" w:hAnsi="Barlow" w:cs="Barlow"/>
-                <w:b w:val="0"/>
-                <w:i w:val="0"/>
-                <w:sz w:val="17"/>
-              </w:rPr>
-              <w:t>M03-slides-hallucination.pptx</w:t>
-            </w:r>
-          </w:p>
-        </w:tc>
-        <w:tc>
-          <w:tcPr>
-            <w:tcW w:type="dxa" w:w="5328"/>
-          </w:tcPr>
-          <w:p>
-            <w:pPr>
-              <w:spacing w:before="20" w:after="20" w:line="252" w:lineRule="auto"/>
-            </w:pPr>
-            <w:r>
-              <w:rPr>
-                <w:rFonts w:ascii="Barlow" w:hAnsi="Barlow" w:cs="Barlow"/>
-                <w:b w:val="0"/>
-                <w:i w:val="0"/>
-                <w:sz w:val="17"/>
-              </w:rPr>
-              <w:t>21 slides</w:t>
-            </w:r>
-          </w:p>
-        </w:tc>
-      </w:tr>
-      <w:tr>
-        <w:tc>
-          <w:tcPr>
-            <w:tcW w:type="dxa" w:w="4608"/>
-            <w:shd w:val="clear" w:color="auto" w:fill="F4F6F8"/>
-          </w:tcPr>
-          <w:p>
-            <w:pPr>
-              <w:spacing w:before="20" w:after="20" w:line="252" w:lineRule="auto"/>
-            </w:pPr>
-            <w:r>
-              <w:rPr>
-                <w:rFonts w:ascii="Barlow" w:hAnsi="Barlow" w:cs="Barlow"/>
-                <w:b w:val="0"/>
-                <w:i w:val="0"/>
-                <w:sz w:val="17"/>
-              </w:rPr>
-              <w:t>H3-01-KC-MB-12-county-spec.docx</w:t>
-            </w:r>
-          </w:p>
-        </w:tc>
-        <w:tc>
-          <w:tcPr>
-            <w:tcW w:type="dxa" w:w="5328"/>
-            <w:shd w:val="clear" w:color="auto" w:fill="F4F6F8"/>
-          </w:tcPr>
-          <w:p>
-            <w:pPr>
-              <w:spacing w:before="20" w:after="20" w:line="252" w:lineRule="auto"/>
-            </w:pPr>
-            <w:r>
-              <w:rPr>
-                <w:rFonts w:ascii="Barlow" w:hAnsi="Barlow" w:cs="Barlow"/>
-                <w:b w:val="0"/>
-                <w:i w:val="0"/>
-                <w:sz w:val="17"/>
-              </w:rPr>
-              <w:t>The invented county spec. Print this one</w:t>
-            </w:r>
-          </w:p>
-        </w:tc>
-      </w:tr>
-      <w:tr>
-        <w:tc>
-          <w:tcPr>
-            <w:tcW w:type="dxa" w:w="4608"/>
-          </w:tcPr>
-          <w:p>
-            <w:pPr>
-              <w:spacing w:before="20" w:after="20" w:line="252" w:lineRule="auto"/>
-            </w:pPr>
-            <w:r>
-              <w:rPr>
-                <w:rFonts w:ascii="Barlow" w:hAnsi="Barlow" w:cs="Barlow"/>
-                <w:b w:val="0"/>
-                <w:i w:val="0"/>
-                <w:sz w:val="17"/>
-              </w:rPr>
-              <w:t>H3-02-foreman-spec-summary.docx</w:t>
-            </w:r>
-          </w:p>
-        </w:tc>
-        <w:tc>
-          <w:tcPr>
-            <w:tcW w:type="dxa" w:w="5328"/>
-          </w:tcPr>
-          <w:p>
-            <w:pPr>
-              <w:spacing w:before="20" w:after="20" w:line="252" w:lineRule="auto"/>
-            </w:pPr>
-            <w:r>
-              <w:rPr>
-                <w:rFonts w:ascii="Barlow" w:hAnsi="Barlow" w:cs="Barlow"/>
-                <w:b w:val="0"/>
-                <w:i w:val="0"/>
-                <w:sz w:val="17"/>
-              </w:rPr>
-              <w:t>Ten claims, two of them wrong</w:t>
-            </w:r>
-          </w:p>
-        </w:tc>
-      </w:tr>
-      <w:tr>
-        <w:tc>
-          <w:tcPr>
-            <w:tcW w:type="dxa" w:w="4608"/>
-            <w:shd w:val="clear" w:color="auto" w:fill="F4F6F8"/>
-          </w:tcPr>
-          <w:p>
-            <w:pPr>
-              <w:spacing w:before="20" w:after="20" w:line="252" w:lineRule="auto"/>
-            </w:pPr>
-            <w:r>
-              <w:rPr>
-                <w:rFonts w:ascii="Barlow" w:hAnsi="Barlow" w:cs="Barlow"/>
-                <w:b w:val="0"/>
-                <w:i w:val="0"/>
-                <w:sz w:val="17"/>
-              </w:rPr>
-              <w:t>H3-03-next-word-dice-activity.docx</w:t>
-            </w:r>
-          </w:p>
-        </w:tc>
-        <w:tc>
-          <w:tcPr>
-            <w:tcW w:type="dxa" w:w="5328"/>
-            <w:shd w:val="clear" w:color="auto" w:fill="F4F6F8"/>
-          </w:tcPr>
-          <w:p>
-            <w:pPr>
-              <w:spacing w:before="20" w:after="20" w:line="252" w:lineRule="auto"/>
-            </w:pPr>
-            <w:r>
-              <w:rPr>
-                <w:rFonts w:ascii="Barlow" w:hAnsi="Barlow" w:cs="Barlow"/>
-                <w:b w:val="0"/>
-                <w:i w:val="0"/>
-                <w:sz w:val="17"/>
-              </w:rPr>
-              <w:t>The dice table</w:t>
-            </w:r>
-          </w:p>
-        </w:tc>
-      </w:tr>
-      <w:tr>
-        <w:tc>
-          <w:tcPr>
-            <w:tcW w:type="dxa" w:w="4608"/>
-          </w:tcPr>
-          <w:p>
-            <w:pPr>
-              <w:spacing w:before="20" w:after="20" w:line="252" w:lineRule="auto"/>
-            </w:pPr>
-            <w:r>
-              <w:rPr>
-                <w:rFonts w:ascii="Barlow" w:hAnsi="Barlow" w:cs="Barlow"/>
-                <w:b w:val="0"/>
-                <w:i w:val="0"/>
-                <w:sz w:val="17"/>
-              </w:rPr>
-              <w:t>H3-04-source-check-worksheet.docx</w:t>
-            </w:r>
-          </w:p>
-        </w:tc>
-        <w:tc>
-          <w:tcPr>
-            <w:tcW w:type="dxa" w:w="5328"/>
-          </w:tcPr>
-          <w:p>
-            <w:pPr>
-              <w:spacing w:before="20" w:after="20" w:line="252" w:lineRule="auto"/>
-            </w:pPr>
-            <w:r>
-              <w:rPr>
-                <w:rFonts w:ascii="Barlow" w:hAnsi="Barlow" w:cs="Barlow"/>
-                <w:b w:val="0"/>
-                <w:i w:val="0"/>
-                <w:sz w:val="17"/>
-              </w:rPr>
-              <w:t>Check the ten claims</w:t>
-            </w:r>
-          </w:p>
-        </w:tc>
-      </w:tr>
-      <w:tr>
-        <w:tc>
-          <w:tcPr>
-            <w:tcW w:type="dxa" w:w="4608"/>
-            <w:shd w:val="clear" w:color="auto" w:fill="F4F6F8"/>
-          </w:tcPr>
-          <w:p>
-            <w:pPr>
-              <w:spacing w:before="20" w:after="20" w:line="252" w:lineRule="auto"/>
-            </w:pPr>
-            <w:r>
-              <w:rPr>
-                <w:rFonts w:ascii="Barlow" w:hAnsi="Barlow" w:cs="Barlow"/>
-                <w:b w:val="0"/>
-                <w:i w:val="0"/>
-                <w:sz w:val="17"/>
-              </w:rPr>
-              <w:t>H3-05-HW2-spec-summary-check.docx</w:t>
-            </w:r>
-          </w:p>
-        </w:tc>
-        <w:tc>
-          <w:tcPr>
-            <w:tcW w:type="dxa" w:w="5328"/>
-            <w:shd w:val="clear" w:color="auto" w:fill="F4F6F8"/>
-          </w:tcPr>
-          <w:p>
-            <w:pPr>
-              <w:spacing w:before="20" w:after="20" w:line="252" w:lineRule="auto"/>
-            </w:pPr>
-            <w:r>
-              <w:rPr>
-                <w:rFonts w:ascii="Barlow" w:hAnsi="Barlow" w:cs="Barlow"/>
-                <w:b w:val="0"/>
-                <w:i w:val="0"/>
-                <w:sz w:val="17"/>
-              </w:rPr>
-              <w:t>HW2</w:t>
-            </w:r>
-          </w:p>
-        </w:tc>
-      </w:tr>
-      <w:tr>
-        <w:tc>
-          <w:tcPr>
-            <w:tcW w:type="dxa" w:w="4608"/>
-          </w:tcPr>
-          <w:p>
-            <w:pPr>
-              <w:spacing w:before="20" w:after="20" w:line="252" w:lineRule="auto"/>
-            </w:pPr>
-            <w:r>
-              <w:rPr>
-                <w:rFonts w:ascii="Barlow" w:hAnsi="Barlow" w:cs="Barlow"/>
-                <w:b w:val="0"/>
-                <w:i w:val="0"/>
-                <w:sz w:val="17"/>
-              </w:rPr>
-              <w:t>KEY-M03-answer-key.docx</w:t>
-            </w:r>
-          </w:p>
-        </w:tc>
-        <w:tc>
-          <w:tcPr>
-            <w:tcW w:type="dxa" w:w="5328"/>
-          </w:tcPr>
-          <w:p>
-            <w:pPr>
-              <w:spacing w:before="20" w:after="20" w:line="252" w:lineRule="auto"/>
-            </w:pPr>
-            <w:r>
-              <w:rPr>
-                <w:rFonts w:ascii="Barlow" w:hAnsi="Barlow" w:cs="Barlow"/>
-                <w:b w:val="0"/>
-                <w:i w:val="0"/>
-                <w:sz w:val="17"/>
-              </w:rPr>
-              <w:t>Claim-by-claim verdicts, teaching notes</w:t>
-            </w:r>
-          </w:p>
-        </w:tc>
-      </w:tr>
-    </w:tbl>
-    <w:p>
-      <w:pPr>
-        <w:spacing w:before="260" w:after="80" w:line="240" w:lineRule="auto"/>
-      </w:pPr>
-      <w:r>
-        <w:rPr>
-          <w:rFonts w:ascii="Barlow Condensed" w:hAnsi="Barlow Condensed" w:cs="Barlow Condensed"/>
-          <w:b/>
-          <w:i w:val="0"/>
-          <w:color w:val="1F3A5F"/>
-          <w:sz w:val="25"/>
-          <w:caps w:val="1"/>
-          <w:spacing w:val="12"/>
-        </w:rPr>
-        <w:t>05-CHARTS</w:t>
-      </w:r>
-    </w:p>
-    <w:tbl>
-      <w:tblPr>
-        <w:tblStyle w:val="TableGrid"/>
-        <w:tblW w:type="auto" w:w="0"/>
-        <w:jc w:val="left"/>
-        <w:tblLook w:firstColumn="1" w:firstRow="1" w:lastColumn="0" w:lastRow="0" w:noHBand="0" w:noVBand="1" w:val="04A0"/>
-        <w:tblLayout w:type="fixed"/>
-        <w:tblCellMar>
-          <w:top w:w="60" w:type="dxa"/>
-          <w:left w:w="110" w:type="dxa"/>
-          <w:bottom w:w="60" w:type="dxa"/>
-          <w:right w:w="110" w:type="dxa"/>
-        </w:tblCellMar>
-      </w:tblPr>
-      <w:tblGrid>
-        <w:gridCol w:w="4968"/>
-        <w:gridCol w:w="4968"/>
-      </w:tblGrid>
-      <w:tr>
-        <w:tc>
-          <w:tcPr>
-            <w:tcW w:type="dxa" w:w="4608"/>
-            <w:shd w:val="clear" w:color="auto" w:fill="1F3A5F"/>
-          </w:tcPr>
-          <w:p>
-            <w:pPr>
-              <w:spacing w:before="20" w:after="20" w:line="252" w:lineRule="auto"/>
-            </w:pPr>
-            <w:r>
-              <w:rPr>
-                <w:rFonts w:ascii="Barlow Condensed" w:hAnsi="Barlow Condensed" w:cs="Barlow Condensed"/>
-                <w:b/>
-                <w:i w:val="0"/>
-                <w:color w:val="FFFFFF"/>
-                <w:sz w:val="17"/>
-              </w:rPr>
-              <w:t>File</w:t>
-            </w:r>
-          </w:p>
-        </w:tc>
-        <w:tc>
-          <w:tcPr>
-            <w:tcW w:type="dxa" w:w="5328"/>
-            <w:shd w:val="clear" w:color="auto" w:fill="1F3A5F"/>
-          </w:tcPr>
-          <w:p>
-            <w:pPr>
-              <w:spacing w:before="20" w:after="20" w:line="252" w:lineRule="auto"/>
-            </w:pPr>
-            <w:r>
-              <w:rPr>
-                <w:rFonts w:ascii="Barlow Condensed" w:hAnsi="Barlow Condensed" w:cs="Barlow Condensed"/>
-                <w:b/>
-                <w:i w:val="0"/>
-                <w:color w:val="FFFFFF"/>
-                <w:sz w:val="17"/>
-              </w:rPr>
-              <w:t>What it is</w:t>
-            </w:r>
-          </w:p>
-        </w:tc>
-      </w:tr>
-      <w:tr>
-        <w:tc>
-          <w:tcPr>
-            <w:tcW w:type="dxa" w:w="4608"/>
-          </w:tcPr>
-          <w:p>
-            <w:pPr>
-              <w:spacing w:before="20" w:after="20" w:line="252" w:lineRule="auto"/>
-            </w:pPr>
-            <w:r>
-              <w:rPr>
-                <w:rFonts w:ascii="Barlow" w:hAnsi="Barlow" w:cs="Barlow"/>
-                <w:b w:val="0"/>
-                <w:i w:val="0"/>
-                <w:sz w:val="17"/>
-              </w:rPr>
-              <w:t>*.png</w:t>
-            </w:r>
-          </w:p>
-        </w:tc>
-        <w:tc>
-          <w:tcPr>
-            <w:tcW w:type="dxa" w:w="5328"/>
-          </w:tcPr>
-          <w:p>
-            <w:pPr>
-              <w:spacing w:before="20" w:after="20" w:line="252" w:lineRule="auto"/>
-            </w:pPr>
-            <w:r>
-              <w:rPr>
-                <w:rFonts w:ascii="Barlow" w:hAnsi="Barlow" w:cs="Barlow"/>
-                <w:b w:val="0"/>
-                <w:i w:val="0"/>
-                <w:sz w:val="17"/>
-              </w:rPr>
-              <w:t>Every chart used in the decks, if you want them elsewhere</w:t>
-            </w:r>
-          </w:p>
-        </w:tc>
-      </w:tr>
-    </w:tbl>
-    <w:p>
-      <w:pPr>
-        <w:spacing w:before="260" w:after="80" w:line="240" w:lineRule="auto"/>
-      </w:pPr>
-      <w:r>
-        <w:rPr>
-          <w:rFonts w:ascii="Barlow Condensed" w:hAnsi="Barlow Condensed" w:cs="Barlow Condensed"/>
-          <w:b/>
-          <w:i w:val="0"/>
-          <w:color w:val="1F3A5F"/>
-          <w:sz w:val="25"/>
-          <w:caps w:val="1"/>
-          <w:spacing w:val="12"/>
-        </w:rPr>
-        <w:t>06-BRIDGE</w:t>
-      </w:r>
-    </w:p>
-    <w:tbl>
-      <w:tblPr>
-        <w:tblStyle w:val="TableGrid"/>
-        <w:tblW w:type="auto" w:w="0"/>
-        <w:jc w:val="left"/>
-        <w:tblLook w:firstColumn="1" w:firstRow="1" w:lastColumn="0" w:lastRow="0" w:noHBand="0" w:noVBand="1" w:val="04A0"/>
-        <w:tblLayout w:type="fixed"/>
-        <w:tblCellMar>
-          <w:top w:w="60" w:type="dxa"/>
-          <w:left w:w="110" w:type="dxa"/>
-          <w:bottom w:w="60" w:type="dxa"/>
-          <w:right w:w="110" w:type="dxa"/>
-        </w:tblCellMar>
-      </w:tblPr>
-      <w:tblGrid>
-        <w:gridCol w:w="4968"/>
-        <w:gridCol w:w="4968"/>
-      </w:tblGrid>
-      <w:tr>
-        <w:tc>
-          <w:tcPr>
-            <w:tcW w:type="dxa" w:w="4608"/>
-            <w:shd w:val="clear" w:color="auto" w:fill="1F3A5F"/>
-          </w:tcPr>
-          <w:p>
-            <w:pPr>
-              <w:spacing w:before="20" w:after="20" w:line="252" w:lineRule="auto"/>
-            </w:pPr>
-            <w:r>
-              <w:rPr>
-                <w:rFonts w:ascii="Barlow Condensed" w:hAnsi="Barlow Condensed" w:cs="Barlow Condensed"/>
-                <w:b/>
-                <w:i w:val="0"/>
-                <w:color w:val="FFFFFF"/>
-                <w:sz w:val="17"/>
-              </w:rPr>
-              <w:t>File</w:t>
-            </w:r>
-          </w:p>
-        </w:tc>
-        <w:tc>
-          <w:tcPr>
-            <w:tcW w:type="dxa" w:w="5328"/>
-            <w:shd w:val="clear" w:color="auto" w:fill="1F3A5F"/>
-          </w:tcPr>
-          <w:p>
-            <w:pPr>
-              <w:spacing w:before="20" w:after="20" w:line="252" w:lineRule="auto"/>
-            </w:pPr>
-            <w:r>
-              <w:rPr>
-                <w:rFonts w:ascii="Barlow Condensed" w:hAnsi="Barlow Condensed" w:cs="Barlow Condensed"/>
-                <w:b/>
-                <w:i w:val="0"/>
-                <w:color w:val="FFFFFF"/>
-                <w:sz w:val="17"/>
-              </w:rPr>
-              <w:t>What it is</w:t>
-            </w:r>
-          </w:p>
-        </w:tc>
-      </w:tr>
-      <w:tr>
-        <w:tc>
-          <w:tcPr>
-            <w:tcW w:type="dxa" w:w="4608"/>
-          </w:tcPr>
-          <w:p>
-            <w:pPr>
-              <w:spacing w:before="20" w:after="20" w:line="252" w:lineRule="auto"/>
-            </w:pPr>
-            <w:r>
-              <w:rPr>
-                <w:rFonts w:ascii="Barlow" w:hAnsi="Barlow" w:cs="Barlow"/>
-                <w:b w:val="0"/>
-                <w:i w:val="0"/>
-                <w:sz w:val="17"/>
-              </w:rPr>
-              <w:t>otter-bend-lift-bridge-flat-claude.png</w:t>
-            </w:r>
-          </w:p>
-        </w:tc>
-        <w:tc>
-          <w:tcPr>
-            <w:tcW w:type="dxa" w:w="5328"/>
-          </w:tcPr>
-          <w:p>
-            <w:pPr>
-              <w:spacing w:before="20" w:after="20" w:line="252" w:lineRule="auto"/>
-            </w:pPr>
-            <w:r>
-              <w:rPr>
-                <w:rFonts w:ascii="Barlow" w:hAnsi="Barlow" w:cs="Barlow"/>
-                <w:b w:val="0"/>
-                <w:i w:val="0"/>
-                <w:sz w:val="17"/>
-              </w:rPr>
-              <w:t>Primary flat illustration, ready for PowerPoint</w:t>
-            </w:r>
-          </w:p>
-        </w:tc>
-      </w:tr>
-      <w:tr>
-        <w:tc>
-          <w:tcPr>
-            <w:tcW w:type="dxa" w:w="4608"/>
-            <w:shd w:val="clear" w:color="auto" w:fill="F4F6F8"/>
-          </w:tcPr>
-          <w:p>
-            <w:pPr>
-              <w:spacing w:before="20" w:after="20" w:line="252" w:lineRule="auto"/>
-            </w:pPr>
-            <w:r>
-              <w:rPr>
-                <w:rFonts w:ascii="Barlow" w:hAnsi="Barlow" w:cs="Barlow"/>
-                <w:b w:val="0"/>
-                <w:i w:val="0"/>
-                <w:sz w:val="17"/>
-              </w:rPr>
-              <w:t>otter-bend-general-elevation.png</w:t>
-            </w:r>
-          </w:p>
-        </w:tc>
-        <w:tc>
-          <w:tcPr>
-            <w:tcW w:type="dxa" w:w="5328"/>
-            <w:shd w:val="clear" w:color="auto" w:fill="F4F6F8"/>
-          </w:tcPr>
-          <w:p>
-            <w:pPr>
-              <w:spacing w:before="20" w:after="20" w:line="252" w:lineRule="auto"/>
-            </w:pPr>
-            <w:r>
-              <w:rPr>
-                <w:rFonts w:ascii="Barlow" w:hAnsi="Barlow" w:cs="Barlow"/>
-                <w:b w:val="0"/>
-                <w:i w:val="0"/>
-                <w:sz w:val="17"/>
-              </w:rPr>
-              <w:t>Dimensioned general elevation; keep the disclaimer visible</w:t>
-            </w:r>
-          </w:p>
-        </w:tc>
-      </w:tr>
-      <w:tr>
-        <w:tc>
-          <w:tcPr>
-            <w:tcW w:type="dxa" w:w="4608"/>
-          </w:tcPr>
-          <w:p>
-            <w:pPr>
-              <w:spacing w:before="20" w:after="20" w:line="252" w:lineRule="auto"/>
-            </w:pPr>
-            <w:r>
-              <w:rPr>
-                <w:rFonts w:ascii="Barlow" w:hAnsi="Barlow" w:cs="Barlow"/>
-                <w:b w:val="0"/>
-                <w:i w:val="0"/>
-                <w:sz w:val="17"/>
-              </w:rPr>
-              <w:t>otter-bend-strain-gauge-array.png</w:t>
-            </w:r>
-          </w:p>
-        </w:tc>
-        <w:tc>
-          <w:tcPr>
-            <w:tcW w:type="dxa" w:w="5328"/>
-          </w:tcPr>
-          <w:p>
-            <w:pPr>
-              <w:spacing w:before="20" w:after="20" w:line="252" w:lineRule="auto"/>
-            </w:pPr>
-            <w:r>
-              <w:rPr>
-                <w:rFonts w:ascii="Barlow" w:hAnsi="Barlow" w:cs="Barlow"/>
-                <w:b w:val="0"/>
-                <w:i w:val="0"/>
-                <w:sz w:val="17"/>
-              </w:rPr>
-              <w:t>M02 gauge array G1–G8; G5/G6 at midspan, G6 redundant</w:t>
-            </w:r>
-          </w:p>
-        </w:tc>
-      </w:tr>
-      <w:tr>
-        <w:tc>
-          <w:tcPr>
-            <w:tcW w:type="dxa" w:w="4608"/>
-            <w:shd w:val="clear" w:color="auto" w:fill="F4F6F8"/>
-          </w:tcPr>
-          <w:p>
-            <w:pPr>
-              <w:spacing w:before="20" w:after="20" w:line="252" w:lineRule="auto"/>
-            </w:pPr>
-            <w:r>
-              <w:rPr>
-                <w:rFonts w:ascii="Barlow" w:hAnsi="Barlow" w:cs="Barlow"/>
-                <w:b w:val="0"/>
-                <w:i w:val="0"/>
-                <w:sz w:val="17"/>
-              </w:rPr>
-              <w:t>otter-bend-site-location.png</w:t>
-            </w:r>
-          </w:p>
-        </w:tc>
-        <w:tc>
-          <w:tcPr>
-            <w:tcW w:type="dxa" w:w="5328"/>
-            <w:shd w:val="clear" w:color="auto" w:fill="F4F6F8"/>
-          </w:tcPr>
-          <w:p>
-            <w:pPr>
-              <w:spacing w:before="20" w:after="20" w:line="252" w:lineRule="auto"/>
-            </w:pPr>
-            <w:r>
-              <w:rPr>
-                <w:rFonts w:ascii="Barlow" w:hAnsi="Barlow" w:cs="Barlow"/>
-                <w:b w:val="0"/>
-                <w:i w:val="0"/>
-                <w:sz w:val="17"/>
-              </w:rPr>
-              <w:t>Primary site map: Otter Bend, Kinnickville, County Road 9</w:t>
-            </w:r>
-          </w:p>
-        </w:tc>
-      </w:tr>
-      <w:tr>
-        <w:tc>
-          <w:tcPr>
-            <w:tcW w:type="dxa" w:w="4608"/>
-          </w:tcPr>
-          <w:p>
-            <w:pPr>
-              <w:spacing w:before="20" w:after="20" w:line="252" w:lineRule="auto"/>
-            </w:pPr>
-            <w:r>
-              <w:rPr>
-                <w:rFonts w:ascii="Barlow" w:hAnsi="Barlow" w:cs="Barlow"/>
-                <w:b w:val="0"/>
-                <w:i w:val="0"/>
-                <w:sz w:val="17"/>
-              </w:rPr>
-              <w:t>otter-bend-location-map.png</w:t>
-            </w:r>
-          </w:p>
-        </w:tc>
-        <w:tc>
-          <w:tcPr>
-            <w:tcW w:type="dxa" w:w="5328"/>
-          </w:tcPr>
-          <w:p>
-            <w:pPr>
-              <w:spacing w:before="20" w:after="20" w:line="252" w:lineRule="auto"/>
-            </w:pPr>
-            <w:r>
-              <w:rPr>
-                <w:rFonts w:ascii="Barlow" w:hAnsi="Barlow" w:cs="Barlow"/>
-                <w:b w:val="0"/>
-                <w:i w:val="0"/>
-                <w:sz w:val="17"/>
-              </w:rPr>
-              <w:t>Optional backup: simpler fictional-site locator</w:t>
-            </w:r>
-          </w:p>
-        </w:tc>
-      </w:tr>
-      <w:tr>
-        <w:tc>
-          <w:tcPr>
-            <w:tcW w:type="dxa" w:w="4608"/>
-            <w:shd w:val="clear" w:color="auto" w:fill="F4F6F8"/>
-          </w:tcPr>
-          <w:p>
-            <w:pPr>
-              <w:spacing w:before="20" w:after="20" w:line="252" w:lineRule="auto"/>
-            </w:pPr>
-            <w:r>
-              <w:rPr>
-                <w:rFonts w:ascii="Barlow" w:hAnsi="Barlow" w:cs="Barlow"/>
-                <w:b w:val="0"/>
-                <w:i w:val="0"/>
-                <w:sz w:val="17"/>
-              </w:rPr>
-              <w:t>README.txt</w:t>
-            </w:r>
-          </w:p>
-        </w:tc>
-        <w:tc>
-          <w:tcPr>
-            <w:tcW w:type="dxa" w:w="5328"/>
-            <w:shd w:val="clear" w:color="auto" w:fill="F4F6F8"/>
-          </w:tcPr>
-          <w:p>
-            <w:pPr>
-              <w:spacing w:before="20" w:after="20" w:line="252" w:lineRule="auto"/>
-            </w:pPr>
-            <w:r>
-              <w:rPr>
-                <w:rFonts w:ascii="Barlow" w:hAnsi="Barlow" w:cs="Barlow"/>
-                <w:b w:val="0"/>
-                <w:i w:val="0"/>
-                <w:sz w:val="17"/>
-              </w:rPr>
-              <w:t>PowerPoint placement and disclaimer instructions</w:t>
+              <w:t>Instructor-only physical-event resolution</w:t>
             </w:r>
           </w:p>
         </w:tc>
@@ -2342,7 +832,7 @@
         <w:color w:val="6B7280"/>
         <w:sz w:val="16"/>
       </w:rPr>
-      <w:t>SEIS 201  ·  M01 – M03</w:t>
+      <w:t>SEIS 201  ·  M01 – M06</w:t>
     </w:r>
     <w:r>
       <w:tab/>
@@ -2415,7 +905,7 @@
         <w:caps w:val="1"/>
         <w:spacing w:val="20"/>
       </w:rPr>
-      <w:t>M01 – M03  ·  FILE INDEX</w:t>
+      <w:t>M01 – M06  ·  FILE INDEX</w:t>
     </w:r>
   </w:p>
 </w:hdr>

</xml_diff>

<commit_message>
Build Meeting M07 training mismatch pack
Co-authored-by: shaseaver25 <shannon@tailoredu.org>
</commit_message>
<xml_diff>
--- a/teaching-pack/00-INSTRUCTOR/FILE-INDEX.docx
+++ b/teaching-pack/00-INSTRUCTOR/FILE-INDEX.docx
@@ -29,24 +29,7 @@
           <w:color w:val="6B7280"/>
           <w:sz w:val="18"/>
         </w:rPr>
-        <w:t>Folders are in teaching order. This index covers every folder in the assembled M01–M06 teaching pack.</w:t>
-      </w:r>
-    </w:p>
-    <w:p>
-      <w:pPr>
-        <w:spacing w:before="260" w:after="80" w:line="240" w:lineRule="auto"/>
-      </w:pPr>
-      <w:r>
-        <w:rPr>
-          <w:rFonts w:ascii="Barlow Condensed" w:hAnsi="Barlow Condensed" w:cs="Barlow Condensed"/>
-          <w:b/>
-          <w:i w:val="0"/>
-          <w:color w:val="1F3A5F"/>
-          <w:sz w:val="25"/>
-          <w:caps w:val="1"/>
-          <w:spacing w:val="12"/>
-        </w:rPr>
-        <w:t>00-INSTRUCTOR</w:t>
+        <w:t>Folders are in teaching order. M07 opens Unit 2 and preserves the student hunt by separating evidence from the gated applicability conclusion.</w:t>
       </w:r>
     </w:p>
     <w:tbl>
@@ -70,7 +53,7 @@
       <w:tr>
         <w:tc>
           <w:tcPr>
-            <w:tcW w:type="dxa" w:w="4536"/>
+            <w:tcW w:type="dxa" w:w="3672"/>
             <w:shd w:val="clear" w:color="auto" w:fill="1F3A5F"/>
           </w:tcPr>
           <w:p>
@@ -85,13 +68,13 @@
                 <w:color w:val="FFFFFF"/>
                 <w:sz w:val="16"/>
               </w:rPr>
-              <w:t>File</w:t>
+              <w:t>Folder</w:t>
             </w:r>
           </w:p>
         </w:tc>
         <w:tc>
           <w:tcPr>
-            <w:tcW w:type="dxa" w:w="5400"/>
+            <w:tcW w:type="dxa" w:w="6264"/>
             <w:shd w:val="clear" w:color="auto" w:fill="1F3A5F"/>
           </w:tcPr>
           <w:p>
@@ -106,7 +89,7 @@
                 <w:color w:val="FFFFFF"/>
                 <w:sz w:val="16"/>
               </w:rPr>
-              <w:t>What it is</w:t>
+              <w:t>Purpose</w:t>
             </w:r>
           </w:p>
         </w:tc>
@@ -114,7 +97,7 @@
       <w:tr>
         <w:tc>
           <w:tcPr>
-            <w:tcW w:type="dxa" w:w="4536"/>
+            <w:tcW w:type="dxa" w:w="3672"/>
           </w:tcPr>
           <w:p>
             <w:pPr>
@@ -127,13 +110,13 @@
                 <w:i w:val="0"/>
                 <w:sz w:val="16"/>
               </w:rPr>
-              <w:t>INSTRUCTOR-GUIDE-M01-M04.docx</w:t>
+              <w:t>00-INSTRUCTOR</w:t>
             </w:r>
           </w:p>
         </w:tc>
         <w:tc>
           <w:tcPr>
-            <w:tcW w:type="dxa" w:w="5400"/>
+            <w:tcW w:type="dxa" w:w="6264"/>
           </w:tcPr>
           <w:p>
             <w:pPr>
@@ -146,7 +129,7 @@
                 <w:i w:val="0"/>
                 <w:sz w:val="16"/>
               </w:rPr>
-              <w:t>Run of show, prep, continuity, and review checklist</w:t>
+              <w:t>Run-of-day desk, faculty brief, source SAY notes, and this index</w:t>
             </w:r>
           </w:p>
         </w:tc>
@@ -154,7 +137,7 @@
       <w:tr>
         <w:tc>
           <w:tcPr>
-            <w:tcW w:type="dxa" w:w="4536"/>
+            <w:tcW w:type="dxa" w:w="3672"/>
             <w:shd w:val="clear" w:color="auto" w:fill="F4F6F8"/>
           </w:tcPr>
           <w:p>
@@ -168,13 +151,13 @@
                 <w:i w:val="0"/>
                 <w:sz w:val="16"/>
               </w:rPr>
-              <w:t>run-of-day/index.html</w:t>
+              <w:t>01-BRAND-KIT</w:t>
             </w:r>
           </w:p>
         </w:tc>
         <w:tc>
           <w:tcPr>
-            <w:tcW w:type="dxa" w:w="5400"/>
+            <w:tcW w:type="dxa" w:w="6264"/>
             <w:shd w:val="clear" w:color="auto" w:fill="F4F6F8"/>
           </w:tcPr>
           <w:p>
@@ -188,7 +171,7 @@
                 <w:i w:val="0"/>
                 <w:sz w:val="16"/>
               </w:rPr>
-              <w:t>Podium desk for Unit 1</w:t>
+              <w:t>ACMEJOB logos, fonts, templates, and brand guide</w:t>
             </w:r>
           </w:p>
         </w:tc>
@@ -196,7 +179,7 @@
       <w:tr>
         <w:tc>
           <w:tcPr>
-            <w:tcW w:type="dxa" w:w="4536"/>
+            <w:tcW w:type="dxa" w:w="3672"/>
           </w:tcPr>
           <w:p>
             <w:pPr>
@@ -209,13 +192,13 @@
                 <w:i w:val="0"/>
                 <w:sz w:val="16"/>
               </w:rPr>
-              <w:t>run-of-day/M01–M05-run-of-day.html</w:t>
+              <w:t>02-M01-first-day</w:t>
             </w:r>
           </w:p>
         </w:tc>
         <w:tc>
           <w:tcPr>
-            <w:tcW w:type="dxa" w:w="5400"/>
+            <w:tcW w:type="dxa" w:w="6264"/>
           </w:tcPr>
           <w:p>
             <w:pPr>
@@ -228,7 +211,7 @@
                 <w:i w:val="0"/>
                 <w:sz w:val="16"/>
               </w:rPr>
-              <w:t>Podium pages for the first five meetings</w:t>
+              <w:t>Rules versus learned patterns</w:t>
             </w:r>
           </w:p>
         </w:tc>
@@ -236,7 +219,7 @@
       <w:tr>
         <w:tc>
           <w:tcPr>
-            <w:tcW w:type="dxa" w:w="4536"/>
+            <w:tcW w:type="dxa" w:w="3672"/>
             <w:shd w:val="clear" w:color="auto" w:fill="F4F6F8"/>
           </w:tcPr>
           <w:p>
@@ -250,13 +233,13 @@
                 <w:i w:val="0"/>
                 <w:sz w:val="16"/>
               </w:rPr>
-              <w:t>run-of-day/M06-run-of-day.html</w:t>
+              <w:t>03-M02-measurement</w:t>
             </w:r>
           </w:p>
         </w:tc>
         <w:tc>
           <w:tcPr>
-            <w:tcW w:type="dxa" w:w="5400"/>
+            <w:tcW w:type="dxa" w:w="6264"/>
             <w:shd w:val="clear" w:color="auto" w:fill="F4F6F8"/>
           </w:tcPr>
           <w:p>
@@ -270,7 +253,7 @@
                 <w:i w:val="0"/>
                 <w:sz w:val="16"/>
               </w:rPr>
-              <w:t>M06 script, reveal boundary, debrief, and Wes handoff</w:t>
+              <w:t>Measurement, resolution, uncertainty, and G6</w:t>
             </w:r>
           </w:p>
         </w:tc>
@@ -278,7 +261,7 @@
       <w:tr>
         <w:tc>
           <w:tcPr>
-            <w:tcW w:type="dxa" w:w="4536"/>
+            <w:tcW w:type="dxa" w:w="3672"/>
           </w:tcPr>
           <w:p>
             <w:pPr>
@@ -291,13 +274,13 @@
                 <w:i w:val="0"/>
                 <w:sz w:val="16"/>
               </w:rPr>
-              <w:t>why-this-way.html</w:t>
+              <w:t>04-M03-hallucination</w:t>
             </w:r>
           </w:p>
         </w:tc>
         <w:tc>
           <w:tcPr>
-            <w:tcW w:type="dxa" w:w="5400"/>
+            <w:tcW w:type="dxa" w:w="6264"/>
           </w:tcPr>
           <w:p>
             <w:pPr>
@@ -310,7 +293,7 @@
                 <w:i w:val="0"/>
                 <w:sz w:val="16"/>
               </w:rPr>
-              <w:t>Faculty brief reflecting Unit 1 M01–M06</w:t>
+              <w:t>Next-token generation and source checking</w:t>
             </w:r>
           </w:p>
         </w:tc>
@@ -318,7 +301,7 @@
       <w:tr>
         <w:tc>
           <w:tcPr>
-            <w:tcW w:type="dxa" w:w="4536"/>
+            <w:tcW w:type="dxa" w:w="3672"/>
             <w:shd w:val="clear" w:color="auto" w:fill="F4F6F8"/>
           </w:tcPr>
           <w:p>
@@ -332,13 +315,13 @@
                 <w:i w:val="0"/>
                 <w:sz w:val="16"/>
               </w:rPr>
-              <w:t>FILE-INDEX.docx</w:t>
+              <w:t>05-CHARTS</w:t>
             </w:r>
           </w:p>
         </w:tc>
         <w:tc>
           <w:tcPr>
-            <w:tcW w:type="dxa" w:w="5400"/>
+            <w:tcW w:type="dxa" w:w="6264"/>
             <w:shd w:val="clear" w:color="auto" w:fill="F4F6F8"/>
           </w:tcPr>
           <w:p>
@@ -352,7 +335,253 @@
                 <w:i w:val="0"/>
                 <w:sz w:val="16"/>
               </w:rPr>
-              <w:t>This generated index</w:t>
+              <w:t>Reusable meeting-deck charts</w:t>
+            </w:r>
+          </w:p>
+        </w:tc>
+      </w:tr>
+      <w:tr>
+        <w:tc>
+          <w:tcPr>
+            <w:tcW w:type="dxa" w:w="3672"/>
+          </w:tcPr>
+          <w:p>
+            <w:pPr>
+              <w:spacing w:before="20" w:after="20" w:line="252" w:lineRule="auto"/>
+            </w:pPr>
+            <w:r>
+              <w:rPr>
+                <w:rFonts w:ascii="Barlow" w:hAnsi="Barlow" w:cs="Barlow"/>
+                <w:b w:val="0"/>
+                <w:i w:val="0"/>
+                <w:sz w:val="16"/>
+              </w:rPr>
+              <w:t>06-BRIDGE</w:t>
+            </w:r>
+          </w:p>
+        </w:tc>
+        <w:tc>
+          <w:tcPr>
+            <w:tcW w:type="dxa" w:w="6264"/>
+          </w:tcPr>
+          <w:p>
+            <w:pPr>
+              <w:spacing w:before="20" w:after="20" w:line="252" w:lineRule="auto"/>
+            </w:pPr>
+            <w:r>
+              <w:rPr>
+                <w:rFonts w:ascii="Barlow" w:hAnsi="Barlow" w:cs="Barlow"/>
+                <w:b w:val="0"/>
+                <w:i w:val="0"/>
+                <w:sz w:val="16"/>
+              </w:rPr>
+              <w:t>Reusable bridge illustrations and schematics</w:t>
+            </w:r>
+          </w:p>
+        </w:tc>
+      </w:tr>
+      <w:tr>
+        <w:tc>
+          <w:tcPr>
+            <w:tcW w:type="dxa" w:w="3672"/>
+            <w:shd w:val="clear" w:color="auto" w:fill="F4F6F8"/>
+          </w:tcPr>
+          <w:p>
+            <w:pPr>
+              <w:spacing w:before="20" w:after="20" w:line="252" w:lineRule="auto"/>
+            </w:pPr>
+            <w:r>
+              <w:rPr>
+                <w:rFonts w:ascii="Barlow" w:hAnsi="Barlow" w:cs="Barlow"/>
+                <w:b w:val="0"/>
+                <w:i w:val="0"/>
+                <w:sz w:val="16"/>
+              </w:rPr>
+              <w:t>07-HW-CASE-B-LIFT-STATION</w:t>
+            </w:r>
+          </w:p>
+        </w:tc>
+        <w:tc>
+          <w:tcPr>
+            <w:tcW w:type="dxa" w:w="6264"/>
+            <w:shd w:val="clear" w:color="auto" w:fill="F4F6F8"/>
+          </w:tcPr>
+          <w:p>
+            <w:pPr>
+              <w:spacing w:before="20" w:after="20" w:line="252" w:lineRule="auto"/>
+            </w:pPr>
+            <w:r>
+              <w:rPr>
+                <w:rFonts w:ascii="Barlow" w:hAnsi="Barlow" w:cs="Barlow"/>
+                <w:b w:val="0"/>
+                <w:i w:val="0"/>
+                <w:sz w:val="16"/>
+              </w:rPr>
+              <w:t>M02 transfer homework and instructor key</w:t>
+            </w:r>
+          </w:p>
+        </w:tc>
+      </w:tr>
+      <w:tr>
+        <w:tc>
+          <w:tcPr>
+            <w:tcW w:type="dxa" w:w="3672"/>
+          </w:tcPr>
+          <w:p>
+            <w:pPr>
+              <w:spacing w:before="20" w:after="20" w:line="252" w:lineRule="auto"/>
+            </w:pPr>
+            <w:r>
+              <w:rPr>
+                <w:rFonts w:ascii="Barlow" w:hAnsi="Barlow" w:cs="Barlow"/>
+                <w:b w:val="0"/>
+                <w:i w:val="0"/>
+                <w:sz w:val="16"/>
+              </w:rPr>
+              <w:t>08-M04-one-number</w:t>
+            </w:r>
+          </w:p>
+        </w:tc>
+        <w:tc>
+          <w:tcPr>
+            <w:tcW w:type="dxa" w:w="6264"/>
+          </w:tcPr>
+          <w:p>
+            <w:pPr>
+              <w:spacing w:before="20" w:after="20" w:line="252" w:lineRule="auto"/>
+            </w:pPr>
+            <w:r>
+              <w:rPr>
+                <w:rFonts w:ascii="Barlow" w:hAnsi="Barlow" w:cs="Barlow"/>
+                <w:b w:val="0"/>
+                <w:i w:val="0"/>
+                <w:sz w:val="16"/>
+              </w:rPr>
+              <w:t>Center, spread, CV, low count, and sample scope</w:t>
+            </w:r>
+          </w:p>
+        </w:tc>
+      </w:tr>
+      <w:tr>
+        <w:tc>
+          <w:tcPr>
+            <w:tcW w:type="dxa" w:w="3672"/>
+            <w:shd w:val="clear" w:color="auto" w:fill="F4F6F8"/>
+          </w:tcPr>
+          <w:p>
+            <w:pPr>
+              <w:spacing w:before="20" w:after="20" w:line="252" w:lineRule="auto"/>
+            </w:pPr>
+            <w:r>
+              <w:rPr>
+                <w:rFonts w:ascii="Barlow" w:hAnsi="Barlow" w:cs="Barlow"/>
+                <w:b w:val="0"/>
+                <w:i w:val="0"/>
+                <w:sz w:val="16"/>
+              </w:rPr>
+              <w:t>09-M05-overnight-alarm</w:t>
+            </w:r>
+          </w:p>
+        </w:tc>
+        <w:tc>
+          <w:tcPr>
+            <w:tcW w:type="dxa" w:w="6264"/>
+            <w:shd w:val="clear" w:color="auto" w:fill="F4F6F8"/>
+          </w:tcPr>
+          <w:p>
+            <w:pPr>
+              <w:spacing w:before="20" w:after="20" w:line="252" w:lineRule="auto"/>
+            </w:pPr>
+            <w:r>
+              <w:rPr>
+                <w:rFonts w:ascii="Barlow" w:hAnsi="Barlow" w:cs="Barlow"/>
+                <w:b w:val="0"/>
+                <w:i w:val="0"/>
+                <w:sz w:val="16"/>
+              </w:rPr>
+              <w:t>Agent loop, threshold alarm, and unresolved event</w:t>
+            </w:r>
+          </w:p>
+        </w:tc>
+      </w:tr>
+      <w:tr>
+        <w:tc>
+          <w:tcPr>
+            <w:tcW w:type="dxa" w:w="3672"/>
+          </w:tcPr>
+          <w:p>
+            <w:pPr>
+              <w:spacing w:before="20" w:after="20" w:line="252" w:lineRule="auto"/>
+            </w:pPr>
+            <w:r>
+              <w:rPr>
+                <w:rFonts w:ascii="Barlow" w:hAnsi="Barlow" w:cs="Barlow"/>
+                <w:b w:val="0"/>
+                <w:i w:val="0"/>
+                <w:sz w:val="16"/>
+              </w:rPr>
+              <w:t>10-M06-alarm-audit</w:t>
+            </w:r>
+          </w:p>
+        </w:tc>
+        <w:tc>
+          <w:tcPr>
+            <w:tcW w:type="dxa" w:w="6264"/>
+          </w:tcPr>
+          <w:p>
+            <w:pPr>
+              <w:spacing w:before="20" w:after="20" w:line="252" w:lineRule="auto"/>
+            </w:pPr>
+            <w:r>
+              <w:rPr>
+                <w:rFonts w:ascii="Barlow" w:hAnsi="Barlow" w:cs="Barlow"/>
+                <w:b w:val="0"/>
+                <w:i w:val="0"/>
+                <w:sz w:val="16"/>
+              </w:rPr>
+              <w:t>Distribution audit, traffic corroboration, and Unit 1 handoff</w:t>
+            </w:r>
+          </w:p>
+        </w:tc>
+      </w:tr>
+      <w:tr>
+        <w:tc>
+          <w:tcPr>
+            <w:tcW w:type="dxa" w:w="3672"/>
+            <w:shd w:val="clear" w:color="auto" w:fill="F4F6F8"/>
+          </w:tcPr>
+          <w:p>
+            <w:pPr>
+              <w:spacing w:before="20" w:after="20" w:line="252" w:lineRule="auto"/>
+            </w:pPr>
+            <w:r>
+              <w:rPr>
+                <w:rFonts w:ascii="Barlow" w:hAnsi="Barlow" w:cs="Barlow"/>
+                <w:b w:val="0"/>
+                <w:i w:val="0"/>
+                <w:sz w:val="16"/>
+              </w:rPr>
+              <w:t>11-M07-training-mismatch</w:t>
+            </w:r>
+          </w:p>
+        </w:tc>
+        <w:tc>
+          <w:tcPr>
+            <w:tcW w:type="dxa" w:w="6264"/>
+            <w:shd w:val="clear" w:color="auto" w:fill="F4F6F8"/>
+          </w:tcPr>
+          <w:p>
+            <w:pPr>
+              <w:spacing w:before="20" w:after="20" w:line="252" w:lineRule="auto"/>
+            </w:pPr>
+            <w:r>
+              <w:rPr>
+                <w:rFonts w:ascii="Barlow" w:hAnsi="Barlow" w:cs="Barlow"/>
+                <w:b w:val="0"/>
+                <w:i w:val="0"/>
+                <w:sz w:val="16"/>
+              </w:rPr>
+              <w:t>Training bias, distribution shift, out-of-domain use, and Unit 2 note v2</w:t>
             </w:r>
           </w:p>
         </w:tc>
@@ -372,7 +601,7 @@
           <w:caps w:val="1"/>
           <w:spacing w:val="12"/>
         </w:rPr>
-        <w:t>01-BRAND-KIT</w:t>
+        <w:t>11-M07-training-mismatch</w:t>
       </w:r>
     </w:p>
     <w:tbl>
@@ -396,7 +625,7 @@
       <w:tr>
         <w:tc>
           <w:tcPr>
-            <w:tcW w:type="dxa" w:w="4536"/>
+            <w:tcW w:type="dxa" w:w="4608"/>
             <w:shd w:val="clear" w:color="auto" w:fill="1F3A5F"/>
           </w:tcPr>
           <w:p>
@@ -417,7 +646,7 @@
         </w:tc>
         <w:tc>
           <w:tcPr>
-            <w:tcW w:type="dxa" w:w="5400"/>
+            <w:tcW w:type="dxa" w:w="5328"/>
             <w:shd w:val="clear" w:color="auto" w:fill="1F3A5F"/>
           </w:tcPr>
           <w:p>
@@ -440,7 +669,7 @@
       <w:tr>
         <w:tc>
           <w:tcPr>
-            <w:tcW w:type="dxa" w:w="4536"/>
+            <w:tcW w:type="dxa" w:w="4608"/>
           </w:tcPr>
           <w:p>
             <w:pPr>
@@ -453,13 +682,13 @@
                 <w:i w:val="0"/>
                 <w:sz w:val="16"/>
               </w:rPr>
-              <w:t>ACMEJOB-brand-kit.zip and expanded kit</w:t>
+              <w:t>M07-student.pptx</w:t>
             </w:r>
           </w:p>
         </w:tc>
         <w:tc>
           <w:tcPr>
-            <w:tcW w:type="dxa" w:w="5400"/>
+            <w:tcW w:type="dxa" w:w="5328"/>
           </w:tcPr>
           <w:p>
             <w:pPr>
@@ -472,87 +701,7 @@
                 <w:i w:val="0"/>
                 <w:sz w:val="16"/>
               </w:rPr>
-              <w:t>Logos, fonts, templates, and brand guide</w:t>
-            </w:r>
-          </w:p>
-        </w:tc>
-      </w:tr>
-    </w:tbl>
-    <w:p>
-      <w:pPr>
-        <w:spacing w:before="260" w:after="80" w:line="240" w:lineRule="auto"/>
-      </w:pPr>
-      <w:r>
-        <w:rPr>
-          <w:rFonts w:ascii="Barlow Condensed" w:hAnsi="Barlow Condensed" w:cs="Barlow Condensed"/>
-          <w:b/>
-          <w:i w:val="0"/>
-          <w:color w:val="1F3A5F"/>
-          <w:sz w:val="25"/>
-          <w:caps w:val="1"/>
-          <w:spacing w:val="12"/>
-        </w:rPr>
-        <w:t>02-M01-first-day</w:t>
-      </w:r>
-    </w:p>
-    <w:tbl>
-      <w:tblPr>
-        <w:tblStyle w:val="TableGrid"/>
-        <w:tblW w:type="auto" w:w="0"/>
-        <w:jc w:val="left"/>
-        <w:tblLook w:firstColumn="1" w:firstRow="1" w:lastColumn="0" w:lastRow="0" w:noHBand="0" w:noVBand="1" w:val="04A0"/>
-        <w:tblLayout w:type="fixed"/>
-        <w:tblCellMar>
-          <w:top w:w="60" w:type="dxa"/>
-          <w:left w:w="110" w:type="dxa"/>
-          <w:bottom w:w="60" w:type="dxa"/>
-          <w:right w:w="110" w:type="dxa"/>
-        </w:tblCellMar>
-      </w:tblPr>
-      <w:tblGrid>
-        <w:gridCol w:w="4968"/>
-        <w:gridCol w:w="4968"/>
-      </w:tblGrid>
-      <w:tr>
-        <w:tc>
-          <w:tcPr>
-            <w:tcW w:type="dxa" w:w="4536"/>
-            <w:shd w:val="clear" w:color="auto" w:fill="1F3A5F"/>
-          </w:tcPr>
-          <w:p>
-            <w:pPr>
-              <w:spacing w:before="20" w:after="20" w:line="252" w:lineRule="auto"/>
-            </w:pPr>
-            <w:r>
-              <w:rPr>
-                <w:rFonts w:ascii="Barlow Condensed" w:hAnsi="Barlow Condensed" w:cs="Barlow Condensed"/>
-                <w:b/>
-                <w:i w:val="0"/>
-                <w:color w:val="FFFFFF"/>
-                <w:sz w:val="16"/>
-              </w:rPr>
-              <w:t>File</w:t>
-            </w:r>
-          </w:p>
-        </w:tc>
-        <w:tc>
-          <w:tcPr>
-            <w:tcW w:type="dxa" w:w="5400"/>
-            <w:shd w:val="clear" w:color="auto" w:fill="1F3A5F"/>
-          </w:tcPr>
-          <w:p>
-            <w:pPr>
-              <w:spacing w:before="20" w:after="20" w:line="252" w:lineRule="auto"/>
-            </w:pPr>
-            <w:r>
-              <w:rPr>
-                <w:rFonts w:ascii="Barlow Condensed" w:hAnsi="Barlow Condensed" w:cs="Barlow Condensed"/>
-                <w:b/>
-                <w:i w:val="0"/>
-                <w:color w:val="FFFFFF"/>
-                <w:sz w:val="16"/>
-              </w:rPr>
-              <w:t>What it is</w:t>
+              <w:t>Spoiler-safe concept and hunt deck with approved Oli SAY in notes</w:t>
             </w:r>
           </w:p>
         </w:tc>
@@ -560,887 +709,7 @@
       <w:tr>
         <w:tc>
           <w:tcPr>
-            <w:tcW w:type="dxa" w:w="4536"/>
-          </w:tcPr>
-          <w:p>
-            <w:pPr>
-              <w:spacing w:before="20" w:after="20" w:line="252" w:lineRule="auto"/>
-            </w:pPr>
-            <w:r>
-              <w:rPr>
-                <w:rFonts w:ascii="Barlow" w:hAnsi="Barlow" w:cs="Barlow"/>
-                <w:b w:val="0"/>
-                <w:i w:val="0"/>
-                <w:sz w:val="16"/>
-              </w:rPr>
-              <w:t>M01 slides, H1-01–H1-06, and key</w:t>
-            </w:r>
-          </w:p>
-        </w:tc>
-        <w:tc>
-          <w:tcPr>
-            <w:tcW w:type="dxa" w:w="5400"/>
-          </w:tcPr>
-          <w:p>
-            <w:pPr>
-              <w:spacing w:before="20" w:after="20" w:line="252" w:lineRule="auto"/>
-            </w:pPr>
-            <w:r>
-              <w:rPr>
-                <w:rFonts w:ascii="Barlow" w:hAnsi="Barlow" w:cs="Barlow"/>
-                <w:b w:val="0"/>
-                <w:i w:val="0"/>
-                <w:sz w:val="16"/>
-              </w:rPr>
-              <w:t>Rules versus learned patterns</w:t>
-            </w:r>
-          </w:p>
-        </w:tc>
-      </w:tr>
-    </w:tbl>
-    <w:p>
-      <w:pPr>
-        <w:spacing w:before="260" w:after="80" w:line="240" w:lineRule="auto"/>
-      </w:pPr>
-      <w:r>
-        <w:rPr>
-          <w:rFonts w:ascii="Barlow Condensed" w:hAnsi="Barlow Condensed" w:cs="Barlow Condensed"/>
-          <w:b/>
-          <w:i w:val="0"/>
-          <w:color w:val="1F3A5F"/>
-          <w:sz w:val="25"/>
-          <w:caps w:val="1"/>
-          <w:spacing w:val="12"/>
-        </w:rPr>
-        <w:t>03-M02-measurement</w:t>
-      </w:r>
-    </w:p>
-    <w:tbl>
-      <w:tblPr>
-        <w:tblStyle w:val="TableGrid"/>
-        <w:tblW w:type="auto" w:w="0"/>
-        <w:jc w:val="left"/>
-        <w:tblLook w:firstColumn="1" w:firstRow="1" w:lastColumn="0" w:lastRow="0" w:noHBand="0" w:noVBand="1" w:val="04A0"/>
-        <w:tblLayout w:type="fixed"/>
-        <w:tblCellMar>
-          <w:top w:w="60" w:type="dxa"/>
-          <w:left w:w="110" w:type="dxa"/>
-          <w:bottom w:w="60" w:type="dxa"/>
-          <w:right w:w="110" w:type="dxa"/>
-        </w:tblCellMar>
-      </w:tblPr>
-      <w:tblGrid>
-        <w:gridCol w:w="4968"/>
-        <w:gridCol w:w="4968"/>
-      </w:tblGrid>
-      <w:tr>
-        <w:tc>
-          <w:tcPr>
-            <w:tcW w:type="dxa" w:w="4536"/>
-            <w:shd w:val="clear" w:color="auto" w:fill="1F3A5F"/>
-          </w:tcPr>
-          <w:p>
-            <w:pPr>
-              <w:spacing w:before="20" w:after="20" w:line="252" w:lineRule="auto"/>
-            </w:pPr>
-            <w:r>
-              <w:rPr>
-                <w:rFonts w:ascii="Barlow Condensed" w:hAnsi="Barlow Condensed" w:cs="Barlow Condensed"/>
-                <w:b/>
-                <w:i w:val="0"/>
-                <w:color w:val="FFFFFF"/>
-                <w:sz w:val="16"/>
-              </w:rPr>
-              <w:t>File</w:t>
-            </w:r>
-          </w:p>
-        </w:tc>
-        <w:tc>
-          <w:tcPr>
-            <w:tcW w:type="dxa" w:w="5400"/>
-            <w:shd w:val="clear" w:color="auto" w:fill="1F3A5F"/>
-          </w:tcPr>
-          <w:p>
-            <w:pPr>
-              <w:spacing w:before="20" w:after="20" w:line="252" w:lineRule="auto"/>
-            </w:pPr>
-            <w:r>
-              <w:rPr>
-                <w:rFonts w:ascii="Barlow Condensed" w:hAnsi="Barlow Condensed" w:cs="Barlow Condensed"/>
-                <w:b/>
-                <w:i w:val="0"/>
-                <w:color w:val="FFFFFF"/>
-                <w:sz w:val="16"/>
-              </w:rPr>
-              <w:t>What it is</w:t>
-            </w:r>
-          </w:p>
-        </w:tc>
-      </w:tr>
-      <w:tr>
-        <w:tc>
-          <w:tcPr>
-            <w:tcW w:type="dxa" w:w="4536"/>
-          </w:tcPr>
-          <w:p>
-            <w:pPr>
-              <w:spacing w:before="20" w:after="20" w:line="252" w:lineRule="auto"/>
-            </w:pPr>
-            <w:r>
-              <w:rPr>
-                <w:rFonts w:ascii="Barlow" w:hAnsi="Barlow" w:cs="Barlow"/>
-                <w:b w:val="0"/>
-                <w:i w:val="0"/>
-                <w:sz w:val="16"/>
-              </w:rPr>
-              <w:t>M02 student/reveal decks, H2 files, data, and key</w:t>
-            </w:r>
-          </w:p>
-        </w:tc>
-        <w:tc>
-          <w:tcPr>
-            <w:tcW w:type="dxa" w:w="5400"/>
-          </w:tcPr>
-          <w:p>
-            <w:pPr>
-              <w:spacing w:before="20" w:after="20" w:line="252" w:lineRule="auto"/>
-            </w:pPr>
-            <w:r>
-              <w:rPr>
-                <w:rFonts w:ascii="Barlow" w:hAnsi="Barlow" w:cs="Barlow"/>
-                <w:b w:val="0"/>
-                <w:i w:val="0"/>
-                <w:sz w:val="16"/>
-              </w:rPr>
-              <w:t>Measurement and uncertainty</w:t>
-            </w:r>
-          </w:p>
-        </w:tc>
-      </w:tr>
-    </w:tbl>
-    <w:p>
-      <w:pPr>
-        <w:spacing w:before="260" w:after="80" w:line="240" w:lineRule="auto"/>
-      </w:pPr>
-      <w:r>
-        <w:rPr>
-          <w:rFonts w:ascii="Barlow Condensed" w:hAnsi="Barlow Condensed" w:cs="Barlow Condensed"/>
-          <w:b/>
-          <w:i w:val="0"/>
-          <w:color w:val="1F3A5F"/>
-          <w:sz w:val="25"/>
-          <w:caps w:val="1"/>
-          <w:spacing w:val="12"/>
-        </w:rPr>
-        <w:t>04-M03-hallucination</w:t>
-      </w:r>
-    </w:p>
-    <w:tbl>
-      <w:tblPr>
-        <w:tblStyle w:val="TableGrid"/>
-        <w:tblW w:type="auto" w:w="0"/>
-        <w:jc w:val="left"/>
-        <w:tblLook w:firstColumn="1" w:firstRow="1" w:lastColumn="0" w:lastRow="0" w:noHBand="0" w:noVBand="1" w:val="04A0"/>
-        <w:tblLayout w:type="fixed"/>
-        <w:tblCellMar>
-          <w:top w:w="60" w:type="dxa"/>
-          <w:left w:w="110" w:type="dxa"/>
-          <w:bottom w:w="60" w:type="dxa"/>
-          <w:right w:w="110" w:type="dxa"/>
-        </w:tblCellMar>
-      </w:tblPr>
-      <w:tblGrid>
-        <w:gridCol w:w="4968"/>
-        <w:gridCol w:w="4968"/>
-      </w:tblGrid>
-      <w:tr>
-        <w:tc>
-          <w:tcPr>
-            <w:tcW w:type="dxa" w:w="4536"/>
-            <w:shd w:val="clear" w:color="auto" w:fill="1F3A5F"/>
-          </w:tcPr>
-          <w:p>
-            <w:pPr>
-              <w:spacing w:before="20" w:after="20" w:line="252" w:lineRule="auto"/>
-            </w:pPr>
-            <w:r>
-              <w:rPr>
-                <w:rFonts w:ascii="Barlow Condensed" w:hAnsi="Barlow Condensed" w:cs="Barlow Condensed"/>
-                <w:b/>
-                <w:i w:val="0"/>
-                <w:color w:val="FFFFFF"/>
-                <w:sz w:val="16"/>
-              </w:rPr>
-              <w:t>File</w:t>
-            </w:r>
-          </w:p>
-        </w:tc>
-        <w:tc>
-          <w:tcPr>
-            <w:tcW w:type="dxa" w:w="5400"/>
-            <w:shd w:val="clear" w:color="auto" w:fill="1F3A5F"/>
-          </w:tcPr>
-          <w:p>
-            <w:pPr>
-              <w:spacing w:before="20" w:after="20" w:line="252" w:lineRule="auto"/>
-            </w:pPr>
-            <w:r>
-              <w:rPr>
-                <w:rFonts w:ascii="Barlow Condensed" w:hAnsi="Barlow Condensed" w:cs="Barlow Condensed"/>
-                <w:b/>
-                <w:i w:val="0"/>
-                <w:color w:val="FFFFFF"/>
-                <w:sz w:val="16"/>
-              </w:rPr>
-              <w:t>What it is</w:t>
-            </w:r>
-          </w:p>
-        </w:tc>
-      </w:tr>
-      <w:tr>
-        <w:tc>
-          <w:tcPr>
-            <w:tcW w:type="dxa" w:w="4536"/>
-          </w:tcPr>
-          <w:p>
-            <w:pPr>
-              <w:spacing w:before="20" w:after="20" w:line="252" w:lineRule="auto"/>
-            </w:pPr>
-            <w:r>
-              <w:rPr>
-                <w:rFonts w:ascii="Barlow" w:hAnsi="Barlow" w:cs="Barlow"/>
-                <w:b w:val="0"/>
-                <w:i w:val="0"/>
-                <w:sz w:val="16"/>
-              </w:rPr>
-              <w:t>M03 slides, H3-01–H3-05, and key</w:t>
-            </w:r>
-          </w:p>
-        </w:tc>
-        <w:tc>
-          <w:tcPr>
-            <w:tcW w:type="dxa" w:w="5400"/>
-          </w:tcPr>
-          <w:p>
-            <w:pPr>
-              <w:spacing w:before="20" w:after="20" w:line="252" w:lineRule="auto"/>
-            </w:pPr>
-            <w:r>
-              <w:rPr>
-                <w:rFonts w:ascii="Barlow" w:hAnsi="Barlow" w:cs="Barlow"/>
-                <w:b w:val="0"/>
-                <w:i w:val="0"/>
-                <w:sz w:val="16"/>
-              </w:rPr>
-              <w:t>Next-token generation and source checking</w:t>
-            </w:r>
-          </w:p>
-        </w:tc>
-      </w:tr>
-    </w:tbl>
-    <w:p>
-      <w:pPr>
-        <w:spacing w:before="260" w:after="80" w:line="240" w:lineRule="auto"/>
-      </w:pPr>
-      <w:r>
-        <w:rPr>
-          <w:rFonts w:ascii="Barlow Condensed" w:hAnsi="Barlow Condensed" w:cs="Barlow Condensed"/>
-          <w:b/>
-          <w:i w:val="0"/>
-          <w:color w:val="1F3A5F"/>
-          <w:sz w:val="25"/>
-          <w:caps w:val="1"/>
-          <w:spacing w:val="12"/>
-        </w:rPr>
-        <w:t>05-CHARTS</w:t>
-      </w:r>
-    </w:p>
-    <w:tbl>
-      <w:tblPr>
-        <w:tblStyle w:val="TableGrid"/>
-        <w:tblW w:type="auto" w:w="0"/>
-        <w:jc w:val="left"/>
-        <w:tblLook w:firstColumn="1" w:firstRow="1" w:lastColumn="0" w:lastRow="0" w:noHBand="0" w:noVBand="1" w:val="04A0"/>
-        <w:tblLayout w:type="fixed"/>
-        <w:tblCellMar>
-          <w:top w:w="60" w:type="dxa"/>
-          <w:left w:w="110" w:type="dxa"/>
-          <w:bottom w:w="60" w:type="dxa"/>
-          <w:right w:w="110" w:type="dxa"/>
-        </w:tblCellMar>
-      </w:tblPr>
-      <w:tblGrid>
-        <w:gridCol w:w="4968"/>
-        <w:gridCol w:w="4968"/>
-      </w:tblGrid>
-      <w:tr>
-        <w:tc>
-          <w:tcPr>
-            <w:tcW w:type="dxa" w:w="4536"/>
-            <w:shd w:val="clear" w:color="auto" w:fill="1F3A5F"/>
-          </w:tcPr>
-          <w:p>
-            <w:pPr>
-              <w:spacing w:before="20" w:after="20" w:line="252" w:lineRule="auto"/>
-            </w:pPr>
-            <w:r>
-              <w:rPr>
-                <w:rFonts w:ascii="Barlow Condensed" w:hAnsi="Barlow Condensed" w:cs="Barlow Condensed"/>
-                <w:b/>
-                <w:i w:val="0"/>
-                <w:color w:val="FFFFFF"/>
-                <w:sz w:val="16"/>
-              </w:rPr>
-              <w:t>File</w:t>
-            </w:r>
-          </w:p>
-        </w:tc>
-        <w:tc>
-          <w:tcPr>
-            <w:tcW w:type="dxa" w:w="5400"/>
-            <w:shd w:val="clear" w:color="auto" w:fill="1F3A5F"/>
-          </w:tcPr>
-          <w:p>
-            <w:pPr>
-              <w:spacing w:before="20" w:after="20" w:line="252" w:lineRule="auto"/>
-            </w:pPr>
-            <w:r>
-              <w:rPr>
-                <w:rFonts w:ascii="Barlow Condensed" w:hAnsi="Barlow Condensed" w:cs="Barlow Condensed"/>
-                <w:b/>
-                <w:i w:val="0"/>
-                <w:color w:val="FFFFFF"/>
-                <w:sz w:val="16"/>
-              </w:rPr>
-              <w:t>What it is</w:t>
-            </w:r>
-          </w:p>
-        </w:tc>
-      </w:tr>
-      <w:tr>
-        <w:tc>
-          <w:tcPr>
-            <w:tcW w:type="dxa" w:w="4536"/>
-          </w:tcPr>
-          <w:p>
-            <w:pPr>
-              <w:spacing w:before="20" w:after="20" w:line="252" w:lineRule="auto"/>
-            </w:pPr>
-            <w:r>
-              <w:rPr>
-                <w:rFonts w:ascii="Barlow" w:hAnsi="Barlow" w:cs="Barlow"/>
-                <w:b w:val="0"/>
-                <w:i w:val="0"/>
-                <w:sz w:val="16"/>
-              </w:rPr>
-              <w:t>*.png</w:t>
-            </w:r>
-          </w:p>
-        </w:tc>
-        <w:tc>
-          <w:tcPr>
-            <w:tcW w:type="dxa" w:w="5400"/>
-          </w:tcPr>
-          <w:p>
-            <w:pPr>
-              <w:spacing w:before="20" w:after="20" w:line="252" w:lineRule="auto"/>
-            </w:pPr>
-            <w:r>
-              <w:rPr>
-                <w:rFonts w:ascii="Barlow" w:hAnsi="Barlow" w:cs="Barlow"/>
-                <w:b w:val="0"/>
-                <w:i w:val="0"/>
-                <w:sz w:val="16"/>
-              </w:rPr>
-              <w:t>Charts used throughout the meeting decks</w:t>
-            </w:r>
-          </w:p>
-        </w:tc>
-      </w:tr>
-    </w:tbl>
-    <w:p>
-      <w:pPr>
-        <w:spacing w:before="260" w:after="80" w:line="240" w:lineRule="auto"/>
-      </w:pPr>
-      <w:r>
-        <w:rPr>
-          <w:rFonts w:ascii="Barlow Condensed" w:hAnsi="Barlow Condensed" w:cs="Barlow Condensed"/>
-          <w:b/>
-          <w:i w:val="0"/>
-          <w:color w:val="1F3A5F"/>
-          <w:sz w:val="25"/>
-          <w:caps w:val="1"/>
-          <w:spacing w:val="12"/>
-        </w:rPr>
-        <w:t>06-BRIDGE</w:t>
-      </w:r>
-    </w:p>
-    <w:tbl>
-      <w:tblPr>
-        <w:tblStyle w:val="TableGrid"/>
-        <w:tblW w:type="auto" w:w="0"/>
-        <w:jc w:val="left"/>
-        <w:tblLook w:firstColumn="1" w:firstRow="1" w:lastColumn="0" w:lastRow="0" w:noHBand="0" w:noVBand="1" w:val="04A0"/>
-        <w:tblLayout w:type="fixed"/>
-        <w:tblCellMar>
-          <w:top w:w="60" w:type="dxa"/>
-          <w:left w:w="110" w:type="dxa"/>
-          <w:bottom w:w="60" w:type="dxa"/>
-          <w:right w:w="110" w:type="dxa"/>
-        </w:tblCellMar>
-      </w:tblPr>
-      <w:tblGrid>
-        <w:gridCol w:w="4968"/>
-        <w:gridCol w:w="4968"/>
-      </w:tblGrid>
-      <w:tr>
-        <w:tc>
-          <w:tcPr>
-            <w:tcW w:type="dxa" w:w="4536"/>
-            <w:shd w:val="clear" w:color="auto" w:fill="1F3A5F"/>
-          </w:tcPr>
-          <w:p>
-            <w:pPr>
-              <w:spacing w:before="20" w:after="20" w:line="252" w:lineRule="auto"/>
-            </w:pPr>
-            <w:r>
-              <w:rPr>
-                <w:rFonts w:ascii="Barlow Condensed" w:hAnsi="Barlow Condensed" w:cs="Barlow Condensed"/>
-                <w:b/>
-                <w:i w:val="0"/>
-                <w:color w:val="FFFFFF"/>
-                <w:sz w:val="16"/>
-              </w:rPr>
-              <w:t>File</w:t>
-            </w:r>
-          </w:p>
-        </w:tc>
-        <w:tc>
-          <w:tcPr>
-            <w:tcW w:type="dxa" w:w="5400"/>
-            <w:shd w:val="clear" w:color="auto" w:fill="1F3A5F"/>
-          </w:tcPr>
-          <w:p>
-            <w:pPr>
-              <w:spacing w:before="20" w:after="20" w:line="252" w:lineRule="auto"/>
-            </w:pPr>
-            <w:r>
-              <w:rPr>
-                <w:rFonts w:ascii="Barlow Condensed" w:hAnsi="Barlow Condensed" w:cs="Barlow Condensed"/>
-                <w:b/>
-                <w:i w:val="0"/>
-                <w:color w:val="FFFFFF"/>
-                <w:sz w:val="16"/>
-              </w:rPr>
-              <w:t>What it is</w:t>
-            </w:r>
-          </w:p>
-        </w:tc>
-      </w:tr>
-      <w:tr>
-        <w:tc>
-          <w:tcPr>
-            <w:tcW w:type="dxa" w:w="4536"/>
-          </w:tcPr>
-          <w:p>
-            <w:pPr>
-              <w:spacing w:before="20" w:after="20" w:line="252" w:lineRule="auto"/>
-            </w:pPr>
-            <w:r>
-              <w:rPr>
-                <w:rFonts w:ascii="Barlow" w:hAnsi="Barlow" w:cs="Barlow"/>
-                <w:b w:val="0"/>
-                <w:i w:val="0"/>
-                <w:sz w:val="16"/>
-              </w:rPr>
-              <w:t>Bridge illustrations, elevation, gauge array, maps, and README</w:t>
-            </w:r>
-          </w:p>
-        </w:tc>
-        <w:tc>
-          <w:tcPr>
-            <w:tcW w:type="dxa" w:w="5400"/>
-          </w:tcPr>
-          <w:p>
-            <w:pPr>
-              <w:spacing w:before="20" w:after="20" w:line="252" w:lineRule="auto"/>
-            </w:pPr>
-            <w:r>
-              <w:rPr>
-                <w:rFonts w:ascii="Barlow" w:hAnsi="Barlow" w:cs="Barlow"/>
-                <w:b w:val="0"/>
-                <w:i w:val="0"/>
-                <w:sz w:val="16"/>
-              </w:rPr>
-              <w:t>Reusable visuals</w:t>
-            </w:r>
-          </w:p>
-        </w:tc>
-      </w:tr>
-    </w:tbl>
-    <w:p>
-      <w:pPr>
-        <w:spacing w:before="260" w:after="80" w:line="240" w:lineRule="auto"/>
-      </w:pPr>
-      <w:r>
-        <w:rPr>
-          <w:rFonts w:ascii="Barlow Condensed" w:hAnsi="Barlow Condensed" w:cs="Barlow Condensed"/>
-          <w:b/>
-          <w:i w:val="0"/>
-          <w:color w:val="1F3A5F"/>
-          <w:sz w:val="25"/>
-          <w:caps w:val="1"/>
-          <w:spacing w:val="12"/>
-        </w:rPr>
-        <w:t>07-HW-CASE-B-LIFT-STATION</w:t>
-      </w:r>
-    </w:p>
-    <w:tbl>
-      <w:tblPr>
-        <w:tblStyle w:val="TableGrid"/>
-        <w:tblW w:type="auto" w:w="0"/>
-        <w:jc w:val="left"/>
-        <w:tblLook w:firstColumn="1" w:firstRow="1" w:lastColumn="0" w:lastRow="0" w:noHBand="0" w:noVBand="1" w:val="04A0"/>
-        <w:tblLayout w:type="fixed"/>
-        <w:tblCellMar>
-          <w:top w:w="60" w:type="dxa"/>
-          <w:left w:w="110" w:type="dxa"/>
-          <w:bottom w:w="60" w:type="dxa"/>
-          <w:right w:w="110" w:type="dxa"/>
-        </w:tblCellMar>
-      </w:tblPr>
-      <w:tblGrid>
-        <w:gridCol w:w="4968"/>
-        <w:gridCol w:w="4968"/>
-      </w:tblGrid>
-      <w:tr>
-        <w:tc>
-          <w:tcPr>
-            <w:tcW w:type="dxa" w:w="4536"/>
-            <w:shd w:val="clear" w:color="auto" w:fill="1F3A5F"/>
-          </w:tcPr>
-          <w:p>
-            <w:pPr>
-              <w:spacing w:before="20" w:after="20" w:line="252" w:lineRule="auto"/>
-            </w:pPr>
-            <w:r>
-              <w:rPr>
-                <w:rFonts w:ascii="Barlow Condensed" w:hAnsi="Barlow Condensed" w:cs="Barlow Condensed"/>
-                <w:b/>
-                <w:i w:val="0"/>
-                <w:color w:val="FFFFFF"/>
-                <w:sz w:val="16"/>
-              </w:rPr>
-              <w:t>File</w:t>
-            </w:r>
-          </w:p>
-        </w:tc>
-        <w:tc>
-          <w:tcPr>
-            <w:tcW w:type="dxa" w:w="5400"/>
-            <w:shd w:val="clear" w:color="auto" w:fill="1F3A5F"/>
-          </w:tcPr>
-          <w:p>
-            <w:pPr>
-              <w:spacing w:before="20" w:after="20" w:line="252" w:lineRule="auto"/>
-            </w:pPr>
-            <w:r>
-              <w:rPr>
-                <w:rFonts w:ascii="Barlow Condensed" w:hAnsi="Barlow Condensed" w:cs="Barlow Condensed"/>
-                <w:b/>
-                <w:i w:val="0"/>
-                <w:color w:val="FFFFFF"/>
-                <w:sz w:val="16"/>
-              </w:rPr>
-              <w:t>What it is</w:t>
-            </w:r>
-          </w:p>
-        </w:tc>
-      </w:tr>
-      <w:tr>
-        <w:tc>
-          <w:tcPr>
-            <w:tcW w:type="dxa" w:w="4536"/>
-          </w:tcPr>
-          <w:p>
-            <w:pPr>
-              <w:spacing w:before="20" w:after="20" w:line="252" w:lineRule="auto"/>
-            </w:pPr>
-            <w:r>
-              <w:rPr>
-                <w:rFonts w:ascii="Barlow" w:hAnsi="Barlow" w:cs="Barlow"/>
-                <w:b w:val="0"/>
-                <w:i w:val="0"/>
-                <w:sz w:val="16"/>
-              </w:rPr>
-              <w:t>student/ and instructor/</w:t>
-            </w:r>
-          </w:p>
-        </w:tc>
-        <w:tc>
-          <w:tcPr>
-            <w:tcW w:type="dxa" w:w="5400"/>
-          </w:tcPr>
-          <w:p>
-            <w:pPr>
-              <w:spacing w:before="20" w:after="20" w:line="252" w:lineRule="auto"/>
-            </w:pPr>
-            <w:r>
-              <w:rPr>
-                <w:rFonts w:ascii="Barlow" w:hAnsi="Barlow" w:cs="Barlow"/>
-                <w:b w:val="0"/>
-                <w:i w:val="0"/>
-                <w:sz w:val="16"/>
-              </w:rPr>
-              <w:t>M02 transfer homework, source files, and key</w:t>
-            </w:r>
-          </w:p>
-        </w:tc>
-      </w:tr>
-    </w:tbl>
-    <w:p>
-      <w:pPr>
-        <w:spacing w:before="260" w:after="80" w:line="240" w:lineRule="auto"/>
-      </w:pPr>
-      <w:r>
-        <w:rPr>
-          <w:rFonts w:ascii="Barlow Condensed" w:hAnsi="Barlow Condensed" w:cs="Barlow Condensed"/>
-          <w:b/>
-          <w:i w:val="0"/>
-          <w:color w:val="1F3A5F"/>
-          <w:sz w:val="25"/>
-          <w:caps w:val="1"/>
-          <w:spacing w:val="12"/>
-        </w:rPr>
-        <w:t>08-M04-one-number</w:t>
-      </w:r>
-    </w:p>
-    <w:tbl>
-      <w:tblPr>
-        <w:tblStyle w:val="TableGrid"/>
-        <w:tblW w:type="auto" w:w="0"/>
-        <w:jc w:val="left"/>
-        <w:tblLook w:firstColumn="1" w:firstRow="1" w:lastColumn="0" w:lastRow="0" w:noHBand="0" w:noVBand="1" w:val="04A0"/>
-        <w:tblLayout w:type="fixed"/>
-        <w:tblCellMar>
-          <w:top w:w="60" w:type="dxa"/>
-          <w:left w:w="110" w:type="dxa"/>
-          <w:bottom w:w="60" w:type="dxa"/>
-          <w:right w:w="110" w:type="dxa"/>
-        </w:tblCellMar>
-      </w:tblPr>
-      <w:tblGrid>
-        <w:gridCol w:w="4968"/>
-        <w:gridCol w:w="4968"/>
-      </w:tblGrid>
-      <w:tr>
-        <w:tc>
-          <w:tcPr>
-            <w:tcW w:type="dxa" w:w="4536"/>
-            <w:shd w:val="clear" w:color="auto" w:fill="1F3A5F"/>
-          </w:tcPr>
-          <w:p>
-            <w:pPr>
-              <w:spacing w:before="20" w:after="20" w:line="252" w:lineRule="auto"/>
-            </w:pPr>
-            <w:r>
-              <w:rPr>
-                <w:rFonts w:ascii="Barlow Condensed" w:hAnsi="Barlow Condensed" w:cs="Barlow Condensed"/>
-                <w:b/>
-                <w:i w:val="0"/>
-                <w:color w:val="FFFFFF"/>
-                <w:sz w:val="16"/>
-              </w:rPr>
-              <w:t>File</w:t>
-            </w:r>
-          </w:p>
-        </w:tc>
-        <w:tc>
-          <w:tcPr>
-            <w:tcW w:type="dxa" w:w="5400"/>
-            <w:shd w:val="clear" w:color="auto" w:fill="1F3A5F"/>
-          </w:tcPr>
-          <w:p>
-            <w:pPr>
-              <w:spacing w:before="20" w:after="20" w:line="252" w:lineRule="auto"/>
-            </w:pPr>
-            <w:r>
-              <w:rPr>
-                <w:rFonts w:ascii="Barlow Condensed" w:hAnsi="Barlow Condensed" w:cs="Barlow Condensed"/>
-                <w:b/>
-                <w:i w:val="0"/>
-                <w:color w:val="FFFFFF"/>
-                <w:sz w:val="16"/>
-              </w:rPr>
-              <w:t>What it is</w:t>
-            </w:r>
-          </w:p>
-        </w:tc>
-      </w:tr>
-      <w:tr>
-        <w:tc>
-          <w:tcPr>
-            <w:tcW w:type="dxa" w:w="4536"/>
-          </w:tcPr>
-          <w:p>
-            <w:pPr>
-              <w:spacing w:before="20" w:after="20" w:line="252" w:lineRule="auto"/>
-            </w:pPr>
-            <w:r>
-              <w:rPr>
-                <w:rFonts w:ascii="Barlow" w:hAnsi="Barlow" w:cs="Barlow"/>
-                <w:b w:val="0"/>
-                <w:i w:val="0"/>
-                <w:sz w:val="16"/>
-              </w:rPr>
-              <w:t>M04 student/reveal decks, H4 files, cores_2027.csv, and key</w:t>
-            </w:r>
-          </w:p>
-        </w:tc>
-        <w:tc>
-          <w:tcPr>
-            <w:tcW w:type="dxa" w:w="5400"/>
-          </w:tcPr>
-          <w:p>
-            <w:pPr>
-              <w:spacing w:before="20" w:after="20" w:line="252" w:lineRule="auto"/>
-            </w:pPr>
-            <w:r>
-              <w:rPr>
-                <w:rFonts w:ascii="Barlow" w:hAnsi="Barlow" w:cs="Barlow"/>
-                <w:b w:val="0"/>
-                <w:i w:val="0"/>
-                <w:sz w:val="16"/>
-              </w:rPr>
-              <w:t>Center, spread, CV, low count, and sample scope</w:t>
-            </w:r>
-          </w:p>
-        </w:tc>
-      </w:tr>
-    </w:tbl>
-    <w:p>
-      <w:pPr>
-        <w:spacing w:before="260" w:after="80" w:line="240" w:lineRule="auto"/>
-      </w:pPr>
-      <w:r>
-        <w:rPr>
-          <w:rFonts w:ascii="Barlow Condensed" w:hAnsi="Barlow Condensed" w:cs="Barlow Condensed"/>
-          <w:b/>
-          <w:i w:val="0"/>
-          <w:color w:val="1F3A5F"/>
-          <w:sz w:val="25"/>
-          <w:caps w:val="1"/>
-          <w:spacing w:val="12"/>
-        </w:rPr>
-        <w:t>09-M05-overnight-alarm</w:t>
-      </w:r>
-    </w:p>
-    <w:tbl>
-      <w:tblPr>
-        <w:tblStyle w:val="TableGrid"/>
-        <w:tblW w:type="auto" w:w="0"/>
-        <w:jc w:val="left"/>
-        <w:tblLook w:firstColumn="1" w:firstRow="1" w:lastColumn="0" w:lastRow="0" w:noHBand="0" w:noVBand="1" w:val="04A0"/>
-        <w:tblLayout w:type="fixed"/>
-        <w:tblCellMar>
-          <w:top w:w="60" w:type="dxa"/>
-          <w:left w:w="110" w:type="dxa"/>
-          <w:bottom w:w="60" w:type="dxa"/>
-          <w:right w:w="110" w:type="dxa"/>
-        </w:tblCellMar>
-      </w:tblPr>
-      <w:tblGrid>
-        <w:gridCol w:w="4968"/>
-        <w:gridCol w:w="4968"/>
-      </w:tblGrid>
-      <w:tr>
-        <w:tc>
-          <w:tcPr>
-            <w:tcW w:type="dxa" w:w="4536"/>
-            <w:shd w:val="clear" w:color="auto" w:fill="1F3A5F"/>
-          </w:tcPr>
-          <w:p>
-            <w:pPr>
-              <w:spacing w:before="20" w:after="20" w:line="252" w:lineRule="auto"/>
-            </w:pPr>
-            <w:r>
-              <w:rPr>
-                <w:rFonts w:ascii="Barlow Condensed" w:hAnsi="Barlow Condensed" w:cs="Barlow Condensed"/>
-                <w:b/>
-                <w:i w:val="0"/>
-                <w:color w:val="FFFFFF"/>
-                <w:sz w:val="16"/>
-              </w:rPr>
-              <w:t>File</w:t>
-            </w:r>
-          </w:p>
-        </w:tc>
-        <w:tc>
-          <w:tcPr>
-            <w:tcW w:type="dxa" w:w="5400"/>
-            <w:shd w:val="clear" w:color="auto" w:fill="1F3A5F"/>
-          </w:tcPr>
-          <w:p>
-            <w:pPr>
-              <w:spacing w:before="20" w:after="20" w:line="252" w:lineRule="auto"/>
-            </w:pPr>
-            <w:r>
-              <w:rPr>
-                <w:rFonts w:ascii="Barlow Condensed" w:hAnsi="Barlow Condensed" w:cs="Barlow Condensed"/>
-                <w:b/>
-                <w:i w:val="0"/>
-                <w:color w:val="FFFFFF"/>
-                <w:sz w:val="16"/>
-              </w:rPr>
-              <w:t>What it is</w:t>
-            </w:r>
-          </w:p>
-        </w:tc>
-      </w:tr>
-      <w:tr>
-        <w:tc>
-          <w:tcPr>
-            <w:tcW w:type="dxa" w:w="4536"/>
-          </w:tcPr>
-          <w:p>
-            <w:pPr>
-              <w:spacing w:before="20" w:after="20" w:line="252" w:lineRule="auto"/>
-            </w:pPr>
-            <w:r>
-              <w:rPr>
-                <w:rFonts w:ascii="Barlow" w:hAnsi="Barlow" w:cs="Barlow"/>
-                <w:b w:val="0"/>
-                <w:i w:val="0"/>
-                <w:sz w:val="16"/>
-              </w:rPr>
-              <w:t>feed.csv + run log + threshold_config.csv</w:t>
-            </w:r>
-          </w:p>
-        </w:tc>
-        <w:tc>
-          <w:tcPr>
-            <w:tcW w:type="dxa" w:w="5400"/>
-          </w:tcPr>
-          <w:p>
-            <w:pPr>
-              <w:spacing w:before="20" w:after="20" w:line="252" w:lineRule="auto"/>
-            </w:pPr>
-            <w:r>
-              <w:rPr>
-                <w:rFonts w:ascii="Barlow" w:hAnsi="Barlow" w:cs="Barlow"/>
-                <w:b w:val="0"/>
-                <w:i w:val="0"/>
-                <w:sz w:val="16"/>
-              </w:rPr>
-              <w:t>The chain and unresolved event audited in M06</w:t>
-            </w:r>
-          </w:p>
-        </w:tc>
-      </w:tr>
-      <w:tr>
-        <w:tc>
-          <w:tcPr>
-            <w:tcW w:type="dxa" w:w="4536"/>
+            <w:tcW w:type="dxa" w:w="4608"/>
             <w:shd w:val="clear" w:color="auto" w:fill="F4F6F8"/>
           </w:tcPr>
           <w:p>
@@ -1454,13 +723,13 @@
                 <w:i w:val="0"/>
                 <w:sz w:val="16"/>
               </w:rPr>
-              <w:t>M05 decks, H5 files, and key</w:t>
+              <w:t>M07-instructor-reveal.pptx</w:t>
             </w:r>
           </w:p>
         </w:tc>
         <w:tc>
           <w:tcPr>
-            <w:tcW w:type="dxa" w:w="5400"/>
+            <w:tcW w:type="dxa" w:w="5328"/>
             <w:shd w:val="clear" w:color="auto" w:fill="F4F6F8"/>
           </w:tcPr>
           <w:p>
@@ -1474,87 +743,7 @@
                 <w:i w:val="0"/>
                 <w:sz w:val="16"/>
               </w:rPr>
-              <w:t>Agentic loop, threshold alarm, and audit</w:t>
-            </w:r>
-          </w:p>
-        </w:tc>
-      </w:tr>
-    </w:tbl>
-    <w:p>
-      <w:pPr>
-        <w:spacing w:before="260" w:after="80" w:line="240" w:lineRule="auto"/>
-      </w:pPr>
-      <w:r>
-        <w:rPr>
-          <w:rFonts w:ascii="Barlow Condensed" w:hAnsi="Barlow Condensed" w:cs="Barlow Condensed"/>
-          <w:b/>
-          <w:i w:val="0"/>
-          <w:color w:val="1F3A5F"/>
-          <w:sz w:val="25"/>
-          <w:caps w:val="1"/>
-          <w:spacing w:val="12"/>
-        </w:rPr>
-        <w:t>10-M06-alarm-audit</w:t>
-      </w:r>
-    </w:p>
-    <w:tbl>
-      <w:tblPr>
-        <w:tblStyle w:val="TableGrid"/>
-        <w:tblW w:type="auto" w:w="0"/>
-        <w:jc w:val="left"/>
-        <w:tblLook w:firstColumn="1" w:firstRow="1" w:lastColumn="0" w:lastRow="0" w:noHBand="0" w:noVBand="1" w:val="04A0"/>
-        <w:tblLayout w:type="fixed"/>
-        <w:tblCellMar>
-          <w:top w:w="60" w:type="dxa"/>
-          <w:left w:w="110" w:type="dxa"/>
-          <w:bottom w:w="60" w:type="dxa"/>
-          <w:right w:w="110" w:type="dxa"/>
-        </w:tblCellMar>
-      </w:tblPr>
-      <w:tblGrid>
-        <w:gridCol w:w="4968"/>
-        <w:gridCol w:w="4968"/>
-      </w:tblGrid>
-      <w:tr>
-        <w:tc>
-          <w:tcPr>
-            <w:tcW w:type="dxa" w:w="4536"/>
-            <w:shd w:val="clear" w:color="auto" w:fill="1F3A5F"/>
-          </w:tcPr>
-          <w:p>
-            <w:pPr>
-              <w:spacing w:before="20" w:after="20" w:line="252" w:lineRule="auto"/>
-            </w:pPr>
-            <w:r>
-              <w:rPr>
-                <w:rFonts w:ascii="Barlow Condensed" w:hAnsi="Barlow Condensed" w:cs="Barlow Condensed"/>
-                <w:b/>
-                <w:i w:val="0"/>
-                <w:color w:val="FFFFFF"/>
-                <w:sz w:val="16"/>
-              </w:rPr>
-              <w:t>File</w:t>
-            </w:r>
-          </w:p>
-        </w:tc>
-        <w:tc>
-          <w:tcPr>
-            <w:tcW w:type="dxa" w:w="5400"/>
-            <w:shd w:val="clear" w:color="auto" w:fill="1F3A5F"/>
-          </w:tcPr>
-          <w:p>
-            <w:pPr>
-              <w:spacing w:before="20" w:after="20" w:line="252" w:lineRule="auto"/>
-            </w:pPr>
-            <w:r>
-              <w:rPr>
-                <w:rFonts w:ascii="Barlow Condensed" w:hAnsi="Barlow Condensed" w:cs="Barlow Condensed"/>
-                <w:b/>
-                <w:i w:val="0"/>
-                <w:color w:val="FFFFFF"/>
-                <w:sz w:val="16"/>
-              </w:rPr>
-              <w:t>What it is</w:t>
+              <w:t>Gated coverage conclusion and bounded action</w:t>
             </w:r>
           </w:p>
         </w:tc>
@@ -1562,7 +751,7 @@
       <w:tr>
         <w:tc>
           <w:tcPr>
-            <w:tcW w:type="dxa" w:w="4536"/>
+            <w:tcW w:type="dxa" w:w="4608"/>
           </w:tcPr>
           <w:p>
             <w:pPr>
@@ -1575,13 +764,13 @@
                 <w:i w:val="0"/>
                 <w:sz w:val="16"/>
               </w:rPr>
-              <w:t>M06-student.pptx</w:t>
+              <w:t>H7-01-vendor-training-summary.docx</w:t>
             </w:r>
           </w:p>
         </w:tc>
         <w:tc>
           <w:tcPr>
-            <w:tcW w:type="dxa" w:w="5400"/>
+            <w:tcW w:type="dxa" w:w="5328"/>
           </w:tcPr>
           <w:p>
             <w:pPr>
@@ -1594,7 +783,7 @@
                 <w:i w:val="0"/>
                 <w:sz w:val="16"/>
               </w:rPr>
-              <w:t>Spoiler-safe 13-slide hunt deck</w:t>
+              <w:t>Highway-girder / warm-state training coverage</w:t>
             </w:r>
           </w:p>
         </w:tc>
@@ -1602,7 +791,7 @@
       <w:tr>
         <w:tc>
           <w:tcPr>
-            <w:tcW w:type="dxa" w:w="4536"/>
+            <w:tcW w:type="dxa" w:w="4608"/>
             <w:shd w:val="clear" w:color="auto" w:fill="F4F6F8"/>
           </w:tcPr>
           <w:p>
@@ -1616,13 +805,13 @@
                 <w:i w:val="0"/>
                 <w:sz w:val="16"/>
               </w:rPr>
-              <w:t>M06-instructor-reveal.pptx</w:t>
+              <w:t>H7-02-Otter-Bend-site-and-exposure.docx</w:t>
             </w:r>
           </w:p>
         </w:tc>
         <w:tc>
           <w:tcPr>
-            <w:tcW w:type="dxa" w:w="5400"/>
+            <w:tcW w:type="dxa" w:w="5328"/>
             <w:shd w:val="clear" w:color="auto" w:fill="F4F6F8"/>
           </w:tcPr>
           <w:p>
@@ -1636,7 +825,7 @@
                 <w:i w:val="0"/>
                 <w:sz w:val="16"/>
               </w:rPr>
-              <w:t>Gated 7-slide conclusion and Unit 1 close</w:t>
+              <w:t>Lift machinery, freeze–thaw, and road-salt deployment conditions</w:t>
             </w:r>
           </w:p>
         </w:tc>
@@ -1644,7 +833,7 @@
       <w:tr>
         <w:tc>
           <w:tcPr>
-            <w:tcW w:type="dxa" w:w="4536"/>
+            <w:tcW w:type="dxa" w:w="4608"/>
           </w:tcPr>
           <w:p>
             <w:pPr>
@@ -1657,13 +846,13 @@
                 <w:i w:val="0"/>
                 <w:sz w:val="16"/>
               </w:rPr>
-              <w:t>H6-01-FOREMAN-alarm-disposition.docx</w:t>
+              <w:t>H7-03-inspection-photo-set.docx</w:t>
             </w:r>
           </w:p>
         </w:tc>
         <w:tc>
           <w:tcPr>
-            <w:tcW w:type="dxa" w:w="5400"/>
+            <w:tcW w:type="dxa" w:w="5328"/>
           </w:tcPr>
           <w:p>
             <w:pPr>
@@ -1676,7 +865,7 @@
                 <w:i w:val="0"/>
                 <w:sz w:val="16"/>
               </w:rPr>
-              <w:t>FOREMAN's normality / sensor-fault reversal</w:t>
+              <w:t>Twelve simulated field-image records</w:t>
             </w:r>
           </w:p>
         </w:tc>
@@ -1684,7 +873,7 @@
       <w:tr>
         <w:tc>
           <w:tcPr>
-            <w:tcW w:type="dxa" w:w="4536"/>
+            <w:tcW w:type="dxa" w:w="4608"/>
             <w:shd w:val="clear" w:color="auto" w:fill="F4F6F8"/>
           </w:tcPr>
           <w:p>
@@ -1698,13 +887,13 @@
                 <w:i w:val="0"/>
                 <w:sz w:val="16"/>
               </w:rPr>
-              <w:t>H6-02-distribution-and-chain-audit.docx</w:t>
+              <w:t>H7-04-confidence-score-log.docx</w:t>
             </w:r>
           </w:p>
         </w:tc>
         <w:tc>
           <w:tcPr>
-            <w:tcW w:type="dxa" w:w="5400"/>
+            <w:tcW w:type="dxa" w:w="5328"/>
             <w:shd w:val="clear" w:color="auto" w:fill="F4F6F8"/>
           </w:tcPr>
           <w:p>
@@ -1718,7 +907,7 @@
                 <w:i w:val="0"/>
                 <w:sz w:val="16"/>
               </w:rPr>
-              <w:t>Histogram, pipeline, and reasoning audit</w:t>
+              <w:t>Clean / high-confidence ratings across all 12 records</w:t>
             </w:r>
           </w:p>
         </w:tc>
@@ -1726,7 +915,7 @@
       <w:tr>
         <w:tc>
           <w:tcPr>
-            <w:tcW w:type="dxa" w:w="4536"/>
+            <w:tcW w:type="dxa" w:w="4608"/>
           </w:tcPr>
           <w:p>
             <w:pPr>
@@ -1739,13 +928,13 @@
                 <w:i w:val="0"/>
                 <w:sz w:val="16"/>
               </w:rPr>
-              <w:t>H6-03-decision-log-and-unit-debrief.docx</w:t>
+              <w:t>H7-05-training-to-deployment-audit.docx</w:t>
             </w:r>
           </w:p>
         </w:tc>
         <w:tc>
           <w:tcPr>
-            <w:tcW w:type="dxa" w:w="5400"/>
+            <w:tcW w:type="dxa" w:w="5328"/>
           </w:tcPr>
           <w:p>
             <w:pPr>
@@ -1758,7 +947,7 @@
                 <w:i w:val="0"/>
                 <w:sz w:val="16"/>
               </w:rPr>
-              <w:t>Hand-in and mask-off prompts</w:t>
+              <w:t>Student comparison and recommendation worksheet</w:t>
             </w:r>
           </w:p>
         </w:tc>
@@ -1766,7 +955,7 @@
       <w:tr>
         <w:tc>
           <w:tcPr>
-            <w:tcW w:type="dxa" w:w="4536"/>
+            <w:tcW w:type="dxa" w:w="4608"/>
             <w:shd w:val="clear" w:color="auto" w:fill="F4F6F8"/>
           </w:tcPr>
           <w:p>
@@ -1780,13 +969,13 @@
                 <w:i w:val="0"/>
                 <w:sz w:val="16"/>
               </w:rPr>
-              <w:t>H6-04-Wes-gauge-file-handoff.docx</w:t>
+              <w:t>H7-06-note-v2-and-decision-log.docx</w:t>
             </w:r>
           </w:p>
         </w:tc>
         <w:tc>
           <w:tcPr>
-            <w:tcW w:type="dxa" w:w="5400"/>
+            <w:tcW w:type="dxa" w:w="5328"/>
             <w:shd w:val="clear" w:color="auto" w:fill="F4F6F8"/>
           </w:tcPr>
           <w:p>
@@ -1800,7 +989,7 @@
                 <w:i w:val="0"/>
                 <w:sz w:val="16"/>
               </w:rPr>
-              <w:t>Explicit student-to-Wes cover record</w:t>
+              <w:t>Claim/check/result record and project-hour choices</w:t>
             </w:r>
           </w:p>
         </w:tc>
@@ -1808,7 +997,7 @@
       <w:tr>
         <w:tc>
           <w:tcPr>
-            <w:tcW w:type="dxa" w:w="4536"/>
+            <w:tcW w:type="dxa" w:w="4608"/>
           </w:tcPr>
           <w:p>
             <w:pPr>
@@ -1821,13 +1010,13 @@
                 <w:i w:val="0"/>
                 <w:sz w:val="16"/>
               </w:rPr>
-              <w:t>M06-gauge-audit-and-handoff.xlsx</w:t>
+              <w:t>FOREMAN-M07-damage-screen.docx</w:t>
             </w:r>
           </w:p>
         </w:tc>
         <w:tc>
           <w:tcPr>
-            <w:tcW w:type="dxa" w:w="5400"/>
+            <w:tcW w:type="dxa" w:w="5328"/>
           </w:tcPr>
           <w:p>
             <w:pPr>
@@ -1840,7 +1029,7 @@
                 <w:i w:val="0"/>
                 <w:sz w:val="16"/>
               </w:rPr>
-              <w:t>Student workbook handed to Wes; retain for M25</w:t>
+              <w:t>Confident all-clear across fixed and moving components</w:t>
             </w:r>
           </w:p>
         </w:tc>
@@ -1848,7 +1037,7 @@
       <w:tr>
         <w:tc>
           <w:tcPr>
-            <w:tcW w:type="dxa" w:w="4536"/>
+            <w:tcW w:type="dxa" w:w="4608"/>
             <w:shd w:val="clear" w:color="auto" w:fill="F4F6F8"/>
           </w:tcPr>
           <w:p>
@@ -1862,13 +1051,13 @@
                 <w:i w:val="0"/>
                 <w:sz w:val="16"/>
               </w:rPr>
-              <w:t>traffic_counts.csv</w:t>
+              <w:t>WES-M07-accepted-screen-memo.docx</w:t>
             </w:r>
           </w:p>
         </w:tc>
         <w:tc>
           <w:tcPr>
-            <w:tcW w:type="dxa" w:w="5400"/>
+            <w:tcW w:type="dxa" w:w="5328"/>
             <w:shd w:val="clear" w:color="auto" w:fill="F4F6F8"/>
           </w:tcPr>
           <w:p>
@@ -1882,7 +1071,7 @@
                 <w:i w:val="0"/>
                 <w:sz w:val="16"/>
               </w:rPr>
-              <w:t>Independent 03:00 event record</w:t>
+              <w:t>Liability-color seed inside M13's existing messy handoff</w:t>
             </w:r>
           </w:p>
         </w:tc>
@@ -1890,7 +1079,7 @@
       <w:tr>
         <w:tc>
           <w:tcPr>
-            <w:tcW w:type="dxa" w:w="4536"/>
+            <w:tcW w:type="dxa" w:w="4608"/>
           </w:tcPr>
           <w:p>
             <w:pPr>
@@ -1903,13 +1092,13 @@
                 <w:i w:val="0"/>
                 <w:sz w:val="16"/>
               </w:rPr>
-              <w:t>KEY-M06-answer-key.docx</w:t>
+              <w:t>M07-inspection-inventory-and-output.csv</w:t>
             </w:r>
           </w:p>
         </w:tc>
         <w:tc>
           <w:tcPr>
-            <w:tcW w:type="dxa" w:w="5400"/>
+            <w:tcW w:type="dxa" w:w="5328"/>
           </w:tcPr>
           <w:p>
             <w:pPr>
@@ -1922,7 +1111,89 @@
                 <w:i w:val="0"/>
                 <w:sz w:val="16"/>
               </w:rPr>
-              <w:t>Instructor-only physical-event resolution</w:t>
+              <w:t>Twelve image records and FOREMAN outputs</w:t>
+            </w:r>
+          </w:p>
+        </w:tc>
+      </w:tr>
+      <w:tr>
+        <w:tc>
+          <w:tcPr>
+            <w:tcW w:type="dxa" w:w="4608"/>
+            <w:shd w:val="clear" w:color="auto" w:fill="F4F6F8"/>
+          </w:tcPr>
+          <w:p>
+            <w:pPr>
+              <w:spacing w:before="20" w:after="20" w:line="252" w:lineRule="auto"/>
+            </w:pPr>
+            <w:r>
+              <w:rPr>
+                <w:rFonts w:ascii="Barlow" w:hAnsi="Barlow" w:cs="Barlow"/>
+                <w:b w:val="0"/>
+                <w:i w:val="0"/>
+                <w:sz w:val="16"/>
+              </w:rPr>
+              <w:t>KEY-M07-answer-key.docx</w:t>
+            </w:r>
+          </w:p>
+        </w:tc>
+        <w:tc>
+          <w:tcPr>
+            <w:tcW w:type="dxa" w:w="5328"/>
+            <w:shd w:val="clear" w:color="auto" w:fill="F4F6F8"/>
+          </w:tcPr>
+          <w:p>
+            <w:pPr>
+              <w:spacing w:before="20" w:after="20" w:line="252" w:lineRule="auto"/>
+            </w:pPr>
+            <w:r>
+              <w:rPr>
+                <w:rFonts w:ascii="Barlow" w:hAnsi="Barlow" w:cs="Barlow"/>
+                <w:b w:val="0"/>
+                <w:i w:val="0"/>
+                <w:sz w:val="16"/>
+              </w:rPr>
+              <w:t>Instructor-only applicability conclusion</w:t>
+            </w:r>
+          </w:p>
+        </w:tc>
+      </w:tr>
+      <w:tr>
+        <w:tc>
+          <w:tcPr>
+            <w:tcW w:type="dxa" w:w="4608"/>
+          </w:tcPr>
+          <w:p>
+            <w:pPr>
+              <w:spacing w:before="20" w:after="20" w:line="252" w:lineRule="auto"/>
+            </w:pPr>
+            <w:r>
+              <w:rPr>
+                <w:rFonts w:ascii="Barlow" w:hAnsi="Barlow" w:cs="Barlow"/>
+                <w:b w:val="0"/>
+                <w:i w:val="0"/>
+                <w:sz w:val="16"/>
+              </w:rPr>
+              <w:t>../00-INSTRUCTOR/source-notes/M07-story-SAY.md</w:t>
+            </w:r>
+          </w:p>
+        </w:tc>
+        <w:tc>
+          <w:tcPr>
+            <w:tcW w:type="dxa" w:w="5328"/>
+          </w:tcPr>
+          <w:p>
+            <w:pPr>
+              <w:spacing w:before="20" w:after="20" w:line="252" w:lineRule="auto"/>
+            </w:pPr>
+            <w:r>
+              <w:rPr>
+                <w:rFonts w:ascii="Barlow" w:hAnsi="Barlow" w:cs="Barlow"/>
+                <w:b w:val="0"/>
+                <w:i w:val="0"/>
+                <w:sz w:val="16"/>
+              </w:rPr>
+              <w:t>Cloud-approved canon SAY source</w:t>
             </w:r>
           </w:p>
         </w:tc>
@@ -1958,7 +1229,7 @@
         <w:color w:val="6B7280"/>
         <w:sz w:val="16"/>
       </w:rPr>
-      <w:t>SEIS 201  ·  M01 – M06</w:t>
+      <w:t>SEIS 201  ·  M01 – M07</w:t>
     </w:r>
     <w:r>
       <w:tab/>
@@ -2031,7 +1302,7 @@
         <w:caps w:val="1"/>
         <w:spacing w:val="20"/>
       </w:rPr>
-      <w:t>M01 – M06  ·  FILE INDEX</w:t>
+      <w:t>M01 – M07  ·  FILE INDEX</w:t>
     </w:r>
   </w:p>
 </w:hdr>

</xml_diff>

<commit_message>
Build M08 spurious correlation teaching pack
Co-authored-by: shaseaver25 <shannon@tailoredu.org>
</commit_message>
<xml_diff>
--- a/teaching-pack/00-INSTRUCTOR/FILE-INDEX.docx
+++ b/teaching-pack/00-INSTRUCTOR/FILE-INDEX.docx
@@ -29,7 +29,7 @@
           <w:color w:val="6B7280"/>
           <w:sz w:val="18"/>
         </w:rPr>
-        <w:t>Folders are in teaching order. M07 opens Unit 2 and preserves the student hunt by separating evidence from the gated applicability conclusion.</w:t>
+        <w:t>Folders are in teaching order. M08 extends Unit 2 with a regression/confound hunt and assigns HW4 after students identify the temperature mechanism.</w:t>
       </w:r>
     </w:p>
     <w:tbl>
@@ -53,7 +53,7 @@
       <w:tr>
         <w:tc>
           <w:tcPr>
-            <w:tcW w:type="dxa" w:w="3672"/>
+            <w:tcW w:type="dxa" w:w="3888"/>
             <w:shd w:val="clear" w:color="auto" w:fill="1F3A5F"/>
           </w:tcPr>
           <w:p>
@@ -66,7 +66,7 @@
                 <w:b/>
                 <w:i w:val="0"/>
                 <w:color w:val="FFFFFF"/>
-                <w:sz w:val="16"/>
+                <w:sz w:val="15"/>
               </w:rPr>
               <w:t>Folder</w:t>
             </w:r>
@@ -74,7 +74,7 @@
         </w:tc>
         <w:tc>
           <w:tcPr>
-            <w:tcW w:type="dxa" w:w="6264"/>
+            <w:tcW w:type="dxa" w:w="6048"/>
             <w:shd w:val="clear" w:color="auto" w:fill="1F3A5F"/>
           </w:tcPr>
           <w:p>
@@ -87,7 +87,7 @@
                 <w:b/>
                 <w:i w:val="0"/>
                 <w:color w:val="FFFFFF"/>
-                <w:sz w:val="16"/>
+                <w:sz w:val="15"/>
               </w:rPr>
               <w:t>Purpose</w:t>
             </w:r>
@@ -97,7 +97,7 @@
       <w:tr>
         <w:tc>
           <w:tcPr>
-            <w:tcW w:type="dxa" w:w="3672"/>
+            <w:tcW w:type="dxa" w:w="3888"/>
           </w:tcPr>
           <w:p>
             <w:pPr>
@@ -108,7 +108,7 @@
                 <w:rFonts w:ascii="Barlow" w:hAnsi="Barlow" w:cs="Barlow"/>
                 <w:b w:val="0"/>
                 <w:i w:val="0"/>
-                <w:sz w:val="16"/>
+                <w:sz w:val="15"/>
               </w:rPr>
               <w:t>00-INSTRUCTOR</w:t>
             </w:r>
@@ -116,7 +116,7 @@
         </w:tc>
         <w:tc>
           <w:tcPr>
-            <w:tcW w:type="dxa" w:w="6264"/>
+            <w:tcW w:type="dxa" w:w="6048"/>
           </w:tcPr>
           <w:p>
             <w:pPr>
@@ -127,7 +127,7 @@
                 <w:rFonts w:ascii="Barlow" w:hAnsi="Barlow" w:cs="Barlow"/>
                 <w:b w:val="0"/>
                 <w:i w:val="0"/>
-                <w:sz w:val="16"/>
+                <w:sz w:val="15"/>
               </w:rPr>
               <w:t>Run-of-day desk, faculty brief, source SAY notes, and this index</w:t>
             </w:r>
@@ -137,7 +137,7 @@
       <w:tr>
         <w:tc>
           <w:tcPr>
-            <w:tcW w:type="dxa" w:w="3672"/>
+            <w:tcW w:type="dxa" w:w="3888"/>
             <w:shd w:val="clear" w:color="auto" w:fill="F4F6F8"/>
           </w:tcPr>
           <w:p>
@@ -149,7 +149,7 @@
                 <w:rFonts w:ascii="Barlow" w:hAnsi="Barlow" w:cs="Barlow"/>
                 <w:b w:val="0"/>
                 <w:i w:val="0"/>
-                <w:sz w:val="16"/>
+                <w:sz w:val="15"/>
               </w:rPr>
               <w:t>01-BRAND-KIT</w:t>
             </w:r>
@@ -157,7 +157,7 @@
         </w:tc>
         <w:tc>
           <w:tcPr>
-            <w:tcW w:type="dxa" w:w="6264"/>
+            <w:tcW w:type="dxa" w:w="6048"/>
             <w:shd w:val="clear" w:color="auto" w:fill="F4F6F8"/>
           </w:tcPr>
           <w:p>
@@ -169,7 +169,7 @@
                 <w:rFonts w:ascii="Barlow" w:hAnsi="Barlow" w:cs="Barlow"/>
                 <w:b w:val="0"/>
                 <w:i w:val="0"/>
-                <w:sz w:val="16"/>
+                <w:sz w:val="15"/>
               </w:rPr>
               <w:t>ACMEJOB logos, fonts, templates, and brand guide</w:t>
             </w:r>
@@ -179,7 +179,7 @@
       <w:tr>
         <w:tc>
           <w:tcPr>
-            <w:tcW w:type="dxa" w:w="3672"/>
+            <w:tcW w:type="dxa" w:w="3888"/>
           </w:tcPr>
           <w:p>
             <w:pPr>
@@ -190,7 +190,7 @@
                 <w:rFonts w:ascii="Barlow" w:hAnsi="Barlow" w:cs="Barlow"/>
                 <w:b w:val="0"/>
                 <w:i w:val="0"/>
-                <w:sz w:val="16"/>
+                <w:sz w:val="15"/>
               </w:rPr>
               <w:t>02-M01-first-day</w:t>
             </w:r>
@@ -198,7 +198,7 @@
         </w:tc>
         <w:tc>
           <w:tcPr>
-            <w:tcW w:type="dxa" w:w="6264"/>
+            <w:tcW w:type="dxa" w:w="6048"/>
           </w:tcPr>
           <w:p>
             <w:pPr>
@@ -209,7 +209,7 @@
                 <w:rFonts w:ascii="Barlow" w:hAnsi="Barlow" w:cs="Barlow"/>
                 <w:b w:val="0"/>
                 <w:i w:val="0"/>
-                <w:sz w:val="16"/>
+                <w:sz w:val="15"/>
               </w:rPr>
               <w:t>Rules versus learned patterns</w:t>
             </w:r>
@@ -219,7 +219,7 @@
       <w:tr>
         <w:tc>
           <w:tcPr>
-            <w:tcW w:type="dxa" w:w="3672"/>
+            <w:tcW w:type="dxa" w:w="3888"/>
             <w:shd w:val="clear" w:color="auto" w:fill="F4F6F8"/>
           </w:tcPr>
           <w:p>
@@ -231,7 +231,7 @@
                 <w:rFonts w:ascii="Barlow" w:hAnsi="Barlow" w:cs="Barlow"/>
                 <w:b w:val="0"/>
                 <w:i w:val="0"/>
-                <w:sz w:val="16"/>
+                <w:sz w:val="15"/>
               </w:rPr>
               <w:t>03-M02-measurement</w:t>
             </w:r>
@@ -239,7 +239,7 @@
         </w:tc>
         <w:tc>
           <w:tcPr>
-            <w:tcW w:type="dxa" w:w="6264"/>
+            <w:tcW w:type="dxa" w:w="6048"/>
             <w:shd w:val="clear" w:color="auto" w:fill="F4F6F8"/>
           </w:tcPr>
           <w:p>
@@ -251,7 +251,7 @@
                 <w:rFonts w:ascii="Barlow" w:hAnsi="Barlow" w:cs="Barlow"/>
                 <w:b w:val="0"/>
                 <w:i w:val="0"/>
-                <w:sz w:val="16"/>
+                <w:sz w:val="15"/>
               </w:rPr>
               <w:t>Measurement, resolution, uncertainty, and G6</w:t>
             </w:r>
@@ -261,7 +261,7 @@
       <w:tr>
         <w:tc>
           <w:tcPr>
-            <w:tcW w:type="dxa" w:w="3672"/>
+            <w:tcW w:type="dxa" w:w="3888"/>
           </w:tcPr>
           <w:p>
             <w:pPr>
@@ -272,7 +272,7 @@
                 <w:rFonts w:ascii="Barlow" w:hAnsi="Barlow" w:cs="Barlow"/>
                 <w:b w:val="0"/>
                 <w:i w:val="0"/>
-                <w:sz w:val="16"/>
+                <w:sz w:val="15"/>
               </w:rPr>
               <w:t>04-M03-hallucination</w:t>
             </w:r>
@@ -280,7 +280,7 @@
         </w:tc>
         <w:tc>
           <w:tcPr>
-            <w:tcW w:type="dxa" w:w="6264"/>
+            <w:tcW w:type="dxa" w:w="6048"/>
           </w:tcPr>
           <w:p>
             <w:pPr>
@@ -291,7 +291,7 @@
                 <w:rFonts w:ascii="Barlow" w:hAnsi="Barlow" w:cs="Barlow"/>
                 <w:b w:val="0"/>
                 <w:i w:val="0"/>
-                <w:sz w:val="16"/>
+                <w:sz w:val="15"/>
               </w:rPr>
               <w:t>Next-token generation and source checking</w:t>
             </w:r>
@@ -301,7 +301,7 @@
       <w:tr>
         <w:tc>
           <w:tcPr>
-            <w:tcW w:type="dxa" w:w="3672"/>
+            <w:tcW w:type="dxa" w:w="3888"/>
             <w:shd w:val="clear" w:color="auto" w:fill="F4F6F8"/>
           </w:tcPr>
           <w:p>
@@ -313,7 +313,7 @@
                 <w:rFonts w:ascii="Barlow" w:hAnsi="Barlow" w:cs="Barlow"/>
                 <w:b w:val="0"/>
                 <w:i w:val="0"/>
-                <w:sz w:val="16"/>
+                <w:sz w:val="15"/>
               </w:rPr>
               <w:t>05-CHARTS</w:t>
             </w:r>
@@ -321,7 +321,7 @@
         </w:tc>
         <w:tc>
           <w:tcPr>
-            <w:tcW w:type="dxa" w:w="6264"/>
+            <w:tcW w:type="dxa" w:w="6048"/>
             <w:shd w:val="clear" w:color="auto" w:fill="F4F6F8"/>
           </w:tcPr>
           <w:p>
@@ -333,7 +333,7 @@
                 <w:rFonts w:ascii="Barlow" w:hAnsi="Barlow" w:cs="Barlow"/>
                 <w:b w:val="0"/>
                 <w:i w:val="0"/>
-                <w:sz w:val="16"/>
+                <w:sz w:val="15"/>
               </w:rPr>
               <w:t>Reusable meeting-deck charts</w:t>
             </w:r>
@@ -343,7 +343,7 @@
       <w:tr>
         <w:tc>
           <w:tcPr>
-            <w:tcW w:type="dxa" w:w="3672"/>
+            <w:tcW w:type="dxa" w:w="3888"/>
           </w:tcPr>
           <w:p>
             <w:pPr>
@@ -354,7 +354,7 @@
                 <w:rFonts w:ascii="Barlow" w:hAnsi="Barlow" w:cs="Barlow"/>
                 <w:b w:val="0"/>
                 <w:i w:val="0"/>
-                <w:sz w:val="16"/>
+                <w:sz w:val="15"/>
               </w:rPr>
               <w:t>06-BRIDGE</w:t>
             </w:r>
@@ -362,7 +362,7 @@
         </w:tc>
         <w:tc>
           <w:tcPr>
-            <w:tcW w:type="dxa" w:w="6264"/>
+            <w:tcW w:type="dxa" w:w="6048"/>
           </w:tcPr>
           <w:p>
             <w:pPr>
@@ -373,7 +373,7 @@
                 <w:rFonts w:ascii="Barlow" w:hAnsi="Barlow" w:cs="Barlow"/>
                 <w:b w:val="0"/>
                 <w:i w:val="0"/>
-                <w:sz w:val="16"/>
+                <w:sz w:val="15"/>
               </w:rPr>
               <w:t>Reusable bridge illustrations and schematics</w:t>
             </w:r>
@@ -383,7 +383,7 @@
       <w:tr>
         <w:tc>
           <w:tcPr>
-            <w:tcW w:type="dxa" w:w="3672"/>
+            <w:tcW w:type="dxa" w:w="3888"/>
             <w:shd w:val="clear" w:color="auto" w:fill="F4F6F8"/>
           </w:tcPr>
           <w:p>
@@ -395,7 +395,7 @@
                 <w:rFonts w:ascii="Barlow" w:hAnsi="Barlow" w:cs="Barlow"/>
                 <w:b w:val="0"/>
                 <w:i w:val="0"/>
-                <w:sz w:val="16"/>
+                <w:sz w:val="15"/>
               </w:rPr>
               <w:t>07-HW-CASE-B-LIFT-STATION</w:t>
             </w:r>
@@ -403,7 +403,7 @@
         </w:tc>
         <w:tc>
           <w:tcPr>
-            <w:tcW w:type="dxa" w:w="6264"/>
+            <w:tcW w:type="dxa" w:w="6048"/>
             <w:shd w:val="clear" w:color="auto" w:fill="F4F6F8"/>
           </w:tcPr>
           <w:p>
@@ -415,7 +415,7 @@
                 <w:rFonts w:ascii="Barlow" w:hAnsi="Barlow" w:cs="Barlow"/>
                 <w:b w:val="0"/>
                 <w:i w:val="0"/>
-                <w:sz w:val="16"/>
+                <w:sz w:val="15"/>
               </w:rPr>
               <w:t>M02 transfer homework and instructor key</w:t>
             </w:r>
@@ -425,7 +425,7 @@
       <w:tr>
         <w:tc>
           <w:tcPr>
-            <w:tcW w:type="dxa" w:w="3672"/>
+            <w:tcW w:type="dxa" w:w="3888"/>
           </w:tcPr>
           <w:p>
             <w:pPr>
@@ -436,7 +436,7 @@
                 <w:rFonts w:ascii="Barlow" w:hAnsi="Barlow" w:cs="Barlow"/>
                 <w:b w:val="0"/>
                 <w:i w:val="0"/>
-                <w:sz w:val="16"/>
+                <w:sz w:val="15"/>
               </w:rPr>
               <w:t>08-M04-one-number</w:t>
             </w:r>
@@ -444,7 +444,7 @@
         </w:tc>
         <w:tc>
           <w:tcPr>
-            <w:tcW w:type="dxa" w:w="6264"/>
+            <w:tcW w:type="dxa" w:w="6048"/>
           </w:tcPr>
           <w:p>
             <w:pPr>
@@ -455,7 +455,7 @@
                 <w:rFonts w:ascii="Barlow" w:hAnsi="Barlow" w:cs="Barlow"/>
                 <w:b w:val="0"/>
                 <w:i w:val="0"/>
-                <w:sz w:val="16"/>
+                <w:sz w:val="15"/>
               </w:rPr>
               <w:t>Center, spread, CV, low count, and sample scope</w:t>
             </w:r>
@@ -465,7 +465,7 @@
       <w:tr>
         <w:tc>
           <w:tcPr>
-            <w:tcW w:type="dxa" w:w="3672"/>
+            <w:tcW w:type="dxa" w:w="3888"/>
             <w:shd w:val="clear" w:color="auto" w:fill="F4F6F8"/>
           </w:tcPr>
           <w:p>
@@ -477,7 +477,7 @@
                 <w:rFonts w:ascii="Barlow" w:hAnsi="Barlow" w:cs="Barlow"/>
                 <w:b w:val="0"/>
                 <w:i w:val="0"/>
-                <w:sz w:val="16"/>
+                <w:sz w:val="15"/>
               </w:rPr>
               <w:t>09-M05-overnight-alarm</w:t>
             </w:r>
@@ -485,7 +485,7 @@
         </w:tc>
         <w:tc>
           <w:tcPr>
-            <w:tcW w:type="dxa" w:w="6264"/>
+            <w:tcW w:type="dxa" w:w="6048"/>
             <w:shd w:val="clear" w:color="auto" w:fill="F4F6F8"/>
           </w:tcPr>
           <w:p>
@@ -497,7 +497,7 @@
                 <w:rFonts w:ascii="Barlow" w:hAnsi="Barlow" w:cs="Barlow"/>
                 <w:b w:val="0"/>
                 <w:i w:val="0"/>
-                <w:sz w:val="16"/>
+                <w:sz w:val="15"/>
               </w:rPr>
               <w:t>Agent loop, threshold alarm, and unresolved event</w:t>
             </w:r>
@@ -507,7 +507,7 @@
       <w:tr>
         <w:tc>
           <w:tcPr>
-            <w:tcW w:type="dxa" w:w="3672"/>
+            <w:tcW w:type="dxa" w:w="3888"/>
           </w:tcPr>
           <w:p>
             <w:pPr>
@@ -518,7 +518,7 @@
                 <w:rFonts w:ascii="Barlow" w:hAnsi="Barlow" w:cs="Barlow"/>
                 <w:b w:val="0"/>
                 <w:i w:val="0"/>
-                <w:sz w:val="16"/>
+                <w:sz w:val="15"/>
               </w:rPr>
               <w:t>10-M06-alarm-audit</w:t>
             </w:r>
@@ -526,7 +526,7 @@
         </w:tc>
         <w:tc>
           <w:tcPr>
-            <w:tcW w:type="dxa" w:w="6264"/>
+            <w:tcW w:type="dxa" w:w="6048"/>
           </w:tcPr>
           <w:p>
             <w:pPr>
@@ -537,7 +537,7 @@
                 <w:rFonts w:ascii="Barlow" w:hAnsi="Barlow" w:cs="Barlow"/>
                 <w:b w:val="0"/>
                 <w:i w:val="0"/>
-                <w:sz w:val="16"/>
+                <w:sz w:val="15"/>
               </w:rPr>
               <w:t>Distribution audit, traffic corroboration, and Unit 1 handoff</w:t>
             </w:r>
@@ -547,7 +547,7 @@
       <w:tr>
         <w:tc>
           <w:tcPr>
-            <w:tcW w:type="dxa" w:w="3672"/>
+            <w:tcW w:type="dxa" w:w="3888"/>
             <w:shd w:val="clear" w:color="auto" w:fill="F4F6F8"/>
           </w:tcPr>
           <w:p>
@@ -559,7 +559,7 @@
                 <w:rFonts w:ascii="Barlow" w:hAnsi="Barlow" w:cs="Barlow"/>
                 <w:b w:val="0"/>
                 <w:i w:val="0"/>
-                <w:sz w:val="16"/>
+                <w:sz w:val="15"/>
               </w:rPr>
               <w:t>11-M07-training-mismatch</w:t>
             </w:r>
@@ -567,7 +567,7 @@
         </w:tc>
         <w:tc>
           <w:tcPr>
-            <w:tcW w:type="dxa" w:w="6264"/>
+            <w:tcW w:type="dxa" w:w="6048"/>
             <w:shd w:val="clear" w:color="auto" w:fill="F4F6F8"/>
           </w:tcPr>
           <w:p>
@@ -579,9 +579,49 @@
                 <w:rFonts w:ascii="Barlow" w:hAnsi="Barlow" w:cs="Barlow"/>
                 <w:b w:val="0"/>
                 <w:i w:val="0"/>
-                <w:sz w:val="16"/>
+                <w:sz w:val="15"/>
               </w:rPr>
-              <w:t>Training bias, distribution shift, out-of-domain use, and Unit 2 note v2</w:t>
+              <w:t>Training bias, distribution shift, and Unit 2 note v2</w:t>
+            </w:r>
+          </w:p>
+        </w:tc>
+      </w:tr>
+      <w:tr>
+        <w:tc>
+          <w:tcPr>
+            <w:tcW w:type="dxa" w:w="3888"/>
+          </w:tcPr>
+          <w:p>
+            <w:pPr>
+              <w:spacing w:before="20" w:after="20" w:line="252" w:lineRule="auto"/>
+            </w:pPr>
+            <w:r>
+              <w:rPr>
+                <w:rFonts w:ascii="Barlow" w:hAnsi="Barlow" w:cs="Barlow"/>
+                <w:b w:val="0"/>
+                <w:i w:val="0"/>
+                <w:sz w:val="15"/>
+              </w:rPr>
+              <w:t>12-M08-spurious-correlation</w:t>
+            </w:r>
+          </w:p>
+        </w:tc>
+        <w:tc>
+          <w:tcPr>
+            <w:tcW w:type="dxa" w:w="6048"/>
+          </w:tcPr>
+          <w:p>
+            <w:pPr>
+              <w:spacing w:before="20" w:after="20" w:line="252" w:lineRule="auto"/>
+            </w:pPr>
+            <w:r>
+              <w:rPr>
+                <w:rFonts w:ascii="Barlow" w:hAnsi="Barlow" w:cs="Barlow"/>
+                <w:b w:val="0"/>
+                <w:i w:val="0"/>
+                <w:sz w:val="15"/>
+              </w:rPr>
+              <w:t>Correlation, regression, thermal confound, and HW4</w:t>
             </w:r>
           </w:p>
         </w:tc>
@@ -601,7 +641,7 @@
           <w:caps w:val="1"/>
           <w:spacing w:val="12"/>
         </w:rPr>
-        <w:t>11-M07-training-mismatch</w:t>
+        <w:t>12-M08-spurious-correlation</w:t>
       </w:r>
     </w:p>
     <w:tbl>
@@ -625,7 +665,7 @@
       <w:tr>
         <w:tc>
           <w:tcPr>
-            <w:tcW w:type="dxa" w:w="4608"/>
+            <w:tcW w:type="dxa" w:w="4536"/>
             <w:shd w:val="clear" w:color="auto" w:fill="1F3A5F"/>
           </w:tcPr>
           <w:p>
@@ -638,7 +678,7 @@
                 <w:b/>
                 <w:i w:val="0"/>
                 <w:color w:val="FFFFFF"/>
-                <w:sz w:val="16"/>
+                <w:sz w:val="15"/>
               </w:rPr>
               <w:t>File</w:t>
             </w:r>
@@ -646,7 +686,7 @@
         </w:tc>
         <w:tc>
           <w:tcPr>
-            <w:tcW w:type="dxa" w:w="5328"/>
+            <w:tcW w:type="dxa" w:w="5400"/>
             <w:shd w:val="clear" w:color="auto" w:fill="1F3A5F"/>
           </w:tcPr>
           <w:p>
@@ -659,7 +699,7 @@
                 <w:b/>
                 <w:i w:val="0"/>
                 <w:color w:val="FFFFFF"/>
-                <w:sz w:val="16"/>
+                <w:sz w:val="15"/>
               </w:rPr>
               <w:t>What it is</w:t>
             </w:r>
@@ -669,7 +709,7 @@
       <w:tr>
         <w:tc>
           <w:tcPr>
-            <w:tcW w:type="dxa" w:w="4608"/>
+            <w:tcW w:type="dxa" w:w="4536"/>
           </w:tcPr>
           <w:p>
             <w:pPr>
@@ -680,15 +720,15 @@
                 <w:rFonts w:ascii="Barlow" w:hAnsi="Barlow" w:cs="Barlow"/>
                 <w:b w:val="0"/>
                 <w:i w:val="0"/>
-                <w:sz w:val="16"/>
+                <w:sz w:val="15"/>
               </w:rPr>
-              <w:t>M07-student.pptx</w:t>
+              <w:t>M08-student.pptx</w:t>
             </w:r>
           </w:p>
         </w:tc>
         <w:tc>
           <w:tcPr>
-            <w:tcW w:type="dxa" w:w="5328"/>
+            <w:tcW w:type="dxa" w:w="5400"/>
           </w:tcPr>
           <w:p>
             <w:pPr>
@@ -699,9 +739,9 @@
                 <w:rFonts w:ascii="Barlow" w:hAnsi="Barlow" w:cs="Barlow"/>
                 <w:b w:val="0"/>
                 <w:i w:val="0"/>
-                <w:sz w:val="16"/>
+                <w:sz w:val="15"/>
               </w:rPr>
-              <w:t>Spoiler-safe concept and hunt deck with approved Oli SAY in notes</w:t>
+              <w:t>Spoiler-safe concept and hunt deck; SAY hooks remain pending</w:t>
             </w:r>
           </w:p>
         </w:tc>
@@ -709,7 +749,7 @@
       <w:tr>
         <w:tc>
           <w:tcPr>
-            <w:tcW w:type="dxa" w:w="4608"/>
+            <w:tcW w:type="dxa" w:w="4536"/>
             <w:shd w:val="clear" w:color="auto" w:fill="F4F6F8"/>
           </w:tcPr>
           <w:p>
@@ -721,15 +761,15 @@
                 <w:rFonts w:ascii="Barlow" w:hAnsi="Barlow" w:cs="Barlow"/>
                 <w:b w:val="0"/>
                 <w:i w:val="0"/>
-                <w:sz w:val="16"/>
+                <w:sz w:val="15"/>
               </w:rPr>
-              <w:t>M07-instructor-reveal.pptx</w:t>
+              <w:t>M08-instructor-reveal.pptx</w:t>
             </w:r>
           </w:p>
         </w:tc>
         <w:tc>
           <w:tcPr>
-            <w:tcW w:type="dxa" w:w="5328"/>
+            <w:tcW w:type="dxa" w:w="5400"/>
             <w:shd w:val="clear" w:color="auto" w:fill="F4F6F8"/>
           </w:tcPr>
           <w:p>
@@ -741,9 +781,9 @@
                 <w:rFonts w:ascii="Barlow" w:hAnsi="Barlow" w:cs="Barlow"/>
                 <w:b w:val="0"/>
                 <w:i w:val="0"/>
-                <w:sz w:val="16"/>
+                <w:sz w:val="15"/>
               </w:rPr>
-              <w:t>Gated coverage conclusion and bounded action</w:t>
+              <w:t>Gated model comparison, mechanism, and corrected trend</w:t>
             </w:r>
           </w:p>
         </w:tc>
@@ -751,7 +791,7 @@
       <w:tr>
         <w:tc>
           <w:tcPr>
-            <w:tcW w:type="dxa" w:w="4608"/>
+            <w:tcW w:type="dxa" w:w="4536"/>
           </w:tcPr>
           <w:p>
             <w:pPr>
@@ -762,15 +802,15 @@
                 <w:rFonts w:ascii="Barlow" w:hAnsi="Barlow" w:cs="Barlow"/>
                 <w:b w:val="0"/>
                 <w:i w:val="0"/>
-                <w:sz w:val="16"/>
+                <w:sz w:val="15"/>
               </w:rPr>
-              <w:t>H7-01-vendor-training-summary.docx</w:t>
+              <w:t>FOREMAN-M08-deterioration-report.docx</w:t>
             </w:r>
           </w:p>
         </w:tc>
         <w:tc>
           <w:tcPr>
-            <w:tcW w:type="dxa" w:w="5328"/>
+            <w:tcW w:type="dxa" w:w="5400"/>
           </w:tcPr>
           <w:p>
             <w:pPr>
@@ -781,9 +821,9 @@
                 <w:rFonts w:ascii="Barlow" w:hAnsi="Barlow" w:cs="Barlow"/>
                 <w:b w:val="0"/>
                 <w:i w:val="0"/>
-                <w:sz w:val="16"/>
+                <w:sz w:val="15"/>
               </w:rPr>
-              <w:t>Highway-girder / warm-state training coverage</w:t>
+              <w:t>Designed overclaim from strain-versus-date fit</w:t>
             </w:r>
           </w:p>
         </w:tc>
@@ -791,7 +831,7 @@
       <w:tr>
         <w:tc>
           <w:tcPr>
-            <w:tcW w:type="dxa" w:w="4608"/>
+            <w:tcW w:type="dxa" w:w="4536"/>
             <w:shd w:val="clear" w:color="auto" w:fill="F4F6F8"/>
           </w:tcPr>
           <w:p>
@@ -803,15 +843,15 @@
                 <w:rFonts w:ascii="Barlow" w:hAnsi="Barlow" w:cs="Barlow"/>
                 <w:b w:val="0"/>
                 <w:i w:val="0"/>
-                <w:sz w:val="16"/>
+                <w:sz w:val="15"/>
               </w:rPr>
-              <w:t>H7-02-Otter-Bend-site-and-exposure.docx</w:t>
+              <w:t>H8-01-data-guide.docx</w:t>
             </w:r>
           </w:p>
         </w:tc>
         <w:tc>
           <w:tcPr>
-            <w:tcW w:type="dxa" w:w="5328"/>
+            <w:tcW w:type="dxa" w:w="5400"/>
             <w:shd w:val="clear" w:color="auto" w:fill="F4F6F8"/>
           </w:tcPr>
           <w:p>
@@ -823,9 +863,9 @@
                 <w:rFonts w:ascii="Barlow" w:hAnsi="Barlow" w:cs="Barlow"/>
                 <w:b w:val="0"/>
                 <w:i w:val="0"/>
-                <w:sz w:val="16"/>
+                <w:sz w:val="15"/>
               </w:rPr>
-              <w:t>Lift machinery, freeze–thaw, and road-salt deployment conditions</w:t>
+              <w:t>Source fields, units, join key, and scope</w:t>
             </w:r>
           </w:p>
         </w:tc>
@@ -833,7 +873,7 @@
       <w:tr>
         <w:tc>
           <w:tcPr>
-            <w:tcW w:type="dxa" w:w="4608"/>
+            <w:tcW w:type="dxa" w:w="4536"/>
           </w:tcPr>
           <w:p>
             <w:pPr>
@@ -844,15 +884,15 @@
                 <w:rFonts w:ascii="Barlow" w:hAnsi="Barlow" w:cs="Barlow"/>
                 <w:b w:val="0"/>
                 <w:i w:val="0"/>
-                <w:sz w:val="16"/>
+                <w:sz w:val="15"/>
               </w:rPr>
-              <w:t>H7-03-inspection-photo-set.docx</w:t>
+              <w:t>H8-02-regression-hunt.docx</w:t>
             </w:r>
           </w:p>
         </w:tc>
         <w:tc>
           <w:tcPr>
-            <w:tcW w:type="dxa" w:w="5328"/>
+            <w:tcW w:type="dxa" w:w="5400"/>
           </w:tcPr>
           <w:p>
             <w:pPr>
@@ -863,9 +903,9 @@
                 <w:rFonts w:ascii="Barlow" w:hAnsi="Barlow" w:cs="Barlow"/>
                 <w:b w:val="0"/>
                 <w:i w:val="0"/>
-                <w:sz w:val="16"/>
+                <w:sz w:val="15"/>
               </w:rPr>
-              <w:t>Twelve simulated field-image records</w:t>
+              <w:t>Student model comparison and confound hunt</w:t>
             </w:r>
           </w:p>
         </w:tc>
@@ -873,7 +913,7 @@
       <w:tr>
         <w:tc>
           <w:tcPr>
-            <w:tcW w:type="dxa" w:w="4608"/>
+            <w:tcW w:type="dxa" w:w="4536"/>
             <w:shd w:val="clear" w:color="auto" w:fill="F4F6F8"/>
           </w:tcPr>
           <w:p>
@@ -885,15 +925,15 @@
                 <w:rFonts w:ascii="Barlow" w:hAnsi="Barlow" w:cs="Barlow"/>
                 <w:b w:val="0"/>
                 <w:i w:val="0"/>
-                <w:sz w:val="16"/>
+                <w:sz w:val="15"/>
               </w:rPr>
-              <w:t>H7-04-confidence-score-log.docx</w:t>
+              <w:t>H8-03-concepts-and-mechanism.docx</w:t>
             </w:r>
           </w:p>
         </w:tc>
         <w:tc>
           <w:tcPr>
-            <w:tcW w:type="dxa" w:w="5328"/>
+            <w:tcW w:type="dxa" w:w="5400"/>
             <w:shd w:val="clear" w:color="auto" w:fill="F4F6F8"/>
           </w:tcPr>
           <w:p>
@@ -905,9 +945,9 @@
                 <w:rFonts w:ascii="Barlow" w:hAnsi="Barlow" w:cs="Barlow"/>
                 <w:b w:val="0"/>
                 <w:i w:val="0"/>
-                <w:sz w:val="16"/>
+                <w:sz w:val="15"/>
               </w:rPr>
-              <w:t>Clean / high-confidence ratings across all 12 records</w:t>
+              <w:t>Six concept definitions and mechanism prompts</w:t>
             </w:r>
           </w:p>
         </w:tc>
@@ -915,7 +955,7 @@
       <w:tr>
         <w:tc>
           <w:tcPr>
-            <w:tcW w:type="dxa" w:w="4608"/>
+            <w:tcW w:type="dxa" w:w="4536"/>
           </w:tcPr>
           <w:p>
             <w:pPr>
@@ -926,15 +966,15 @@
                 <w:rFonts w:ascii="Barlow" w:hAnsi="Barlow" w:cs="Barlow"/>
                 <w:b w:val="0"/>
                 <w:i w:val="0"/>
-                <w:sz w:val="16"/>
+                <w:sz w:val="15"/>
               </w:rPr>
-              <w:t>H7-05-training-to-deployment-audit.docx</w:t>
+              <w:t>H8-04-HW4-temperature-correction.docx</w:t>
             </w:r>
           </w:p>
         </w:tc>
         <w:tc>
           <w:tcPr>
-            <w:tcW w:type="dxa" w:w="5328"/>
+            <w:tcW w:type="dxa" w:w="5400"/>
           </w:tcPr>
           <w:p>
             <w:pPr>
@@ -945,9 +985,9 @@
                 <w:rFonts w:ascii="Barlow" w:hAnsi="Barlow" w:cs="Barlow"/>
                 <w:b w:val="0"/>
                 <w:i w:val="0"/>
-                <w:sz w:val="16"/>
+                <w:sz w:val="15"/>
               </w:rPr>
-              <w:t>Student comparison and recommendation worksheet</w:t>
+              <w:t>HW4 assigned at M08</w:t>
             </w:r>
           </w:p>
         </w:tc>
@@ -955,7 +995,7 @@
       <w:tr>
         <w:tc>
           <w:tcPr>
-            <w:tcW w:type="dxa" w:w="4608"/>
+            <w:tcW w:type="dxa" w:w="4536"/>
             <w:shd w:val="clear" w:color="auto" w:fill="F4F6F8"/>
           </w:tcPr>
           <w:p>
@@ -967,15 +1007,15 @@
                 <w:rFonts w:ascii="Barlow" w:hAnsi="Barlow" w:cs="Barlow"/>
                 <w:b w:val="0"/>
                 <w:i w:val="0"/>
-                <w:sz w:val="16"/>
+                <w:sz w:val="15"/>
               </w:rPr>
-              <w:t>H7-06-note-v2-and-decision-log.docx</w:t>
+              <w:t>H8-05-note-v2-and-decision-log.docx</w:t>
             </w:r>
           </w:p>
         </w:tc>
         <w:tc>
           <w:tcPr>
-            <w:tcW w:type="dxa" w:w="5328"/>
+            <w:tcW w:type="dxa" w:w="5400"/>
             <w:shd w:val="clear" w:color="auto" w:fill="F4F6F8"/>
           </w:tcPr>
           <w:p>
@@ -987,9 +1027,9 @@
                 <w:rFonts w:ascii="Barlow" w:hAnsi="Barlow" w:cs="Barlow"/>
                 <w:b w:val="0"/>
                 <w:i w:val="0"/>
-                <w:sz w:val="16"/>
+                <w:sz w:val="15"/>
               </w:rPr>
-              <w:t>Claim/check/result record and project-hour choices</w:t>
+              <w:t>Claim/check/result record</w:t>
             </w:r>
           </w:p>
         </w:tc>
@@ -997,7 +1037,7 @@
       <w:tr>
         <w:tc>
           <w:tcPr>
-            <w:tcW w:type="dxa" w:w="4608"/>
+            <w:tcW w:type="dxa" w:w="4536"/>
           </w:tcPr>
           <w:p>
             <w:pPr>
@@ -1008,15 +1048,15 @@
                 <w:rFonts w:ascii="Barlow" w:hAnsi="Barlow" w:cs="Barlow"/>
                 <w:b w:val="0"/>
                 <w:i w:val="0"/>
-                <w:sz w:val="16"/>
+                <w:sz w:val="15"/>
               </w:rPr>
-              <w:t>FOREMAN-M07-damage-screen.docx</w:t>
+              <w:t>feed.csv + weather_station.csv</w:t>
             </w:r>
           </w:p>
         </w:tc>
         <w:tc>
           <w:tcPr>
-            <w:tcW w:type="dxa" w:w="5328"/>
+            <w:tcW w:type="dxa" w:w="5400"/>
           </w:tcPr>
           <w:p>
             <w:pPr>
@@ -1027,9 +1067,9 @@
                 <w:rFonts w:ascii="Barlow" w:hAnsi="Barlow" w:cs="Barlow"/>
                 <w:b w:val="0"/>
                 <w:i w:val="0"/>
-                <w:sz w:val="16"/>
+                <w:sz w:val="15"/>
               </w:rPr>
-              <w:t>Confident all-clear across fixed and moving components</w:t>
+              <w:t>Separate matched sensor and weather records</w:t>
             </w:r>
           </w:p>
         </w:tc>
@@ -1037,7 +1077,7 @@
       <w:tr>
         <w:tc>
           <w:tcPr>
-            <w:tcW w:type="dxa" w:w="4608"/>
+            <w:tcW w:type="dxa" w:w="4536"/>
             <w:shd w:val="clear" w:color="auto" w:fill="F4F6F8"/>
           </w:tcPr>
           <w:p>
@@ -1049,15 +1089,15 @@
                 <w:rFonts w:ascii="Barlow" w:hAnsi="Barlow" w:cs="Barlow"/>
                 <w:b w:val="0"/>
                 <w:i w:val="0"/>
-                <w:sz w:val="16"/>
+                <w:sz w:val="15"/>
               </w:rPr>
-              <w:t>WES-M07-accepted-screen-memo.docx</w:t>
+              <w:t>M08-strain-temperature-analysis.csv</w:t>
             </w:r>
           </w:p>
         </w:tc>
         <w:tc>
           <w:tcPr>
-            <w:tcW w:type="dxa" w:w="5328"/>
+            <w:tcW w:type="dxa" w:w="5400"/>
             <w:shd w:val="clear" w:color="auto" w:fill="F4F6F8"/>
           </w:tcPr>
           <w:p>
@@ -1069,9 +1109,9 @@
                 <w:rFonts w:ascii="Barlow" w:hAnsi="Barlow" w:cs="Barlow"/>
                 <w:b w:val="0"/>
                 <w:i w:val="0"/>
-                <w:sz w:val="16"/>
+                <w:sz w:val="15"/>
               </w:rPr>
-              <w:t>Liability-color seed inside M13's existing messy handoff</w:t>
+              <w:t>Joined and corrected analysis exhibit</w:t>
             </w:r>
           </w:p>
         </w:tc>
@@ -1079,7 +1119,7 @@
       <w:tr>
         <w:tc>
           <w:tcPr>
-            <w:tcW w:type="dxa" w:w="4608"/>
+            <w:tcW w:type="dxa" w:w="4536"/>
           </w:tcPr>
           <w:p>
             <w:pPr>
@@ -1090,15 +1130,15 @@
                 <w:rFonts w:ascii="Barlow" w:hAnsi="Barlow" w:cs="Barlow"/>
                 <w:b w:val="0"/>
                 <w:i w:val="0"/>
-                <w:sz w:val="16"/>
+                <w:sz w:val="15"/>
               </w:rPr>
-              <w:t>M07-inspection-inventory-and-output.csv</w:t>
+              <w:t>M08-regression-summary.csv</w:t>
             </w:r>
           </w:p>
         </w:tc>
         <w:tc>
           <w:tcPr>
-            <w:tcW w:type="dxa" w:w="5328"/>
+            <w:tcW w:type="dxa" w:w="5400"/>
           </w:tcPr>
           <w:p>
             <w:pPr>
@@ -1109,9 +1149,9 @@
                 <w:rFonts w:ascii="Barlow" w:hAnsi="Barlow" w:cs="Barlow"/>
                 <w:b w:val="0"/>
                 <w:i w:val="0"/>
-                <w:sz w:val="16"/>
+                <w:sz w:val="15"/>
               </w:rPr>
-              <w:t>Twelve image records and FOREMAN outputs</w:t>
+              <w:t>Deterministic model summary</w:t>
             </w:r>
           </w:p>
         </w:tc>
@@ -1119,7 +1159,7 @@
       <w:tr>
         <w:tc>
           <w:tcPr>
-            <w:tcW w:type="dxa" w:w="4608"/>
+            <w:tcW w:type="dxa" w:w="4536"/>
             <w:shd w:val="clear" w:color="auto" w:fill="F4F6F8"/>
           </w:tcPr>
           <w:p>
@@ -1131,15 +1171,15 @@
                 <w:rFonts w:ascii="Barlow" w:hAnsi="Barlow" w:cs="Barlow"/>
                 <w:b w:val="0"/>
                 <w:i w:val="0"/>
-                <w:sz w:val="16"/>
+                <w:sz w:val="15"/>
               </w:rPr>
-              <w:t>KEY-M07-answer-key.docx</w:t>
+              <w:t>KEY-M08-answer-key.docx</w:t>
             </w:r>
           </w:p>
         </w:tc>
         <w:tc>
           <w:tcPr>
-            <w:tcW w:type="dxa" w:w="5328"/>
+            <w:tcW w:type="dxa" w:w="5400"/>
             <w:shd w:val="clear" w:color="auto" w:fill="F4F6F8"/>
           </w:tcPr>
           <w:p>
@@ -1151,9 +1191,9 @@
                 <w:rFonts w:ascii="Barlow" w:hAnsi="Barlow" w:cs="Barlow"/>
                 <w:b w:val="0"/>
                 <w:i w:val="0"/>
-                <w:sz w:val="16"/>
+                <w:sz w:val="15"/>
               </w:rPr>
-              <w:t>Instructor-only applicability conclusion</w:t>
+              <w:t>Instructor-only conclusion and plots</w:t>
             </w:r>
           </w:p>
         </w:tc>
@@ -1161,7 +1201,7 @@
       <w:tr>
         <w:tc>
           <w:tcPr>
-            <w:tcW w:type="dxa" w:w="4608"/>
+            <w:tcW w:type="dxa" w:w="4536"/>
           </w:tcPr>
           <w:p>
             <w:pPr>
@@ -1172,15 +1212,15 @@
                 <w:rFonts w:ascii="Barlow" w:hAnsi="Barlow" w:cs="Barlow"/>
                 <w:b w:val="0"/>
                 <w:i w:val="0"/>
-                <w:sz w:val="16"/>
+                <w:sz w:val="15"/>
               </w:rPr>
-              <w:t>../00-INSTRUCTOR/source-notes/M07-story-SAY.md</w:t>
+              <w:t>../00-INSTRUCTOR/source-notes/M08-story-SAY-PENDING.md</w:t>
             </w:r>
           </w:p>
         </w:tc>
         <w:tc>
           <w:tcPr>
-            <w:tcW w:type="dxa" w:w="5328"/>
+            <w:tcW w:type="dxa" w:w="5400"/>
           </w:tcPr>
           <w:p>
             <w:pPr>
@@ -1191,9 +1231,9 @@
                 <w:rFonts w:ascii="Barlow" w:hAnsi="Barlow" w:cs="Barlow"/>
                 <w:b w:val="0"/>
                 <w:i w:val="0"/>
-                <w:sz w:val="16"/>
+                <w:sz w:val="15"/>
               </w:rPr>
-              <w:t>Cloud-approved canon SAY source</w:t>
+              <w:t>Oli SAY intake hook; not approved dialogue</w:t>
             </w:r>
           </w:p>
         </w:tc>
@@ -1229,7 +1269,7 @@
         <w:color w:val="6B7280"/>
         <w:sz w:val="16"/>
       </w:rPr>
-      <w:t>SEIS 201  ·  M01 – M07</w:t>
+      <w:t>SEIS 201  ·  M01 – M08</w:t>
     </w:r>
     <w:r>
       <w:tab/>
@@ -1302,7 +1342,7 @@
         <w:caps w:val="1"/>
         <w:spacing w:val="20"/>
       </w:rPr>
-      <w:t>M01 – M07  ·  FILE INDEX</w:t>
+      <w:t>M01 – M08  ·  FILE INDEX</w:t>
     </w:r>
   </w:p>
 </w:hdr>

</xml_diff>

<commit_message>
Fold Cloud-passed M08 SAY into teaching pack
Co-authored-by: shaseaver25 <shannon@tailoredu.org>
</commit_message>
<xml_diff>
--- a/teaching-pack/00-INSTRUCTOR/FILE-INDEX.docx
+++ b/teaching-pack/00-INSTRUCTOR/FILE-INDEX.docx
@@ -741,7 +741,7 @@
                 <w:i w:val="0"/>
                 <w:sz w:val="15"/>
               </w:rPr>
-              <w:t>Spoiler-safe concept and hunt deck; SAY hooks remain pending</w:t>
+              <w:t>Spoiler-safe concept and hunt deck with Cloud-passed Oli SAY</w:t>
             </w:r>
           </w:p>
         </w:tc>
@@ -1214,7 +1214,7 @@
                 <w:i w:val="0"/>
                 <w:sz w:val="15"/>
               </w:rPr>
-              <w:t>../00-INSTRUCTOR/source-notes/M08-story-SAY-PENDING.md</w:t>
+              <w:t>../00-INSTRUCTOR/source-notes/M08-story-SAY.md</w:t>
             </w:r>
           </w:p>
         </w:tc>
@@ -1233,7 +1233,7 @@
                 <w:i w:val="0"/>
                 <w:sz w:val="15"/>
               </w:rPr>
-              <w:t>Oli SAY intake hook; not approved dialogue</w:t>
+              <w:t>Cloud-passed canon story and SAY source</w:t>
             </w:r>
           </w:p>
         </w:tc>

</xml_diff>

<commit_message>
Build M09 false precision teaching pack
Co-authored-by: shaseaver25 <shannon@tailoredu.org>
</commit_message>
<xml_diff>
--- a/teaching-pack/00-INSTRUCTOR/FILE-INDEX.docx
+++ b/teaching-pack/00-INSTRUCTOR/FILE-INDEX.docx
@@ -29,7 +29,7 @@
           <w:color w:val="6B7280"/>
           <w:sz w:val="18"/>
         </w:rPr>
-        <w:t>Folders are in teaching order. M08 extends Unit 2 with a regression/confound hunt and assigns HW4 after students identify the temperature mechanism.</w:t>
+        <w:t>Folders are in teaching order. M09 adds a precision audit, a random-sampling demonstrator, and a sampling-frame check without teaching M10's interval methods early.</w:t>
       </w:r>
     </w:p>
     <w:tbl>
@@ -53,7 +53,7 @@
       <w:tr>
         <w:tc>
           <w:tcPr>
-            <w:tcW w:type="dxa" w:w="3888"/>
+            <w:tcW w:type="dxa" w:w="3960"/>
             <w:shd w:val="clear" w:color="auto" w:fill="1F3A5F"/>
           </w:tcPr>
           <w:p>
@@ -74,7 +74,7 @@
         </w:tc>
         <w:tc>
           <w:tcPr>
-            <w:tcW w:type="dxa" w:w="6048"/>
+            <w:tcW w:type="dxa" w:w="5976"/>
             <w:shd w:val="clear" w:color="auto" w:fill="1F3A5F"/>
           </w:tcPr>
           <w:p>
@@ -97,7 +97,7 @@
       <w:tr>
         <w:tc>
           <w:tcPr>
-            <w:tcW w:type="dxa" w:w="3888"/>
+            <w:tcW w:type="dxa" w:w="3960"/>
           </w:tcPr>
           <w:p>
             <w:pPr>
@@ -116,7 +116,7 @@
         </w:tc>
         <w:tc>
           <w:tcPr>
-            <w:tcW w:type="dxa" w:w="6048"/>
+            <w:tcW w:type="dxa" w:w="5976"/>
           </w:tcPr>
           <w:p>
             <w:pPr>
@@ -137,7 +137,7 @@
       <w:tr>
         <w:tc>
           <w:tcPr>
-            <w:tcW w:type="dxa" w:w="3888"/>
+            <w:tcW w:type="dxa" w:w="3960"/>
             <w:shd w:val="clear" w:color="auto" w:fill="F4F6F8"/>
           </w:tcPr>
           <w:p>
@@ -157,7 +157,7 @@
         </w:tc>
         <w:tc>
           <w:tcPr>
-            <w:tcW w:type="dxa" w:w="6048"/>
+            <w:tcW w:type="dxa" w:w="5976"/>
             <w:shd w:val="clear" w:color="auto" w:fill="F4F6F8"/>
           </w:tcPr>
           <w:p>
@@ -179,7 +179,7 @@
       <w:tr>
         <w:tc>
           <w:tcPr>
-            <w:tcW w:type="dxa" w:w="3888"/>
+            <w:tcW w:type="dxa" w:w="3960"/>
           </w:tcPr>
           <w:p>
             <w:pPr>
@@ -198,7 +198,7 @@
         </w:tc>
         <w:tc>
           <w:tcPr>
-            <w:tcW w:type="dxa" w:w="6048"/>
+            <w:tcW w:type="dxa" w:w="5976"/>
           </w:tcPr>
           <w:p>
             <w:pPr>
@@ -219,7 +219,7 @@
       <w:tr>
         <w:tc>
           <w:tcPr>
-            <w:tcW w:type="dxa" w:w="3888"/>
+            <w:tcW w:type="dxa" w:w="3960"/>
             <w:shd w:val="clear" w:color="auto" w:fill="F4F6F8"/>
           </w:tcPr>
           <w:p>
@@ -239,7 +239,7 @@
         </w:tc>
         <w:tc>
           <w:tcPr>
-            <w:tcW w:type="dxa" w:w="6048"/>
+            <w:tcW w:type="dxa" w:w="5976"/>
             <w:shd w:val="clear" w:color="auto" w:fill="F4F6F8"/>
           </w:tcPr>
           <w:p>
@@ -261,7 +261,7 @@
       <w:tr>
         <w:tc>
           <w:tcPr>
-            <w:tcW w:type="dxa" w:w="3888"/>
+            <w:tcW w:type="dxa" w:w="3960"/>
           </w:tcPr>
           <w:p>
             <w:pPr>
@@ -280,7 +280,7 @@
         </w:tc>
         <w:tc>
           <w:tcPr>
-            <w:tcW w:type="dxa" w:w="6048"/>
+            <w:tcW w:type="dxa" w:w="5976"/>
           </w:tcPr>
           <w:p>
             <w:pPr>
@@ -301,7 +301,7 @@
       <w:tr>
         <w:tc>
           <w:tcPr>
-            <w:tcW w:type="dxa" w:w="3888"/>
+            <w:tcW w:type="dxa" w:w="3960"/>
             <w:shd w:val="clear" w:color="auto" w:fill="F4F6F8"/>
           </w:tcPr>
           <w:p>
@@ -321,7 +321,7 @@
         </w:tc>
         <w:tc>
           <w:tcPr>
-            <w:tcW w:type="dxa" w:w="6048"/>
+            <w:tcW w:type="dxa" w:w="5976"/>
             <w:shd w:val="clear" w:color="auto" w:fill="F4F6F8"/>
           </w:tcPr>
           <w:p>
@@ -343,7 +343,7 @@
       <w:tr>
         <w:tc>
           <w:tcPr>
-            <w:tcW w:type="dxa" w:w="3888"/>
+            <w:tcW w:type="dxa" w:w="3960"/>
           </w:tcPr>
           <w:p>
             <w:pPr>
@@ -362,7 +362,7 @@
         </w:tc>
         <w:tc>
           <w:tcPr>
-            <w:tcW w:type="dxa" w:w="6048"/>
+            <w:tcW w:type="dxa" w:w="5976"/>
           </w:tcPr>
           <w:p>
             <w:pPr>
@@ -383,7 +383,7 @@
       <w:tr>
         <w:tc>
           <w:tcPr>
-            <w:tcW w:type="dxa" w:w="3888"/>
+            <w:tcW w:type="dxa" w:w="3960"/>
             <w:shd w:val="clear" w:color="auto" w:fill="F4F6F8"/>
           </w:tcPr>
           <w:p>
@@ -403,7 +403,7 @@
         </w:tc>
         <w:tc>
           <w:tcPr>
-            <w:tcW w:type="dxa" w:w="6048"/>
+            <w:tcW w:type="dxa" w:w="5976"/>
             <w:shd w:val="clear" w:color="auto" w:fill="F4F6F8"/>
           </w:tcPr>
           <w:p>
@@ -425,7 +425,7 @@
       <w:tr>
         <w:tc>
           <w:tcPr>
-            <w:tcW w:type="dxa" w:w="3888"/>
+            <w:tcW w:type="dxa" w:w="3960"/>
           </w:tcPr>
           <w:p>
             <w:pPr>
@@ -444,7 +444,7 @@
         </w:tc>
         <w:tc>
           <w:tcPr>
-            <w:tcW w:type="dxa" w:w="6048"/>
+            <w:tcW w:type="dxa" w:w="5976"/>
           </w:tcPr>
           <w:p>
             <w:pPr>
@@ -465,7 +465,7 @@
       <w:tr>
         <w:tc>
           <w:tcPr>
-            <w:tcW w:type="dxa" w:w="3888"/>
+            <w:tcW w:type="dxa" w:w="3960"/>
             <w:shd w:val="clear" w:color="auto" w:fill="F4F6F8"/>
           </w:tcPr>
           <w:p>
@@ -485,7 +485,7 @@
         </w:tc>
         <w:tc>
           <w:tcPr>
-            <w:tcW w:type="dxa" w:w="6048"/>
+            <w:tcW w:type="dxa" w:w="5976"/>
             <w:shd w:val="clear" w:color="auto" w:fill="F4F6F8"/>
           </w:tcPr>
           <w:p>
@@ -507,7 +507,7 @@
       <w:tr>
         <w:tc>
           <w:tcPr>
-            <w:tcW w:type="dxa" w:w="3888"/>
+            <w:tcW w:type="dxa" w:w="3960"/>
           </w:tcPr>
           <w:p>
             <w:pPr>
@@ -526,7 +526,7 @@
         </w:tc>
         <w:tc>
           <w:tcPr>
-            <w:tcW w:type="dxa" w:w="6048"/>
+            <w:tcW w:type="dxa" w:w="5976"/>
           </w:tcPr>
           <w:p>
             <w:pPr>
@@ -547,7 +547,7 @@
       <w:tr>
         <w:tc>
           <w:tcPr>
-            <w:tcW w:type="dxa" w:w="3888"/>
+            <w:tcW w:type="dxa" w:w="3960"/>
             <w:shd w:val="clear" w:color="auto" w:fill="F4F6F8"/>
           </w:tcPr>
           <w:p>
@@ -567,7 +567,7 @@
         </w:tc>
         <w:tc>
           <w:tcPr>
-            <w:tcW w:type="dxa" w:w="6048"/>
+            <w:tcW w:type="dxa" w:w="5976"/>
             <w:shd w:val="clear" w:color="auto" w:fill="F4F6F8"/>
           </w:tcPr>
           <w:p>
@@ -589,7 +589,7 @@
       <w:tr>
         <w:tc>
           <w:tcPr>
-            <w:tcW w:type="dxa" w:w="3888"/>
+            <w:tcW w:type="dxa" w:w="3960"/>
           </w:tcPr>
           <w:p>
             <w:pPr>
@@ -608,7 +608,7 @@
         </w:tc>
         <w:tc>
           <w:tcPr>
-            <w:tcW w:type="dxa" w:w="6048"/>
+            <w:tcW w:type="dxa" w:w="5976"/>
           </w:tcPr>
           <w:p>
             <w:pPr>
@@ -622,6 +622,48 @@
                 <w:sz w:val="15"/>
               </w:rPr>
               <w:t>Correlation, regression, thermal confound, and HW4</w:t>
+            </w:r>
+          </w:p>
+        </w:tc>
+      </w:tr>
+      <w:tr>
+        <w:tc>
+          <w:tcPr>
+            <w:tcW w:type="dxa" w:w="3960"/>
+            <w:shd w:val="clear" w:color="auto" w:fill="F4F6F8"/>
+          </w:tcPr>
+          <w:p>
+            <w:pPr>
+              <w:spacing w:before="20" w:after="20" w:line="252" w:lineRule="auto"/>
+            </w:pPr>
+            <w:r>
+              <w:rPr>
+                <w:rFonts w:ascii="Barlow" w:hAnsi="Barlow" w:cs="Barlow"/>
+                <w:b w:val="0"/>
+                <w:i w:val="0"/>
+                <w:sz w:val="15"/>
+              </w:rPr>
+              <w:t>13-M09-false-precision</w:t>
+            </w:r>
+          </w:p>
+        </w:tc>
+        <w:tc>
+          <w:tcPr>
+            <w:tcW w:type="dxa" w:w="5976"/>
+            <w:shd w:val="clear" w:color="auto" w:fill="F4F6F8"/>
+          </w:tcPr>
+          <w:p>
+            <w:pPr>
+              <w:spacing w:before="20" w:after="20" w:line="252" w:lineRule="auto"/>
+            </w:pPr>
+            <w:r>
+              <w:rPr>
+                <w:rFonts w:ascii="Barlow" w:hAnsi="Barlow" w:cs="Barlow"/>
+                <w:b w:val="0"/>
+                <w:i w:val="0"/>
+                <w:sz w:val="15"/>
+              </w:rPr>
+              <w:t>Overconfidence, false precision, random sampling, and sampling variability</w:t>
             </w:r>
           </w:p>
         </w:tc>
@@ -641,7 +683,7 @@
           <w:caps w:val="1"/>
           <w:spacing w:val="12"/>
         </w:rPr>
-        <w:t>12-M08-spurious-correlation</w:t>
+        <w:t>13-M09-false-precision</w:t>
       </w:r>
     </w:p>
     <w:tbl>
@@ -665,7 +707,7 @@
       <w:tr>
         <w:tc>
           <w:tcPr>
-            <w:tcW w:type="dxa" w:w="4536"/>
+            <w:tcW w:type="dxa" w:w="4680"/>
             <w:shd w:val="clear" w:color="auto" w:fill="1F3A5F"/>
           </w:tcPr>
           <w:p>
@@ -678,7 +720,7 @@
                 <w:b/>
                 <w:i w:val="0"/>
                 <w:color w:val="FFFFFF"/>
-                <w:sz w:val="15"/>
+                <w:sz w:val="14"/>
               </w:rPr>
               <w:t>File</w:t>
             </w:r>
@@ -686,7 +728,7 @@
         </w:tc>
         <w:tc>
           <w:tcPr>
-            <w:tcW w:type="dxa" w:w="5400"/>
+            <w:tcW w:type="dxa" w:w="5256"/>
             <w:shd w:val="clear" w:color="auto" w:fill="1F3A5F"/>
           </w:tcPr>
           <w:p>
@@ -699,7 +741,7 @@
                 <w:b/>
                 <w:i w:val="0"/>
                 <w:color w:val="FFFFFF"/>
-                <w:sz w:val="15"/>
+                <w:sz w:val="14"/>
               </w:rPr>
               <w:t>What it is</w:t>
             </w:r>
@@ -709,7 +751,7 @@
       <w:tr>
         <w:tc>
           <w:tcPr>
-            <w:tcW w:type="dxa" w:w="4536"/>
+            <w:tcW w:type="dxa" w:w="4680"/>
           </w:tcPr>
           <w:p>
             <w:pPr>
@@ -720,15 +762,15 @@
                 <w:rFonts w:ascii="Barlow" w:hAnsi="Barlow" w:cs="Barlow"/>
                 <w:b w:val="0"/>
                 <w:i w:val="0"/>
-                <w:sz w:val="15"/>
+                <w:sz w:val="14"/>
               </w:rPr>
-              <w:t>M08-student.pptx</w:t>
+              <w:t>M09-student.pptx</w:t>
             </w:r>
           </w:p>
         </w:tc>
         <w:tc>
           <w:tcPr>
-            <w:tcW w:type="dxa" w:w="5400"/>
+            <w:tcW w:type="dxa" w:w="5256"/>
           </w:tcPr>
           <w:p>
             <w:pPr>
@@ -739,9 +781,9 @@
                 <w:rFonts w:ascii="Barlow" w:hAnsi="Barlow" w:cs="Barlow"/>
                 <w:b w:val="0"/>
                 <w:i w:val="0"/>
-                <w:sz w:val="15"/>
+                <w:sz w:val="14"/>
               </w:rPr>
-              <w:t>Spoiler-safe concept and hunt deck; SAY hooks remain pending</w:t>
+              <w:t>Spoiler-safe precision and sampling deck with approved Oli SAY</w:t>
             </w:r>
           </w:p>
         </w:tc>
@@ -749,7 +791,7 @@
       <w:tr>
         <w:tc>
           <w:tcPr>
-            <w:tcW w:type="dxa" w:w="4536"/>
+            <w:tcW w:type="dxa" w:w="4680"/>
             <w:shd w:val="clear" w:color="auto" w:fill="F4F6F8"/>
           </w:tcPr>
           <w:p>
@@ -761,15 +803,15 @@
                 <w:rFonts w:ascii="Barlow" w:hAnsi="Barlow" w:cs="Barlow"/>
                 <w:b w:val="0"/>
                 <w:i w:val="0"/>
-                <w:sz w:val="15"/>
+                <w:sz w:val="14"/>
               </w:rPr>
-              <w:t>M08-instructor-reveal.pptx</w:t>
+              <w:t>M09-instructor-reveal.pptx</w:t>
             </w:r>
           </w:p>
         </w:tc>
         <w:tc>
           <w:tcPr>
-            <w:tcW w:type="dxa" w:w="5400"/>
+            <w:tcW w:type="dxa" w:w="5256"/>
             <w:shd w:val="clear" w:color="auto" w:fill="F4F6F8"/>
           </w:tcPr>
           <w:p>
@@ -781,9 +823,9 @@
                 <w:rFonts w:ascii="Barlow" w:hAnsi="Barlow" w:cs="Barlow"/>
                 <w:b w:val="0"/>
                 <w:i w:val="0"/>
-                <w:sz w:val="15"/>
+                <w:sz w:val="14"/>
               </w:rPr>
-              <w:t>Gated model comparison, mechanism, and corrected trend</w:t>
+              <w:t>Gated precision audit, sample means, and bounded response</w:t>
             </w:r>
           </w:p>
         </w:tc>
@@ -791,7 +833,7 @@
       <w:tr>
         <w:tc>
           <w:tcPr>
-            <w:tcW w:type="dxa" w:w="4536"/>
+            <w:tcW w:type="dxa" w:w="4680"/>
           </w:tcPr>
           <w:p>
             <w:pPr>
@@ -802,15 +844,15 @@
                 <w:rFonts w:ascii="Barlow" w:hAnsi="Barlow" w:cs="Barlow"/>
                 <w:b w:val="0"/>
                 <w:i w:val="0"/>
-                <w:sz w:val="15"/>
+                <w:sz w:val="14"/>
               </w:rPr>
-              <w:t>FOREMAN-M08-deterioration-report.docx</w:t>
+              <w:t>FOREMAN-M09-fatigue-life-output.docx</w:t>
             </w:r>
           </w:p>
         </w:tc>
         <w:tc>
           <w:tcPr>
-            <w:tcW w:type="dxa" w:w="5400"/>
+            <w:tcW w:type="dxa" w:w="5256"/>
           </w:tcPr>
           <w:p>
             <w:pPr>
@@ -821,9 +863,9 @@
                 <w:rFonts w:ascii="Barlow" w:hAnsi="Barlow" w:cs="Barlow"/>
                 <w:b w:val="0"/>
                 <w:i w:val="0"/>
-                <w:sz w:val="15"/>
+                <w:sz w:val="14"/>
               </w:rPr>
-              <w:t>Designed overclaim from strain-versus-date fit</w:t>
+              <w:t>Designed overprecision from coarse, scattered inputs</w:t>
             </w:r>
           </w:p>
         </w:tc>
@@ -831,7 +873,7 @@
       <w:tr>
         <w:tc>
           <w:tcPr>
-            <w:tcW w:type="dxa" w:w="4536"/>
+            <w:tcW w:type="dxa" w:w="4680"/>
             <w:shd w:val="clear" w:color="auto" w:fill="F4F6F8"/>
           </w:tcPr>
           <w:p>
@@ -843,15 +885,15 @@
                 <w:rFonts w:ascii="Barlow" w:hAnsi="Barlow" w:cs="Barlow"/>
                 <w:b w:val="0"/>
                 <w:i w:val="0"/>
-                <w:sz w:val="15"/>
+                <w:sz w:val="14"/>
               </w:rPr>
-              <w:t>H8-01-data-guide.docx</w:t>
+              <w:t>H9-01-fatigue-evidence-guide.docx</w:t>
             </w:r>
           </w:p>
         </w:tc>
         <w:tc>
           <w:tcPr>
-            <w:tcW w:type="dxa" w:w="5400"/>
+            <w:tcW w:type="dxa" w:w="5256"/>
             <w:shd w:val="clear" w:color="auto" w:fill="F4F6F8"/>
           </w:tcPr>
           <w:p>
@@ -863,9 +905,9 @@
                 <w:rFonts w:ascii="Barlow" w:hAnsi="Barlow" w:cs="Barlow"/>
                 <w:b w:val="0"/>
                 <w:i w:val="0"/>
-                <w:sz w:val="15"/>
+                <w:sz w:val="14"/>
               </w:rPr>
-              <w:t>Source fields, units, join key, and scope</w:t>
+              <w:t>Fatigue fields, units, resolution, and audit checks</w:t>
             </w:r>
           </w:p>
         </w:tc>
@@ -873,7 +915,7 @@
       <w:tr>
         <w:tc>
           <w:tcPr>
-            <w:tcW w:type="dxa" w:w="4536"/>
+            <w:tcW w:type="dxa" w:w="4680"/>
           </w:tcPr>
           <w:p>
             <w:pPr>
@@ -884,15 +926,15 @@
                 <w:rFonts w:ascii="Barlow" w:hAnsi="Barlow" w:cs="Barlow"/>
                 <w:b w:val="0"/>
                 <w:i w:val="0"/>
-                <w:sz w:val="15"/>
+                <w:sz w:val="14"/>
               </w:rPr>
-              <w:t>H8-02-regression-hunt.docx</w:t>
+              <w:t>H9-02-precision-audit.docx</w:t>
             </w:r>
           </w:p>
         </w:tc>
         <w:tc>
           <w:tcPr>
-            <w:tcW w:type="dxa" w:w="5400"/>
+            <w:tcW w:type="dxa" w:w="5256"/>
           </w:tcPr>
           <w:p>
             <w:pPr>
@@ -903,9 +945,9 @@
                 <w:rFonts w:ascii="Barlow" w:hAnsi="Barlow" w:cs="Barlow"/>
                 <w:b w:val="0"/>
                 <w:i w:val="0"/>
-                <w:sz w:val="15"/>
+                <w:sz w:val="14"/>
               </w:rPr>
-              <w:t>Student model comparison and confound hunt</w:t>
+              <w:t>Digit trace and defensible-reporting worksheet</w:t>
             </w:r>
           </w:p>
         </w:tc>
@@ -913,7 +955,7 @@
       <w:tr>
         <w:tc>
           <w:tcPr>
-            <w:tcW w:type="dxa" w:w="4536"/>
+            <w:tcW w:type="dxa" w:w="4680"/>
             <w:shd w:val="clear" w:color="auto" w:fill="F4F6F8"/>
           </w:tcPr>
           <w:p>
@@ -925,15 +967,15 @@
                 <w:rFonts w:ascii="Barlow" w:hAnsi="Barlow" w:cs="Barlow"/>
                 <w:b w:val="0"/>
                 <w:i w:val="0"/>
-                <w:sz w:val="15"/>
+                <w:sz w:val="14"/>
               </w:rPr>
-              <w:t>H8-03-concepts-and-mechanism.docx</w:t>
+              <w:t>H9-03-concepts-and-reporting.docx</w:t>
             </w:r>
           </w:p>
         </w:tc>
         <w:tc>
           <w:tcPr>
-            <w:tcW w:type="dxa" w:w="5400"/>
+            <w:tcW w:type="dxa" w:w="5256"/>
             <w:shd w:val="clear" w:color="auto" w:fill="F4F6F8"/>
           </w:tcPr>
           <w:p>
@@ -945,9 +987,9 @@
                 <w:rFonts w:ascii="Barlow" w:hAnsi="Barlow" w:cs="Barlow"/>
                 <w:b w:val="0"/>
                 <w:i w:val="0"/>
-                <w:sz w:val="15"/>
+                <w:sz w:val="14"/>
               </w:rPr>
-              <w:t>Six concept definitions and mechanism prompts</w:t>
+              <w:t>Five concepts and significant-figures boundary</w:t>
             </w:r>
           </w:p>
         </w:tc>
@@ -955,7 +997,7 @@
       <w:tr>
         <w:tc>
           <w:tcPr>
-            <w:tcW w:type="dxa" w:w="4536"/>
+            <w:tcW w:type="dxa" w:w="4680"/>
           </w:tcPr>
           <w:p>
             <w:pPr>
@@ -966,15 +1008,15 @@
                 <w:rFonts w:ascii="Barlow" w:hAnsi="Barlow" w:cs="Barlow"/>
                 <w:b w:val="0"/>
                 <w:i w:val="0"/>
-                <w:sz w:val="15"/>
+                <w:sz w:val="14"/>
               </w:rPr>
-              <w:t>H8-04-HW4-temperature-correction.docx</w:t>
+              <w:t>H9-04-random-sampling-lab.docx</w:t>
             </w:r>
           </w:p>
         </w:tc>
         <w:tc>
           <w:tcPr>
-            <w:tcW w:type="dxa" w:w="5400"/>
+            <w:tcW w:type="dxa" w:w="5256"/>
           </w:tcPr>
           <w:p>
             <w:pPr>
@@ -985,9 +1027,9 @@
                 <w:rFonts w:ascii="Barlow" w:hAnsi="Barlow" w:cs="Barlow"/>
                 <w:b w:val="0"/>
                 <w:i w:val="0"/>
-                <w:sz w:val="15"/>
+                <w:sz w:val="14"/>
               </w:rPr>
-              <w:t>HW4 assigned at M08</w:t>
+              <w:t>Twelve deterministic random draws of n = 8</w:t>
             </w:r>
           </w:p>
         </w:tc>
@@ -995,7 +1037,7 @@
       <w:tr>
         <w:tc>
           <w:tcPr>
-            <w:tcW w:type="dxa" w:w="4536"/>
+            <w:tcW w:type="dxa" w:w="4680"/>
             <w:shd w:val="clear" w:color="auto" w:fill="F4F6F8"/>
           </w:tcPr>
           <w:p>
@@ -1007,15 +1049,15 @@
                 <w:rFonts w:ascii="Barlow" w:hAnsi="Barlow" w:cs="Barlow"/>
                 <w:b w:val="0"/>
                 <w:i w:val="0"/>
-                <w:sz w:val="15"/>
+                <w:sz w:val="14"/>
               </w:rPr>
-              <w:t>H8-05-note-v2-and-decision-log.docx</w:t>
+              <w:t>H9-05-core-sampling-frame-audit.docx</w:t>
             </w:r>
           </w:p>
         </w:tc>
         <w:tc>
           <w:tcPr>
-            <w:tcW w:type="dxa" w:w="5400"/>
+            <w:tcW w:type="dxa" w:w="5256"/>
             <w:shd w:val="clear" w:color="auto" w:fill="F4F6F8"/>
           </w:tcPr>
           <w:p>
@@ -1027,9 +1069,9 @@
                 <w:rFonts w:ascii="Barlow" w:hAnsi="Barlow" w:cs="Barlow"/>
                 <w:b w:val="0"/>
                 <w:i w:val="0"/>
-                <w:sz w:val="15"/>
+                <w:sz w:val="14"/>
               </w:rPr>
-              <w:t>Claim/check/result record</w:t>
+              <w:t>Shoulder-only convenience-sample audit</w:t>
             </w:r>
           </w:p>
         </w:tc>
@@ -1037,7 +1079,7 @@
       <w:tr>
         <w:tc>
           <w:tcPr>
-            <w:tcW w:type="dxa" w:w="4536"/>
+            <w:tcW w:type="dxa" w:w="4680"/>
           </w:tcPr>
           <w:p>
             <w:pPr>
@@ -1048,15 +1090,15 @@
                 <w:rFonts w:ascii="Barlow" w:hAnsi="Barlow" w:cs="Barlow"/>
                 <w:b w:val="0"/>
                 <w:i w:val="0"/>
-                <w:sz w:val="15"/>
+                <w:sz w:val="14"/>
               </w:rPr>
-              <w:t>feed.csv + weather_station.csv</w:t>
+              <w:t>H9-06-note-v2-and-decision-log.docx</w:t>
             </w:r>
           </w:p>
         </w:tc>
         <w:tc>
           <w:tcPr>
-            <w:tcW w:type="dxa" w:w="5400"/>
+            <w:tcW w:type="dxa" w:w="5256"/>
           </w:tcPr>
           <w:p>
             <w:pPr>
@@ -1067,9 +1109,9 @@
                 <w:rFonts w:ascii="Barlow" w:hAnsi="Barlow" w:cs="Barlow"/>
                 <w:b w:val="0"/>
                 <w:i w:val="0"/>
-                <w:sz w:val="15"/>
+                <w:sz w:val="14"/>
               </w:rPr>
-              <w:t>Separate matched sensor and weather records</w:t>
+              <w:t>Claim/check/result and project-hour record</w:t>
             </w:r>
           </w:p>
         </w:tc>
@@ -1077,7 +1119,7 @@
       <w:tr>
         <w:tc>
           <w:tcPr>
-            <w:tcW w:type="dxa" w:w="4536"/>
+            <w:tcW w:type="dxa" w:w="4680"/>
             <w:shd w:val="clear" w:color="auto" w:fill="F4F6F8"/>
           </w:tcPr>
           <w:p>
@@ -1089,15 +1131,15 @@
                 <w:rFonts w:ascii="Barlow" w:hAnsi="Barlow" w:cs="Barlow"/>
                 <w:b w:val="0"/>
                 <w:i w:val="0"/>
-                <w:sz w:val="15"/>
+                <w:sz w:val="14"/>
               </w:rPr>
-              <w:t>M08-strain-temperature-analysis.csv</w:t>
+              <w:t>fatigue_tests.csv + M09-fatigue-summary.csv</w:t>
             </w:r>
           </w:p>
         </w:tc>
         <w:tc>
           <w:tcPr>
-            <w:tcW w:type="dxa" w:w="5400"/>
+            <w:tcW w:type="dxa" w:w="5256"/>
             <w:shd w:val="clear" w:color="auto" w:fill="F4F6F8"/>
           </w:tcPr>
           <w:p>
@@ -1109,9 +1151,9 @@
                 <w:rFonts w:ascii="Barlow" w:hAnsi="Barlow" w:cs="Barlow"/>
                 <w:b w:val="0"/>
                 <w:i w:val="0"/>
-                <w:sz w:val="15"/>
+                <w:sz w:val="14"/>
               </w:rPr>
-              <w:t>Joined and corrected analysis exhibit</w:t>
+              <w:t>Synthetic tests and deterministic summary</w:t>
             </w:r>
           </w:p>
         </w:tc>
@@ -1119,7 +1161,7 @@
       <w:tr>
         <w:tc>
           <w:tcPr>
-            <w:tcW w:type="dxa" w:w="4536"/>
+            <w:tcW w:type="dxa" w:w="4680"/>
           </w:tcPr>
           <w:p>
             <w:pPr>
@@ -1130,15 +1172,15 @@
                 <w:rFonts w:ascii="Barlow" w:hAnsi="Barlow" w:cs="Barlow"/>
                 <w:b w:val="0"/>
                 <w:i w:val="0"/>
-                <w:sz w:val="15"/>
+                <w:sz w:val="14"/>
               </w:rPr>
-              <w:t>M08-regression-summary.csv</w:t>
+              <w:t>core_population_200_simulated.csv</w:t>
             </w:r>
           </w:p>
         </w:tc>
         <w:tc>
           <w:tcPr>
-            <w:tcW w:type="dxa" w:w="5400"/>
+            <w:tcW w:type="dxa" w:w="5256"/>
           </w:tcPr>
           <w:p>
             <w:pPr>
@@ -1149,9 +1191,9 @@
                 <w:rFonts w:ascii="Barlow" w:hAnsi="Barlow" w:cs="Barlow"/>
                 <w:b w:val="0"/>
                 <w:i w:val="0"/>
-                <w:sz w:val="15"/>
+                <w:sz w:val="14"/>
               </w:rPr>
-              <w:t>Deterministic model summary</w:t>
+              <w:t>Sampling demonstrator; explicitly not bridge evidence</w:t>
             </w:r>
           </w:p>
         </w:tc>
@@ -1159,7 +1201,7 @@
       <w:tr>
         <w:tc>
           <w:tcPr>
-            <w:tcW w:type="dxa" w:w="4536"/>
+            <w:tcW w:type="dxa" w:w="4680"/>
             <w:shd w:val="clear" w:color="auto" w:fill="F4F6F8"/>
           </w:tcPr>
           <w:p>
@@ -1171,15 +1213,15 @@
                 <w:rFonts w:ascii="Barlow" w:hAnsi="Barlow" w:cs="Barlow"/>
                 <w:b w:val="0"/>
                 <w:i w:val="0"/>
-                <w:sz w:val="15"/>
+                <w:sz w:val="14"/>
               </w:rPr>
-              <w:t>KEY-M08-answer-key.docx</w:t>
+              <w:t>M09-random-samples-n8.csv</w:t>
             </w:r>
           </w:p>
         </w:tc>
         <w:tc>
           <w:tcPr>
-            <w:tcW w:type="dxa" w:w="5400"/>
+            <w:tcW w:type="dxa" w:w="5256"/>
             <w:shd w:val="clear" w:color="auto" w:fill="F4F6F8"/>
           </w:tcPr>
           <w:p>
@@ -1191,9 +1233,9 @@
                 <w:rFonts w:ascii="Barlow" w:hAnsi="Barlow" w:cs="Barlow"/>
                 <w:b w:val="0"/>
                 <w:i w:val="0"/>
-                <w:sz w:val="15"/>
+                <w:sz w:val="14"/>
               </w:rPr>
-              <w:t>Instructor-only conclusion and plots</w:t>
+              <w:t>Deterministic sample IDs and statistics</w:t>
             </w:r>
           </w:p>
         </w:tc>
@@ -1201,7 +1243,7 @@
       <w:tr>
         <w:tc>
           <w:tcPr>
-            <w:tcW w:type="dxa" w:w="4536"/>
+            <w:tcW w:type="dxa" w:w="4680"/>
           </w:tcPr>
           <w:p>
             <w:pPr>
@@ -1212,15 +1254,15 @@
                 <w:rFonts w:ascii="Barlow" w:hAnsi="Barlow" w:cs="Barlow"/>
                 <w:b w:val="0"/>
                 <w:i w:val="0"/>
-                <w:sz w:val="15"/>
+                <w:sz w:val="14"/>
               </w:rPr>
-              <w:t>../00-INSTRUCTOR/source-notes/M08-story-SAY-PENDING.md</w:t>
+              <w:t>cores_2027.csv</w:t>
             </w:r>
           </w:p>
         </w:tc>
         <w:tc>
           <w:tcPr>
-            <w:tcW w:type="dxa" w:w="5400"/>
+            <w:tcW w:type="dxa" w:w="5256"/>
           </w:tcPr>
           <w:p>
             <w:pPr>
@@ -1231,9 +1273,91 @@
                 <w:rFonts w:ascii="Barlow" w:hAnsi="Barlow" w:cs="Barlow"/>
                 <w:b w:val="0"/>
                 <w:i w:val="0"/>
-                <w:sz w:val="15"/>
+                <w:sz w:val="14"/>
               </w:rPr>
-              <w:t>Oli SAY intake hook; not approved dialogue</w:t>
+              <w:t>M04's 24 shoulder cores returned for sampling-frame audit</w:t>
+            </w:r>
+          </w:p>
+        </w:tc>
+      </w:tr>
+      <w:tr>
+        <w:tc>
+          <w:tcPr>
+            <w:tcW w:type="dxa" w:w="4680"/>
+            <w:shd w:val="clear" w:color="auto" w:fill="F4F6F8"/>
+          </w:tcPr>
+          <w:p>
+            <w:pPr>
+              <w:spacing w:before="20" w:after="20" w:line="252" w:lineRule="auto"/>
+            </w:pPr>
+            <w:r>
+              <w:rPr>
+                <w:rFonts w:ascii="Barlow" w:hAnsi="Barlow" w:cs="Barlow"/>
+                <w:b w:val="0"/>
+                <w:i w:val="0"/>
+                <w:sz w:val="14"/>
+              </w:rPr>
+              <w:t>KEY-M09-answer-key.docx</w:t>
+            </w:r>
+          </w:p>
+        </w:tc>
+        <w:tc>
+          <w:tcPr>
+            <w:tcW w:type="dxa" w:w="5256"/>
+            <w:shd w:val="clear" w:color="auto" w:fill="F4F6F8"/>
+          </w:tcPr>
+          <w:p>
+            <w:pPr>
+              <w:spacing w:before="20" w:after="20" w:line="252" w:lineRule="auto"/>
+            </w:pPr>
+            <w:r>
+              <w:rPr>
+                <w:rFonts w:ascii="Barlow" w:hAnsi="Barlow" w:cs="Barlow"/>
+                <w:b w:val="0"/>
+                <w:i w:val="0"/>
+                <w:sz w:val="14"/>
+              </w:rPr>
+              <w:t>Instructor-only values, reporting model, and boundaries</w:t>
+            </w:r>
+          </w:p>
+        </w:tc>
+      </w:tr>
+      <w:tr>
+        <w:tc>
+          <w:tcPr>
+            <w:tcW w:type="dxa" w:w="4680"/>
+          </w:tcPr>
+          <w:p>
+            <w:pPr>
+              <w:spacing w:before="20" w:after="20" w:line="252" w:lineRule="auto"/>
+            </w:pPr>
+            <w:r>
+              <w:rPr>
+                <w:rFonts w:ascii="Barlow" w:hAnsi="Barlow" w:cs="Barlow"/>
+                <w:b w:val="0"/>
+                <w:i w:val="0"/>
+                <w:sz w:val="14"/>
+              </w:rPr>
+              <w:t>../00-INSTRUCTOR/source-notes/M09-story-SAY.md</w:t>
+            </w:r>
+          </w:p>
+        </w:tc>
+        <w:tc>
+          <w:tcPr>
+            <w:tcW w:type="dxa" w:w="5256"/>
+          </w:tcPr>
+          <w:p>
+            <w:pPr>
+              <w:spacing w:before="20" w:after="20" w:line="252" w:lineRule="auto"/>
+            </w:pPr>
+            <w:r>
+              <w:rPr>
+                <w:rFonts w:ascii="Barlow" w:hAnsi="Barlow" w:cs="Barlow"/>
+                <w:b w:val="0"/>
+                <w:i w:val="0"/>
+                <w:sz w:val="14"/>
+              </w:rPr>
+              <w:t>Cloud-approved canon SAY with repaired Inbox timing</w:t>
             </w:r>
           </w:p>
         </w:tc>
@@ -1269,7 +1393,7 @@
         <w:color w:val="6B7280"/>
         <w:sz w:val="16"/>
       </w:rPr>
-      <w:t>SEIS 201  ·  M01 – M08</w:t>
+      <w:t>SEIS 201  ·  M01 – M09</w:t>
     </w:r>
     <w:r>
       <w:tab/>
@@ -1342,7 +1466,7 @@
         <w:caps w:val="1"/>
         <w:spacing w:val="20"/>
       </w:rPr>
-      <w:t>M01 – M08  ·  FILE INDEX</w:t>
+      <w:t>M01 – M09  ·  FILE INDEX</w:t>
     </w:r>
   </w:p>
 </w:hdr>

</xml_diff>

<commit_message>
Hold M09 SAY pending Cloud re-check
Co-authored-by: shaseaver25 <shannon@tailoredu.org>
</commit_message>
<xml_diff>
--- a/teaching-pack/00-INSTRUCTOR/FILE-INDEX.docx
+++ b/teaching-pack/00-INSTRUCTOR/FILE-INDEX.docx
@@ -783,7 +783,7 @@
                 <w:i w:val="0"/>
                 <w:sz w:val="14"/>
               </w:rPr>
-              <w:t>Spoiler-safe precision and sampling deck with approved Oli SAY</w:t>
+              <w:t>Spoiler-safe precision and sampling deck; SAY placeholders on HOLD</w:t>
             </w:r>
           </w:p>
         </w:tc>
@@ -1338,7 +1338,7 @@
                 <w:i w:val="0"/>
                 <w:sz w:val="14"/>
               </w:rPr>
-              <w:t>../00-INSTRUCTOR/source-notes/M09-story-SAY.md</w:t>
+              <w:t>../00-INSTRUCTOR/source-notes/M09-story-SAY-PENDING.md</w:t>
             </w:r>
           </w:p>
         </w:tc>
@@ -1357,7 +1357,7 @@
                 <w:i w:val="0"/>
                 <w:sz w:val="14"/>
               </w:rPr>
-              <w:t>Cloud-approved canon SAY with repaired Inbox timing</w:t>
+              <w:t>Re-check intake and placeholder boundaries; not canon SAY</w:t>
             </w:r>
           </w:p>
         </w:tc>

</xml_diff>

<commit_message>
Generate and verify M10 teaching artifacts
Co-authored-by: shaseaver25 <shannon@tailoredu.org>
</commit_message>
<xml_diff>
--- a/teaching-pack/00-INSTRUCTOR/FILE-INDEX.docx
+++ b/teaching-pack/00-INSTRUCTOR/FILE-INDEX.docx
@@ -29,7 +29,7 @@
           <w:color w:val="6B7280"/>
           <w:sz w:val="18"/>
         </w:rPr>
-        <w:t>Folders are in teaching order. M07 opens Unit 2 and preserves the student hunt by separating evidence from the gated applicability conclusion.</w:t>
+        <w:t>Folders are in teaching order. M10 is folder 14 after the M09 pack and separates a small paired deterioration signal from measurement, process, and sampling noise.</w:t>
       </w:r>
     </w:p>
     <w:tbl>
@@ -53,7 +53,7 @@
       <w:tr>
         <w:tc>
           <w:tcPr>
-            <w:tcW w:type="dxa" w:w="3672"/>
+            <w:tcW w:type="dxa" w:w="3960"/>
             <w:shd w:val="clear" w:color="auto" w:fill="1F3A5F"/>
           </w:tcPr>
           <w:p>
@@ -66,7 +66,7 @@
                 <w:b/>
                 <w:i w:val="0"/>
                 <w:color w:val="FFFFFF"/>
-                <w:sz w:val="16"/>
+                <w:sz w:val="14"/>
               </w:rPr>
               <w:t>Folder</w:t>
             </w:r>
@@ -74,7 +74,7 @@
         </w:tc>
         <w:tc>
           <w:tcPr>
-            <w:tcW w:type="dxa" w:w="6264"/>
+            <w:tcW w:type="dxa" w:w="5976"/>
             <w:shd w:val="clear" w:color="auto" w:fill="1F3A5F"/>
           </w:tcPr>
           <w:p>
@@ -87,7 +87,7 @@
                 <w:b/>
                 <w:i w:val="0"/>
                 <w:color w:val="FFFFFF"/>
-                <w:sz w:val="16"/>
+                <w:sz w:val="14"/>
               </w:rPr>
               <w:t>Purpose</w:t>
             </w:r>
@@ -97,7 +97,7 @@
       <w:tr>
         <w:tc>
           <w:tcPr>
-            <w:tcW w:type="dxa" w:w="3672"/>
+            <w:tcW w:type="dxa" w:w="3960"/>
           </w:tcPr>
           <w:p>
             <w:pPr>
@@ -108,7 +108,7 @@
                 <w:rFonts w:ascii="Barlow" w:hAnsi="Barlow" w:cs="Barlow"/>
                 <w:b w:val="0"/>
                 <w:i w:val="0"/>
-                <w:sz w:val="16"/>
+                <w:sz w:val="14"/>
               </w:rPr>
               <w:t>00-INSTRUCTOR</w:t>
             </w:r>
@@ -116,7 +116,7 @@
         </w:tc>
         <w:tc>
           <w:tcPr>
-            <w:tcW w:type="dxa" w:w="6264"/>
+            <w:tcW w:type="dxa" w:w="5976"/>
           </w:tcPr>
           <w:p>
             <w:pPr>
@@ -127,7 +127,7 @@
                 <w:rFonts w:ascii="Barlow" w:hAnsi="Barlow" w:cs="Barlow"/>
                 <w:b w:val="0"/>
                 <w:i w:val="0"/>
-                <w:sz w:val="16"/>
+                <w:sz w:val="14"/>
               </w:rPr>
               <w:t>Run-of-day desk, faculty brief, source SAY notes, and this index</w:t>
             </w:r>
@@ -137,7 +137,7 @@
       <w:tr>
         <w:tc>
           <w:tcPr>
-            <w:tcW w:type="dxa" w:w="3672"/>
+            <w:tcW w:type="dxa" w:w="3960"/>
             <w:shd w:val="clear" w:color="auto" w:fill="F4F6F8"/>
           </w:tcPr>
           <w:p>
@@ -149,7 +149,7 @@
                 <w:rFonts w:ascii="Barlow" w:hAnsi="Barlow" w:cs="Barlow"/>
                 <w:b w:val="0"/>
                 <w:i w:val="0"/>
-                <w:sz w:val="16"/>
+                <w:sz w:val="14"/>
               </w:rPr>
               <w:t>01-BRAND-KIT</w:t>
             </w:r>
@@ -157,7 +157,7 @@
         </w:tc>
         <w:tc>
           <w:tcPr>
-            <w:tcW w:type="dxa" w:w="6264"/>
+            <w:tcW w:type="dxa" w:w="5976"/>
             <w:shd w:val="clear" w:color="auto" w:fill="F4F6F8"/>
           </w:tcPr>
           <w:p>
@@ -169,7 +169,7 @@
                 <w:rFonts w:ascii="Barlow" w:hAnsi="Barlow" w:cs="Barlow"/>
                 <w:b w:val="0"/>
                 <w:i w:val="0"/>
-                <w:sz w:val="16"/>
+                <w:sz w:val="14"/>
               </w:rPr>
               <w:t>ACMEJOB logos, fonts, templates, and brand guide</w:t>
             </w:r>
@@ -179,7 +179,7 @@
       <w:tr>
         <w:tc>
           <w:tcPr>
-            <w:tcW w:type="dxa" w:w="3672"/>
+            <w:tcW w:type="dxa" w:w="3960"/>
           </w:tcPr>
           <w:p>
             <w:pPr>
@@ -190,7 +190,7 @@
                 <w:rFonts w:ascii="Barlow" w:hAnsi="Barlow" w:cs="Barlow"/>
                 <w:b w:val="0"/>
                 <w:i w:val="0"/>
-                <w:sz w:val="16"/>
+                <w:sz w:val="14"/>
               </w:rPr>
               <w:t>02-M01-first-day</w:t>
             </w:r>
@@ -198,7 +198,7 @@
         </w:tc>
         <w:tc>
           <w:tcPr>
-            <w:tcW w:type="dxa" w:w="6264"/>
+            <w:tcW w:type="dxa" w:w="5976"/>
           </w:tcPr>
           <w:p>
             <w:pPr>
@@ -209,7 +209,7 @@
                 <w:rFonts w:ascii="Barlow" w:hAnsi="Barlow" w:cs="Barlow"/>
                 <w:b w:val="0"/>
                 <w:i w:val="0"/>
-                <w:sz w:val="16"/>
+                <w:sz w:val="14"/>
               </w:rPr>
               <w:t>Rules versus learned patterns</w:t>
             </w:r>
@@ -219,7 +219,7 @@
       <w:tr>
         <w:tc>
           <w:tcPr>
-            <w:tcW w:type="dxa" w:w="3672"/>
+            <w:tcW w:type="dxa" w:w="3960"/>
             <w:shd w:val="clear" w:color="auto" w:fill="F4F6F8"/>
           </w:tcPr>
           <w:p>
@@ -231,7 +231,7 @@
                 <w:rFonts w:ascii="Barlow" w:hAnsi="Barlow" w:cs="Barlow"/>
                 <w:b w:val="0"/>
                 <w:i w:val="0"/>
-                <w:sz w:val="16"/>
+                <w:sz w:val="14"/>
               </w:rPr>
               <w:t>03-M02-measurement</w:t>
             </w:r>
@@ -239,7 +239,7 @@
         </w:tc>
         <w:tc>
           <w:tcPr>
-            <w:tcW w:type="dxa" w:w="6264"/>
+            <w:tcW w:type="dxa" w:w="5976"/>
             <w:shd w:val="clear" w:color="auto" w:fill="F4F6F8"/>
           </w:tcPr>
           <w:p>
@@ -251,7 +251,7 @@
                 <w:rFonts w:ascii="Barlow" w:hAnsi="Barlow" w:cs="Barlow"/>
                 <w:b w:val="0"/>
                 <w:i w:val="0"/>
-                <w:sz w:val="16"/>
+                <w:sz w:val="14"/>
               </w:rPr>
               <w:t>Measurement, resolution, uncertainty, and G6</w:t>
             </w:r>
@@ -261,7 +261,7 @@
       <w:tr>
         <w:tc>
           <w:tcPr>
-            <w:tcW w:type="dxa" w:w="3672"/>
+            <w:tcW w:type="dxa" w:w="3960"/>
           </w:tcPr>
           <w:p>
             <w:pPr>
@@ -272,7 +272,7 @@
                 <w:rFonts w:ascii="Barlow" w:hAnsi="Barlow" w:cs="Barlow"/>
                 <w:b w:val="0"/>
                 <w:i w:val="0"/>
-                <w:sz w:val="16"/>
+                <w:sz w:val="14"/>
               </w:rPr>
               <w:t>04-M03-hallucination</w:t>
             </w:r>
@@ -280,7 +280,7 @@
         </w:tc>
         <w:tc>
           <w:tcPr>
-            <w:tcW w:type="dxa" w:w="6264"/>
+            <w:tcW w:type="dxa" w:w="5976"/>
           </w:tcPr>
           <w:p>
             <w:pPr>
@@ -291,7 +291,7 @@
                 <w:rFonts w:ascii="Barlow" w:hAnsi="Barlow" w:cs="Barlow"/>
                 <w:b w:val="0"/>
                 <w:i w:val="0"/>
-                <w:sz w:val="16"/>
+                <w:sz w:val="14"/>
               </w:rPr>
               <w:t>Next-token generation and source checking</w:t>
             </w:r>
@@ -301,7 +301,7 @@
       <w:tr>
         <w:tc>
           <w:tcPr>
-            <w:tcW w:type="dxa" w:w="3672"/>
+            <w:tcW w:type="dxa" w:w="3960"/>
             <w:shd w:val="clear" w:color="auto" w:fill="F4F6F8"/>
           </w:tcPr>
           <w:p>
@@ -313,7 +313,7 @@
                 <w:rFonts w:ascii="Barlow" w:hAnsi="Barlow" w:cs="Barlow"/>
                 <w:b w:val="0"/>
                 <w:i w:val="0"/>
-                <w:sz w:val="16"/>
+                <w:sz w:val="14"/>
               </w:rPr>
               <w:t>05-CHARTS</w:t>
             </w:r>
@@ -321,7 +321,7 @@
         </w:tc>
         <w:tc>
           <w:tcPr>
-            <w:tcW w:type="dxa" w:w="6264"/>
+            <w:tcW w:type="dxa" w:w="5976"/>
             <w:shd w:val="clear" w:color="auto" w:fill="F4F6F8"/>
           </w:tcPr>
           <w:p>
@@ -333,7 +333,7 @@
                 <w:rFonts w:ascii="Barlow" w:hAnsi="Barlow" w:cs="Barlow"/>
                 <w:b w:val="0"/>
                 <w:i w:val="0"/>
-                <w:sz w:val="16"/>
+                <w:sz w:val="14"/>
               </w:rPr>
               <w:t>Reusable meeting-deck charts</w:t>
             </w:r>
@@ -343,7 +343,7 @@
       <w:tr>
         <w:tc>
           <w:tcPr>
-            <w:tcW w:type="dxa" w:w="3672"/>
+            <w:tcW w:type="dxa" w:w="3960"/>
           </w:tcPr>
           <w:p>
             <w:pPr>
@@ -354,7 +354,7 @@
                 <w:rFonts w:ascii="Barlow" w:hAnsi="Barlow" w:cs="Barlow"/>
                 <w:b w:val="0"/>
                 <w:i w:val="0"/>
-                <w:sz w:val="16"/>
+                <w:sz w:val="14"/>
               </w:rPr>
               <w:t>06-BRIDGE</w:t>
             </w:r>
@@ -362,7 +362,7 @@
         </w:tc>
         <w:tc>
           <w:tcPr>
-            <w:tcW w:type="dxa" w:w="6264"/>
+            <w:tcW w:type="dxa" w:w="5976"/>
           </w:tcPr>
           <w:p>
             <w:pPr>
@@ -373,7 +373,7 @@
                 <w:rFonts w:ascii="Barlow" w:hAnsi="Barlow" w:cs="Barlow"/>
                 <w:b w:val="0"/>
                 <w:i w:val="0"/>
-                <w:sz w:val="16"/>
+                <w:sz w:val="14"/>
               </w:rPr>
               <w:t>Reusable bridge illustrations and schematics</w:t>
             </w:r>
@@ -383,7 +383,7 @@
       <w:tr>
         <w:tc>
           <w:tcPr>
-            <w:tcW w:type="dxa" w:w="3672"/>
+            <w:tcW w:type="dxa" w:w="3960"/>
             <w:shd w:val="clear" w:color="auto" w:fill="F4F6F8"/>
           </w:tcPr>
           <w:p>
@@ -395,7 +395,7 @@
                 <w:rFonts w:ascii="Barlow" w:hAnsi="Barlow" w:cs="Barlow"/>
                 <w:b w:val="0"/>
                 <w:i w:val="0"/>
-                <w:sz w:val="16"/>
+                <w:sz w:val="14"/>
               </w:rPr>
               <w:t>07-HW-CASE-B-LIFT-STATION</w:t>
             </w:r>
@@ -403,7 +403,7 @@
         </w:tc>
         <w:tc>
           <w:tcPr>
-            <w:tcW w:type="dxa" w:w="6264"/>
+            <w:tcW w:type="dxa" w:w="5976"/>
             <w:shd w:val="clear" w:color="auto" w:fill="F4F6F8"/>
           </w:tcPr>
           <w:p>
@@ -415,7 +415,7 @@
                 <w:rFonts w:ascii="Barlow" w:hAnsi="Barlow" w:cs="Barlow"/>
                 <w:b w:val="0"/>
                 <w:i w:val="0"/>
-                <w:sz w:val="16"/>
+                <w:sz w:val="14"/>
               </w:rPr>
               <w:t>M02 transfer homework and instructor key</w:t>
             </w:r>
@@ -425,7 +425,7 @@
       <w:tr>
         <w:tc>
           <w:tcPr>
-            <w:tcW w:type="dxa" w:w="3672"/>
+            <w:tcW w:type="dxa" w:w="3960"/>
           </w:tcPr>
           <w:p>
             <w:pPr>
@@ -436,7 +436,7 @@
                 <w:rFonts w:ascii="Barlow" w:hAnsi="Barlow" w:cs="Barlow"/>
                 <w:b w:val="0"/>
                 <w:i w:val="0"/>
-                <w:sz w:val="16"/>
+                <w:sz w:val="14"/>
               </w:rPr>
               <w:t>08-M04-one-number</w:t>
             </w:r>
@@ -444,7 +444,7 @@
         </w:tc>
         <w:tc>
           <w:tcPr>
-            <w:tcW w:type="dxa" w:w="6264"/>
+            <w:tcW w:type="dxa" w:w="5976"/>
           </w:tcPr>
           <w:p>
             <w:pPr>
@@ -455,7 +455,7 @@
                 <w:rFonts w:ascii="Barlow" w:hAnsi="Barlow" w:cs="Barlow"/>
                 <w:b w:val="0"/>
                 <w:i w:val="0"/>
-                <w:sz w:val="16"/>
+                <w:sz w:val="14"/>
               </w:rPr>
               <w:t>Center, spread, CV, low count, and sample scope</w:t>
             </w:r>
@@ -465,7 +465,7 @@
       <w:tr>
         <w:tc>
           <w:tcPr>
-            <w:tcW w:type="dxa" w:w="3672"/>
+            <w:tcW w:type="dxa" w:w="3960"/>
             <w:shd w:val="clear" w:color="auto" w:fill="F4F6F8"/>
           </w:tcPr>
           <w:p>
@@ -477,7 +477,7 @@
                 <w:rFonts w:ascii="Barlow" w:hAnsi="Barlow" w:cs="Barlow"/>
                 <w:b w:val="0"/>
                 <w:i w:val="0"/>
-                <w:sz w:val="16"/>
+                <w:sz w:val="14"/>
               </w:rPr>
               <w:t>09-M05-overnight-alarm</w:t>
             </w:r>
@@ -485,7 +485,7 @@
         </w:tc>
         <w:tc>
           <w:tcPr>
-            <w:tcW w:type="dxa" w:w="6264"/>
+            <w:tcW w:type="dxa" w:w="5976"/>
             <w:shd w:val="clear" w:color="auto" w:fill="F4F6F8"/>
           </w:tcPr>
           <w:p>
@@ -497,7 +497,7 @@
                 <w:rFonts w:ascii="Barlow" w:hAnsi="Barlow" w:cs="Barlow"/>
                 <w:b w:val="0"/>
                 <w:i w:val="0"/>
-                <w:sz w:val="16"/>
+                <w:sz w:val="14"/>
               </w:rPr>
               <w:t>Agent loop, threshold alarm, and unresolved event</w:t>
             </w:r>
@@ -507,7 +507,7 @@
       <w:tr>
         <w:tc>
           <w:tcPr>
-            <w:tcW w:type="dxa" w:w="3672"/>
+            <w:tcW w:type="dxa" w:w="3960"/>
           </w:tcPr>
           <w:p>
             <w:pPr>
@@ -518,7 +518,7 @@
                 <w:rFonts w:ascii="Barlow" w:hAnsi="Barlow" w:cs="Barlow"/>
                 <w:b w:val="0"/>
                 <w:i w:val="0"/>
-                <w:sz w:val="16"/>
+                <w:sz w:val="14"/>
               </w:rPr>
               <w:t>10-M06-alarm-audit</w:t>
             </w:r>
@@ -526,7 +526,7 @@
         </w:tc>
         <w:tc>
           <w:tcPr>
-            <w:tcW w:type="dxa" w:w="6264"/>
+            <w:tcW w:type="dxa" w:w="5976"/>
           </w:tcPr>
           <w:p>
             <w:pPr>
@@ -537,7 +537,7 @@
                 <w:rFonts w:ascii="Barlow" w:hAnsi="Barlow" w:cs="Barlow"/>
                 <w:b w:val="0"/>
                 <w:i w:val="0"/>
-                <w:sz w:val="16"/>
+                <w:sz w:val="14"/>
               </w:rPr>
               <w:t>Distribution audit, traffic corroboration, and Unit 1 handoff</w:t>
             </w:r>
@@ -547,7 +547,7 @@
       <w:tr>
         <w:tc>
           <w:tcPr>
-            <w:tcW w:type="dxa" w:w="3672"/>
+            <w:tcW w:type="dxa" w:w="3960"/>
             <w:shd w:val="clear" w:color="auto" w:fill="F4F6F8"/>
           </w:tcPr>
           <w:p>
@@ -559,7 +559,7 @@
                 <w:rFonts w:ascii="Barlow" w:hAnsi="Barlow" w:cs="Barlow"/>
                 <w:b w:val="0"/>
                 <w:i w:val="0"/>
-                <w:sz w:val="16"/>
+                <w:sz w:val="14"/>
               </w:rPr>
               <w:t>11-M07-training-mismatch</w:t>
             </w:r>
@@ -567,7 +567,7 @@
         </w:tc>
         <w:tc>
           <w:tcPr>
-            <w:tcW w:type="dxa" w:w="6264"/>
+            <w:tcW w:type="dxa" w:w="5976"/>
             <w:shd w:val="clear" w:color="auto" w:fill="F4F6F8"/>
           </w:tcPr>
           <w:p>
@@ -579,9 +579,131 @@
                 <w:rFonts w:ascii="Barlow" w:hAnsi="Barlow" w:cs="Barlow"/>
                 <w:b w:val="0"/>
                 <w:i w:val="0"/>
-                <w:sz w:val="16"/>
+                <w:sz w:val="14"/>
               </w:rPr>
-              <w:t>Training bias, distribution shift, out-of-domain use, and Unit 2 note v2</w:t>
+              <w:t>Training bias, distribution shift, and Unit 2 note v2</w:t>
+            </w:r>
+          </w:p>
+        </w:tc>
+      </w:tr>
+      <w:tr>
+        <w:tc>
+          <w:tcPr>
+            <w:tcW w:type="dxa" w:w="3960"/>
+          </w:tcPr>
+          <w:p>
+            <w:pPr>
+              <w:spacing w:before="20" w:after="20" w:line="252" w:lineRule="auto"/>
+            </w:pPr>
+            <w:r>
+              <w:rPr>
+                <w:rFonts w:ascii="Barlow" w:hAnsi="Barlow" w:cs="Barlow"/>
+                <w:b w:val="0"/>
+                <w:i w:val="0"/>
+                <w:sz w:val="14"/>
+              </w:rPr>
+              <w:t>12-M08-spurious-correlation</w:t>
+            </w:r>
+          </w:p>
+        </w:tc>
+        <w:tc>
+          <w:tcPr>
+            <w:tcW w:type="dxa" w:w="5976"/>
+          </w:tcPr>
+          <w:p>
+            <w:pPr>
+              <w:spacing w:before="20" w:after="20" w:line="252" w:lineRule="auto"/>
+            </w:pPr>
+            <w:r>
+              <w:rPr>
+                <w:rFonts w:ascii="Barlow" w:hAnsi="Barlow" w:cs="Barlow"/>
+                <w:b w:val="0"/>
+                <w:i w:val="0"/>
+                <w:sz w:val="14"/>
+              </w:rPr>
+              <w:t>Correlation, regression, thermal confound, and HW4</w:t>
+            </w:r>
+          </w:p>
+        </w:tc>
+      </w:tr>
+      <w:tr>
+        <w:tc>
+          <w:tcPr>
+            <w:tcW w:type="dxa" w:w="3960"/>
+            <w:shd w:val="clear" w:color="auto" w:fill="F4F6F8"/>
+          </w:tcPr>
+          <w:p>
+            <w:pPr>
+              <w:spacing w:before="20" w:after="20" w:line="252" w:lineRule="auto"/>
+            </w:pPr>
+            <w:r>
+              <w:rPr>
+                <w:rFonts w:ascii="Barlow" w:hAnsi="Barlow" w:cs="Barlow"/>
+                <w:b w:val="0"/>
+                <w:i w:val="0"/>
+                <w:sz w:val="14"/>
+              </w:rPr>
+              <w:t>13-M09-false-precision</w:t>
+            </w:r>
+          </w:p>
+        </w:tc>
+        <w:tc>
+          <w:tcPr>
+            <w:tcW w:type="dxa" w:w="5976"/>
+            <w:shd w:val="clear" w:color="auto" w:fill="F4F6F8"/>
+          </w:tcPr>
+          <w:p>
+            <w:pPr>
+              <w:spacing w:before="20" w:after="20" w:line="252" w:lineRule="auto"/>
+            </w:pPr>
+            <w:r>
+              <w:rPr>
+                <w:rFonts w:ascii="Barlow" w:hAnsi="Barlow" w:cs="Barlow"/>
+                <w:b w:val="0"/>
+                <w:i w:val="0"/>
+                <w:sz w:val="14"/>
+              </w:rPr>
+              <w:t>Overconfidence, false precision, sampling, and sample scope</w:t>
+            </w:r>
+          </w:p>
+        </w:tc>
+      </w:tr>
+      <w:tr>
+        <w:tc>
+          <w:tcPr>
+            <w:tcW w:type="dxa" w:w="3960"/>
+          </w:tcPr>
+          <w:p>
+            <w:pPr>
+              <w:spacing w:before="20" w:after="20" w:line="252" w:lineRule="auto"/>
+            </w:pPr>
+            <w:r>
+              <w:rPr>
+                <w:rFonts w:ascii="Barlow" w:hAnsi="Barlow" w:cs="Barlow"/>
+                <w:b w:val="0"/>
+                <w:i w:val="0"/>
+                <w:sz w:val="14"/>
+              </w:rPr>
+              <w:t>14-M10-deterioration-v-noise</w:t>
+            </w:r>
+          </w:p>
+        </w:tc>
+        <w:tc>
+          <w:tcPr>
+            <w:tcW w:type="dxa" w:w="5976"/>
+          </w:tcPr>
+          <w:p>
+            <w:pPr>
+              <w:spacing w:before="20" w:after="20" w:line="252" w:lineRule="auto"/>
+            </w:pPr>
+            <w:r>
+              <w:rPr>
+                <w:rFonts w:ascii="Barlow" w:hAnsi="Barlow" w:cs="Barlow"/>
+                <w:b w:val="0"/>
+                <w:i w:val="0"/>
+                <w:sz w:val="14"/>
+              </w:rPr>
+              <w:t>Paired intervals, signal/noise audit, and HW5 callback</w:t>
             </w:r>
           </w:p>
         </w:tc>
@@ -601,7 +723,7 @@
           <w:caps w:val="1"/>
           <w:spacing w:val="12"/>
         </w:rPr>
-        <w:t>11-M07-training-mismatch</w:t>
+        <w:t>14-M10-deterioration-v-noise</w:t>
       </w:r>
     </w:p>
     <w:tbl>
@@ -638,7 +760,7 @@
                 <w:b/>
                 <w:i w:val="0"/>
                 <w:color w:val="FFFFFF"/>
-                <w:sz w:val="16"/>
+                <w:sz w:val="14"/>
               </w:rPr>
               <w:t>File</w:t>
             </w:r>
@@ -659,7 +781,7 @@
                 <w:b/>
                 <w:i w:val="0"/>
                 <w:color w:val="FFFFFF"/>
-                <w:sz w:val="16"/>
+                <w:sz w:val="14"/>
               </w:rPr>
               <w:t>What it is</w:t>
             </w:r>
@@ -680,9 +802,9 @@
                 <w:rFonts w:ascii="Barlow" w:hAnsi="Barlow" w:cs="Barlow"/>
                 <w:b w:val="0"/>
                 <w:i w:val="0"/>
-                <w:sz w:val="16"/>
+                <w:sz w:val="14"/>
               </w:rPr>
-              <w:t>M07-student.pptx</w:t>
+              <w:t>M10-student.pptx</w:t>
             </w:r>
           </w:p>
         </w:tc>
@@ -699,9 +821,9 @@
                 <w:rFonts w:ascii="Barlow" w:hAnsi="Barlow" w:cs="Barlow"/>
                 <w:b w:val="0"/>
                 <w:i w:val="0"/>
-                <w:sz w:val="16"/>
+                <w:sz w:val="14"/>
               </w:rPr>
-              <w:t>Spoiler-safe concept and hunt deck with approved Oli SAY in notes</w:t>
+              <w:t>Spoiler-safe concepts and interval hunt; SAY placeholders</w:t>
             </w:r>
           </w:p>
         </w:tc>
@@ -721,9 +843,9 @@
                 <w:rFonts w:ascii="Barlow" w:hAnsi="Barlow" w:cs="Barlow"/>
                 <w:b w:val="0"/>
                 <w:i w:val="0"/>
-                <w:sz w:val="16"/>
+                <w:sz w:val="14"/>
               </w:rPr>
-              <w:t>M07-instructor-reveal.pptx</w:t>
+              <w:t>M10-instructor-reveal.pptx</w:t>
             </w:r>
           </w:p>
         </w:tc>
@@ -741,9 +863,9 @@
                 <w:rFonts w:ascii="Barlow" w:hAnsi="Barlow" w:cs="Barlow"/>
                 <w:b w:val="0"/>
                 <w:i w:val="0"/>
-                <w:sz w:val="16"/>
+                <w:sz w:val="14"/>
               </w:rPr>
-              <w:t>Gated coverage conclusion and bounded action</w:t>
+              <w:t>Gated 95%/99% comparison and bounded claim</w:t>
             </w:r>
           </w:p>
         </w:tc>
@@ -762,9 +884,9 @@
                 <w:rFonts w:ascii="Barlow" w:hAnsi="Barlow" w:cs="Barlow"/>
                 <w:b w:val="0"/>
                 <w:i w:val="0"/>
-                <w:sz w:val="16"/>
+                <w:sz w:val="14"/>
               </w:rPr>
-              <w:t>H7-01-vendor-training-summary.docx</w:t>
+              <w:t>FOREMAN-M10-deterioration-claim.docx</w:t>
             </w:r>
           </w:p>
         </w:tc>
@@ -781,9 +903,9 @@
                 <w:rFonts w:ascii="Barlow" w:hAnsi="Barlow" w:cs="Barlow"/>
                 <w:b w:val="0"/>
                 <w:i w:val="0"/>
-                <w:sz w:val="16"/>
+                <w:sz w:val="14"/>
               </w:rPr>
-              <w:t>Highway-girder / warm-state training coverage</w:t>
+              <w:t>Designed p-value and significance overclaim</w:t>
             </w:r>
           </w:p>
         </w:tc>
@@ -803,9 +925,9 @@
                 <w:rFonts w:ascii="Barlow" w:hAnsi="Barlow" w:cs="Barlow"/>
                 <w:b w:val="0"/>
                 <w:i w:val="0"/>
-                <w:sz w:val="16"/>
+                <w:sz w:val="14"/>
               </w:rPr>
-              <w:t>H7-02-Otter-Bend-site-and-exposure.docx</w:t>
+              <w:t>H10-01-coupon-interval-warmup.docx</w:t>
             </w:r>
           </w:p>
         </w:tc>
@@ -823,9 +945,9 @@
                 <w:rFonts w:ascii="Barlow" w:hAnsi="Barlow" w:cs="Barlow"/>
                 <w:b w:val="0"/>
                 <w:i w:val="0"/>
-                <w:sz w:val="16"/>
+                <w:sz w:val="14"/>
               </w:rPr>
-              <w:t>Lift machinery, freeze–thaw, and road-salt deployment conditions</w:t>
+              <w:t>Six-coupon guided t interval</w:t>
             </w:r>
           </w:p>
         </w:tc>
@@ -844,9 +966,9 @@
                 <w:rFonts w:ascii="Barlow" w:hAnsi="Barlow" w:cs="Barlow"/>
                 <w:b w:val="0"/>
                 <w:i w:val="0"/>
-                <w:sz w:val="16"/>
+                <w:sz w:val="14"/>
               </w:rPr>
-              <w:t>H7-03-inspection-photo-set.docx</w:t>
+              <w:t>H10-02-paired-load-test-guide.docx</w:t>
             </w:r>
           </w:p>
         </w:tc>
@@ -863,9 +985,9 @@
                 <w:rFonts w:ascii="Barlow" w:hAnsi="Barlow" w:cs="Barlow"/>
                 <w:b w:val="0"/>
                 <w:i w:val="0"/>
-                <w:sz w:val="16"/>
+                <w:sz w:val="14"/>
               </w:rPr>
-              <w:t>Twelve simulated field-image records</w:t>
+              <w:t>Data dictionary and measurement/process-noise audit</w:t>
             </w:r>
           </w:p>
         </w:tc>
@@ -885,9 +1007,9 @@
                 <w:rFonts w:ascii="Barlow" w:hAnsi="Barlow" w:cs="Barlow"/>
                 <w:b w:val="0"/>
                 <w:i w:val="0"/>
-                <w:sz w:val="16"/>
+                <w:sz w:val="14"/>
               </w:rPr>
-              <w:t>H7-04-confidence-score-log.docx</w:t>
+              <w:t>H10-03-signal-v-noise-worksheet.docx</w:t>
             </w:r>
           </w:p>
         </w:tc>
@@ -905,9 +1027,9 @@
                 <w:rFonts w:ascii="Barlow" w:hAnsi="Barlow" w:cs="Barlow"/>
                 <w:b w:val="0"/>
                 <w:i w:val="0"/>
-                <w:sz w:val="16"/>
+                <w:sz w:val="14"/>
               </w:rPr>
-              <w:t>Clean / high-confidence ratings across all 12 records</w:t>
+              <w:t>Paired-change interval worksheet</w:t>
             </w:r>
           </w:p>
         </w:tc>
@@ -926,9 +1048,9 @@
                 <w:rFonts w:ascii="Barlow" w:hAnsi="Barlow" w:cs="Barlow"/>
                 <w:b w:val="0"/>
                 <w:i w:val="0"/>
-                <w:sz w:val="16"/>
+                <w:sz w:val="14"/>
               </w:rPr>
-              <w:t>H7-05-training-to-deployment-audit.docx</w:t>
+              <w:t>H10-04-concepts-and-language.docx</w:t>
             </w:r>
           </w:p>
         </w:tc>
@@ -945,9 +1067,9 @@
                 <w:rFonts w:ascii="Barlow" w:hAnsi="Barlow" w:cs="Barlow"/>
                 <w:b w:val="0"/>
                 <w:i w:val="0"/>
-                <w:sz w:val="16"/>
+                <w:sz w:val="14"/>
               </w:rPr>
-              <w:t>Student comparison and recommendation worksheet</w:t>
+              <w:t>Five concept definitions and safe language</w:t>
             </w:r>
           </w:p>
         </w:tc>
@@ -967,9 +1089,9 @@
                 <w:rFonts w:ascii="Barlow" w:hAnsi="Barlow" w:cs="Barlow"/>
                 <w:b w:val="0"/>
                 <w:i w:val="0"/>
-                <w:sz w:val="16"/>
+                <w:sz w:val="14"/>
               </w:rPr>
-              <w:t>H7-06-note-v2-and-decision-log.docx</w:t>
+              <w:t>H10-05-HW5-peak-strain-interval.docx</w:t>
             </w:r>
           </w:p>
         </w:tc>
@@ -987,9 +1109,9 @@
                 <w:rFonts w:ascii="Barlow" w:hAnsi="Barlow" w:cs="Barlow"/>
                 <w:b w:val="0"/>
                 <w:i w:val="0"/>
-                <w:sz w:val="16"/>
+                <w:sz w:val="14"/>
               </w:rPr>
-              <w:t>Claim/check/result record and project-hour choices</w:t>
+              <w:t>Duplicate-timestamp callback assignment</w:t>
             </w:r>
           </w:p>
         </w:tc>
@@ -1008,9 +1130,9 @@
                 <w:rFonts w:ascii="Barlow" w:hAnsi="Barlow" w:cs="Barlow"/>
                 <w:b w:val="0"/>
                 <w:i w:val="0"/>
-                <w:sz w:val="16"/>
+                <w:sz w:val="14"/>
               </w:rPr>
-              <w:t>FOREMAN-M07-damage-screen.docx</w:t>
+              <w:t>H10-06-note-v2-and-decision-log.docx</w:t>
             </w:r>
           </w:p>
         </w:tc>
@@ -1027,9 +1149,9 @@
                 <w:rFonts w:ascii="Barlow" w:hAnsi="Barlow" w:cs="Barlow"/>
                 <w:b w:val="0"/>
                 <w:i w:val="0"/>
-                <w:sz w:val="16"/>
+                <w:sz w:val="14"/>
               </w:rPr>
-              <w:t>Confident all-clear across fixed and moving components</w:t>
+              <w:t>Claim/check/result with interval</w:t>
             </w:r>
           </w:p>
         </w:tc>
@@ -1049,9 +1171,9 @@
                 <w:rFonts w:ascii="Barlow" w:hAnsi="Barlow" w:cs="Barlow"/>
                 <w:b w:val="0"/>
                 <w:i w:val="0"/>
-                <w:sz w:val="16"/>
+                <w:sz w:val="14"/>
               </w:rPr>
-              <w:t>WES-M07-accepted-screen-memo.docx</w:t>
+              <w:t>coupons.csv + loadtest_2019_2027.csv</w:t>
             </w:r>
           </w:p>
         </w:tc>
@@ -1069,9 +1191,9 @@
                 <w:rFonts w:ascii="Barlow" w:hAnsi="Barlow" w:cs="Barlow"/>
                 <w:b w:val="0"/>
                 <w:i w:val="0"/>
-                <w:sz w:val="16"/>
+                <w:sz w:val="14"/>
               </w:rPr>
-              <w:t>Liability-color seed inside M13's existing messy handoff</w:t>
+              <w:t>Warm-up and pass-level source data</w:t>
             </w:r>
           </w:p>
         </w:tc>
@@ -1090,9 +1212,9 @@
                 <w:rFonts w:ascii="Barlow" w:hAnsi="Barlow" w:cs="Barlow"/>
                 <w:b w:val="0"/>
                 <w:i w:val="0"/>
-                <w:sz w:val="16"/>
+                <w:sz w:val="14"/>
               </w:rPr>
-              <w:t>M07-inspection-inventory-and-output.csv</w:t>
+              <w:t>M10-paired-location-summary.csv</w:t>
             </w:r>
           </w:p>
         </w:tc>
@@ -1109,9 +1231,9 @@
                 <w:rFonts w:ascii="Barlow" w:hAnsi="Barlow" w:cs="Barlow"/>
                 <w:b w:val="0"/>
                 <w:i w:val="0"/>
-                <w:sz w:val="16"/>
+                <w:sz w:val="14"/>
               </w:rPr>
-              <w:t>Twelve image records and FOREMAN outputs</w:t>
+              <w:t>Eight paired location means and repeatability SD</w:t>
             </w:r>
           </w:p>
         </w:tc>
@@ -1131,9 +1253,9 @@
                 <w:rFonts w:ascii="Barlow" w:hAnsi="Barlow" w:cs="Barlow"/>
                 <w:b w:val="0"/>
                 <w:i w:val="0"/>
-                <w:sz w:val="16"/>
+                <w:sz w:val="14"/>
               </w:rPr>
-              <w:t>KEY-M07-answer-key.docx</w:t>
+              <w:t>M10-interval-summary.csv</w:t>
             </w:r>
           </w:p>
         </w:tc>
@@ -1151,9 +1273,9 @@
                 <w:rFonts w:ascii="Barlow" w:hAnsi="Barlow" w:cs="Barlow"/>
                 <w:b w:val="0"/>
                 <w:i w:val="0"/>
-                <w:sz w:val="16"/>
+                <w:sz w:val="14"/>
               </w:rPr>
-              <w:t>Instructor-only applicability conclusion</w:t>
+              <w:t>Deterministic 95% and 99% calculations</w:t>
             </w:r>
           </w:p>
         </w:tc>
@@ -1172,9 +1294,9 @@
                 <w:rFonts w:ascii="Barlow" w:hAnsi="Barlow" w:cs="Barlow"/>
                 <w:b w:val="0"/>
                 <w:i w:val="0"/>
-                <w:sz w:val="16"/>
+                <w:sz w:val="14"/>
               </w:rPr>
-              <w:t>../00-INSTRUCTOR/source-notes/M07-story-SAY.md</w:t>
+              <w:t>M10-test-control-check.csv</w:t>
             </w:r>
           </w:p>
         </w:tc>
@@ -1191,9 +1313,91 @@
                 <w:rFonts w:ascii="Barlow" w:hAnsi="Barlow" w:cs="Barlow"/>
                 <w:b w:val="0"/>
                 <w:i w:val="0"/>
-                <w:sz w:val="16"/>
+                <w:sz w:val="14"/>
               </w:rPr>
-              <w:t>Cloud-approved canon SAY source</w:t>
+              <w:t>Matched process-control record</w:t>
+            </w:r>
+          </w:p>
+        </w:tc>
+      </w:tr>
+      <w:tr>
+        <w:tc>
+          <w:tcPr>
+            <w:tcW w:type="dxa" w:w="4608"/>
+            <w:shd w:val="clear" w:color="auto" w:fill="F4F6F8"/>
+          </w:tcPr>
+          <w:p>
+            <w:pPr>
+              <w:spacing w:before="20" w:after="20" w:line="252" w:lineRule="auto"/>
+            </w:pPr>
+            <w:r>
+              <w:rPr>
+                <w:rFonts w:ascii="Barlow" w:hAnsi="Barlow" w:cs="Barlow"/>
+                <w:b w:val="0"/>
+                <w:i w:val="0"/>
+                <w:sz w:val="14"/>
+              </w:rPr>
+              <w:t>KEY-M10-answer-key.docx</w:t>
+            </w:r>
+          </w:p>
+        </w:tc>
+        <w:tc>
+          <w:tcPr>
+            <w:tcW w:type="dxa" w:w="5328"/>
+            <w:shd w:val="clear" w:color="auto" w:fill="F4F6F8"/>
+          </w:tcPr>
+          <w:p>
+            <w:pPr>
+              <w:spacing w:before="20" w:after="20" w:line="252" w:lineRule="auto"/>
+            </w:pPr>
+            <w:r>
+              <w:rPr>
+                <w:rFonts w:ascii="Barlow" w:hAnsi="Barlow" w:cs="Barlow"/>
+                <w:b w:val="0"/>
+                <w:i w:val="0"/>
+                <w:sz w:val="14"/>
+              </w:rPr>
+              <w:t>Instructor-only calculations and boundaries</w:t>
+            </w:r>
+          </w:p>
+        </w:tc>
+      </w:tr>
+      <w:tr>
+        <w:tc>
+          <w:tcPr>
+            <w:tcW w:type="dxa" w:w="4608"/>
+          </w:tcPr>
+          <w:p>
+            <w:pPr>
+              <w:spacing w:before="20" w:after="20" w:line="252" w:lineRule="auto"/>
+            </w:pPr>
+            <w:r>
+              <w:rPr>
+                <w:rFonts w:ascii="Barlow" w:hAnsi="Barlow" w:cs="Barlow"/>
+                <w:b w:val="0"/>
+                <w:i w:val="0"/>
+                <w:sz w:val="14"/>
+              </w:rPr>
+              <w:t>../00-INSTRUCTOR/source-notes/M10-story-SAY.md</w:t>
+            </w:r>
+          </w:p>
+        </w:tc>
+        <w:tc>
+          <w:tcPr>
+            <w:tcW w:type="dxa" w:w="5328"/>
+          </w:tcPr>
+          <w:p>
+            <w:pPr>
+              <w:spacing w:before="20" w:after="20" w:line="252" w:lineRule="auto"/>
+            </w:pPr>
+            <w:r>
+              <w:rPr>
+                <w:rFonts w:ascii="Barlow" w:hAnsi="Barlow" w:cs="Barlow"/>
+                <w:b w:val="0"/>
+                <w:i w:val="0"/>
+                <w:sz w:val="14"/>
+              </w:rPr>
+              <w:t>Placeholder scaffold; replace only after Cloud PASS</w:t>
             </w:r>
           </w:p>
         </w:tc>
@@ -1229,7 +1433,7 @@
         <w:color w:val="6B7280"/>
         <w:sz w:val="16"/>
       </w:rPr>
-      <w:t>SEIS 201  ·  M01 – M07</w:t>
+      <w:t>SEIS 201  ·  M01 – M10</w:t>
     </w:r>
     <w:r>
       <w:tab/>
@@ -1302,7 +1506,7 @@
         <w:caps w:val="1"/>
         <w:spacing w:val="20"/>
       </w:rPr>
-      <w:t>M01 – M07  ·  FILE INDEX</w:t>
+      <w:t>M01 – M10  ·  FILE INDEX</w:t>
     </w:r>
   </w:p>
 </w:hdr>

</xml_diff>

<commit_message>
Fold Cloud-PASS M09 SAY
Co-authored-by: shaseaver25 <shannon@tailoredu.org>
</commit_message>
<xml_diff>
--- a/teaching-pack/00-INSTRUCTOR/FILE-INDEX.docx
+++ b/teaching-pack/00-INSTRUCTOR/FILE-INDEX.docx
@@ -783,7 +783,7 @@
                 <w:i w:val="0"/>
                 <w:sz w:val="14"/>
               </w:rPr>
-              <w:t>Spoiler-safe precision and sampling deck; SAY placeholders on HOLD</w:t>
+              <w:t>Spoiler-safe precision and sampling deck with Cloud-PASS Oli SAY</w:t>
             </w:r>
           </w:p>
         </w:tc>
@@ -1338,7 +1338,7 @@
                 <w:i w:val="0"/>
                 <w:sz w:val="14"/>
               </w:rPr>
-              <w:t>../00-INSTRUCTOR/source-notes/M09-story-SAY-PENDING.md</w:t>
+              <w:t>../00-INSTRUCTOR/source-notes/M09-story-SAY.md</w:t>
             </w:r>
           </w:p>
         </w:tc>
@@ -1357,7 +1357,7 @@
                 <w:i w:val="0"/>
                 <w:sz w:val="14"/>
               </w:rPr>
-              <w:t>Re-check intake and placeholder boundaries; not canon SAY</w:t>
+              <w:t>Cloud re-check PASS canon SAY with repaired Inbox timing</w:t>
             </w:r>
           </w:p>
         </w:tc>

</xml_diff>

<commit_message>
Regenerate M10 artifacts with approved SAY
Co-authored-by: shaseaver25 <shannon@tailoredu.org>
</commit_message>
<xml_diff>
--- a/teaching-pack/00-INSTRUCTOR/FILE-INDEX.docx
+++ b/teaching-pack/00-INSTRUCTOR/FILE-INDEX.docx
@@ -823,7 +823,7 @@
                 <w:i w:val="0"/>
                 <w:sz w:val="14"/>
               </w:rPr>
-              <w:t>Spoiler-safe concepts and interval hunt; SAY placeholders</w:t>
+              <w:t>Spoiler-safe concepts and interval hunt with Cloud-PASS canon SAY</w:t>
             </w:r>
           </w:p>
         </w:tc>
@@ -1397,7 +1397,7 @@
                 <w:i w:val="0"/>
                 <w:sz w:val="14"/>
               </w:rPr>
-              <w:t>Placeholder scaffold; replace only after Cloud PASS</w:t>
+              <w:t>Revised M10 Cloud-PASS canon story and SAY source</w:t>
             </w:r>
           </w:p>
         </w:tc>

</xml_diff>

<commit_message>
Build M11 dashboard publish checkpoint
Co-authored-by: shaseaver25 <shannon@tailoredu.org>
</commit_message>
<xml_diff>
--- a/teaching-pack/00-INSTRUCTOR/FILE-INDEX.docx
+++ b/teaching-pack/00-INSTRUCTOR/FILE-INDEX.docx
@@ -29,7 +29,7 @@
           <w:color w:val="6B7280"/>
           <w:sz w:val="18"/>
         </w:rPr>
-        <w:t>Folders are in teaching order. M10 is folder 14 after the M09 pack and separates a small paired deterioration signal from measurement, process, and sampling noise.</w:t>
+        <w:t>Folders are numbered in teaching order. M11 is folder 15 so it follows the M09 and M10 packs without renumbering.</w:t>
       </w:r>
     </w:p>
     <w:tbl>
@@ -53,7 +53,7 @@
       <w:tr>
         <w:tc>
           <w:tcPr>
-            <w:tcW w:type="dxa" w:w="3960"/>
+            <w:tcW w:type="dxa" w:w="3888"/>
             <w:shd w:val="clear" w:color="auto" w:fill="1F3A5F"/>
           </w:tcPr>
           <w:p>
@@ -66,7 +66,7 @@
                 <w:b/>
                 <w:i w:val="0"/>
                 <w:color w:val="FFFFFF"/>
-                <w:sz w:val="14"/>
+                <w:sz w:val="15"/>
               </w:rPr>
               <w:t>Folder</w:t>
             </w:r>
@@ -74,7 +74,7 @@
         </w:tc>
         <w:tc>
           <w:tcPr>
-            <w:tcW w:type="dxa" w:w="5976"/>
+            <w:tcW w:type="dxa" w:w="6048"/>
             <w:shd w:val="clear" w:color="auto" w:fill="1F3A5F"/>
           </w:tcPr>
           <w:p>
@@ -87,7 +87,7 @@
                 <w:b/>
                 <w:i w:val="0"/>
                 <w:color w:val="FFFFFF"/>
-                <w:sz w:val="14"/>
+                <w:sz w:val="15"/>
               </w:rPr>
               <w:t>Purpose</w:t>
             </w:r>
@@ -97,7 +97,7 @@
       <w:tr>
         <w:tc>
           <w:tcPr>
-            <w:tcW w:type="dxa" w:w="3960"/>
+            <w:tcW w:type="dxa" w:w="3888"/>
           </w:tcPr>
           <w:p>
             <w:pPr>
@@ -108,7 +108,7 @@
                 <w:rFonts w:ascii="Barlow" w:hAnsi="Barlow" w:cs="Barlow"/>
                 <w:b w:val="0"/>
                 <w:i w:val="0"/>
-                <w:sz w:val="14"/>
+                <w:sz w:val="15"/>
               </w:rPr>
               <w:t>00-INSTRUCTOR</w:t>
             </w:r>
@@ -116,7 +116,7 @@
         </w:tc>
         <w:tc>
           <w:tcPr>
-            <w:tcW w:type="dxa" w:w="5976"/>
+            <w:tcW w:type="dxa" w:w="6048"/>
           </w:tcPr>
           <w:p>
             <w:pPr>
@@ -127,7 +127,7 @@
                 <w:rFonts w:ascii="Barlow" w:hAnsi="Barlow" w:cs="Barlow"/>
                 <w:b w:val="0"/>
                 <w:i w:val="0"/>
-                <w:sz w:val="14"/>
+                <w:sz w:val="15"/>
               </w:rPr>
               <w:t>Run-of-day desk, faculty brief, source SAY notes, and this index</w:t>
             </w:r>
@@ -137,7 +137,7 @@
       <w:tr>
         <w:tc>
           <w:tcPr>
-            <w:tcW w:type="dxa" w:w="3960"/>
+            <w:tcW w:type="dxa" w:w="3888"/>
             <w:shd w:val="clear" w:color="auto" w:fill="F4F6F8"/>
           </w:tcPr>
           <w:p>
@@ -149,7 +149,7 @@
                 <w:rFonts w:ascii="Barlow" w:hAnsi="Barlow" w:cs="Barlow"/>
                 <w:b w:val="0"/>
                 <w:i w:val="0"/>
-                <w:sz w:val="14"/>
+                <w:sz w:val="15"/>
               </w:rPr>
               <w:t>01-BRAND-KIT</w:t>
             </w:r>
@@ -157,7 +157,7 @@
         </w:tc>
         <w:tc>
           <w:tcPr>
-            <w:tcW w:type="dxa" w:w="5976"/>
+            <w:tcW w:type="dxa" w:w="6048"/>
             <w:shd w:val="clear" w:color="auto" w:fill="F4F6F8"/>
           </w:tcPr>
           <w:p>
@@ -169,7 +169,7 @@
                 <w:rFonts w:ascii="Barlow" w:hAnsi="Barlow" w:cs="Barlow"/>
                 <w:b w:val="0"/>
                 <w:i w:val="0"/>
-                <w:sz w:val="14"/>
+                <w:sz w:val="15"/>
               </w:rPr>
               <w:t>ACMEJOB logos, fonts, templates, and brand guide</w:t>
             </w:r>
@@ -179,7 +179,7 @@
       <w:tr>
         <w:tc>
           <w:tcPr>
-            <w:tcW w:type="dxa" w:w="3960"/>
+            <w:tcW w:type="dxa" w:w="3888"/>
           </w:tcPr>
           <w:p>
             <w:pPr>
@@ -190,7 +190,7 @@
                 <w:rFonts w:ascii="Barlow" w:hAnsi="Barlow" w:cs="Barlow"/>
                 <w:b w:val="0"/>
                 <w:i w:val="0"/>
-                <w:sz w:val="14"/>
+                <w:sz w:val="15"/>
               </w:rPr>
               <w:t>02-M01-first-day</w:t>
             </w:r>
@@ -198,7 +198,7 @@
         </w:tc>
         <w:tc>
           <w:tcPr>
-            <w:tcW w:type="dxa" w:w="5976"/>
+            <w:tcW w:type="dxa" w:w="6048"/>
           </w:tcPr>
           <w:p>
             <w:pPr>
@@ -209,7 +209,7 @@
                 <w:rFonts w:ascii="Barlow" w:hAnsi="Barlow" w:cs="Barlow"/>
                 <w:b w:val="0"/>
                 <w:i w:val="0"/>
-                <w:sz w:val="14"/>
+                <w:sz w:val="15"/>
               </w:rPr>
               <w:t>Rules versus learned patterns</w:t>
             </w:r>
@@ -219,7 +219,7 @@
       <w:tr>
         <w:tc>
           <w:tcPr>
-            <w:tcW w:type="dxa" w:w="3960"/>
+            <w:tcW w:type="dxa" w:w="3888"/>
             <w:shd w:val="clear" w:color="auto" w:fill="F4F6F8"/>
           </w:tcPr>
           <w:p>
@@ -231,7 +231,7 @@
                 <w:rFonts w:ascii="Barlow" w:hAnsi="Barlow" w:cs="Barlow"/>
                 <w:b w:val="0"/>
                 <w:i w:val="0"/>
-                <w:sz w:val="14"/>
+                <w:sz w:val="15"/>
               </w:rPr>
               <w:t>03-M02-measurement</w:t>
             </w:r>
@@ -239,7 +239,7 @@
         </w:tc>
         <w:tc>
           <w:tcPr>
-            <w:tcW w:type="dxa" w:w="5976"/>
+            <w:tcW w:type="dxa" w:w="6048"/>
             <w:shd w:val="clear" w:color="auto" w:fill="F4F6F8"/>
           </w:tcPr>
           <w:p>
@@ -251,7 +251,7 @@
                 <w:rFonts w:ascii="Barlow" w:hAnsi="Barlow" w:cs="Barlow"/>
                 <w:b w:val="0"/>
                 <w:i w:val="0"/>
-                <w:sz w:val="14"/>
+                <w:sz w:val="15"/>
               </w:rPr>
               <w:t>Measurement, resolution, uncertainty, and G6</w:t>
             </w:r>
@@ -261,7 +261,7 @@
       <w:tr>
         <w:tc>
           <w:tcPr>
-            <w:tcW w:type="dxa" w:w="3960"/>
+            <w:tcW w:type="dxa" w:w="3888"/>
           </w:tcPr>
           <w:p>
             <w:pPr>
@@ -272,7 +272,7 @@
                 <w:rFonts w:ascii="Barlow" w:hAnsi="Barlow" w:cs="Barlow"/>
                 <w:b w:val="0"/>
                 <w:i w:val="0"/>
-                <w:sz w:val="14"/>
+                <w:sz w:val="15"/>
               </w:rPr>
               <w:t>04-M03-hallucination</w:t>
             </w:r>
@@ -280,7 +280,7 @@
         </w:tc>
         <w:tc>
           <w:tcPr>
-            <w:tcW w:type="dxa" w:w="5976"/>
+            <w:tcW w:type="dxa" w:w="6048"/>
           </w:tcPr>
           <w:p>
             <w:pPr>
@@ -291,7 +291,7 @@
                 <w:rFonts w:ascii="Barlow" w:hAnsi="Barlow" w:cs="Barlow"/>
                 <w:b w:val="0"/>
                 <w:i w:val="0"/>
-                <w:sz w:val="14"/>
+                <w:sz w:val="15"/>
               </w:rPr>
               <w:t>Next-token generation and source checking</w:t>
             </w:r>
@@ -301,7 +301,7 @@
       <w:tr>
         <w:tc>
           <w:tcPr>
-            <w:tcW w:type="dxa" w:w="3960"/>
+            <w:tcW w:type="dxa" w:w="3888"/>
             <w:shd w:val="clear" w:color="auto" w:fill="F4F6F8"/>
           </w:tcPr>
           <w:p>
@@ -313,7 +313,7 @@
                 <w:rFonts w:ascii="Barlow" w:hAnsi="Barlow" w:cs="Barlow"/>
                 <w:b w:val="0"/>
                 <w:i w:val="0"/>
-                <w:sz w:val="14"/>
+                <w:sz w:val="15"/>
               </w:rPr>
               <w:t>05-CHARTS</w:t>
             </w:r>
@@ -321,7 +321,7 @@
         </w:tc>
         <w:tc>
           <w:tcPr>
-            <w:tcW w:type="dxa" w:w="5976"/>
+            <w:tcW w:type="dxa" w:w="6048"/>
             <w:shd w:val="clear" w:color="auto" w:fill="F4F6F8"/>
           </w:tcPr>
           <w:p>
@@ -333,7 +333,7 @@
                 <w:rFonts w:ascii="Barlow" w:hAnsi="Barlow" w:cs="Barlow"/>
                 <w:b w:val="0"/>
                 <w:i w:val="0"/>
-                <w:sz w:val="14"/>
+                <w:sz w:val="15"/>
               </w:rPr>
               <w:t>Reusable meeting-deck charts</w:t>
             </w:r>
@@ -343,7 +343,7 @@
       <w:tr>
         <w:tc>
           <w:tcPr>
-            <w:tcW w:type="dxa" w:w="3960"/>
+            <w:tcW w:type="dxa" w:w="3888"/>
           </w:tcPr>
           <w:p>
             <w:pPr>
@@ -354,7 +354,7 @@
                 <w:rFonts w:ascii="Barlow" w:hAnsi="Barlow" w:cs="Barlow"/>
                 <w:b w:val="0"/>
                 <w:i w:val="0"/>
-                <w:sz w:val="14"/>
+                <w:sz w:val="15"/>
               </w:rPr>
               <w:t>06-BRIDGE</w:t>
             </w:r>
@@ -362,7 +362,7 @@
         </w:tc>
         <w:tc>
           <w:tcPr>
-            <w:tcW w:type="dxa" w:w="5976"/>
+            <w:tcW w:type="dxa" w:w="6048"/>
           </w:tcPr>
           <w:p>
             <w:pPr>
@@ -373,7 +373,7 @@
                 <w:rFonts w:ascii="Barlow" w:hAnsi="Barlow" w:cs="Barlow"/>
                 <w:b w:val="0"/>
                 <w:i w:val="0"/>
-                <w:sz w:val="14"/>
+                <w:sz w:val="15"/>
               </w:rPr>
               <w:t>Reusable bridge illustrations and schematics</w:t>
             </w:r>
@@ -383,7 +383,7 @@
       <w:tr>
         <w:tc>
           <w:tcPr>
-            <w:tcW w:type="dxa" w:w="3960"/>
+            <w:tcW w:type="dxa" w:w="3888"/>
             <w:shd w:val="clear" w:color="auto" w:fill="F4F6F8"/>
           </w:tcPr>
           <w:p>
@@ -395,7 +395,7 @@
                 <w:rFonts w:ascii="Barlow" w:hAnsi="Barlow" w:cs="Barlow"/>
                 <w:b w:val="0"/>
                 <w:i w:val="0"/>
-                <w:sz w:val="14"/>
+                <w:sz w:val="15"/>
               </w:rPr>
               <w:t>07-HW-CASE-B-LIFT-STATION</w:t>
             </w:r>
@@ -403,7 +403,7 @@
         </w:tc>
         <w:tc>
           <w:tcPr>
-            <w:tcW w:type="dxa" w:w="5976"/>
+            <w:tcW w:type="dxa" w:w="6048"/>
             <w:shd w:val="clear" w:color="auto" w:fill="F4F6F8"/>
           </w:tcPr>
           <w:p>
@@ -415,7 +415,7 @@
                 <w:rFonts w:ascii="Barlow" w:hAnsi="Barlow" w:cs="Barlow"/>
                 <w:b w:val="0"/>
                 <w:i w:val="0"/>
-                <w:sz w:val="14"/>
+                <w:sz w:val="15"/>
               </w:rPr>
               <w:t>M02 transfer homework and instructor key</w:t>
             </w:r>
@@ -425,7 +425,7 @@
       <w:tr>
         <w:tc>
           <w:tcPr>
-            <w:tcW w:type="dxa" w:w="3960"/>
+            <w:tcW w:type="dxa" w:w="3888"/>
           </w:tcPr>
           <w:p>
             <w:pPr>
@@ -436,7 +436,7 @@
                 <w:rFonts w:ascii="Barlow" w:hAnsi="Barlow" w:cs="Barlow"/>
                 <w:b w:val="0"/>
                 <w:i w:val="0"/>
-                <w:sz w:val="14"/>
+                <w:sz w:val="15"/>
               </w:rPr>
               <w:t>08-M04-one-number</w:t>
             </w:r>
@@ -444,7 +444,7 @@
         </w:tc>
         <w:tc>
           <w:tcPr>
-            <w:tcW w:type="dxa" w:w="5976"/>
+            <w:tcW w:type="dxa" w:w="6048"/>
           </w:tcPr>
           <w:p>
             <w:pPr>
@@ -455,7 +455,7 @@
                 <w:rFonts w:ascii="Barlow" w:hAnsi="Barlow" w:cs="Barlow"/>
                 <w:b w:val="0"/>
                 <w:i w:val="0"/>
-                <w:sz w:val="14"/>
+                <w:sz w:val="15"/>
               </w:rPr>
               <w:t>Center, spread, CV, low count, and sample scope</w:t>
             </w:r>
@@ -465,7 +465,7 @@
       <w:tr>
         <w:tc>
           <w:tcPr>
-            <w:tcW w:type="dxa" w:w="3960"/>
+            <w:tcW w:type="dxa" w:w="3888"/>
             <w:shd w:val="clear" w:color="auto" w:fill="F4F6F8"/>
           </w:tcPr>
           <w:p>
@@ -477,7 +477,7 @@
                 <w:rFonts w:ascii="Barlow" w:hAnsi="Barlow" w:cs="Barlow"/>
                 <w:b w:val="0"/>
                 <w:i w:val="0"/>
-                <w:sz w:val="14"/>
+                <w:sz w:val="15"/>
               </w:rPr>
               <w:t>09-M05-overnight-alarm</w:t>
             </w:r>
@@ -485,7 +485,7 @@
         </w:tc>
         <w:tc>
           <w:tcPr>
-            <w:tcW w:type="dxa" w:w="5976"/>
+            <w:tcW w:type="dxa" w:w="6048"/>
             <w:shd w:val="clear" w:color="auto" w:fill="F4F6F8"/>
           </w:tcPr>
           <w:p>
@@ -497,7 +497,7 @@
                 <w:rFonts w:ascii="Barlow" w:hAnsi="Barlow" w:cs="Barlow"/>
                 <w:b w:val="0"/>
                 <w:i w:val="0"/>
-                <w:sz w:val="14"/>
+                <w:sz w:val="15"/>
               </w:rPr>
               <w:t>Agent loop, threshold alarm, and unresolved event</w:t>
             </w:r>
@@ -507,7 +507,7 @@
       <w:tr>
         <w:tc>
           <w:tcPr>
-            <w:tcW w:type="dxa" w:w="3960"/>
+            <w:tcW w:type="dxa" w:w="3888"/>
           </w:tcPr>
           <w:p>
             <w:pPr>
@@ -518,7 +518,7 @@
                 <w:rFonts w:ascii="Barlow" w:hAnsi="Barlow" w:cs="Barlow"/>
                 <w:b w:val="0"/>
                 <w:i w:val="0"/>
-                <w:sz w:val="14"/>
+                <w:sz w:val="15"/>
               </w:rPr>
               <w:t>10-M06-alarm-audit</w:t>
             </w:r>
@@ -526,7 +526,7 @@
         </w:tc>
         <w:tc>
           <w:tcPr>
-            <w:tcW w:type="dxa" w:w="5976"/>
+            <w:tcW w:type="dxa" w:w="6048"/>
           </w:tcPr>
           <w:p>
             <w:pPr>
@@ -537,7 +537,7 @@
                 <w:rFonts w:ascii="Barlow" w:hAnsi="Barlow" w:cs="Barlow"/>
                 <w:b w:val="0"/>
                 <w:i w:val="0"/>
-                <w:sz w:val="14"/>
+                <w:sz w:val="15"/>
               </w:rPr>
               <w:t>Distribution audit, traffic corroboration, and Unit 1 handoff</w:t>
             </w:r>
@@ -547,7 +547,7 @@
       <w:tr>
         <w:tc>
           <w:tcPr>
-            <w:tcW w:type="dxa" w:w="3960"/>
+            <w:tcW w:type="dxa" w:w="3888"/>
             <w:shd w:val="clear" w:color="auto" w:fill="F4F6F8"/>
           </w:tcPr>
           <w:p>
@@ -559,7 +559,7 @@
                 <w:rFonts w:ascii="Barlow" w:hAnsi="Barlow" w:cs="Barlow"/>
                 <w:b w:val="0"/>
                 <w:i w:val="0"/>
-                <w:sz w:val="14"/>
+                <w:sz w:val="15"/>
               </w:rPr>
               <w:t>11-M07-training-mismatch</w:t>
             </w:r>
@@ -567,7 +567,7 @@
         </w:tc>
         <w:tc>
           <w:tcPr>
-            <w:tcW w:type="dxa" w:w="5976"/>
+            <w:tcW w:type="dxa" w:w="6048"/>
             <w:shd w:val="clear" w:color="auto" w:fill="F4F6F8"/>
           </w:tcPr>
           <w:p>
@@ -579,7 +579,7 @@
                 <w:rFonts w:ascii="Barlow" w:hAnsi="Barlow" w:cs="Barlow"/>
                 <w:b w:val="0"/>
                 <w:i w:val="0"/>
-                <w:sz w:val="14"/>
+                <w:sz w:val="15"/>
               </w:rPr>
               <w:t>Training bias, distribution shift, and Unit 2 note v2</w:t>
             </w:r>
@@ -589,7 +589,7 @@
       <w:tr>
         <w:tc>
           <w:tcPr>
-            <w:tcW w:type="dxa" w:w="3960"/>
+            <w:tcW w:type="dxa" w:w="3888"/>
           </w:tcPr>
           <w:p>
             <w:pPr>
@@ -600,7 +600,7 @@
                 <w:rFonts w:ascii="Barlow" w:hAnsi="Barlow" w:cs="Barlow"/>
                 <w:b w:val="0"/>
                 <w:i w:val="0"/>
-                <w:sz w:val="14"/>
+                <w:sz w:val="15"/>
               </w:rPr>
               <w:t>12-M08-spurious-correlation</w:t>
             </w:r>
@@ -608,7 +608,7 @@
         </w:tc>
         <w:tc>
           <w:tcPr>
-            <w:tcW w:type="dxa" w:w="5976"/>
+            <w:tcW w:type="dxa" w:w="6048"/>
           </w:tcPr>
           <w:p>
             <w:pPr>
@@ -619,7 +619,7 @@
                 <w:rFonts w:ascii="Barlow" w:hAnsi="Barlow" w:cs="Barlow"/>
                 <w:b w:val="0"/>
                 <w:i w:val="0"/>
-                <w:sz w:val="14"/>
+                <w:sz w:val="15"/>
               </w:rPr>
               <w:t>Correlation, regression, thermal confound, and HW4</w:t>
             </w:r>
@@ -629,7 +629,7 @@
       <w:tr>
         <w:tc>
           <w:tcPr>
-            <w:tcW w:type="dxa" w:w="3960"/>
+            <w:tcW w:type="dxa" w:w="3888"/>
             <w:shd w:val="clear" w:color="auto" w:fill="F4F6F8"/>
           </w:tcPr>
           <w:p>
@@ -641,7 +641,7 @@
                 <w:rFonts w:ascii="Barlow" w:hAnsi="Barlow" w:cs="Barlow"/>
                 <w:b w:val="0"/>
                 <w:i w:val="0"/>
-                <w:sz w:val="14"/>
+                <w:sz w:val="15"/>
               </w:rPr>
               <w:t>13-M09-false-precision</w:t>
             </w:r>
@@ -649,7 +649,7 @@
         </w:tc>
         <w:tc>
           <w:tcPr>
-            <w:tcW w:type="dxa" w:w="5976"/>
+            <w:tcW w:type="dxa" w:w="6048"/>
             <w:shd w:val="clear" w:color="auto" w:fill="F4F6F8"/>
           </w:tcPr>
           <w:p>
@@ -661,9 +661,9 @@
                 <w:rFonts w:ascii="Barlow" w:hAnsi="Barlow" w:cs="Barlow"/>
                 <w:b w:val="0"/>
                 <w:i w:val="0"/>
-                <w:sz w:val="14"/>
+                <w:sz w:val="15"/>
               </w:rPr>
-              <w:t>Overconfidence, false precision, sampling, and sample scope</w:t>
+              <w:t>False precision, fatigue-test scatter, and random sample means</w:t>
             </w:r>
           </w:p>
         </w:tc>
@@ -671,7 +671,7 @@
       <w:tr>
         <w:tc>
           <w:tcPr>
-            <w:tcW w:type="dxa" w:w="3960"/>
+            <w:tcW w:type="dxa" w:w="3888"/>
           </w:tcPr>
           <w:p>
             <w:pPr>
@@ -682,7 +682,7 @@
                 <w:rFonts w:ascii="Barlow" w:hAnsi="Barlow" w:cs="Barlow"/>
                 <w:b w:val="0"/>
                 <w:i w:val="0"/>
-                <w:sz w:val="14"/>
+                <w:sz w:val="15"/>
               </w:rPr>
               <w:t>14-M10-deterioration-v-noise</w:t>
             </w:r>
@@ -690,7 +690,7 @@
         </w:tc>
         <w:tc>
           <w:tcPr>
-            <w:tcW w:type="dxa" w:w="5976"/>
+            <w:tcW w:type="dxa" w:w="6048"/>
           </w:tcPr>
           <w:p>
             <w:pPr>
@@ -701,9 +701,51 @@
                 <w:rFonts w:ascii="Barlow" w:hAnsi="Barlow" w:cs="Barlow"/>
                 <w:b w:val="0"/>
                 <w:i w:val="0"/>
-                <w:sz w:val="14"/>
+                <w:sz w:val="15"/>
               </w:rPr>
-              <w:t>Paired intervals, signal/noise audit, and HW5 callback</w:t>
+              <w:t>Confidence intervals and paired signal-versus-noise audit</w:t>
+            </w:r>
+          </w:p>
+        </w:tc>
+      </w:tr>
+      <w:tr>
+        <w:tc>
+          <w:tcPr>
+            <w:tcW w:type="dxa" w:w="3888"/>
+            <w:shd w:val="clear" w:color="auto" w:fill="F4F6F8"/>
+          </w:tcPr>
+          <w:p>
+            <w:pPr>
+              <w:spacing w:before="20" w:after="20" w:line="252" w:lineRule="auto"/>
+            </w:pPr>
+            <w:r>
+              <w:rPr>
+                <w:rFonts w:ascii="Barlow" w:hAnsi="Barlow" w:cs="Barlow"/>
+                <w:b w:val="0"/>
+                <w:i w:val="0"/>
+                <w:sz w:val="15"/>
+              </w:rPr>
+              <w:t>15-M11-dashboard-publish</w:t>
+            </w:r>
+          </w:p>
+        </w:tc>
+        <w:tc>
+          <w:tcPr>
+            <w:tcW w:type="dxa" w:w="6048"/>
+            <w:shd w:val="clear" w:color="auto" w:fill="F4F6F8"/>
+          </w:tcPr>
+          <w:p>
+            <w:pPr>
+              <w:spacing w:before="20" w:after="20" w:line="252" w:lineRule="auto"/>
+            </w:pPr>
+            <w:r>
+              <w:rPr>
+                <w:rFonts w:ascii="Barlow" w:hAnsi="Barlow" w:cs="Barlow"/>
+                <w:b w:val="0"/>
+                <w:i w:val="0"/>
+                <w:sz w:val="15"/>
+              </w:rPr>
+              <w:t>Agentic dashboards and the human publish checkpoint</w:t>
             </w:r>
           </w:p>
         </w:tc>
@@ -723,7 +765,7 @@
           <w:caps w:val="1"/>
           <w:spacing w:val="12"/>
         </w:rPr>
-        <w:t>14-M10-deterioration-v-noise</w:t>
+        <w:t>15-M11-dashboard-publish</w:t>
       </w:r>
     </w:p>
     <w:tbl>
@@ -747,7 +789,7 @@
       <w:tr>
         <w:tc>
           <w:tcPr>
-            <w:tcW w:type="dxa" w:w="4608"/>
+            <w:tcW w:type="dxa" w:w="4536"/>
             <w:shd w:val="clear" w:color="auto" w:fill="1F3A5F"/>
           </w:tcPr>
           <w:p>
@@ -760,7 +802,7 @@
                 <w:b/>
                 <w:i w:val="0"/>
                 <w:color w:val="FFFFFF"/>
-                <w:sz w:val="14"/>
+                <w:sz w:val="15"/>
               </w:rPr>
               <w:t>File</w:t>
             </w:r>
@@ -768,7 +810,7 @@
         </w:tc>
         <w:tc>
           <w:tcPr>
-            <w:tcW w:type="dxa" w:w="5328"/>
+            <w:tcW w:type="dxa" w:w="5400"/>
             <w:shd w:val="clear" w:color="auto" w:fill="1F3A5F"/>
           </w:tcPr>
           <w:p>
@@ -781,7 +823,7 @@
                 <w:b/>
                 <w:i w:val="0"/>
                 <w:color w:val="FFFFFF"/>
-                <w:sz w:val="14"/>
+                <w:sz w:val="15"/>
               </w:rPr>
               <w:t>What it is</w:t>
             </w:r>
@@ -791,7 +833,7 @@
       <w:tr>
         <w:tc>
           <w:tcPr>
-            <w:tcW w:type="dxa" w:w="4608"/>
+            <w:tcW w:type="dxa" w:w="4536"/>
           </w:tcPr>
           <w:p>
             <w:pPr>
@@ -802,15 +844,15 @@
                 <w:rFonts w:ascii="Barlow" w:hAnsi="Barlow" w:cs="Barlow"/>
                 <w:b w:val="0"/>
                 <w:i w:val="0"/>
-                <w:sz w:val="14"/>
+                <w:sz w:val="15"/>
               </w:rPr>
-              <w:t>M10-student.pptx</w:t>
+              <w:t>M11-student.pptx</w:t>
             </w:r>
           </w:p>
         </w:tc>
         <w:tc>
           <w:tcPr>
-            <w:tcW w:type="dxa" w:w="5328"/>
+            <w:tcW w:type="dxa" w:w="5400"/>
           </w:tcPr>
           <w:p>
             <w:pPr>
@@ -821,9 +863,9 @@
                 <w:rFonts w:ascii="Barlow" w:hAnsi="Barlow" w:cs="Barlow"/>
                 <w:b w:val="0"/>
                 <w:i w:val="0"/>
-                <w:sz w:val="14"/>
+                <w:sz w:val="15"/>
               </w:rPr>
-              <w:t>Spoiler-safe concepts and interval hunt with Cloud-PASS canon SAY</w:t>
+              <w:t>Spoiler-safe concepts and five-tile hunt with Cloud-passed SAY</w:t>
             </w:r>
           </w:p>
         </w:tc>
@@ -831,7 +873,7 @@
       <w:tr>
         <w:tc>
           <w:tcPr>
-            <w:tcW w:type="dxa" w:w="4608"/>
+            <w:tcW w:type="dxa" w:w="4536"/>
             <w:shd w:val="clear" w:color="auto" w:fill="F4F6F8"/>
           </w:tcPr>
           <w:p>
@@ -843,15 +885,15 @@
                 <w:rFonts w:ascii="Barlow" w:hAnsi="Barlow" w:cs="Barlow"/>
                 <w:b w:val="0"/>
                 <w:i w:val="0"/>
-                <w:sz w:val="14"/>
+                <w:sz w:val="15"/>
               </w:rPr>
-              <w:t>M10-instructor-reveal.pptx</w:t>
+              <w:t>M11-instructor-reveal.pptx</w:t>
             </w:r>
           </w:p>
         </w:tc>
         <w:tc>
           <w:tcPr>
-            <w:tcW w:type="dxa" w:w="5328"/>
+            <w:tcW w:type="dxa" w:w="5400"/>
             <w:shd w:val="clear" w:color="auto" w:fill="F4F6F8"/>
           </w:tcPr>
           <w:p>
@@ -863,9 +905,9 @@
                 <w:rFonts w:ascii="Barlow" w:hAnsi="Barlow" w:cs="Barlow"/>
                 <w:b w:val="0"/>
                 <w:i w:val="0"/>
-                <w:sz w:val="14"/>
+                <w:sz w:val="15"/>
               </w:rPr>
-              <w:t>Gated 95%/99% comparison and bounded claim</w:t>
+              <w:t>Gated tile decisions and publish boundary</w:t>
             </w:r>
           </w:p>
         </w:tc>
@@ -873,7 +915,7 @@
       <w:tr>
         <w:tc>
           <w:tcPr>
-            <w:tcW w:type="dxa" w:w="4608"/>
+            <w:tcW w:type="dxa" w:w="4536"/>
           </w:tcPr>
           <w:p>
             <w:pPr>
@@ -884,15 +926,15 @@
                 <w:rFonts w:ascii="Barlow" w:hAnsi="Barlow" w:cs="Barlow"/>
                 <w:b w:val="0"/>
                 <w:i w:val="0"/>
-                <w:sz w:val="14"/>
+                <w:sz w:val="15"/>
               </w:rPr>
-              <w:t>FOREMAN-M10-deterioration-claim.docx</w:t>
+              <w:t>FOREMAN-M11-dashboard-stub.docx</w:t>
             </w:r>
           </w:p>
         </w:tc>
         <w:tc>
           <w:tcPr>
-            <w:tcW w:type="dxa" w:w="5328"/>
+            <w:tcW w:type="dxa" w:w="5400"/>
           </w:tcPr>
           <w:p>
             <w:pPr>
@@ -903,9 +945,9 @@
                 <w:rFonts w:ascii="Barlow" w:hAnsi="Barlow" w:cs="Barlow"/>
                 <w:b w:val="0"/>
                 <w:i w:val="0"/>
-                <w:sz w:val="14"/>
+                <w:sz w:val="15"/>
               </w:rPr>
-              <w:t>Designed p-value and significance overclaim</w:t>
+              <w:t>Five-tile county-facing publish candidate</w:t>
             </w:r>
           </w:p>
         </w:tc>
@@ -913,7 +955,7 @@
       <w:tr>
         <w:tc>
           <w:tcPr>
-            <w:tcW w:type="dxa" w:w="4608"/>
+            <w:tcW w:type="dxa" w:w="4536"/>
             <w:shd w:val="clear" w:color="auto" w:fill="F4F6F8"/>
           </w:tcPr>
           <w:p>
@@ -925,15 +967,15 @@
                 <w:rFonts w:ascii="Barlow" w:hAnsi="Barlow" w:cs="Barlow"/>
                 <w:b w:val="0"/>
                 <w:i w:val="0"/>
-                <w:sz w:val="14"/>
+                <w:sz w:val="15"/>
               </w:rPr>
-              <w:t>H10-01-coupon-interval-warmup.docx</w:t>
+              <w:t>H11-01-dashboard-review-form.docx</w:t>
             </w:r>
           </w:p>
         </w:tc>
         <w:tc>
           <w:tcPr>
-            <w:tcW w:type="dxa" w:w="5328"/>
+            <w:tcW w:type="dxa" w:w="5400"/>
             <w:shd w:val="clear" w:color="auto" w:fill="F4F6F8"/>
           </w:tcPr>
           <w:p>
@@ -945,9 +987,9 @@
                 <w:rFonts w:ascii="Barlow" w:hAnsi="Barlow" w:cs="Barlow"/>
                 <w:b w:val="0"/>
                 <w:i w:val="0"/>
-                <w:sz w:val="14"/>
+                <w:sz w:val="15"/>
               </w:rPr>
-              <w:t>Six-coupon guided t interval</w:t>
+              <w:t>Approve / fix / pull plus reason for all five tiles</w:t>
             </w:r>
           </w:p>
         </w:tc>
@@ -955,7 +997,7 @@
       <w:tr>
         <w:tc>
           <w:tcPr>
-            <w:tcW w:type="dxa" w:w="4608"/>
+            <w:tcW w:type="dxa" w:w="4536"/>
           </w:tcPr>
           <w:p>
             <w:pPr>
@@ -966,15 +1008,15 @@
                 <w:rFonts w:ascii="Barlow" w:hAnsi="Barlow" w:cs="Barlow"/>
                 <w:b w:val="0"/>
                 <w:i w:val="0"/>
-                <w:sz w:val="14"/>
+                <w:sz w:val="15"/>
               </w:rPr>
-              <w:t>H10-02-paired-load-test-guide.docx</w:t>
+              <w:t>H11-02-metric-checkpoint-guide.docx</w:t>
             </w:r>
           </w:p>
         </w:tc>
         <w:tc>
           <w:tcPr>
-            <w:tcW w:type="dxa" w:w="5328"/>
+            <w:tcW w:type="dxa" w:w="5400"/>
           </w:tcPr>
           <w:p>
             <w:pPr>
@@ -985,9 +1027,9 @@
                 <w:rFonts w:ascii="Barlow" w:hAnsi="Barlow" w:cs="Barlow"/>
                 <w:b w:val="0"/>
                 <w:i w:val="0"/>
-                <w:sz w:val="14"/>
+                <w:sz w:val="15"/>
               </w:rPr>
-              <w:t>Data dictionary and measurement/process-noise audit</w:t>
+              <w:t>Definition, units, source, timestamp, and claim checks</w:t>
             </w:r>
           </w:p>
         </w:tc>
@@ -995,7 +1037,7 @@
       <w:tr>
         <w:tc>
           <w:tcPr>
-            <w:tcW w:type="dxa" w:w="4608"/>
+            <w:tcW w:type="dxa" w:w="4536"/>
             <w:shd w:val="clear" w:color="auto" w:fill="F4F6F8"/>
           </w:tcPr>
           <w:p>
@@ -1007,15 +1049,15 @@
                 <w:rFonts w:ascii="Barlow" w:hAnsi="Barlow" w:cs="Barlow"/>
                 <w:b w:val="0"/>
                 <w:i w:val="0"/>
-                <w:sz w:val="14"/>
+                <w:sz w:val="15"/>
               </w:rPr>
-              <w:t>H10-03-signal-v-noise-worksheet.docx</w:t>
+              <w:t>H11-03-concepts-and-publish-check.docx</w:t>
             </w:r>
           </w:p>
         </w:tc>
         <w:tc>
           <w:tcPr>
-            <w:tcW w:type="dxa" w:w="5328"/>
+            <w:tcW w:type="dxa" w:w="5400"/>
             <w:shd w:val="clear" w:color="auto" w:fill="F4F6F8"/>
           </w:tcPr>
           <w:p>
@@ -1027,9 +1069,9 @@
                 <w:rFonts w:ascii="Barlow" w:hAnsi="Barlow" w:cs="Barlow"/>
                 <w:b w:val="0"/>
                 <w:i w:val="0"/>
-                <w:sz w:val="14"/>
+                <w:sz w:val="15"/>
               </w:rPr>
-              <w:t>Paired-change interval worksheet</w:t>
+              <w:t>Five concepts and the authority boundary</w:t>
             </w:r>
           </w:p>
         </w:tc>
@@ -1037,7 +1079,7 @@
       <w:tr>
         <w:tc>
           <w:tcPr>
-            <w:tcW w:type="dxa" w:w="4608"/>
+            <w:tcW w:type="dxa" w:w="4536"/>
           </w:tcPr>
           <w:p>
             <w:pPr>
@@ -1048,15 +1090,15 @@
                 <w:rFonts w:ascii="Barlow" w:hAnsi="Barlow" w:cs="Barlow"/>
                 <w:b w:val="0"/>
                 <w:i w:val="0"/>
-                <w:sz w:val="14"/>
+                <w:sz w:val="15"/>
               </w:rPr>
-              <w:t>H10-04-concepts-and-language.docx</w:t>
+              <w:t>H11-04-note-v2-and-decision-log.docx</w:t>
             </w:r>
           </w:p>
         </w:tc>
         <w:tc>
           <w:tcPr>
-            <w:tcW w:type="dxa" w:w="5328"/>
+            <w:tcW w:type="dxa" w:w="5400"/>
           </w:tcPr>
           <w:p>
             <w:pPr>
@@ -1067,9 +1109,9 @@
                 <w:rFonts w:ascii="Barlow" w:hAnsi="Barlow" w:cs="Barlow"/>
                 <w:b w:val="0"/>
                 <w:i w:val="0"/>
-                <w:sz w:val="14"/>
+                <w:sz w:val="15"/>
               </w:rPr>
-              <w:t>Five concept definitions and safe language</w:t>
+              <w:t>Claim / check / result hand-in</w:t>
             </w:r>
           </w:p>
         </w:tc>
@@ -1077,7 +1119,7 @@
       <w:tr>
         <w:tc>
           <w:tcPr>
-            <w:tcW w:type="dxa" w:w="4608"/>
+            <w:tcW w:type="dxa" w:w="4536"/>
             <w:shd w:val="clear" w:color="auto" w:fill="F4F6F8"/>
           </w:tcPr>
           <w:p>
@@ -1089,15 +1131,15 @@
                 <w:rFonts w:ascii="Barlow" w:hAnsi="Barlow" w:cs="Barlow"/>
                 <w:b w:val="0"/>
                 <w:i w:val="0"/>
-                <w:sz w:val="14"/>
+                <w:sz w:val="15"/>
               </w:rPr>
-              <w:t>H10-05-HW5-peak-strain-interval.docx</w:t>
+              <w:t>M11-dashboard-tile-register.csv</w:t>
             </w:r>
           </w:p>
         </w:tc>
         <w:tc>
           <w:tcPr>
-            <w:tcW w:type="dxa" w:w="5328"/>
+            <w:tcW w:type="dxa" w:w="5400"/>
             <w:shd w:val="clear" w:color="auto" w:fill="F4F6F8"/>
           </w:tcPr>
           <w:p>
@@ -1109,9 +1151,9 @@
                 <w:rFonts w:ascii="Barlow" w:hAnsi="Barlow" w:cs="Barlow"/>
                 <w:b w:val="0"/>
                 <w:i w:val="0"/>
-                <w:sz w:val="14"/>
+                <w:sz w:val="15"/>
               </w:rPr>
-              <w:t>Duplicate-timestamp callback assignment</w:t>
+              <w:t>Deterministic definitions and provenance for all tiles</w:t>
             </w:r>
           </w:p>
         </w:tc>
@@ -1119,7 +1161,7 @@
       <w:tr>
         <w:tc>
           <w:tcPr>
-            <w:tcW w:type="dxa" w:w="4608"/>
+            <w:tcW w:type="dxa" w:w="4536"/>
           </w:tcPr>
           <w:p>
             <w:pPr>
@@ -1130,15 +1172,15 @@
                 <w:rFonts w:ascii="Barlow" w:hAnsi="Barlow" w:cs="Barlow"/>
                 <w:b w:val="0"/>
                 <w:i w:val="0"/>
-                <w:sz w:val="14"/>
+                <w:sz w:val="15"/>
               </w:rPr>
-              <w:t>H10-06-note-v2-and-decision-log.docx</w:t>
+              <w:t>M11-five-tile-dashboard.png</w:t>
             </w:r>
           </w:p>
         </w:tc>
         <w:tc>
           <w:tcPr>
-            <w:tcW w:type="dxa" w:w="5328"/>
+            <w:tcW w:type="dxa" w:w="5400"/>
           </w:tcPr>
           <w:p>
             <w:pPr>
@@ -1149,9 +1191,9 @@
                 <w:rFonts w:ascii="Barlow" w:hAnsi="Barlow" w:cs="Barlow"/>
                 <w:b w:val="0"/>
                 <w:i w:val="0"/>
-                <w:sz w:val="14"/>
+                <w:sz w:val="15"/>
               </w:rPr>
-              <w:t>Claim/check/result with interval</w:t>
+              <w:t>Rendered dashboard stub used in the pack</w:t>
             </w:r>
           </w:p>
         </w:tc>
@@ -1159,7 +1201,7 @@
       <w:tr>
         <w:tc>
           <w:tcPr>
-            <w:tcW w:type="dxa" w:w="4608"/>
+            <w:tcW w:type="dxa" w:w="4536"/>
             <w:shd w:val="clear" w:color="auto" w:fill="F4F6F8"/>
           </w:tcPr>
           <w:p>
@@ -1171,15 +1213,15 @@
                 <w:rFonts w:ascii="Barlow" w:hAnsi="Barlow" w:cs="Barlow"/>
                 <w:b w:val="0"/>
                 <w:i w:val="0"/>
-                <w:sz w:val="14"/>
+                <w:sz w:val="15"/>
               </w:rPr>
-              <w:t>coupons.csv + loadtest_2019_2027.csv</w:t>
+              <w:t>KEY-M11-answer-key.docx</w:t>
             </w:r>
           </w:p>
         </w:tc>
         <w:tc>
           <w:tcPr>
-            <w:tcW w:type="dxa" w:w="5328"/>
+            <w:tcW w:type="dxa" w:w="5400"/>
             <w:shd w:val="clear" w:color="auto" w:fill="F4F6F8"/>
           </w:tcPr>
           <w:p>
@@ -1191,9 +1233,9 @@
                 <w:rFonts w:ascii="Barlow" w:hAnsi="Barlow" w:cs="Barlow"/>
                 <w:b w:val="0"/>
                 <w:i w:val="0"/>
-                <w:sz w:val="14"/>
+                <w:sz w:val="15"/>
               </w:rPr>
-              <w:t>Warm-up and pass-level source data</w:t>
+              <w:t>Instructor-only designed errors and acceptable decisions</w:t>
             </w:r>
           </w:p>
         </w:tc>
@@ -1201,7 +1243,7 @@
       <w:tr>
         <w:tc>
           <w:tcPr>
-            <w:tcW w:type="dxa" w:w="4608"/>
+            <w:tcW w:type="dxa" w:w="4536"/>
           </w:tcPr>
           <w:p>
             <w:pPr>
@@ -1212,15 +1254,15 @@
                 <w:rFonts w:ascii="Barlow" w:hAnsi="Barlow" w:cs="Barlow"/>
                 <w:b w:val="0"/>
                 <w:i w:val="0"/>
-                <w:sz w:val="14"/>
+                <w:sz w:val="15"/>
               </w:rPr>
-              <w:t>M10-paired-location-summary.csv</w:t>
+              <w:t>../00-INSTRUCTOR/source-notes/M11-story-SAY.md</w:t>
             </w:r>
           </w:p>
         </w:tc>
         <w:tc>
           <w:tcPr>
-            <w:tcW w:type="dxa" w:w="5328"/>
+            <w:tcW w:type="dxa" w:w="5400"/>
           </w:tcPr>
           <w:p>
             <w:pPr>
@@ -1231,173 +1273,9 @@
                 <w:rFonts w:ascii="Barlow" w:hAnsi="Barlow" w:cs="Barlow"/>
                 <w:b w:val="0"/>
                 <w:i w:val="0"/>
-                <w:sz w:val="14"/>
+                <w:sz w:val="15"/>
               </w:rPr>
-              <w:t>Eight paired location means and repeatability SD</w:t>
-            </w:r>
-          </w:p>
-        </w:tc>
-      </w:tr>
-      <w:tr>
-        <w:tc>
-          <w:tcPr>
-            <w:tcW w:type="dxa" w:w="4608"/>
-            <w:shd w:val="clear" w:color="auto" w:fill="F4F6F8"/>
-          </w:tcPr>
-          <w:p>
-            <w:pPr>
-              <w:spacing w:before="20" w:after="20" w:line="252" w:lineRule="auto"/>
-            </w:pPr>
-            <w:r>
-              <w:rPr>
-                <w:rFonts w:ascii="Barlow" w:hAnsi="Barlow" w:cs="Barlow"/>
-                <w:b w:val="0"/>
-                <w:i w:val="0"/>
-                <w:sz w:val="14"/>
-              </w:rPr>
-              <w:t>M10-interval-summary.csv</w:t>
-            </w:r>
-          </w:p>
-        </w:tc>
-        <w:tc>
-          <w:tcPr>
-            <w:tcW w:type="dxa" w:w="5328"/>
-            <w:shd w:val="clear" w:color="auto" w:fill="F4F6F8"/>
-          </w:tcPr>
-          <w:p>
-            <w:pPr>
-              <w:spacing w:before="20" w:after="20" w:line="252" w:lineRule="auto"/>
-            </w:pPr>
-            <w:r>
-              <w:rPr>
-                <w:rFonts w:ascii="Barlow" w:hAnsi="Barlow" w:cs="Barlow"/>
-                <w:b w:val="0"/>
-                <w:i w:val="0"/>
-                <w:sz w:val="14"/>
-              </w:rPr>
-              <w:t>Deterministic 95% and 99% calculations</w:t>
-            </w:r>
-          </w:p>
-        </w:tc>
-      </w:tr>
-      <w:tr>
-        <w:tc>
-          <w:tcPr>
-            <w:tcW w:type="dxa" w:w="4608"/>
-          </w:tcPr>
-          <w:p>
-            <w:pPr>
-              <w:spacing w:before="20" w:after="20" w:line="252" w:lineRule="auto"/>
-            </w:pPr>
-            <w:r>
-              <w:rPr>
-                <w:rFonts w:ascii="Barlow" w:hAnsi="Barlow" w:cs="Barlow"/>
-                <w:b w:val="0"/>
-                <w:i w:val="0"/>
-                <w:sz w:val="14"/>
-              </w:rPr>
-              <w:t>M10-test-control-check.csv</w:t>
-            </w:r>
-          </w:p>
-        </w:tc>
-        <w:tc>
-          <w:tcPr>
-            <w:tcW w:type="dxa" w:w="5328"/>
-          </w:tcPr>
-          <w:p>
-            <w:pPr>
-              <w:spacing w:before="20" w:after="20" w:line="252" w:lineRule="auto"/>
-            </w:pPr>
-            <w:r>
-              <w:rPr>
-                <w:rFonts w:ascii="Barlow" w:hAnsi="Barlow" w:cs="Barlow"/>
-                <w:b w:val="0"/>
-                <w:i w:val="0"/>
-                <w:sz w:val="14"/>
-              </w:rPr>
-              <w:t>Matched process-control record</w:t>
-            </w:r>
-          </w:p>
-        </w:tc>
-      </w:tr>
-      <w:tr>
-        <w:tc>
-          <w:tcPr>
-            <w:tcW w:type="dxa" w:w="4608"/>
-            <w:shd w:val="clear" w:color="auto" w:fill="F4F6F8"/>
-          </w:tcPr>
-          <w:p>
-            <w:pPr>
-              <w:spacing w:before="20" w:after="20" w:line="252" w:lineRule="auto"/>
-            </w:pPr>
-            <w:r>
-              <w:rPr>
-                <w:rFonts w:ascii="Barlow" w:hAnsi="Barlow" w:cs="Barlow"/>
-                <w:b w:val="0"/>
-                <w:i w:val="0"/>
-                <w:sz w:val="14"/>
-              </w:rPr>
-              <w:t>KEY-M10-answer-key.docx</w:t>
-            </w:r>
-          </w:p>
-        </w:tc>
-        <w:tc>
-          <w:tcPr>
-            <w:tcW w:type="dxa" w:w="5328"/>
-            <w:shd w:val="clear" w:color="auto" w:fill="F4F6F8"/>
-          </w:tcPr>
-          <w:p>
-            <w:pPr>
-              <w:spacing w:before="20" w:after="20" w:line="252" w:lineRule="auto"/>
-            </w:pPr>
-            <w:r>
-              <w:rPr>
-                <w:rFonts w:ascii="Barlow" w:hAnsi="Barlow" w:cs="Barlow"/>
-                <w:b w:val="0"/>
-                <w:i w:val="0"/>
-                <w:sz w:val="14"/>
-              </w:rPr>
-              <w:t>Instructor-only calculations and boundaries</w:t>
-            </w:r>
-          </w:p>
-        </w:tc>
-      </w:tr>
-      <w:tr>
-        <w:tc>
-          <w:tcPr>
-            <w:tcW w:type="dxa" w:w="4608"/>
-          </w:tcPr>
-          <w:p>
-            <w:pPr>
-              <w:spacing w:before="20" w:after="20" w:line="252" w:lineRule="auto"/>
-            </w:pPr>
-            <w:r>
-              <w:rPr>
-                <w:rFonts w:ascii="Barlow" w:hAnsi="Barlow" w:cs="Barlow"/>
-                <w:b w:val="0"/>
-                <w:i w:val="0"/>
-                <w:sz w:val="14"/>
-              </w:rPr>
-              <w:t>../00-INSTRUCTOR/source-notes/M10-story-SAY.md</w:t>
-            </w:r>
-          </w:p>
-        </w:tc>
-        <w:tc>
-          <w:tcPr>
-            <w:tcW w:type="dxa" w:w="5328"/>
-          </w:tcPr>
-          <w:p>
-            <w:pPr>
-              <w:spacing w:before="20" w:after="20" w:line="252" w:lineRule="auto"/>
-            </w:pPr>
-            <w:r>
-              <w:rPr>
-                <w:rFonts w:ascii="Barlow" w:hAnsi="Barlow" w:cs="Barlow"/>
-                <w:b w:val="0"/>
-                <w:i w:val="0"/>
-                <w:sz w:val="14"/>
-              </w:rPr>
-              <w:t>Revised M10 Cloud-PASS canon story and SAY source</w:t>
+              <w:t>Cloud-passed canon story and SAY source</w:t>
             </w:r>
           </w:p>
         </w:tc>
@@ -1433,7 +1311,7 @@
         <w:color w:val="6B7280"/>
         <w:sz w:val="16"/>
       </w:rPr>
-      <w:t>SEIS 201  ·  M01 – M10</w:t>
+      <w:t>SEIS 201  ·  M01 – M11</w:t>
     </w:r>
     <w:r>
       <w:tab/>
@@ -1506,7 +1384,7 @@
         <w:caps w:val="1"/>
         <w:spacing w:val="20"/>
       </w:rPr>
-      <w:t>M01 – M10  ·  FILE INDEX</w:t>
+      <w:t>M01 – M11  ·  FILE INDEX</w:t>
     </w:r>
   </w:p>
 </w:hdr>

</xml_diff>

<commit_message>
Build M12 misleading visualization teaching pack
Co-authored-by: shaseaver25 <shannon@tailoredu.org>
</commit_message>
<xml_diff>
--- a/teaching-pack/00-INSTRUCTOR/FILE-INDEX.docx
+++ b/teaching-pack/00-INSTRUCTOR/FILE-INDEX.docx
@@ -19,7 +19,7 @@
     </w:p>
     <w:p>
       <w:pPr>
-        <w:spacing w:before="0" w:after="200" w:line="276" w:lineRule="auto"/>
+        <w:spacing w:before="0" w:after="120" w:line="276" w:lineRule="auto"/>
       </w:pPr>
       <w:r>
         <w:rPr>
@@ -29,7 +29,7 @@
           <w:color w:val="6B7280"/>
           <w:sz w:val="18"/>
         </w:rPr>
-        <w:t>Folders are numbered in teaching order. M11 is folder 15 so it follows the M09 and M10 packs without renumbering.</w:t>
+        <w:t>Folders are in teaching order. Folder 15 is reserved for M11; M12 is folder 16 so meeting and pack numbering remain stable when the M11 pack lands.</w:t>
       </w:r>
     </w:p>
     <w:tbl>
@@ -53,7 +53,7 @@
       <w:tr>
         <w:tc>
           <w:tcPr>
-            <w:tcW w:type="dxa" w:w="3888"/>
+            <w:tcW w:type="dxa" w:w="3960"/>
             <w:shd w:val="clear" w:color="auto" w:fill="1F3A5F"/>
           </w:tcPr>
           <w:p>
@@ -66,7 +66,7 @@
                 <w:b/>
                 <w:i w:val="0"/>
                 <w:color w:val="FFFFFF"/>
-                <w:sz w:val="15"/>
+                <w:sz w:val="14"/>
               </w:rPr>
               <w:t>Folder</w:t>
             </w:r>
@@ -74,7 +74,7 @@
         </w:tc>
         <w:tc>
           <w:tcPr>
-            <w:tcW w:type="dxa" w:w="6048"/>
+            <w:tcW w:type="dxa" w:w="5976"/>
             <w:shd w:val="clear" w:color="auto" w:fill="1F3A5F"/>
           </w:tcPr>
           <w:p>
@@ -87,7 +87,7 @@
                 <w:b/>
                 <w:i w:val="0"/>
                 <w:color w:val="FFFFFF"/>
-                <w:sz w:val="15"/>
+                <w:sz w:val="14"/>
               </w:rPr>
               <w:t>Purpose</w:t>
             </w:r>
@@ -97,7 +97,7 @@
       <w:tr>
         <w:tc>
           <w:tcPr>
-            <w:tcW w:type="dxa" w:w="3888"/>
+            <w:tcW w:type="dxa" w:w="3960"/>
           </w:tcPr>
           <w:p>
             <w:pPr>
@@ -108,7 +108,7 @@
                 <w:rFonts w:ascii="Barlow" w:hAnsi="Barlow" w:cs="Barlow"/>
                 <w:b w:val="0"/>
                 <w:i w:val="0"/>
-                <w:sz w:val="15"/>
+                <w:sz w:val="14"/>
               </w:rPr>
               <w:t>00-INSTRUCTOR</w:t>
             </w:r>
@@ -116,7 +116,7 @@
         </w:tc>
         <w:tc>
           <w:tcPr>
-            <w:tcW w:type="dxa" w:w="6048"/>
+            <w:tcW w:type="dxa" w:w="5976"/>
           </w:tcPr>
           <w:p>
             <w:pPr>
@@ -127,9 +127,9 @@
                 <w:rFonts w:ascii="Barlow" w:hAnsi="Barlow" w:cs="Barlow"/>
                 <w:b w:val="0"/>
                 <w:i w:val="0"/>
-                <w:sz w:val="15"/>
+                <w:sz w:val="14"/>
               </w:rPr>
-              <w:t>Run-of-day desk, faculty brief, source SAY notes, and this index</w:t>
+              <w:t>Run-of-day desk, faculty brief, source SAY notes, TOC, and this index</w:t>
             </w:r>
           </w:p>
         </w:tc>
@@ -137,7 +137,7 @@
       <w:tr>
         <w:tc>
           <w:tcPr>
-            <w:tcW w:type="dxa" w:w="3888"/>
+            <w:tcW w:type="dxa" w:w="3960"/>
             <w:shd w:val="clear" w:color="auto" w:fill="F4F6F8"/>
           </w:tcPr>
           <w:p>
@@ -149,7 +149,7 @@
                 <w:rFonts w:ascii="Barlow" w:hAnsi="Barlow" w:cs="Barlow"/>
                 <w:b w:val="0"/>
                 <w:i w:val="0"/>
-                <w:sz w:val="15"/>
+                <w:sz w:val="14"/>
               </w:rPr>
               <w:t>01-BRAND-KIT</w:t>
             </w:r>
@@ -157,7 +157,7 @@
         </w:tc>
         <w:tc>
           <w:tcPr>
-            <w:tcW w:type="dxa" w:w="6048"/>
+            <w:tcW w:type="dxa" w:w="5976"/>
             <w:shd w:val="clear" w:color="auto" w:fill="F4F6F8"/>
           </w:tcPr>
           <w:p>
@@ -169,7 +169,7 @@
                 <w:rFonts w:ascii="Barlow" w:hAnsi="Barlow" w:cs="Barlow"/>
                 <w:b w:val="0"/>
                 <w:i w:val="0"/>
-                <w:sz w:val="15"/>
+                <w:sz w:val="14"/>
               </w:rPr>
               <w:t>ACMEJOB logos, fonts, templates, and brand guide</w:t>
             </w:r>
@@ -179,7 +179,7 @@
       <w:tr>
         <w:tc>
           <w:tcPr>
-            <w:tcW w:type="dxa" w:w="3888"/>
+            <w:tcW w:type="dxa" w:w="3960"/>
           </w:tcPr>
           <w:p>
             <w:pPr>
@@ -190,7 +190,7 @@
                 <w:rFonts w:ascii="Barlow" w:hAnsi="Barlow" w:cs="Barlow"/>
                 <w:b w:val="0"/>
                 <w:i w:val="0"/>
-                <w:sz w:val="15"/>
+                <w:sz w:val="14"/>
               </w:rPr>
               <w:t>02-M01-first-day</w:t>
             </w:r>
@@ -198,7 +198,7 @@
         </w:tc>
         <w:tc>
           <w:tcPr>
-            <w:tcW w:type="dxa" w:w="6048"/>
+            <w:tcW w:type="dxa" w:w="5976"/>
           </w:tcPr>
           <w:p>
             <w:pPr>
@@ -209,7 +209,7 @@
                 <w:rFonts w:ascii="Barlow" w:hAnsi="Barlow" w:cs="Barlow"/>
                 <w:b w:val="0"/>
                 <w:i w:val="0"/>
-                <w:sz w:val="15"/>
+                <w:sz w:val="14"/>
               </w:rPr>
               <w:t>Rules versus learned patterns</w:t>
             </w:r>
@@ -219,7 +219,7 @@
       <w:tr>
         <w:tc>
           <w:tcPr>
-            <w:tcW w:type="dxa" w:w="3888"/>
+            <w:tcW w:type="dxa" w:w="3960"/>
             <w:shd w:val="clear" w:color="auto" w:fill="F4F6F8"/>
           </w:tcPr>
           <w:p>
@@ -231,7 +231,7 @@
                 <w:rFonts w:ascii="Barlow" w:hAnsi="Barlow" w:cs="Barlow"/>
                 <w:b w:val="0"/>
                 <w:i w:val="0"/>
-                <w:sz w:val="15"/>
+                <w:sz w:val="14"/>
               </w:rPr>
               <w:t>03-M02-measurement</w:t>
             </w:r>
@@ -239,7 +239,7 @@
         </w:tc>
         <w:tc>
           <w:tcPr>
-            <w:tcW w:type="dxa" w:w="6048"/>
+            <w:tcW w:type="dxa" w:w="5976"/>
             <w:shd w:val="clear" w:color="auto" w:fill="F4F6F8"/>
           </w:tcPr>
           <w:p>
@@ -251,9 +251,9 @@
                 <w:rFonts w:ascii="Barlow" w:hAnsi="Barlow" w:cs="Barlow"/>
                 <w:b w:val="0"/>
                 <w:i w:val="0"/>
-                <w:sz w:val="15"/>
+                <w:sz w:val="14"/>
               </w:rPr>
-              <w:t>Measurement, resolution, uncertainty, and G6</w:t>
+              <w:t>Measurement, uncertainty, and G6</w:t>
             </w:r>
           </w:p>
         </w:tc>
@@ -261,7 +261,7 @@
       <w:tr>
         <w:tc>
           <w:tcPr>
-            <w:tcW w:type="dxa" w:w="3888"/>
+            <w:tcW w:type="dxa" w:w="3960"/>
           </w:tcPr>
           <w:p>
             <w:pPr>
@@ -272,7 +272,7 @@
                 <w:rFonts w:ascii="Barlow" w:hAnsi="Barlow" w:cs="Barlow"/>
                 <w:b w:val="0"/>
                 <w:i w:val="0"/>
-                <w:sz w:val="15"/>
+                <w:sz w:val="14"/>
               </w:rPr>
               <w:t>04-M03-hallucination</w:t>
             </w:r>
@@ -280,7 +280,7 @@
         </w:tc>
         <w:tc>
           <w:tcPr>
-            <w:tcW w:type="dxa" w:w="6048"/>
+            <w:tcW w:type="dxa" w:w="5976"/>
           </w:tcPr>
           <w:p>
             <w:pPr>
@@ -291,7 +291,7 @@
                 <w:rFonts w:ascii="Barlow" w:hAnsi="Barlow" w:cs="Barlow"/>
                 <w:b w:val="0"/>
                 <w:i w:val="0"/>
-                <w:sz w:val="15"/>
+                <w:sz w:val="14"/>
               </w:rPr>
               <w:t>Next-token generation and source checking</w:t>
             </w:r>
@@ -301,7 +301,7 @@
       <w:tr>
         <w:tc>
           <w:tcPr>
-            <w:tcW w:type="dxa" w:w="3888"/>
+            <w:tcW w:type="dxa" w:w="3960"/>
             <w:shd w:val="clear" w:color="auto" w:fill="F4F6F8"/>
           </w:tcPr>
           <w:p>
@@ -313,7 +313,7 @@
                 <w:rFonts w:ascii="Barlow" w:hAnsi="Barlow" w:cs="Barlow"/>
                 <w:b w:val="0"/>
                 <w:i w:val="0"/>
-                <w:sz w:val="15"/>
+                <w:sz w:val="14"/>
               </w:rPr>
               <w:t>05-CHARTS</w:t>
             </w:r>
@@ -321,7 +321,7 @@
         </w:tc>
         <w:tc>
           <w:tcPr>
-            <w:tcW w:type="dxa" w:w="6048"/>
+            <w:tcW w:type="dxa" w:w="5976"/>
             <w:shd w:val="clear" w:color="auto" w:fill="F4F6F8"/>
           </w:tcPr>
           <w:p>
@@ -333,7 +333,7 @@
                 <w:rFonts w:ascii="Barlow" w:hAnsi="Barlow" w:cs="Barlow"/>
                 <w:b w:val="0"/>
                 <w:i w:val="0"/>
-                <w:sz w:val="15"/>
+                <w:sz w:val="14"/>
               </w:rPr>
               <w:t>Reusable meeting-deck charts</w:t>
             </w:r>
@@ -343,7 +343,7 @@
       <w:tr>
         <w:tc>
           <w:tcPr>
-            <w:tcW w:type="dxa" w:w="3888"/>
+            <w:tcW w:type="dxa" w:w="3960"/>
           </w:tcPr>
           <w:p>
             <w:pPr>
@@ -354,7 +354,7 @@
                 <w:rFonts w:ascii="Barlow" w:hAnsi="Barlow" w:cs="Barlow"/>
                 <w:b w:val="0"/>
                 <w:i w:val="0"/>
-                <w:sz w:val="15"/>
+                <w:sz w:val="14"/>
               </w:rPr>
               <w:t>06-BRIDGE</w:t>
             </w:r>
@@ -362,7 +362,7 @@
         </w:tc>
         <w:tc>
           <w:tcPr>
-            <w:tcW w:type="dxa" w:w="6048"/>
+            <w:tcW w:type="dxa" w:w="5976"/>
           </w:tcPr>
           <w:p>
             <w:pPr>
@@ -373,7 +373,7 @@
                 <w:rFonts w:ascii="Barlow" w:hAnsi="Barlow" w:cs="Barlow"/>
                 <w:b w:val="0"/>
                 <w:i w:val="0"/>
-                <w:sz w:val="15"/>
+                <w:sz w:val="14"/>
               </w:rPr>
               <w:t>Reusable bridge illustrations and schematics</w:t>
             </w:r>
@@ -383,7 +383,7 @@
       <w:tr>
         <w:tc>
           <w:tcPr>
-            <w:tcW w:type="dxa" w:w="3888"/>
+            <w:tcW w:type="dxa" w:w="3960"/>
             <w:shd w:val="clear" w:color="auto" w:fill="F4F6F8"/>
           </w:tcPr>
           <w:p>
@@ -395,7 +395,7 @@
                 <w:rFonts w:ascii="Barlow" w:hAnsi="Barlow" w:cs="Barlow"/>
                 <w:b w:val="0"/>
                 <w:i w:val="0"/>
-                <w:sz w:val="15"/>
+                <w:sz w:val="14"/>
               </w:rPr>
               <w:t>07-HW-CASE-B-LIFT-STATION</w:t>
             </w:r>
@@ -403,7 +403,7 @@
         </w:tc>
         <w:tc>
           <w:tcPr>
-            <w:tcW w:type="dxa" w:w="6048"/>
+            <w:tcW w:type="dxa" w:w="5976"/>
             <w:shd w:val="clear" w:color="auto" w:fill="F4F6F8"/>
           </w:tcPr>
           <w:p>
@@ -415,7 +415,7 @@
                 <w:rFonts w:ascii="Barlow" w:hAnsi="Barlow" w:cs="Barlow"/>
                 <w:b w:val="0"/>
                 <w:i w:val="0"/>
-                <w:sz w:val="15"/>
+                <w:sz w:val="14"/>
               </w:rPr>
               <w:t>M02 transfer homework and instructor key</w:t>
             </w:r>
@@ -425,7 +425,7 @@
       <w:tr>
         <w:tc>
           <w:tcPr>
-            <w:tcW w:type="dxa" w:w="3888"/>
+            <w:tcW w:type="dxa" w:w="3960"/>
           </w:tcPr>
           <w:p>
             <w:pPr>
@@ -436,7 +436,7 @@
                 <w:rFonts w:ascii="Barlow" w:hAnsi="Barlow" w:cs="Barlow"/>
                 <w:b w:val="0"/>
                 <w:i w:val="0"/>
-                <w:sz w:val="15"/>
+                <w:sz w:val="14"/>
               </w:rPr>
               <w:t>08-M04-one-number</w:t>
             </w:r>
@@ -444,7 +444,7 @@
         </w:tc>
         <w:tc>
           <w:tcPr>
-            <w:tcW w:type="dxa" w:w="6048"/>
+            <w:tcW w:type="dxa" w:w="5976"/>
           </w:tcPr>
           <w:p>
             <w:pPr>
@@ -455,7 +455,7 @@
                 <w:rFonts w:ascii="Barlow" w:hAnsi="Barlow" w:cs="Barlow"/>
                 <w:b w:val="0"/>
                 <w:i w:val="0"/>
-                <w:sz w:val="15"/>
+                <w:sz w:val="14"/>
               </w:rPr>
               <w:t>Center, spread, CV, low count, and sample scope</w:t>
             </w:r>
@@ -465,7 +465,7 @@
       <w:tr>
         <w:tc>
           <w:tcPr>
-            <w:tcW w:type="dxa" w:w="3888"/>
+            <w:tcW w:type="dxa" w:w="3960"/>
             <w:shd w:val="clear" w:color="auto" w:fill="F4F6F8"/>
           </w:tcPr>
           <w:p>
@@ -477,7 +477,7 @@
                 <w:rFonts w:ascii="Barlow" w:hAnsi="Barlow" w:cs="Barlow"/>
                 <w:b w:val="0"/>
                 <w:i w:val="0"/>
-                <w:sz w:val="15"/>
+                <w:sz w:val="14"/>
               </w:rPr>
               <w:t>09-M05-overnight-alarm</w:t>
             </w:r>
@@ -485,7 +485,7 @@
         </w:tc>
         <w:tc>
           <w:tcPr>
-            <w:tcW w:type="dxa" w:w="6048"/>
+            <w:tcW w:type="dxa" w:w="5976"/>
             <w:shd w:val="clear" w:color="auto" w:fill="F4F6F8"/>
           </w:tcPr>
           <w:p>
@@ -497,9 +497,9 @@
                 <w:rFonts w:ascii="Barlow" w:hAnsi="Barlow" w:cs="Barlow"/>
                 <w:b w:val="0"/>
                 <w:i w:val="0"/>
-                <w:sz w:val="15"/>
+                <w:sz w:val="14"/>
               </w:rPr>
-              <w:t>Agent loop, threshold alarm, and unresolved event</w:t>
+              <w:t>Agent loop and threshold alarm</w:t>
             </w:r>
           </w:p>
         </w:tc>
@@ -507,7 +507,7 @@
       <w:tr>
         <w:tc>
           <w:tcPr>
-            <w:tcW w:type="dxa" w:w="3888"/>
+            <w:tcW w:type="dxa" w:w="3960"/>
           </w:tcPr>
           <w:p>
             <w:pPr>
@@ -518,7 +518,7 @@
                 <w:rFonts w:ascii="Barlow" w:hAnsi="Barlow" w:cs="Barlow"/>
                 <w:b w:val="0"/>
                 <w:i w:val="0"/>
-                <w:sz w:val="15"/>
+                <w:sz w:val="14"/>
               </w:rPr>
               <w:t>10-M06-alarm-audit</w:t>
             </w:r>
@@ -526,7 +526,7 @@
         </w:tc>
         <w:tc>
           <w:tcPr>
-            <w:tcW w:type="dxa" w:w="6048"/>
+            <w:tcW w:type="dxa" w:w="5976"/>
           </w:tcPr>
           <w:p>
             <w:pPr>
@@ -537,9 +537,9 @@
                 <w:rFonts w:ascii="Barlow" w:hAnsi="Barlow" w:cs="Barlow"/>
                 <w:b w:val="0"/>
                 <w:i w:val="0"/>
-                <w:sz w:val="15"/>
+                <w:sz w:val="14"/>
               </w:rPr>
-              <w:t>Distribution audit, traffic corroboration, and Unit 1 handoff</w:t>
+              <w:t>Distribution audit and Unit 1 handoff</w:t>
             </w:r>
           </w:p>
         </w:tc>
@@ -547,7 +547,7 @@
       <w:tr>
         <w:tc>
           <w:tcPr>
-            <w:tcW w:type="dxa" w:w="3888"/>
+            <w:tcW w:type="dxa" w:w="3960"/>
             <w:shd w:val="clear" w:color="auto" w:fill="F4F6F8"/>
           </w:tcPr>
           <w:p>
@@ -559,7 +559,7 @@
                 <w:rFonts w:ascii="Barlow" w:hAnsi="Barlow" w:cs="Barlow"/>
                 <w:b w:val="0"/>
                 <w:i w:val="0"/>
-                <w:sz w:val="15"/>
+                <w:sz w:val="14"/>
               </w:rPr>
               <w:t>11-M07-training-mismatch</w:t>
             </w:r>
@@ -567,7 +567,7 @@
         </w:tc>
         <w:tc>
           <w:tcPr>
-            <w:tcW w:type="dxa" w:w="6048"/>
+            <w:tcW w:type="dxa" w:w="5976"/>
             <w:shd w:val="clear" w:color="auto" w:fill="F4F6F8"/>
           </w:tcPr>
           <w:p>
@@ -579,9 +579,9 @@
                 <w:rFonts w:ascii="Barlow" w:hAnsi="Barlow" w:cs="Barlow"/>
                 <w:b w:val="0"/>
                 <w:i w:val="0"/>
-                <w:sz w:val="15"/>
+                <w:sz w:val="14"/>
               </w:rPr>
-              <w:t>Training bias, distribution shift, and Unit 2 note v2</w:t>
+              <w:t>Training coverage and distribution shift</w:t>
             </w:r>
           </w:p>
         </w:tc>
@@ -589,7 +589,7 @@
       <w:tr>
         <w:tc>
           <w:tcPr>
-            <w:tcW w:type="dxa" w:w="3888"/>
+            <w:tcW w:type="dxa" w:w="3960"/>
           </w:tcPr>
           <w:p>
             <w:pPr>
@@ -600,7 +600,7 @@
                 <w:rFonts w:ascii="Barlow" w:hAnsi="Barlow" w:cs="Barlow"/>
                 <w:b w:val="0"/>
                 <w:i w:val="0"/>
-                <w:sz w:val="15"/>
+                <w:sz w:val="14"/>
               </w:rPr>
               <w:t>12-M08-spurious-correlation</w:t>
             </w:r>
@@ -608,7 +608,7 @@
         </w:tc>
         <w:tc>
           <w:tcPr>
-            <w:tcW w:type="dxa" w:w="6048"/>
+            <w:tcW w:type="dxa" w:w="5976"/>
           </w:tcPr>
           <w:p>
             <w:pPr>
@@ -619,9 +619,9 @@
                 <w:rFonts w:ascii="Barlow" w:hAnsi="Barlow" w:cs="Barlow"/>
                 <w:b w:val="0"/>
                 <w:i w:val="0"/>
-                <w:sz w:val="15"/>
+                <w:sz w:val="14"/>
               </w:rPr>
-              <w:t>Correlation, regression, thermal confound, and HW4</w:t>
+              <w:t>Regression and the thermal confound</w:t>
             </w:r>
           </w:p>
         </w:tc>
@@ -629,7 +629,7 @@
       <w:tr>
         <w:tc>
           <w:tcPr>
-            <w:tcW w:type="dxa" w:w="3888"/>
+            <w:tcW w:type="dxa" w:w="3960"/>
             <w:shd w:val="clear" w:color="auto" w:fill="F4F6F8"/>
           </w:tcPr>
           <w:p>
@@ -641,7 +641,7 @@
                 <w:rFonts w:ascii="Barlow" w:hAnsi="Barlow" w:cs="Barlow"/>
                 <w:b w:val="0"/>
                 <w:i w:val="0"/>
-                <w:sz w:val="15"/>
+                <w:sz w:val="14"/>
               </w:rPr>
               <w:t>13-M09-false-precision</w:t>
             </w:r>
@@ -649,7 +649,7 @@
         </w:tc>
         <w:tc>
           <w:tcPr>
-            <w:tcW w:type="dxa" w:w="6048"/>
+            <w:tcW w:type="dxa" w:w="5976"/>
             <w:shd w:val="clear" w:color="auto" w:fill="F4F6F8"/>
           </w:tcPr>
           <w:p>
@@ -661,9 +661,9 @@
                 <w:rFonts w:ascii="Barlow" w:hAnsi="Barlow" w:cs="Barlow"/>
                 <w:b w:val="0"/>
                 <w:i w:val="0"/>
-                <w:sz w:val="15"/>
+                <w:sz w:val="14"/>
               </w:rPr>
-              <w:t>False precision, fatigue-test scatter, and random sample means</w:t>
+              <w:t>False precision and sampling variability</w:t>
             </w:r>
           </w:p>
         </w:tc>
@@ -671,7 +671,7 @@
       <w:tr>
         <w:tc>
           <w:tcPr>
-            <w:tcW w:type="dxa" w:w="3888"/>
+            <w:tcW w:type="dxa" w:w="3960"/>
           </w:tcPr>
           <w:p>
             <w:pPr>
@@ -682,7 +682,7 @@
                 <w:rFonts w:ascii="Barlow" w:hAnsi="Barlow" w:cs="Barlow"/>
                 <w:b w:val="0"/>
                 <w:i w:val="0"/>
-                <w:sz w:val="15"/>
+                <w:sz w:val="14"/>
               </w:rPr>
               <w:t>14-M10-deterioration-v-noise</w:t>
             </w:r>
@@ -690,7 +690,7 @@
         </w:tc>
         <w:tc>
           <w:tcPr>
-            <w:tcW w:type="dxa" w:w="6048"/>
+            <w:tcW w:type="dxa" w:w="5976"/>
           </w:tcPr>
           <w:p>
             <w:pPr>
@@ -701,9 +701,9 @@
                 <w:rFonts w:ascii="Barlow" w:hAnsi="Barlow" w:cs="Barlow"/>
                 <w:b w:val="0"/>
                 <w:i w:val="0"/>
-                <w:sz w:val="15"/>
+                <w:sz w:val="14"/>
               </w:rPr>
-              <w:t>Confidence intervals and paired signal-versus-noise audit</w:t>
+              <w:t>Paired intervals and signal/noise audit</w:t>
             </w:r>
           </w:p>
         </w:tc>
@@ -711,7 +711,7 @@
       <w:tr>
         <w:tc>
           <w:tcPr>
-            <w:tcW w:type="dxa" w:w="3888"/>
+            <w:tcW w:type="dxa" w:w="3960"/>
             <w:shd w:val="clear" w:color="auto" w:fill="F4F6F8"/>
           </w:tcPr>
           <w:p>
@@ -723,15 +723,15 @@
                 <w:rFonts w:ascii="Barlow" w:hAnsi="Barlow" w:cs="Barlow"/>
                 <w:b w:val="0"/>
                 <w:i w:val="0"/>
-                <w:sz w:val="15"/>
+                <w:sz w:val="14"/>
               </w:rPr>
-              <w:t>15-M11-dashboard-publish</w:t>
+              <w:t>15-M11 (reserved)</w:t>
             </w:r>
           </w:p>
         </w:tc>
         <w:tc>
           <w:tcPr>
-            <w:tcW w:type="dxa" w:w="6048"/>
+            <w:tcW w:type="dxa" w:w="5976"/>
             <w:shd w:val="clear" w:color="auto" w:fill="F4F6F8"/>
           </w:tcPr>
           <w:p>
@@ -743,9 +743,49 @@
                 <w:rFonts w:ascii="Barlow" w:hAnsi="Barlow" w:cs="Barlow"/>
                 <w:b w:val="0"/>
                 <w:i w:val="0"/>
-                <w:sz w:val="15"/>
+                <w:sz w:val="14"/>
               </w:rPr>
-              <w:t>Agentic dashboards and the human publish checkpoint</w:t>
+              <w:t>Agentic dashboard meeting; pack not present on this branch</w:t>
+            </w:r>
+          </w:p>
+        </w:tc>
+      </w:tr>
+      <w:tr>
+        <w:tc>
+          <w:tcPr>
+            <w:tcW w:type="dxa" w:w="3960"/>
+          </w:tcPr>
+          <w:p>
+            <w:pPr>
+              <w:spacing w:before="20" w:after="20" w:line="252" w:lineRule="auto"/>
+            </w:pPr>
+            <w:r>
+              <w:rPr>
+                <w:rFonts w:ascii="Barlow" w:hAnsi="Barlow" w:cs="Barlow"/>
+                <w:b w:val="0"/>
+                <w:i w:val="0"/>
+                <w:sz w:val="14"/>
+              </w:rPr>
+              <w:t>16-M12-misleading-charts</w:t>
+            </w:r>
+          </w:p>
+        </w:tc>
+        <w:tc>
+          <w:tcPr>
+            <w:tcW w:type="dxa" w:w="5976"/>
+          </w:tcPr>
+          <w:p>
+            <w:pPr>
+              <w:spacing w:before="20" w:after="20" w:line="252" w:lineRule="auto"/>
+            </w:pPr>
+            <w:r>
+              <w:rPr>
+                <w:rFonts w:ascii="Barlow" w:hAnsi="Barlow" w:cs="Barlow"/>
+                <w:b w:val="0"/>
+                <w:i w:val="0"/>
+                <w:sz w:val="14"/>
+              </w:rPr>
+              <w:t>Chart-type and truncated-axis hunt, HW6, and separate review</w:t>
             </w:r>
           </w:p>
         </w:tc>
@@ -765,7 +805,7 @@
           <w:caps w:val="1"/>
           <w:spacing w:val="12"/>
         </w:rPr>
-        <w:t>15-M11-dashboard-publish</w:t>
+        <w:t>16-M12-misleading-charts</w:t>
       </w:r>
     </w:p>
     <w:tbl>
@@ -789,7 +829,7 @@
       <w:tr>
         <w:tc>
           <w:tcPr>
-            <w:tcW w:type="dxa" w:w="4536"/>
+            <w:tcW w:type="dxa" w:w="4608"/>
             <w:shd w:val="clear" w:color="auto" w:fill="1F3A5F"/>
           </w:tcPr>
           <w:p>
@@ -802,7 +842,7 @@
                 <w:b/>
                 <w:i w:val="0"/>
                 <w:color w:val="FFFFFF"/>
-                <w:sz w:val="15"/>
+                <w:sz w:val="14"/>
               </w:rPr>
               <w:t>File</w:t>
             </w:r>
@@ -810,7 +850,7 @@
         </w:tc>
         <w:tc>
           <w:tcPr>
-            <w:tcW w:type="dxa" w:w="5400"/>
+            <w:tcW w:type="dxa" w:w="5328"/>
             <w:shd w:val="clear" w:color="auto" w:fill="1F3A5F"/>
           </w:tcPr>
           <w:p>
@@ -823,7 +863,7 @@
                 <w:b/>
                 <w:i w:val="0"/>
                 <w:color w:val="FFFFFF"/>
-                <w:sz w:val="15"/>
+                <w:sz w:val="14"/>
               </w:rPr>
               <w:t>What it is</w:t>
             </w:r>
@@ -833,7 +873,7 @@
       <w:tr>
         <w:tc>
           <w:tcPr>
-            <w:tcW w:type="dxa" w:w="4536"/>
+            <w:tcW w:type="dxa" w:w="4608"/>
           </w:tcPr>
           <w:p>
             <w:pPr>
@@ -844,15 +884,15 @@
                 <w:rFonts w:ascii="Barlow" w:hAnsi="Barlow" w:cs="Barlow"/>
                 <w:b w:val="0"/>
                 <w:i w:val="0"/>
-                <w:sz w:val="15"/>
+                <w:sz w:val="14"/>
               </w:rPr>
-              <w:t>M11-student.pptx</w:t>
+              <w:t>M12-student.pptx</w:t>
             </w:r>
           </w:p>
         </w:tc>
         <w:tc>
           <w:tcPr>
-            <w:tcW w:type="dxa" w:w="5400"/>
+            <w:tcW w:type="dxa" w:w="5328"/>
           </w:tcPr>
           <w:p>
             <w:pPr>
@@ -863,9 +903,9 @@
                 <w:rFonts w:ascii="Barlow" w:hAnsi="Barlow" w:cs="Barlow"/>
                 <w:b w:val="0"/>
                 <w:i w:val="0"/>
-                <w:sz w:val="15"/>
+                <w:sz w:val="14"/>
               </w:rPr>
-              <w:t>Spoiler-safe concepts and five-tile hunt with Cloud-passed SAY</w:t>
+              <w:t>Spoiler-safe Teach, chart hunt, Lab, and separate review transition</w:t>
             </w:r>
           </w:p>
         </w:tc>
@@ -873,7 +913,7 @@
       <w:tr>
         <w:tc>
           <w:tcPr>
-            <w:tcW w:type="dxa" w:w="4536"/>
+            <w:tcW w:type="dxa" w:w="4608"/>
             <w:shd w:val="clear" w:color="auto" w:fill="F4F6F8"/>
           </w:tcPr>
           <w:p>
@@ -885,15 +925,15 @@
                 <w:rFonts w:ascii="Barlow" w:hAnsi="Barlow" w:cs="Barlow"/>
                 <w:b w:val="0"/>
                 <w:i w:val="0"/>
-                <w:sz w:val="15"/>
+                <w:sz w:val="14"/>
               </w:rPr>
-              <w:t>M11-instructor-reveal.pptx</w:t>
+              <w:t>M12-instructor-reveal.pptx</w:t>
             </w:r>
           </w:p>
         </w:tc>
         <w:tc>
           <w:tcPr>
-            <w:tcW w:type="dxa" w:w="5400"/>
+            <w:tcW w:type="dxa" w:w="5328"/>
             <w:shd w:val="clear" w:color="auto" w:fill="F4F6F8"/>
           </w:tcPr>
           <w:p>
@@ -905,9 +945,9 @@
                 <w:rFonts w:ascii="Barlow" w:hAnsi="Barlow" w:cs="Barlow"/>
                 <w:b w:val="0"/>
                 <w:i w:val="0"/>
-                <w:sz w:val="15"/>
+                <w:sz w:val="14"/>
               </w:rPr>
-              <w:t>Gated tile decisions and publish boundary</w:t>
+              <w:t>Gated designed-error names and corrected charts</w:t>
             </w:r>
           </w:p>
         </w:tc>
@@ -915,7 +955,7 @@
       <w:tr>
         <w:tc>
           <w:tcPr>
-            <w:tcW w:type="dxa" w:w="4536"/>
+            <w:tcW w:type="dxa" w:w="4608"/>
           </w:tcPr>
           <w:p>
             <w:pPr>
@@ -926,15 +966,15 @@
                 <w:rFonts w:ascii="Barlow" w:hAnsi="Barlow" w:cs="Barlow"/>
                 <w:b w:val="0"/>
                 <w:i w:val="0"/>
-                <w:sz w:val="15"/>
+                <w:sz w:val="14"/>
               </w:rPr>
-              <w:t>FOREMAN-M11-dashboard-stub.docx</w:t>
+              <w:t>FOREMAN-M12-interim-chart-pack.docx</w:t>
             </w:r>
           </w:p>
         </w:tc>
         <w:tc>
           <w:tcPr>
-            <w:tcW w:type="dxa" w:w="5400"/>
+            <w:tcW w:type="dxa" w:w="5328"/>
           </w:tcPr>
           <w:p>
             <w:pPr>
@@ -945,9 +985,9 @@
                 <w:rFonts w:ascii="Barlow" w:hAnsi="Barlow" w:cs="Barlow"/>
                 <w:b w:val="0"/>
                 <w:i w:val="0"/>
-                <w:sz w:val="15"/>
+                <w:sz w:val="14"/>
               </w:rPr>
-              <w:t>Five-tile county-facing publish candidate</w:t>
+              <w:t>Three-tile county chart pack; errors unlabeled</w:t>
             </w:r>
           </w:p>
         </w:tc>
@@ -955,7 +995,7 @@
       <w:tr>
         <w:tc>
           <w:tcPr>
-            <w:tcW w:type="dxa" w:w="4536"/>
+            <w:tcW w:type="dxa" w:w="4608"/>
             <w:shd w:val="clear" w:color="auto" w:fill="F4F6F8"/>
           </w:tcPr>
           <w:p>
@@ -967,15 +1007,15 @@
                 <w:rFonts w:ascii="Barlow" w:hAnsi="Barlow" w:cs="Barlow"/>
                 <w:b w:val="0"/>
                 <w:i w:val="0"/>
-                <w:sz w:val="15"/>
+                <w:sz w:val="14"/>
               </w:rPr>
-              <w:t>H11-01-dashboard-review-form.docx</w:t>
+              <w:t>H12-01-chart-hunt.docx</w:t>
             </w:r>
           </w:p>
         </w:tc>
         <w:tc>
           <w:tcPr>
-            <w:tcW w:type="dxa" w:w="5400"/>
+            <w:tcW w:type="dxa" w:w="5328"/>
             <w:shd w:val="clear" w:color="auto" w:fill="F4F6F8"/>
           </w:tcPr>
           <w:p>
@@ -987,9 +1027,9 @@
                 <w:rFonts w:ascii="Barlow" w:hAnsi="Barlow" w:cs="Barlow"/>
                 <w:b w:val="0"/>
                 <w:i w:val="0"/>
-                <w:sz w:val="15"/>
+                <w:sz w:val="14"/>
               </w:rPr>
-              <w:t>Approve / fix / pull plus reason for all five tiles</w:t>
+              <w:t>Approve / fix / pull review checkpoint</w:t>
             </w:r>
           </w:p>
         </w:tc>
@@ -997,7 +1037,7 @@
       <w:tr>
         <w:tc>
           <w:tcPr>
-            <w:tcW w:type="dxa" w:w="4536"/>
+            <w:tcW w:type="dxa" w:w="4608"/>
           </w:tcPr>
           <w:p>
             <w:pPr>
@@ -1008,15 +1048,15 @@
                 <w:rFonts w:ascii="Barlow" w:hAnsi="Barlow" w:cs="Barlow"/>
                 <w:b w:val="0"/>
                 <w:i w:val="0"/>
-                <w:sz w:val="15"/>
+                <w:sz w:val="14"/>
               </w:rPr>
-              <w:t>H11-02-metric-checkpoint-guide.docx</w:t>
+              <w:t>H12-02-chart-choice-and-axis-guide.docx</w:t>
             </w:r>
           </w:p>
         </w:tc>
         <w:tc>
           <w:tcPr>
-            <w:tcW w:type="dxa" w:w="5400"/>
+            <w:tcW w:type="dxa" w:w="5328"/>
           </w:tcPr>
           <w:p>
             <w:pPr>
@@ -1027,9 +1067,9 @@
                 <w:rFonts w:ascii="Barlow" w:hAnsi="Barlow" w:cs="Barlow"/>
                 <w:b w:val="0"/>
                 <w:i w:val="0"/>
-                <w:sz w:val="15"/>
+                <w:sz w:val="14"/>
               </w:rPr>
-              <w:t>Definition, units, source, timestamp, and claim checks</w:t>
+              <w:t>Chart type, baseline, and AI-chart reference</w:t>
             </w:r>
           </w:p>
         </w:tc>
@@ -1037,7 +1077,7 @@
       <w:tr>
         <w:tc>
           <w:tcPr>
-            <w:tcW w:type="dxa" w:w="4536"/>
+            <w:tcW w:type="dxa" w:w="4608"/>
             <w:shd w:val="clear" w:color="auto" w:fill="F4F6F8"/>
           </w:tcPr>
           <w:p>
@@ -1049,15 +1089,15 @@
                 <w:rFonts w:ascii="Barlow" w:hAnsi="Barlow" w:cs="Barlow"/>
                 <w:b w:val="0"/>
                 <w:i w:val="0"/>
-                <w:sz w:val="15"/>
+                <w:sz w:val="14"/>
               </w:rPr>
-              <w:t>H11-03-concepts-and-publish-check.docx</w:t>
+              <w:t>H12-03-redraw-lab.docx</w:t>
             </w:r>
           </w:p>
         </w:tc>
         <w:tc>
           <w:tcPr>
-            <w:tcW w:type="dxa" w:w="5400"/>
+            <w:tcW w:type="dxa" w:w="5328"/>
             <w:shd w:val="clear" w:color="auto" w:fill="F4F6F8"/>
           </w:tcPr>
           <w:p>
@@ -1069,9 +1109,9 @@
                 <w:rFonts w:ascii="Barlow" w:hAnsi="Barlow" w:cs="Barlow"/>
                 <w:b w:val="0"/>
                 <w:i w:val="0"/>
-                <w:sz w:val="15"/>
+                <w:sz w:val="14"/>
               </w:rPr>
-              <w:t>Five concepts and the authority boundary</w:t>
+              <w:t>Source values and two redraw work areas</w:t>
             </w:r>
           </w:p>
         </w:tc>
@@ -1079,7 +1119,7 @@
       <w:tr>
         <w:tc>
           <w:tcPr>
-            <w:tcW w:type="dxa" w:w="4536"/>
+            <w:tcW w:type="dxa" w:w="4608"/>
           </w:tcPr>
           <w:p>
             <w:pPr>
@@ -1090,15 +1130,15 @@
                 <w:rFonts w:ascii="Barlow" w:hAnsi="Barlow" w:cs="Barlow"/>
                 <w:b w:val="0"/>
                 <w:i w:val="0"/>
-                <w:sz w:val="15"/>
+                <w:sz w:val="14"/>
               </w:rPr>
-              <w:t>H11-04-note-v2-and-decision-log.docx</w:t>
+              <w:t>H12-04-HW6-two-redraws.docx</w:t>
             </w:r>
           </w:p>
         </w:tc>
         <w:tc>
           <w:tcPr>
-            <w:tcW w:type="dxa" w:w="5400"/>
+            <w:tcW w:type="dxa" w:w="5328"/>
           </w:tcPr>
           <w:p>
             <w:pPr>
@@ -1109,9 +1149,9 @@
                 <w:rFonts w:ascii="Barlow" w:hAnsi="Barlow" w:cs="Barlow"/>
                 <w:b w:val="0"/>
                 <w:i w:val="0"/>
-                <w:sz w:val="15"/>
+                <w:sz w:val="14"/>
               </w:rPr>
-              <w:t>Claim / check / result hand-in</w:t>
+              <w:t>HW6 hand-in and Unit 2 Note v2</w:t>
             </w:r>
           </w:p>
         </w:tc>
@@ -1119,7 +1159,7 @@
       <w:tr>
         <w:tc>
           <w:tcPr>
-            <w:tcW w:type="dxa" w:w="4536"/>
+            <w:tcW w:type="dxa" w:w="4608"/>
             <w:shd w:val="clear" w:color="auto" w:fill="F4F6F8"/>
           </w:tcPr>
           <w:p>
@@ -1131,15 +1171,15 @@
                 <w:rFonts w:ascii="Barlow" w:hAnsi="Barlow" w:cs="Barlow"/>
                 <w:b w:val="0"/>
                 <w:i w:val="0"/>
-                <w:sz w:val="15"/>
+                <w:sz w:val="14"/>
               </w:rPr>
-              <w:t>M11-dashboard-tile-register.csv</w:t>
+              <w:t>H12-05-exam-1-review.docx</w:t>
             </w:r>
           </w:p>
         </w:tc>
         <w:tc>
           <w:tcPr>
-            <w:tcW w:type="dxa" w:w="5400"/>
+            <w:tcW w:type="dxa" w:w="5328"/>
             <w:shd w:val="clear" w:color="auto" w:fill="F4F6F8"/>
           </w:tcPr>
           <w:p>
@@ -1151,9 +1191,9 @@
                 <w:rFonts w:ascii="Barlow" w:hAnsi="Barlow" w:cs="Barlow"/>
                 <w:b w:val="0"/>
                 <w:i w:val="0"/>
-                <w:sz w:val="15"/>
+                <w:sz w:val="14"/>
               </w:rPr>
-              <w:t>Deterministic definitions and provenance for all tiles</w:t>
+              <w:t>Separate spoiler-safe 25-minute Units 1–2 review</w:t>
             </w:r>
           </w:p>
         </w:tc>
@@ -1161,7 +1201,7 @@
       <w:tr>
         <w:tc>
           <w:tcPr>
-            <w:tcW w:type="dxa" w:w="4536"/>
+            <w:tcW w:type="dxa" w:w="4608"/>
           </w:tcPr>
           <w:p>
             <w:pPr>
@@ -1172,15 +1212,15 @@
                 <w:rFonts w:ascii="Barlow" w:hAnsi="Barlow" w:cs="Barlow"/>
                 <w:b w:val="0"/>
                 <w:i w:val="0"/>
-                <w:sz w:val="15"/>
+                <w:sz w:val="14"/>
               </w:rPr>
-              <w:t>M11-five-tile-dashboard.png</w:t>
+              <w:t>H12-06-async-code-reading-primer.docx</w:t>
             </w:r>
           </w:p>
         </w:tc>
         <w:tc>
           <w:tcPr>
-            <w:tcW w:type="dxa" w:w="5400"/>
+            <w:tcW w:type="dxa" w:w="5328"/>
           </w:tcPr>
           <w:p>
             <w:pPr>
@@ -1191,9 +1231,9 @@
                 <w:rFonts w:ascii="Barlow" w:hAnsi="Barlow" w:cs="Barlow"/>
                 <w:b w:val="0"/>
                 <w:i w:val="0"/>
-                <w:sz w:val="15"/>
+                <w:sz w:val="14"/>
               </w:rPr>
-              <w:t>Rendered dashboard stub used in the pack</w:t>
+              <w:t>Primer assignment due before M15</w:t>
             </w:r>
           </w:p>
         </w:tc>
@@ -1201,7 +1241,7 @@
       <w:tr>
         <w:tc>
           <w:tcPr>
-            <w:tcW w:type="dxa" w:w="4536"/>
+            <w:tcW w:type="dxa" w:w="4608"/>
             <w:shd w:val="clear" w:color="auto" w:fill="F4F6F8"/>
           </w:tcPr>
           <w:p>
@@ -1213,15 +1253,15 @@
                 <w:rFonts w:ascii="Barlow" w:hAnsi="Barlow" w:cs="Barlow"/>
                 <w:b w:val="0"/>
                 <w:i w:val="0"/>
-                <w:sz w:val="15"/>
+                <w:sz w:val="14"/>
               </w:rPr>
-              <w:t>KEY-M11-answer-key.docx</w:t>
+              <w:t>M12-*.csv</w:t>
             </w:r>
           </w:p>
         </w:tc>
         <w:tc>
           <w:tcPr>
-            <w:tcW w:type="dxa" w:w="5400"/>
+            <w:tcW w:type="dxa" w:w="5328"/>
             <w:shd w:val="clear" w:color="auto" w:fill="F4F6F8"/>
           </w:tcPr>
           <w:p>
@@ -1233,9 +1273,9 @@
                 <w:rFonts w:ascii="Barlow" w:hAnsi="Barlow" w:cs="Barlow"/>
                 <w:b w:val="0"/>
                 <w:i w:val="0"/>
-                <w:sz w:val="15"/>
+                <w:sz w:val="14"/>
               </w:rPr>
-              <w:t>Instructor-only designed errors and acceptable decisions</w:t>
+              <w:t>Deterministic strain, hourly traffic, and vehicle-class source data</w:t>
             </w:r>
           </w:p>
         </w:tc>
@@ -1243,7 +1283,7 @@
       <w:tr>
         <w:tc>
           <w:tcPr>
-            <w:tcW w:type="dxa" w:w="4536"/>
+            <w:tcW w:type="dxa" w:w="4608"/>
           </w:tcPr>
           <w:p>
             <w:pPr>
@@ -1254,15 +1294,15 @@
                 <w:rFonts w:ascii="Barlow" w:hAnsi="Barlow" w:cs="Barlow"/>
                 <w:b w:val="0"/>
                 <w:i w:val="0"/>
-                <w:sz w:val="15"/>
+                <w:sz w:val="14"/>
               </w:rPr>
-              <w:t>../00-INSTRUCTOR/source-notes/M11-story-SAY.md</w:t>
+              <w:t>M12-tile-*.png</w:t>
             </w:r>
           </w:p>
         </w:tc>
         <w:tc>
           <w:tcPr>
-            <w:tcW w:type="dxa" w:w="5400"/>
+            <w:tcW w:type="dxa" w:w="5328"/>
           </w:tcPr>
           <w:p>
             <w:pPr>
@@ -1273,9 +1313,133 @@
                 <w:rFonts w:ascii="Barlow" w:hAnsi="Barlow" w:cs="Barlow"/>
                 <w:b w:val="0"/>
                 <w:i w:val="0"/>
-                <w:sz w:val="15"/>
+                <w:sz w:val="14"/>
               </w:rPr>
-              <w:t>Cloud-passed canon story and SAY source</w:t>
+              <w:t>Three student hunt charts</w:t>
+            </w:r>
+          </w:p>
+        </w:tc>
+      </w:tr>
+      <w:tr>
+        <w:tc>
+          <w:tcPr>
+            <w:tcW w:type="dxa" w:w="4608"/>
+            <w:shd w:val="clear" w:color="auto" w:fill="F4F6F8"/>
+          </w:tcPr>
+          <w:p>
+            <w:pPr>
+              <w:spacing w:before="20" w:after="20" w:line="252" w:lineRule="auto"/>
+            </w:pPr>
+            <w:r>
+              <w:rPr>
+                <w:rFonts w:ascii="Barlow" w:hAnsi="Barlow" w:cs="Barlow"/>
+                <w:b w:val="0"/>
+                <w:i w:val="0"/>
+                <w:sz w:val="14"/>
+              </w:rPr>
+              <w:t>M12-fix-*.png</w:t>
+            </w:r>
+          </w:p>
+        </w:tc>
+        <w:tc>
+          <w:tcPr>
+            <w:tcW w:type="dxa" w:w="5328"/>
+            <w:shd w:val="clear" w:color="auto" w:fill="F4F6F8"/>
+          </w:tcPr>
+          <w:p>
+            <w:pPr>
+              <w:spacing w:before="20" w:after="20" w:line="252" w:lineRule="auto"/>
+            </w:pPr>
+            <w:r>
+              <w:rPr>
+                <w:rFonts w:ascii="Barlow" w:hAnsi="Barlow" w:cs="Barlow"/>
+                <w:b w:val="0"/>
+                <w:i w:val="0"/>
+                <w:sz w:val="14"/>
+              </w:rPr>
+              <w:t>Instructor-only model redraws</w:t>
+            </w:r>
+          </w:p>
+        </w:tc>
+      </w:tr>
+      <w:tr>
+        <w:tc>
+          <w:tcPr>
+            <w:tcW w:type="dxa" w:w="4608"/>
+          </w:tcPr>
+          <w:p>
+            <w:pPr>
+              <w:spacing w:before="20" w:after="20" w:line="252" w:lineRule="auto"/>
+            </w:pPr>
+            <w:r>
+              <w:rPr>
+                <w:rFonts w:ascii="Barlow" w:hAnsi="Barlow" w:cs="Barlow"/>
+                <w:b w:val="0"/>
+                <w:i w:val="0"/>
+                <w:sz w:val="14"/>
+              </w:rPr>
+              <w:t>KEY-M12-answer-key.docx</w:t>
+            </w:r>
+          </w:p>
+        </w:tc>
+        <w:tc>
+          <w:tcPr>
+            <w:tcW w:type="dxa" w:w="5328"/>
+          </w:tcPr>
+          <w:p>
+            <w:pPr>
+              <w:spacing w:before="20" w:after="20" w:line="252" w:lineRule="auto"/>
+            </w:pPr>
+            <w:r>
+              <w:rPr>
+                <w:rFonts w:ascii="Barlow" w:hAnsi="Barlow" w:cs="Barlow"/>
+                <w:b w:val="0"/>
+                <w:i w:val="0"/>
+                <w:sz w:val="14"/>
+              </w:rPr>
+              <w:t>Dispositions, model repairs, timing conflict, and boundaries</w:t>
+            </w:r>
+          </w:p>
+        </w:tc>
+      </w:tr>
+      <w:tr>
+        <w:tc>
+          <w:tcPr>
+            <w:tcW w:type="dxa" w:w="4608"/>
+            <w:shd w:val="clear" w:color="auto" w:fill="F4F6F8"/>
+          </w:tcPr>
+          <w:p>
+            <w:pPr>
+              <w:spacing w:before="20" w:after="20" w:line="252" w:lineRule="auto"/>
+            </w:pPr>
+            <w:r>
+              <w:rPr>
+                <w:rFonts w:ascii="Barlow" w:hAnsi="Barlow" w:cs="Barlow"/>
+                <w:b w:val="0"/>
+                <w:i w:val="0"/>
+                <w:sz w:val="14"/>
+              </w:rPr>
+              <w:t>../00-INSTRUCTOR/source-notes/M12-story-SAY.md</w:t>
+            </w:r>
+          </w:p>
+        </w:tc>
+        <w:tc>
+          <w:tcPr>
+            <w:tcW w:type="dxa" w:w="5328"/>
+            <w:shd w:val="clear" w:color="auto" w:fill="F4F6F8"/>
+          </w:tcPr>
+          <w:p>
+            <w:pPr>
+              <w:spacing w:before="20" w:after="20" w:line="252" w:lineRule="auto"/>
+            </w:pPr>
+            <w:r>
+              <w:rPr>
+                <w:rFonts w:ascii="Barlow" w:hAnsi="Barlow" w:cs="Barlow"/>
+                <w:b w:val="0"/>
+                <w:i w:val="0"/>
+                <w:sz w:val="14"/>
+              </w:rPr>
+              <w:t>Cloud-PASS revised M12 canon SAY</w:t>
             </w:r>
           </w:p>
         </w:tc>
@@ -1311,7 +1475,7 @@
         <w:color w:val="6B7280"/>
         <w:sz w:val="16"/>
       </w:rPr>
-      <w:t>SEIS 201  ·  M01 – M11</w:t>
+      <w:t>SEIS 201  ·  M01 – M12</w:t>
     </w:r>
     <w:r>
       <w:tab/>
@@ -1384,7 +1548,7 @@
         <w:caps w:val="1"/>
         <w:spacing w:val="20"/>
       </w:rPr>
-      <w:t>M01 – M11  ·  FILE INDEX</w:t>
+      <w:t>M01 – M12  ·  FILE INDEX</w:t>
     </w:r>
   </w:p>
 </w:hdr>

</xml_diff>

<commit_message>
Build M13 late pipeline teaching pack
Co-authored-by: shaseaver25 <shannon@tailoredu.org>
</commit_message>
<xml_diff>
--- a/teaching-pack/00-INSTRUCTOR/FILE-INDEX.docx
+++ b/teaching-pack/00-INSTRUCTOR/FILE-INDEX.docx
@@ -19,7 +19,7 @@
     </w:p>
     <w:p>
       <w:pPr>
-        <w:spacing w:before="0" w:after="120" w:line="276" w:lineRule="auto"/>
+        <w:spacing w:before="0" w:after="200" w:line="276" w:lineRule="auto"/>
       </w:pPr>
       <w:r>
         <w:rPr>
@@ -29,7 +29,7 @@
           <w:color w:val="6B7280"/>
           <w:sz w:val="18"/>
         </w:rPr>
-        <w:t>Folders are in teaching order. M11 uses folder 15 and M12 uses folder 16, keeping meeting and pack numbering stable.</w:t>
+        <w:t>M13 is folder 17 in teaching order. It is designed to follow the separately built M11 dashboard and M12 chart packs when those branches land.</w:t>
       </w:r>
     </w:p>
     <w:tbl>
@@ -66,7 +66,7 @@
                 <w:b/>
                 <w:i w:val="0"/>
                 <w:color w:val="FFFFFF"/>
-                <w:sz w:val="14"/>
+                <w:sz w:val="13"/>
               </w:rPr>
               <w:t>Folder</w:t>
             </w:r>
@@ -87,7 +87,7 @@
                 <w:b/>
                 <w:i w:val="0"/>
                 <w:color w:val="FFFFFF"/>
-                <w:sz w:val="14"/>
+                <w:sz w:val="13"/>
               </w:rPr>
               <w:t>Purpose</w:t>
             </w:r>
@@ -108,7 +108,7 @@
                 <w:rFonts w:ascii="Barlow" w:hAnsi="Barlow" w:cs="Barlow"/>
                 <w:b w:val="0"/>
                 <w:i w:val="0"/>
-                <w:sz w:val="14"/>
+                <w:sz w:val="13"/>
               </w:rPr>
               <w:t>00-INSTRUCTOR</w:t>
             </w:r>
@@ -127,9 +127,9 @@
                 <w:rFonts w:ascii="Barlow" w:hAnsi="Barlow" w:cs="Barlow"/>
                 <w:b w:val="0"/>
                 <w:i w:val="0"/>
-                <w:sz w:val="14"/>
+                <w:sz w:val="13"/>
               </w:rPr>
-              <w:t>Run-of-day desk, faculty brief, source SAY notes, TOC, and this index</w:t>
+              <w:t>Run-of-day desk, faculty brief, source SAY notes, and this index</w:t>
             </w:r>
           </w:p>
         </w:tc>
@@ -149,7 +149,7 @@
                 <w:rFonts w:ascii="Barlow" w:hAnsi="Barlow" w:cs="Barlow"/>
                 <w:b w:val="0"/>
                 <w:i w:val="0"/>
-                <w:sz w:val="14"/>
+                <w:sz w:val="13"/>
               </w:rPr>
               <w:t>01-BRAND-KIT</w:t>
             </w:r>
@@ -169,7 +169,7 @@
                 <w:rFonts w:ascii="Barlow" w:hAnsi="Barlow" w:cs="Barlow"/>
                 <w:b w:val="0"/>
                 <w:i w:val="0"/>
-                <w:sz w:val="14"/>
+                <w:sz w:val="13"/>
               </w:rPr>
               <w:t>ACMEJOB logos, fonts, templates, and brand guide</w:t>
             </w:r>
@@ -190,7 +190,7 @@
                 <w:rFonts w:ascii="Barlow" w:hAnsi="Barlow" w:cs="Barlow"/>
                 <w:b w:val="0"/>
                 <w:i w:val="0"/>
-                <w:sz w:val="14"/>
+                <w:sz w:val="13"/>
               </w:rPr>
               <w:t>02-M01-first-day</w:t>
             </w:r>
@@ -209,7 +209,7 @@
                 <w:rFonts w:ascii="Barlow" w:hAnsi="Barlow" w:cs="Barlow"/>
                 <w:b w:val="0"/>
                 <w:i w:val="0"/>
-                <w:sz w:val="14"/>
+                <w:sz w:val="13"/>
               </w:rPr>
               <w:t>Rules versus learned patterns</w:t>
             </w:r>
@@ -231,7 +231,7 @@
                 <w:rFonts w:ascii="Barlow" w:hAnsi="Barlow" w:cs="Barlow"/>
                 <w:b w:val="0"/>
                 <w:i w:val="0"/>
-                <w:sz w:val="14"/>
+                <w:sz w:val="13"/>
               </w:rPr>
               <w:t>03-M02-measurement</w:t>
             </w:r>
@@ -251,9 +251,9 @@
                 <w:rFonts w:ascii="Barlow" w:hAnsi="Barlow" w:cs="Barlow"/>
                 <w:b w:val="0"/>
                 <w:i w:val="0"/>
-                <w:sz w:val="14"/>
+                <w:sz w:val="13"/>
               </w:rPr>
-              <w:t>Measurement, uncertainty, and G6</w:t>
+              <w:t>Measurement, resolution, uncertainty, and G6</w:t>
             </w:r>
           </w:p>
         </w:tc>
@@ -272,7 +272,7 @@
                 <w:rFonts w:ascii="Barlow" w:hAnsi="Barlow" w:cs="Barlow"/>
                 <w:b w:val="0"/>
                 <w:i w:val="0"/>
-                <w:sz w:val="14"/>
+                <w:sz w:val="13"/>
               </w:rPr>
               <w:t>04-M03-hallucination</w:t>
             </w:r>
@@ -291,7 +291,7 @@
                 <w:rFonts w:ascii="Barlow" w:hAnsi="Barlow" w:cs="Barlow"/>
                 <w:b w:val="0"/>
                 <w:i w:val="0"/>
-                <w:sz w:val="14"/>
+                <w:sz w:val="13"/>
               </w:rPr>
               <w:t>Next-token generation and source checking</w:t>
             </w:r>
@@ -313,7 +313,7 @@
                 <w:rFonts w:ascii="Barlow" w:hAnsi="Barlow" w:cs="Barlow"/>
                 <w:b w:val="0"/>
                 <w:i w:val="0"/>
-                <w:sz w:val="14"/>
+                <w:sz w:val="13"/>
               </w:rPr>
               <w:t>05-CHARTS</w:t>
             </w:r>
@@ -333,7 +333,7 @@
                 <w:rFonts w:ascii="Barlow" w:hAnsi="Barlow" w:cs="Barlow"/>
                 <w:b w:val="0"/>
                 <w:i w:val="0"/>
-                <w:sz w:val="14"/>
+                <w:sz w:val="13"/>
               </w:rPr>
               <w:t>Reusable meeting-deck charts</w:t>
             </w:r>
@@ -354,7 +354,7 @@
                 <w:rFonts w:ascii="Barlow" w:hAnsi="Barlow" w:cs="Barlow"/>
                 <w:b w:val="0"/>
                 <w:i w:val="0"/>
-                <w:sz w:val="14"/>
+                <w:sz w:val="13"/>
               </w:rPr>
               <w:t>06-BRIDGE</w:t>
             </w:r>
@@ -373,7 +373,7 @@
                 <w:rFonts w:ascii="Barlow" w:hAnsi="Barlow" w:cs="Barlow"/>
                 <w:b w:val="0"/>
                 <w:i w:val="0"/>
-                <w:sz w:val="14"/>
+                <w:sz w:val="13"/>
               </w:rPr>
               <w:t>Reusable bridge illustrations and schematics</w:t>
             </w:r>
@@ -395,7 +395,7 @@
                 <w:rFonts w:ascii="Barlow" w:hAnsi="Barlow" w:cs="Barlow"/>
                 <w:b w:val="0"/>
                 <w:i w:val="0"/>
-                <w:sz w:val="14"/>
+                <w:sz w:val="13"/>
               </w:rPr>
               <w:t>07-HW-CASE-B-LIFT-STATION</w:t>
             </w:r>
@@ -415,7 +415,7 @@
                 <w:rFonts w:ascii="Barlow" w:hAnsi="Barlow" w:cs="Barlow"/>
                 <w:b w:val="0"/>
                 <w:i w:val="0"/>
-                <w:sz w:val="14"/>
+                <w:sz w:val="13"/>
               </w:rPr>
               <w:t>M02 transfer homework and instructor key</w:t>
             </w:r>
@@ -436,7 +436,7 @@
                 <w:rFonts w:ascii="Barlow" w:hAnsi="Barlow" w:cs="Barlow"/>
                 <w:b w:val="0"/>
                 <w:i w:val="0"/>
-                <w:sz w:val="14"/>
+                <w:sz w:val="13"/>
               </w:rPr>
               <w:t>08-M04-one-number</w:t>
             </w:r>
@@ -455,7 +455,7 @@
                 <w:rFonts w:ascii="Barlow" w:hAnsi="Barlow" w:cs="Barlow"/>
                 <w:b w:val="0"/>
                 <w:i w:val="0"/>
-                <w:sz w:val="14"/>
+                <w:sz w:val="13"/>
               </w:rPr>
               <w:t>Center, spread, CV, low count, and sample scope</w:t>
             </w:r>
@@ -477,7 +477,7 @@
                 <w:rFonts w:ascii="Barlow" w:hAnsi="Barlow" w:cs="Barlow"/>
                 <w:b w:val="0"/>
                 <w:i w:val="0"/>
-                <w:sz w:val="14"/>
+                <w:sz w:val="13"/>
               </w:rPr>
               <w:t>09-M05-overnight-alarm</w:t>
             </w:r>
@@ -497,9 +497,9 @@
                 <w:rFonts w:ascii="Barlow" w:hAnsi="Barlow" w:cs="Barlow"/>
                 <w:b w:val="0"/>
                 <w:i w:val="0"/>
-                <w:sz w:val="14"/>
+                <w:sz w:val="13"/>
               </w:rPr>
-              <w:t>Agent loop and threshold alarm</w:t>
+              <w:t>Agent loop, threshold alarm, and unresolved event</w:t>
             </w:r>
           </w:p>
         </w:tc>
@@ -518,7 +518,7 @@
                 <w:rFonts w:ascii="Barlow" w:hAnsi="Barlow" w:cs="Barlow"/>
                 <w:b w:val="0"/>
                 <w:i w:val="0"/>
-                <w:sz w:val="14"/>
+                <w:sz w:val="13"/>
               </w:rPr>
               <w:t>10-M06-alarm-audit</w:t>
             </w:r>
@@ -537,9 +537,9 @@
                 <w:rFonts w:ascii="Barlow" w:hAnsi="Barlow" w:cs="Barlow"/>
                 <w:b w:val="0"/>
                 <w:i w:val="0"/>
-                <w:sz w:val="14"/>
+                <w:sz w:val="13"/>
               </w:rPr>
-              <w:t>Distribution audit and Unit 1 handoff</w:t>
+              <w:t>Distribution audit, traffic corroboration, and Unit 1 handoff</w:t>
             </w:r>
           </w:p>
         </w:tc>
@@ -559,7 +559,7 @@
                 <w:rFonts w:ascii="Barlow" w:hAnsi="Barlow" w:cs="Barlow"/>
                 <w:b w:val="0"/>
                 <w:i w:val="0"/>
-                <w:sz w:val="14"/>
+                <w:sz w:val="13"/>
               </w:rPr>
               <w:t>11-M07-training-mismatch</w:t>
             </w:r>
@@ -579,9 +579,9 @@
                 <w:rFonts w:ascii="Barlow" w:hAnsi="Barlow" w:cs="Barlow"/>
                 <w:b w:val="0"/>
                 <w:i w:val="0"/>
-                <w:sz w:val="14"/>
+                <w:sz w:val="13"/>
               </w:rPr>
-              <w:t>Training coverage and distribution shift</w:t>
+              <w:t>Training bias, distribution shift, and Unit 2 note v2</w:t>
             </w:r>
           </w:p>
         </w:tc>
@@ -600,7 +600,7 @@
                 <w:rFonts w:ascii="Barlow" w:hAnsi="Barlow" w:cs="Barlow"/>
                 <w:b w:val="0"/>
                 <w:i w:val="0"/>
-                <w:sz w:val="14"/>
+                <w:sz w:val="13"/>
               </w:rPr>
               <w:t>12-M08-spurious-correlation</w:t>
             </w:r>
@@ -619,9 +619,9 @@
                 <w:rFonts w:ascii="Barlow" w:hAnsi="Barlow" w:cs="Barlow"/>
                 <w:b w:val="0"/>
                 <w:i w:val="0"/>
-                <w:sz w:val="14"/>
+                <w:sz w:val="13"/>
               </w:rPr>
-              <w:t>Regression and the thermal confound</w:t>
+              <w:t>Correlation, regression, thermal confound, and HW4</w:t>
             </w:r>
           </w:p>
         </w:tc>
@@ -641,7 +641,7 @@
                 <w:rFonts w:ascii="Barlow" w:hAnsi="Barlow" w:cs="Barlow"/>
                 <w:b w:val="0"/>
                 <w:i w:val="0"/>
-                <w:sz w:val="14"/>
+                <w:sz w:val="13"/>
               </w:rPr>
               <w:t>13-M09-false-precision</w:t>
             </w:r>
@@ -661,9 +661,9 @@
                 <w:rFonts w:ascii="Barlow" w:hAnsi="Barlow" w:cs="Barlow"/>
                 <w:b w:val="0"/>
                 <w:i w:val="0"/>
-                <w:sz w:val="14"/>
+                <w:sz w:val="13"/>
               </w:rPr>
-              <w:t>False precision and sampling variability</w:t>
+              <w:t>Overconfidence, false precision, sampling, and sample scope</w:t>
             </w:r>
           </w:p>
         </w:tc>
@@ -682,7 +682,7 @@
                 <w:rFonts w:ascii="Barlow" w:hAnsi="Barlow" w:cs="Barlow"/>
                 <w:b w:val="0"/>
                 <w:i w:val="0"/>
-                <w:sz w:val="14"/>
+                <w:sz w:val="13"/>
               </w:rPr>
               <w:t>14-M10-deterioration-v-noise</w:t>
             </w:r>
@@ -701,9 +701,9 @@
                 <w:rFonts w:ascii="Barlow" w:hAnsi="Barlow" w:cs="Barlow"/>
                 <w:b w:val="0"/>
                 <w:i w:val="0"/>
-                <w:sz w:val="14"/>
+                <w:sz w:val="13"/>
               </w:rPr>
-              <w:t>Paired intervals and signal/noise audit</w:t>
+              <w:t>Paired intervals, signal/noise audit, and HW5 callback</w:t>
             </w:r>
           </w:p>
         </w:tc>
@@ -723,7 +723,7 @@
                 <w:rFonts w:ascii="Barlow" w:hAnsi="Barlow" w:cs="Barlow"/>
                 <w:b w:val="0"/>
                 <w:i w:val="0"/>
-                <w:sz w:val="14"/>
+                <w:sz w:val="13"/>
               </w:rPr>
               <w:t>15-M11-dashboard-publish</w:t>
             </w:r>
@@ -743,9 +743,9 @@
                 <w:rFonts w:ascii="Barlow" w:hAnsi="Barlow" w:cs="Barlow"/>
                 <w:b w:val="0"/>
                 <w:i w:val="0"/>
-                <w:sz w:val="14"/>
+                <w:sz w:val="13"/>
               </w:rPr>
-              <w:t>Agentic dashboard review and human publish checkpoint</w:t>
+              <w:t>Agent dashboard and human publish checkpoint</w:t>
             </w:r>
           </w:p>
         </w:tc>
@@ -764,9 +764,9 @@
                 <w:rFonts w:ascii="Barlow" w:hAnsi="Barlow" w:cs="Barlow"/>
                 <w:b w:val="0"/>
                 <w:i w:val="0"/>
-                <w:sz w:val="14"/>
+                <w:sz w:val="13"/>
               </w:rPr>
-              <w:t>16-M12-misleading-charts</w:t>
+              <w:t>16-M12-chart-critique</w:t>
             </w:r>
           </w:p>
         </w:tc>
@@ -783,9 +783,51 @@
                 <w:rFonts w:ascii="Barlow" w:hAnsi="Barlow" w:cs="Barlow"/>
                 <w:b w:val="0"/>
                 <w:i w:val="0"/>
-                <w:sz w:val="14"/>
+                <w:sz w:val="13"/>
               </w:rPr>
-              <w:t>Chart-type and truncated-axis hunt, HW6, and separate review</w:t>
+              <w:t>Chart selection, axes, and misleading visual claims</w:t>
+            </w:r>
+          </w:p>
+        </w:tc>
+      </w:tr>
+      <w:tr>
+        <w:tc>
+          <w:tcPr>
+            <w:tcW w:type="dxa" w:w="3960"/>
+            <w:shd w:val="clear" w:color="auto" w:fill="F4F6F8"/>
+          </w:tcPr>
+          <w:p>
+            <w:pPr>
+              <w:spacing w:before="20" w:after="20" w:line="252" w:lineRule="auto"/>
+            </w:pPr>
+            <w:r>
+              <w:rPr>
+                <w:rFonts w:ascii="Barlow" w:hAnsi="Barlow" w:cs="Barlow"/>
+                <w:b w:val="0"/>
+                <w:i w:val="0"/>
+                <w:sz w:val="13"/>
+              </w:rPr>
+              <w:t>17-M13-wes-handoff</w:t>
+            </w:r>
+          </w:p>
+        </w:tc>
+        <w:tc>
+          <w:tcPr>
+            <w:tcW w:type="dxa" w:w="5976"/>
+            <w:shd w:val="clear" w:color="auto" w:fill="F4F6F8"/>
+          </w:tcPr>
+          <w:p>
+            <w:pPr>
+              <w:spacing w:before="20" w:after="20" w:line="252" w:lineRule="auto"/>
+            </w:pPr>
+            <w:r>
+              <w:rPr>
+                <w:rFonts w:ascii="Barlow" w:hAnsi="Barlow" w:cs="Barlow"/>
+                <w:b w:val="0"/>
+                <w:i w:val="0"/>
+                <w:sz w:val="13"/>
+              </w:rPr>
+              <w:t>Pipeline ingestion, mixed formats, missing data, and Unit 2 debrief</w:t>
             </w:r>
           </w:p>
         </w:tc>
@@ -805,7 +847,7 @@
           <w:caps w:val="1"/>
           <w:spacing w:val="12"/>
         </w:rPr>
-        <w:t>16-M12-misleading-charts</w:t>
+        <w:t>17-M13-wes-handoff</w:t>
       </w:r>
     </w:p>
     <w:tbl>
@@ -886,7 +928,7 @@
                 <w:i w:val="0"/>
                 <w:sz w:val="14"/>
               </w:rPr>
-              <w:t>M12-student.pptx</w:t>
+              <w:t>M13-student.pptx</w:t>
             </w:r>
           </w:p>
         </w:tc>
@@ -905,7 +947,7 @@
                 <w:i w:val="0"/>
                 <w:sz w:val="14"/>
               </w:rPr>
-              <w:t>Spoiler-safe Teach, chart hunt, Lab, and separate review transition</w:t>
+              <w:t>Spoiler-safe inbox, concepts, trace hunt, Note v2, and debrief</w:t>
             </w:r>
           </w:p>
         </w:tc>
@@ -927,7 +969,7 @@
                 <w:i w:val="0"/>
                 <w:sz w:val="14"/>
               </w:rPr>
-              <w:t>M12-instructor-reveal.pptx</w:t>
+              <w:t>M13-instructor-reveal.pptx</w:t>
             </w:r>
           </w:p>
         </w:tc>
@@ -947,7 +989,7 @@
                 <w:i w:val="0"/>
                 <w:sz w:val="14"/>
               </w:rPr>
-              <w:t>Gated designed-error names and corrected charts</w:t>
+              <w:t>Gated silent-ingestion reveal and one worked trace</w:t>
             </w:r>
           </w:p>
         </w:tc>
@@ -968,7 +1010,7 @@
                 <w:i w:val="0"/>
                 <w:sz w:val="14"/>
               </w:rPr>
-              <w:t>FOREMAN-M12-interim-chart-pack.docx</w:t>
+              <w:t>wes_handoff.xlsx</w:t>
             </w:r>
           </w:p>
         </w:tc>
@@ -987,7 +1029,7 @@
                 <w:i w:val="0"/>
                 <w:sz w:val="14"/>
               </w:rPr>
-              <w:t>Three-tile county chart pack; errors unlabeled</w:t>
+              <w:t>Two delivered source sheets from Wes’s four-sheet handoff</w:t>
             </w:r>
           </w:p>
         </w:tc>
@@ -1009,7 +1051,7 @@
                 <w:i w:val="0"/>
                 <w:sz w:val="14"/>
               </w:rPr>
-              <w:t>H12-01-chart-hunt.docx</w:t>
+              <w:t>WES-M13-partial-handoff-note.docx</w:t>
             </w:r>
           </w:p>
         </w:tc>
@@ -1029,7 +1071,7 @@
                 <w:i w:val="0"/>
                 <w:sz w:val="14"/>
               </w:rPr>
-              <w:t>Approve / fix / pull review checkpoint</w:t>
+              <w:t>Late handoff, Diane direction, and M07 liability color</w:t>
             </w:r>
           </w:p>
         </w:tc>
@@ -1050,7 +1092,7 @@
                 <w:i w:val="0"/>
                 <w:sz w:val="14"/>
               </w:rPr>
-              <w:t>H12-02-chart-choice-and-axis-guide.docx</w:t>
+              <w:t>FOREMAN-M13-pipeline-log.docx / .csv</w:t>
             </w:r>
           </w:p>
         </w:tc>
@@ -1069,7 +1111,7 @@
                 <w:i w:val="0"/>
                 <w:sz w:val="14"/>
               </w:rPr>
-              <w:t>Chart type, baseline, and AI-chart reference</w:t>
+              <w:t>Orange machine run record</w:t>
             </w:r>
           </w:p>
         </w:tc>
@@ -1091,7 +1133,7 @@
                 <w:i w:val="0"/>
                 <w:sz w:val="14"/>
               </w:rPr>
-              <w:t>H12-03-redraw-lab.docx</w:t>
+              <w:t>M13-pipeline-output.csv</w:t>
             </w:r>
           </w:p>
         </w:tc>
@@ -1111,7 +1153,7 @@
                 <w:i w:val="0"/>
                 <w:sz w:val="14"/>
               </w:rPr>
-              <w:t>Source values and two redraw work areas</w:t>
+              <w:t>Ten rows emitted to the existing consumer</w:t>
             </w:r>
           </w:p>
         </w:tc>
@@ -1132,7 +1174,7 @@
                 <w:i w:val="0"/>
                 <w:sz w:val="14"/>
               </w:rPr>
-              <w:t>H12-04-HW6-two-redraws.docx</w:t>
+              <w:t>H13-01-pipeline-trace-hunt.docx</w:t>
             </w:r>
           </w:p>
         </w:tc>
@@ -1151,7 +1193,7 @@
                 <w:i w:val="0"/>
                 <w:sz w:val="14"/>
               </w:rPr>
-              <w:t>HW6 hand-in and Unit 2 Note v2</w:t>
+              <w:t>One-value end-to-end trace worksheet</w:t>
             </w:r>
           </w:p>
         </w:tc>
@@ -1173,7 +1215,7 @@
                 <w:i w:val="0"/>
                 <w:sz w:val="14"/>
               </w:rPr>
-              <w:t>H12-05-exam-1-review.docx</w:t>
+              <w:t>H13-02-pipeline-concepts.docx</w:t>
             </w:r>
           </w:p>
         </w:tc>
@@ -1193,7 +1235,7 @@
                 <w:i w:val="0"/>
                 <w:sz w:val="14"/>
               </w:rPr>
-              <w:t>Separate spoiler-safe 25-minute Units 1–2 review</w:t>
+              <w:t>Six concepts and minimum visible records</w:t>
             </w:r>
           </w:p>
         </w:tc>
@@ -1214,7 +1256,7 @@
                 <w:i w:val="0"/>
                 <w:sz w:val="14"/>
               </w:rPr>
-              <w:t>H12-06-async-code-reading-primer.docx</w:t>
+              <w:t>H13-03-note-v2-unchecked-log.docx</w:t>
             </w:r>
           </w:p>
         </w:tc>
@@ -1233,7 +1275,7 @@
                 <w:i w:val="0"/>
                 <w:sz w:val="14"/>
               </w:rPr>
-              <w:t>Primer assignment due before M15</w:t>
+              <w:t>Claim/check/result plus unchecked-column log</w:t>
             </w:r>
           </w:p>
         </w:tc>
@@ -1255,7 +1297,7 @@
                 <w:i w:val="0"/>
                 <w:sz w:val="14"/>
               </w:rPr>
-              <w:t>M12-*.csv</w:t>
+              <w:t>H13-04-unit-2-debrief.docx</w:t>
             </w:r>
           </w:p>
         </w:tc>
@@ -1275,7 +1317,7 @@
                 <w:i w:val="0"/>
                 <w:sz w:val="14"/>
               </w:rPr>
-              <w:t>Deterministic strain, hourly traffic, and vehicle-class source data</w:t>
+              <w:t>Mask-off Unit 2 debrief</w:t>
             </w:r>
           </w:p>
         </w:tc>
@@ -1296,7 +1338,7 @@
                 <w:i w:val="0"/>
                 <w:sz w:val="14"/>
               </w:rPr>
-              <w:t>M12-tile-*.png</w:t>
+              <w:t>KEY-M13-answer-key.docx</w:t>
             </w:r>
           </w:p>
         </w:tc>
@@ -1315,7 +1357,7 @@
                 <w:i w:val="0"/>
                 <w:sz w:val="14"/>
               </w:rPr>
-              <w:t>Three student hunt charts</w:t>
+              <w:t>Instructor-only reveal, worked trace, and boundaries</w:t>
             </w:r>
           </w:p>
         </w:tc>
@@ -1337,7 +1379,7 @@
                 <w:i w:val="0"/>
                 <w:sz w:val="14"/>
               </w:rPr>
-              <w:t>M12-fix-*.png</w:t>
+              <w:t>../00-INSTRUCTOR/source-notes/M13-story-SAY.md</w:t>
             </w:r>
           </w:p>
         </w:tc>
@@ -1357,89 +1399,7 @@
                 <w:i w:val="0"/>
                 <w:sz w:val="14"/>
               </w:rPr>
-              <w:t>Instructor-only model redraws</w:t>
-            </w:r>
-          </w:p>
-        </w:tc>
-      </w:tr>
-      <w:tr>
-        <w:tc>
-          <w:tcPr>
-            <w:tcW w:type="dxa" w:w="4608"/>
-          </w:tcPr>
-          <w:p>
-            <w:pPr>
-              <w:spacing w:before="20" w:after="20" w:line="252" w:lineRule="auto"/>
-            </w:pPr>
-            <w:r>
-              <w:rPr>
-                <w:rFonts w:ascii="Barlow" w:hAnsi="Barlow" w:cs="Barlow"/>
-                <w:b w:val="0"/>
-                <w:i w:val="0"/>
-                <w:sz w:val="14"/>
-              </w:rPr>
-              <w:t>KEY-M12-answer-key.docx</w:t>
-            </w:r>
-          </w:p>
-        </w:tc>
-        <w:tc>
-          <w:tcPr>
-            <w:tcW w:type="dxa" w:w="5328"/>
-          </w:tcPr>
-          <w:p>
-            <w:pPr>
-              <w:spacing w:before="20" w:after="20" w:line="252" w:lineRule="auto"/>
-            </w:pPr>
-            <w:r>
-              <w:rPr>
-                <w:rFonts w:ascii="Barlow" w:hAnsi="Barlow" w:cs="Barlow"/>
-                <w:b w:val="0"/>
-                <w:i w:val="0"/>
-                <w:sz w:val="14"/>
-              </w:rPr>
-              <w:t>Dispositions, model repairs, timing conflict, and boundaries</w:t>
-            </w:r>
-          </w:p>
-        </w:tc>
-      </w:tr>
-      <w:tr>
-        <w:tc>
-          <w:tcPr>
-            <w:tcW w:type="dxa" w:w="4608"/>
-            <w:shd w:val="clear" w:color="auto" w:fill="F4F6F8"/>
-          </w:tcPr>
-          <w:p>
-            <w:pPr>
-              <w:spacing w:before="20" w:after="20" w:line="252" w:lineRule="auto"/>
-            </w:pPr>
-            <w:r>
-              <w:rPr>
-                <w:rFonts w:ascii="Barlow" w:hAnsi="Barlow" w:cs="Barlow"/>
-                <w:b w:val="0"/>
-                <w:i w:val="0"/>
-                <w:sz w:val="14"/>
-              </w:rPr>
-              <w:t>../00-INSTRUCTOR/source-notes/M12-story-SAY.md</w:t>
-            </w:r>
-          </w:p>
-        </w:tc>
-        <w:tc>
-          <w:tcPr>
-            <w:tcW w:type="dxa" w:w="5328"/>
-            <w:shd w:val="clear" w:color="auto" w:fill="F4F6F8"/>
-          </w:tcPr>
-          <w:p>
-            <w:pPr>
-              <w:spacing w:before="20" w:after="20" w:line="252" w:lineRule="auto"/>
-            </w:pPr>
-            <w:r>
-              <w:rPr>
-                <w:rFonts w:ascii="Barlow" w:hAnsi="Barlow" w:cs="Barlow"/>
-                <w:b w:val="0"/>
-                <w:i w:val="0"/>
-                <w:sz w:val="14"/>
-              </w:rPr>
-              <w:t>Cloud-PASS revised M12 canon SAY</w:t>
+              <w:t>Cloud-PASS M13 canon story and SAY source</w:t>
             </w:r>
           </w:p>
         </w:tc>
@@ -1475,7 +1435,7 @@
         <w:color w:val="6B7280"/>
         <w:sz w:val="16"/>
       </w:rPr>
-      <w:t>SEIS 201  ·  M01 – M12</w:t>
+      <w:t>SEIS 201  ·  M01 – M13</w:t>
     </w:r>
     <w:r>
       <w:tab/>
@@ -1548,7 +1508,7 @@
         <w:caps w:val="1"/>
         <w:spacing w:val="20"/>
       </w:rPr>
-      <w:t>M01 – M12  ·  FILE INDEX</w:t>
+      <w:t>M01 – M13  ·  FILE INDEX</w:t>
     </w:r>
   </w:p>
 </w:hdr>

</xml_diff>

<commit_message>
Regenerate M12 file index after M11 merge
Co-authored-by: shaseaver25 <shannon@tailoredu.org>
</commit_message>
<xml_diff>
--- a/teaching-pack/00-INSTRUCTOR/FILE-INDEX.docx
+++ b/teaching-pack/00-INSTRUCTOR/FILE-INDEX.docx
@@ -29,7 +29,7 @@
           <w:color w:val="6B7280"/>
           <w:sz w:val="18"/>
         </w:rPr>
-        <w:t>Folders are in teaching order. Folder 15 is reserved for M11; M12 is folder 16 so meeting and pack numbering remain stable when the M11 pack lands.</w:t>
+        <w:t>Folders are in teaching order. M11 uses folder 15 and M12 uses folder 16, keeping meeting and pack numbering stable.</w:t>
       </w:r>
     </w:p>
     <w:tbl>
@@ -725,7 +725,7 @@
                 <w:i w:val="0"/>
                 <w:sz w:val="14"/>
               </w:rPr>
-              <w:t>15-M11 (reserved)</w:t>
+              <w:t>15-M11-dashboard-publish</w:t>
             </w:r>
           </w:p>
         </w:tc>
@@ -745,7 +745,7 @@
                 <w:i w:val="0"/>
                 <w:sz w:val="14"/>
               </w:rPr>
-              <w:t>Agentic dashboard meeting; pack not present on this branch</w:t>
+              <w:t>Agentic dashboard review and human publish checkpoint</w:t>
             </w:r>
           </w:p>
         </w:tc>

</xml_diff>

<commit_message>
Regenerate M13 file index after stacking packs
Co-authored-by: shaseaver25 <shannon@tailoredu.org>
</commit_message>
<xml_diff>
--- a/teaching-pack/00-INSTRUCTOR/FILE-INDEX.docx
+++ b/teaching-pack/00-INSTRUCTOR/FILE-INDEX.docx
@@ -29,7 +29,7 @@
           <w:color w:val="6B7280"/>
           <w:sz w:val="18"/>
         </w:rPr>
-        <w:t>M13 is folder 17 in teaching order. It is designed to follow the separately built M11 dashboard and M12 chart packs when those branches land.</w:t>
+        <w:t>M13 is folder 17 in teaching order, following the built M11 dashboard and M12 chart packs in folders 15 and 16.</w:t>
       </w:r>
     </w:p>
     <w:tbl>
@@ -766,7 +766,7 @@
                 <w:i w:val="0"/>
                 <w:sz w:val="13"/>
               </w:rPr>
-              <w:t>16-M12-chart-critique</w:t>
+              <w:t>16-M12-misleading-charts</w:t>
             </w:r>
           </w:p>
         </w:tc>

</xml_diff>

<commit_message>
Build M14 overweight permit exam pack
Co-authored-by: shaseaver25 <shannon@tailoredu.org>
</commit_message>
<xml_diff>
--- a/teaching-pack/00-INSTRUCTOR/FILE-INDEX.docx
+++ b/teaching-pack/00-INSTRUCTOR/FILE-INDEX.docx
@@ -29,7 +29,7 @@
           <w:color w:val="6B7280"/>
           <w:sz w:val="18"/>
         </w:rPr>
-        <w:t>M13 is folder 17 in teaching order, following the built M11 dashboard and M12 chart packs in folders 15 and 16.</w:t>
+        <w:t>M14 is folder 18 in teaching order and closes Unit 2 with Exam 1.</w:t>
       </w:r>
     </w:p>
     <w:tbl>
@@ -129,7 +129,7 @@
                 <w:i w:val="0"/>
                 <w:sz w:val="13"/>
               </w:rPr>
-              <w:t>Run-of-day desk, faculty brief, source SAY notes, and this index</w:t>
+              <w:t>Run-of-day desk, faculty brief, source / SAY holds, and this index</w:t>
             </w:r>
           </w:p>
         </w:tc>
@@ -457,7 +457,7 @@
                 <w:i w:val="0"/>
                 <w:sz w:val="13"/>
               </w:rPr>
-              <w:t>Center, spread, CV, low count, and sample scope</w:t>
+              <w:t>Descriptive statistics</w:t>
             </w:r>
           </w:p>
         </w:tc>
@@ -499,7 +499,7 @@
                 <w:i w:val="0"/>
                 <w:sz w:val="13"/>
               </w:rPr>
-              <w:t>Agent loop, threshold alarm, and unresolved event</w:t>
+              <w:t>Agentic alarm chain</w:t>
             </w:r>
           </w:p>
         </w:tc>
@@ -539,7 +539,7 @@
                 <w:i w:val="0"/>
                 <w:sz w:val="13"/>
               </w:rPr>
-              <w:t>Distribution audit, traffic corroboration, and Unit 1 handoff</w:t>
+              <w:t>Distribution audit</w:t>
             </w:r>
           </w:p>
         </w:tc>
@@ -581,7 +581,7 @@
                 <w:i w:val="0"/>
                 <w:sz w:val="13"/>
               </w:rPr>
-              <w:t>Training bias, distribution shift, and Unit 2 note v2</w:t>
+              <w:t>Training coverage and distribution shift</w:t>
             </w:r>
           </w:p>
         </w:tc>
@@ -621,7 +621,7 @@
                 <w:i w:val="0"/>
                 <w:sz w:val="13"/>
               </w:rPr>
-              <w:t>Correlation, regression, thermal confound, and HW4</w:t>
+              <w:t>Regression and confounding</w:t>
             </w:r>
           </w:p>
         </w:tc>
@@ -663,7 +663,7 @@
                 <w:i w:val="0"/>
                 <w:sz w:val="13"/>
               </w:rPr>
-              <w:t>Overconfidence, false precision, sampling, and sample scope</w:t>
+              <w:t>False precision and sampling</w:t>
             </w:r>
           </w:p>
         </w:tc>
@@ -703,7 +703,7 @@
                 <w:i w:val="0"/>
                 <w:sz w:val="13"/>
               </w:rPr>
-              <w:t>Paired intervals, signal/noise audit, and HW5 callback</w:t>
+              <w:t>Confidence intervals and significance</w:t>
             </w:r>
           </w:p>
         </w:tc>
@@ -785,7 +785,7 @@
                 <w:i w:val="0"/>
                 <w:sz w:val="13"/>
               </w:rPr>
-              <w:t>Chart selection, axes, and misleading visual claims</w:t>
+              <w:t>Chart selection, axes, HW6, and Exam 1 review</w:t>
             </w:r>
           </w:p>
         </w:tc>
@@ -827,7 +827,47 @@
                 <w:i w:val="0"/>
                 <w:sz w:val="13"/>
               </w:rPr>
-              <w:t>Pipeline ingestion, mixed formats, missing data, and Unit 2 debrief</w:t>
+              <w:t>Pipeline trace and Unit 2 debrief</w:t>
+            </w:r>
+          </w:p>
+        </w:tc>
+      </w:tr>
+      <w:tr>
+        <w:tc>
+          <w:tcPr>
+            <w:tcW w:type="dxa" w:w="3960"/>
+          </w:tcPr>
+          <w:p>
+            <w:pPr>
+              <w:spacing w:before="20" w:after="20" w:line="252" w:lineRule="auto"/>
+            </w:pPr>
+            <w:r>
+              <w:rPr>
+                <w:rFonts w:ascii="Barlow" w:hAnsi="Barlow" w:cs="Barlow"/>
+                <w:b w:val="0"/>
+                <w:i w:val="0"/>
+                <w:sz w:val="13"/>
+              </w:rPr>
+              <w:t>18-M14-exam-1-overweight-permit</w:t>
+            </w:r>
+          </w:p>
+        </w:tc>
+        <w:tc>
+          <w:tcPr>
+            <w:tcW w:type="dxa" w:w="5976"/>
+          </w:tcPr>
+          <w:p>
+            <w:pPr>
+              <w:spacing w:before="20" w:after="20" w:line="252" w:lineRule="auto"/>
+            </w:pPr>
+            <w:r>
+              <w:rPr>
+                <w:rFonts w:ascii="Barlow" w:hAnsi="Barlow" w:cs="Barlow"/>
+                <w:b w:val="0"/>
+                <w:i w:val="0"/>
+                <w:sz w:val="13"/>
+              </w:rPr>
+              <w:t>Exam 1 clean file, permit decision, rubric, and reveal</w:t>
             </w:r>
           </w:p>
         </w:tc>
@@ -847,7 +887,7 @@
           <w:caps w:val="1"/>
           <w:spacing w:val="12"/>
         </w:rPr>
-        <w:t>17-M13-wes-handoff</w:t>
+        <w:t>18-M14-exam-1-overweight-permit</w:t>
       </w:r>
     </w:p>
     <w:tbl>
@@ -928,7 +968,7 @@
                 <w:i w:val="0"/>
                 <w:sz w:val="14"/>
               </w:rPr>
-              <w:t>M13-student.pptx</w:t>
+              <w:t>M14-exam-launch.pptx</w:t>
             </w:r>
           </w:p>
         </w:tc>
@@ -947,7 +987,7 @@
                 <w:i w:val="0"/>
                 <w:sz w:val="14"/>
               </w:rPr>
-              <w:t>Spoiler-safe inbox, concepts, trace hunt, Note v2, and debrief</w:t>
+              <w:t>Student-facing exam launch and clock; placeholder notes only</w:t>
             </w:r>
           </w:p>
         </w:tc>
@@ -969,7 +1009,7 @@
                 <w:i w:val="0"/>
                 <w:sz w:val="14"/>
               </w:rPr>
-              <w:t>M13-instructor-reveal.pptx</w:t>
+              <w:t>M14-instructor-reveal.pptx</w:t>
             </w:r>
           </w:p>
         </w:tc>
@@ -989,7 +1029,7 @@
                 <w:i w:val="0"/>
                 <w:sz w:val="14"/>
               </w:rPr>
-              <w:t>Gated silent-ingestion reveal and one worked trace</w:t>
+              <w:t>Post-collection worked reveal; placeholder notes only</w:t>
             </w:r>
           </w:p>
         </w:tc>
@@ -1010,7 +1050,7 @@
                 <w:i w:val="0"/>
                 <w:sz w:val="14"/>
               </w:rPr>
-              <w:t>wes_handoff.xlsx</w:t>
+              <w:t>EX1-01-student-exam-booklet.docx</w:t>
             </w:r>
           </w:p>
         </w:tc>
@@ -1029,7 +1069,7 @@
                 <w:i w:val="0"/>
                 <w:sz w:val="14"/>
               </w:rPr>
-              <w:t>Two delivered source sheets from Wes’s four-sheet handoff</w:t>
+              <w:t>Five-task 75-minute applied practical</w:t>
             </w:r>
           </w:p>
         </w:tc>
@@ -1051,7 +1091,7 @@
                 <w:i w:val="0"/>
                 <w:sz w:val="14"/>
               </w:rPr>
-              <w:t>WES-M13-partial-handoff-note.docx</w:t>
+              <w:t>EX1-02-reference-sheet.docx</w:t>
             </w:r>
           </w:p>
         </w:tc>
@@ -1071,7 +1111,7 @@
                 <w:i w:val="0"/>
                 <w:sz w:val="14"/>
               </w:rPr>
-              <w:t>Late handoff, Diane direction, and M07 liability color</w:t>
+              <w:t>Supplied formulas, t multiplier, and interpretation guards</w:t>
             </w:r>
           </w:p>
         </w:tc>
@@ -1092,7 +1132,7 @@
                 <w:i w:val="0"/>
                 <w:sz w:val="14"/>
               </w:rPr>
-              <w:t>FOREMAN-M13-pipeline-log.docx / .csv</w:t>
+              <w:t>M14-exam-evidence.xlsx / control-gauge CSV</w:t>
             </w:r>
           </w:p>
         </w:tc>
@@ -1111,7 +1151,7 @@
                 <w:i w:val="0"/>
                 <w:sz w:val="14"/>
               </w:rPr>
-              <w:t>Orange machine run record</w:t>
+              <w:t>Same clean source file for every student</w:t>
             </w:r>
           </w:p>
         </w:tc>
@@ -1133,7 +1173,7 @@
                 <w:i w:val="0"/>
                 <w:sz w:val="14"/>
               </w:rPr>
-              <w:t>M13-pipeline-output.csv</w:t>
+              <w:t>FOREMAN-M14-permit-recommendation.docx / chart PNG</w:t>
             </w:r>
           </w:p>
         </w:tc>
@@ -1153,7 +1193,7 @@
                 <w:i w:val="0"/>
                 <w:sz w:val="14"/>
               </w:rPr>
-              <w:t>Ten rows emitted to the existing consumer</w:t>
+              <w:t>Machine recommendation and visual evidence</w:t>
             </w:r>
           </w:p>
         </w:tc>
@@ -1174,7 +1214,7 @@
                 <w:i w:val="0"/>
                 <w:sz w:val="14"/>
               </w:rPr>
-              <w:t>H13-01-pipeline-trace-hunt.docx</w:t>
+              <w:t>EX1-03-instructor-rubric.docx</w:t>
             </w:r>
           </w:p>
         </w:tc>
@@ -1193,7 +1233,7 @@
                 <w:i w:val="0"/>
                 <w:sz w:val="14"/>
               </w:rPr>
-              <w:t>One-value end-to-end trace worksheet</w:t>
+              <w:t>100-point outcome-neutral scoring rubric</w:t>
             </w:r>
           </w:p>
         </w:tc>
@@ -1215,7 +1255,7 @@
                 <w:i w:val="0"/>
                 <w:sz w:val="14"/>
               </w:rPr>
-              <w:t>H13-02-pipeline-concepts.docx</w:t>
+              <w:t>KEY-M14-answer-key.docx</w:t>
             </w:r>
           </w:p>
         </w:tc>
@@ -1235,7 +1275,7 @@
                 <w:i w:val="0"/>
                 <w:sz w:val="14"/>
               </w:rPr>
-              <w:t>Six concepts and minimum visible records</w:t>
+              <w:t>Worked values, defensible calls, and reveal boundaries</w:t>
             </w:r>
           </w:p>
         </w:tc>
@@ -1256,7 +1296,7 @@
                 <w:i w:val="0"/>
                 <w:sz w:val="14"/>
               </w:rPr>
-              <w:t>H13-03-note-v2-unchecked-log.docx</w:t>
+              <w:t>../00-INSTRUCTOR/source-notes/M14-SAY-HOLD.md</w:t>
             </w:r>
           </w:p>
         </w:tc>
@@ -1275,131 +1315,7 @@
                 <w:i w:val="0"/>
                 <w:sz w:val="14"/>
               </w:rPr>
-              <w:t>Claim/check/result plus unchecked-column log</w:t>
-            </w:r>
-          </w:p>
-        </w:tc>
-      </w:tr>
-      <w:tr>
-        <w:tc>
-          <w:tcPr>
-            <w:tcW w:type="dxa" w:w="4608"/>
-            <w:shd w:val="clear" w:color="auto" w:fill="F4F6F8"/>
-          </w:tcPr>
-          <w:p>
-            <w:pPr>
-              <w:spacing w:before="20" w:after="20" w:line="252" w:lineRule="auto"/>
-            </w:pPr>
-            <w:r>
-              <w:rPr>
-                <w:rFonts w:ascii="Barlow" w:hAnsi="Barlow" w:cs="Barlow"/>
-                <w:b w:val="0"/>
-                <w:i w:val="0"/>
-                <w:sz w:val="14"/>
-              </w:rPr>
-              <w:t>H13-04-unit-2-debrief.docx</w:t>
-            </w:r>
-          </w:p>
-        </w:tc>
-        <w:tc>
-          <w:tcPr>
-            <w:tcW w:type="dxa" w:w="5328"/>
-            <w:shd w:val="clear" w:color="auto" w:fill="F4F6F8"/>
-          </w:tcPr>
-          <w:p>
-            <w:pPr>
-              <w:spacing w:before="20" w:after="20" w:line="252" w:lineRule="auto"/>
-            </w:pPr>
-            <w:r>
-              <w:rPr>
-                <w:rFonts w:ascii="Barlow" w:hAnsi="Barlow" w:cs="Barlow"/>
-                <w:b w:val="0"/>
-                <w:i w:val="0"/>
-                <w:sz w:val="14"/>
-              </w:rPr>
-              <w:t>Mask-off Unit 2 debrief</w:t>
-            </w:r>
-          </w:p>
-        </w:tc>
-      </w:tr>
-      <w:tr>
-        <w:tc>
-          <w:tcPr>
-            <w:tcW w:type="dxa" w:w="4608"/>
-          </w:tcPr>
-          <w:p>
-            <w:pPr>
-              <w:spacing w:before="20" w:after="20" w:line="252" w:lineRule="auto"/>
-            </w:pPr>
-            <w:r>
-              <w:rPr>
-                <w:rFonts w:ascii="Barlow" w:hAnsi="Barlow" w:cs="Barlow"/>
-                <w:b w:val="0"/>
-                <w:i w:val="0"/>
-                <w:sz w:val="14"/>
-              </w:rPr>
-              <w:t>KEY-M13-answer-key.docx</w:t>
-            </w:r>
-          </w:p>
-        </w:tc>
-        <w:tc>
-          <w:tcPr>
-            <w:tcW w:type="dxa" w:w="5328"/>
-          </w:tcPr>
-          <w:p>
-            <w:pPr>
-              <w:spacing w:before="20" w:after="20" w:line="252" w:lineRule="auto"/>
-            </w:pPr>
-            <w:r>
-              <w:rPr>
-                <w:rFonts w:ascii="Barlow" w:hAnsi="Barlow" w:cs="Barlow"/>
-                <w:b w:val="0"/>
-                <w:i w:val="0"/>
-                <w:sz w:val="14"/>
-              </w:rPr>
-              <w:t>Instructor-only reveal, worked trace, and boundaries</w:t>
-            </w:r>
-          </w:p>
-        </w:tc>
-      </w:tr>
-      <w:tr>
-        <w:tc>
-          <w:tcPr>
-            <w:tcW w:type="dxa" w:w="4608"/>
-            <w:shd w:val="clear" w:color="auto" w:fill="F4F6F8"/>
-          </w:tcPr>
-          <w:p>
-            <w:pPr>
-              <w:spacing w:before="20" w:after="20" w:line="252" w:lineRule="auto"/>
-            </w:pPr>
-            <w:r>
-              <w:rPr>
-                <w:rFonts w:ascii="Barlow" w:hAnsi="Barlow" w:cs="Barlow"/>
-                <w:b w:val="0"/>
-                <w:i w:val="0"/>
-                <w:sz w:val="14"/>
-              </w:rPr>
-              <w:t>../00-INSTRUCTOR/source-notes/M13-story-SAY.md</w:t>
-            </w:r>
-          </w:p>
-        </w:tc>
-        <w:tc>
-          <w:tcPr>
-            <w:tcW w:type="dxa" w:w="5328"/>
-            <w:shd w:val="clear" w:color="auto" w:fill="F4F6F8"/>
-          </w:tcPr>
-          <w:p>
-            <w:pPr>
-              <w:spacing w:before="20" w:after="20" w:line="252" w:lineRule="auto"/>
-            </w:pPr>
-            <w:r>
-              <w:rPr>
-                <w:rFonts w:ascii="Barlow" w:hAnsi="Barlow" w:cs="Barlow"/>
-                <w:b w:val="0"/>
-                <w:i w:val="0"/>
-                <w:sz w:val="14"/>
-              </w:rPr>
-              <w:t>Cloud-PASS M13 canon story and SAY source</w:t>
+              <w:t>Explicit placeholder hook pending Cloud-PASS file</w:t>
             </w:r>
           </w:p>
         </w:tc>
@@ -1435,7 +1351,7 @@
         <w:color w:val="6B7280"/>
         <w:sz w:val="16"/>
       </w:rPr>
-      <w:t>SEIS 201  ·  M01 – M13</w:t>
+      <w:t>SEIS 201  ·  M01 – M14</w:t>
     </w:r>
     <w:r>
       <w:tab/>
@@ -1508,7 +1424,7 @@
         <w:caps w:val="1"/>
         <w:spacing w:val="20"/>
       </w:rPr>
-      <w:t>M01 – M13  ·  FILE INDEX</w:t>
+      <w:t>M01 – M14  ·  FILE INDEX</w:t>
     </w:r>
   </w:p>
 </w:hdr>

</xml_diff>

<commit_message>
Fold Cloud-PASS M14 exam SAY
Co-authored-by: shaseaver25 <shannon@tailoredu.org>
</commit_message>
<xml_diff>
--- a/teaching-pack/00-INSTRUCTOR/FILE-INDEX.docx
+++ b/teaching-pack/00-INSTRUCTOR/FILE-INDEX.docx
@@ -867,7 +867,7 @@
                 <w:i w:val="0"/>
                 <w:sz w:val="13"/>
               </w:rPr>
-              <w:t>Exam 1 clean file, permit decision, rubric, and reveal</w:t>
+              <w:t>Exam 1 clean file, permit decision, rubric, and later review</w:t>
             </w:r>
           </w:p>
         </w:tc>
@@ -987,7 +987,7 @@
                 <w:i w:val="0"/>
                 <w:sz w:val="14"/>
               </w:rPr>
-              <w:t>Student-facing exam launch and clock; placeholder notes only</w:t>
+              <w:t>Student-facing exam launch and clock with Cloud-PASS SAY</w:t>
             </w:r>
           </w:p>
         </w:tc>
@@ -1009,7 +1009,7 @@
                 <w:i w:val="0"/>
                 <w:sz w:val="14"/>
               </w:rPr>
-              <w:t>M14-instructor-reveal.pptx</w:t>
+              <w:t>M14-instructor-later-review.pptx</w:t>
             </w:r>
           </w:p>
         </w:tc>
@@ -1029,7 +1029,7 @@
                 <w:i w:val="0"/>
                 <w:sz w:val="14"/>
               </w:rPr>
-              <w:t>Post-collection worked reveal; placeholder notes only</w:t>
+              <w:t>Worked later-review deck; never open on exam day</w:t>
             </w:r>
           </w:p>
         </w:tc>
@@ -1275,7 +1275,7 @@
                 <w:i w:val="0"/>
                 <w:sz w:val="14"/>
               </w:rPr>
-              <w:t>Worked values, defensible calls, and reveal boundaries</w:t>
+              <w:t>Worked values, defensible calls, and later-review boundaries</w:t>
             </w:r>
           </w:p>
         </w:tc>
@@ -1296,7 +1296,7 @@
                 <w:i w:val="0"/>
                 <w:sz w:val="14"/>
               </w:rPr>
-              <w:t>../00-INSTRUCTOR/source-notes/M14-SAY-HOLD.md</w:t>
+              <w:t>STUDENT-PACKET-STATUS.md</w:t>
             </w:r>
           </w:p>
         </w:tc>
@@ -1315,7 +1315,49 @@
                 <w:i w:val="0"/>
                 <w:sz w:val="14"/>
               </w:rPr>
-              <w:t>Explicit placeholder hook pending Cloud-PASS file</w:t>
+              <w:t>Ready-for-Shannon-skim hold; not LMS published</w:t>
+            </w:r>
+          </w:p>
+        </w:tc>
+      </w:tr>
+      <w:tr>
+        <w:tc>
+          <w:tcPr>
+            <w:tcW w:type="dxa" w:w="4608"/>
+            <w:shd w:val="clear" w:color="auto" w:fill="F4F6F8"/>
+          </w:tcPr>
+          <w:p>
+            <w:pPr>
+              <w:spacing w:before="20" w:after="20" w:line="252" w:lineRule="auto"/>
+            </w:pPr>
+            <w:r>
+              <w:rPr>
+                <w:rFonts w:ascii="Barlow" w:hAnsi="Barlow" w:cs="Barlow"/>
+                <w:b w:val="0"/>
+                <w:i w:val="0"/>
+                <w:sz w:val="14"/>
+              </w:rPr>
+              <w:t>../00-INSTRUCTOR/source-notes/M14-story-SAY.md</w:t>
+            </w:r>
+          </w:p>
+        </w:tc>
+        <w:tc>
+          <w:tcPr>
+            <w:tcW w:type="dxa" w:w="5328"/>
+            <w:shd w:val="clear" w:color="auto" w:fill="F4F6F8"/>
+          </w:tcPr>
+          <w:p>
+            <w:pPr>
+              <w:spacing w:before="20" w:after="20" w:line="252" w:lineRule="auto"/>
+            </w:pPr>
+            <w:r>
+              <w:rPr>
+                <w:rFonts w:ascii="Barlow" w:hAnsi="Barlow" w:cs="Barlow"/>
+                <w:b w:val="0"/>
+                <w:i w:val="0"/>
+                <w:sz w:val="14"/>
+              </w:rPr>
+              <w:t>Cloud-PASS M14 canon story and SAY source</w:t>
             </w:r>
           </w:p>
         </w:tc>

</xml_diff>

<commit_message>
Revert "Fold Cloud-PASS M14 exam SAY"
This reverts commit 5710d69eee49c5d1a82d40e4050057d216c1c2ac.
</commit_message>
<xml_diff>
--- a/teaching-pack/00-INSTRUCTOR/FILE-INDEX.docx
+++ b/teaching-pack/00-INSTRUCTOR/FILE-INDEX.docx
@@ -867,7 +867,7 @@
                 <w:i w:val="0"/>
                 <w:sz w:val="13"/>
               </w:rPr>
-              <w:t>Exam 1 clean file, permit decision, rubric, and later review</w:t>
+              <w:t>Exam 1 clean file, permit decision, rubric, and reveal</w:t>
             </w:r>
           </w:p>
         </w:tc>
@@ -987,7 +987,7 @@
                 <w:i w:val="0"/>
                 <w:sz w:val="14"/>
               </w:rPr>
-              <w:t>Student-facing exam launch and clock with Cloud-PASS SAY</w:t>
+              <w:t>Student-facing exam launch and clock; placeholder notes only</w:t>
             </w:r>
           </w:p>
         </w:tc>
@@ -1009,7 +1009,7 @@
                 <w:i w:val="0"/>
                 <w:sz w:val="14"/>
               </w:rPr>
-              <w:t>M14-instructor-later-review.pptx</w:t>
+              <w:t>M14-instructor-reveal.pptx</w:t>
             </w:r>
           </w:p>
         </w:tc>
@@ -1029,7 +1029,7 @@
                 <w:i w:val="0"/>
                 <w:sz w:val="14"/>
               </w:rPr>
-              <w:t>Worked later-review deck; never open on exam day</w:t>
+              <w:t>Post-collection worked reveal; placeholder notes only</w:t>
             </w:r>
           </w:p>
         </w:tc>
@@ -1275,7 +1275,7 @@
                 <w:i w:val="0"/>
                 <w:sz w:val="14"/>
               </w:rPr>
-              <w:t>Worked values, defensible calls, and later-review boundaries</w:t>
+              <w:t>Worked values, defensible calls, and reveal boundaries</w:t>
             </w:r>
           </w:p>
         </w:tc>
@@ -1296,7 +1296,7 @@
                 <w:i w:val="0"/>
                 <w:sz w:val="14"/>
               </w:rPr>
-              <w:t>STUDENT-PACKET-STATUS.md</w:t>
+              <w:t>../00-INSTRUCTOR/source-notes/M14-SAY-HOLD.md</w:t>
             </w:r>
           </w:p>
         </w:tc>
@@ -1315,49 +1315,7 @@
                 <w:i w:val="0"/>
                 <w:sz w:val="14"/>
               </w:rPr>
-              <w:t>Ready-for-Shannon-skim hold; not LMS published</w:t>
-            </w:r>
-          </w:p>
-        </w:tc>
-      </w:tr>
-      <w:tr>
-        <w:tc>
-          <w:tcPr>
-            <w:tcW w:type="dxa" w:w="4608"/>
-            <w:shd w:val="clear" w:color="auto" w:fill="F4F6F8"/>
-          </w:tcPr>
-          <w:p>
-            <w:pPr>
-              <w:spacing w:before="20" w:after="20" w:line="252" w:lineRule="auto"/>
-            </w:pPr>
-            <w:r>
-              <w:rPr>
-                <w:rFonts w:ascii="Barlow" w:hAnsi="Barlow" w:cs="Barlow"/>
-                <w:b w:val="0"/>
-                <w:i w:val="0"/>
-                <w:sz w:val="14"/>
-              </w:rPr>
-              <w:t>../00-INSTRUCTOR/source-notes/M14-story-SAY.md</w:t>
-            </w:r>
-          </w:p>
-        </w:tc>
-        <w:tc>
-          <w:tcPr>
-            <w:tcW w:type="dxa" w:w="5328"/>
-            <w:shd w:val="clear" w:color="auto" w:fill="F4F6F8"/>
-          </w:tcPr>
-          <w:p>
-            <w:pPr>
-              <w:spacing w:before="20" w:after="20" w:line="252" w:lineRule="auto"/>
-            </w:pPr>
-            <w:r>
-              <w:rPr>
-                <w:rFonts w:ascii="Barlow" w:hAnsi="Barlow" w:cs="Barlow"/>
-                <w:b w:val="0"/>
-                <w:i w:val="0"/>
-                <w:sz w:val="14"/>
-              </w:rPr>
-              <w:t>Cloud-PASS M14 canon story and SAY source</w:t>
+              <w:t>Explicit placeholder hook pending Cloud-PASS file</w:t>
             </w:r>
           </w:p>
         </w:tc>

</xml_diff>

<commit_message>
Reapply "Fold Cloud-PASS M14 exam SAY"
This reverts commit d2434907d0376321689dd9e707e758c2950ce26c.
</commit_message>
<xml_diff>
--- a/teaching-pack/00-INSTRUCTOR/FILE-INDEX.docx
+++ b/teaching-pack/00-INSTRUCTOR/FILE-INDEX.docx
@@ -867,7 +867,7 @@
                 <w:i w:val="0"/>
                 <w:sz w:val="13"/>
               </w:rPr>
-              <w:t>Exam 1 clean file, permit decision, rubric, and reveal</w:t>
+              <w:t>Exam 1 clean file, permit decision, rubric, and later review</w:t>
             </w:r>
           </w:p>
         </w:tc>
@@ -987,7 +987,7 @@
                 <w:i w:val="0"/>
                 <w:sz w:val="14"/>
               </w:rPr>
-              <w:t>Student-facing exam launch and clock; placeholder notes only</w:t>
+              <w:t>Student-facing exam launch and clock with Cloud-PASS SAY</w:t>
             </w:r>
           </w:p>
         </w:tc>
@@ -1009,7 +1009,7 @@
                 <w:i w:val="0"/>
                 <w:sz w:val="14"/>
               </w:rPr>
-              <w:t>M14-instructor-reveal.pptx</w:t>
+              <w:t>M14-instructor-later-review.pptx</w:t>
             </w:r>
           </w:p>
         </w:tc>
@@ -1029,7 +1029,7 @@
                 <w:i w:val="0"/>
                 <w:sz w:val="14"/>
               </w:rPr>
-              <w:t>Post-collection worked reveal; placeholder notes only</w:t>
+              <w:t>Worked later-review deck; never open on exam day</w:t>
             </w:r>
           </w:p>
         </w:tc>
@@ -1275,7 +1275,7 @@
                 <w:i w:val="0"/>
                 <w:sz w:val="14"/>
               </w:rPr>
-              <w:t>Worked values, defensible calls, and reveal boundaries</w:t>
+              <w:t>Worked values, defensible calls, and later-review boundaries</w:t>
             </w:r>
           </w:p>
         </w:tc>
@@ -1296,7 +1296,7 @@
                 <w:i w:val="0"/>
                 <w:sz w:val="14"/>
               </w:rPr>
-              <w:t>../00-INSTRUCTOR/source-notes/M14-SAY-HOLD.md</w:t>
+              <w:t>STUDENT-PACKET-STATUS.md</w:t>
             </w:r>
           </w:p>
         </w:tc>
@@ -1315,7 +1315,49 @@
                 <w:i w:val="0"/>
                 <w:sz w:val="14"/>
               </w:rPr>
-              <w:t>Explicit placeholder hook pending Cloud-PASS file</w:t>
+              <w:t>Ready-for-Shannon-skim hold; not LMS published</w:t>
+            </w:r>
+          </w:p>
+        </w:tc>
+      </w:tr>
+      <w:tr>
+        <w:tc>
+          <w:tcPr>
+            <w:tcW w:type="dxa" w:w="4608"/>
+            <w:shd w:val="clear" w:color="auto" w:fill="F4F6F8"/>
+          </w:tcPr>
+          <w:p>
+            <w:pPr>
+              <w:spacing w:before="20" w:after="20" w:line="252" w:lineRule="auto"/>
+            </w:pPr>
+            <w:r>
+              <w:rPr>
+                <w:rFonts w:ascii="Barlow" w:hAnsi="Barlow" w:cs="Barlow"/>
+                <w:b w:val="0"/>
+                <w:i w:val="0"/>
+                <w:sz w:val="14"/>
+              </w:rPr>
+              <w:t>../00-INSTRUCTOR/source-notes/M14-story-SAY.md</w:t>
+            </w:r>
+          </w:p>
+        </w:tc>
+        <w:tc>
+          <w:tcPr>
+            <w:tcW w:type="dxa" w:w="5328"/>
+            <w:shd w:val="clear" w:color="auto" w:fill="F4F6F8"/>
+          </w:tcPr>
+          <w:p>
+            <w:pPr>
+              <w:spacing w:before="20" w:after="20" w:line="252" w:lineRule="auto"/>
+            </w:pPr>
+            <w:r>
+              <w:rPr>
+                <w:rFonts w:ascii="Barlow" w:hAnsi="Barlow" w:cs="Barlow"/>
+                <w:b w:val="0"/>
+                <w:i w:val="0"/>
+                <w:sz w:val="14"/>
+              </w:rPr>
+              <w:t>Cloud-PASS M14 canon story and SAY source</w:t>
             </w:r>
           </w:p>
         </w:tc>

</xml_diff>